<commit_message>
feat: make Mantel matrix comparison primary
</commit_message>
<xml_diff>
--- a/products/manuscript.docx
+++ b/products/manuscript.docx
@@ -454,7 +454,52 @@
         </m:r>
       </m:oMath>
       <w:r>
-        <w:t xml:space="preserve">-Epitope, and cartography) using Pearson’s correlation.</w:t>
+        <w:t xml:space="preserve">-Epitope, and cartography) using Mantel correlations with matrix</w:t>
+      </w:r>
+      <w:r>
+        <w:t xml:space="preserve"> </w:t>
+      </w:r>
+      <w:r>
+        <w:t xml:space="preserve">permutation p-values</w:t>
+      </w:r>
+      <w:r>
+        <w:t xml:space="preserve"> </w:t>
+      </w:r>
+      <w:r>
+        <w:t xml:space="preserve">[13,14]</w:t>
+      </w:r>
+      <w:r>
+        <w:t xml:space="preserve">. These comparisons used only unique off-diagonal</w:t>
+      </w:r>
+      <w:r>
+        <w:t xml:space="preserve"> </w:t>
+      </w:r>
+      <w:r>
+        <w:t xml:space="preserve">strain pairs, excluding duplicate symmetric distances and self-comparisons.</w:t>
+      </w:r>
+      <w:r>
+        <w:t xml:space="preserve"> </w:t>
+      </w:r>
+      <w:r>
+        <w:t xml:space="preserve">We estimated 95% intervals for the Mantel statistic using Bayesian bootstrap</w:t>
+      </w:r>
+      <w:r>
+        <w:t xml:space="preserve"> </w:t>
+      </w:r>
+      <w:r>
+        <w:t xml:space="preserve">resampling over strain units. Descriptive Pearson correlations using the same</w:t>
+      </w:r>
+      <w:r>
+        <w:t xml:space="preserve"> </w:t>
+      </w:r>
+      <w:r>
+        <w:t xml:space="preserve">unique off-diagonal pair representation are reported in the supplement for</w:t>
+      </w:r>
+      <w:r>
+        <w:t xml:space="preserve"> </w:t>
+      </w:r>
+      <w:r>
+        <w:t xml:space="preserve">interpretability.</w:t>
       </w:r>
     </w:p>
     <w:p>
@@ -504,7 +549,7 @@
         <w:t xml:space="preserve"> </w:t>
       </w:r>
       <w:r>
-        <w:t xml:space="preserve">[13]</w:t>
+        <w:t xml:space="preserve">[15]</w:t>
       </w:r>
       <w:r>
         <w:t xml:space="preserve"> </w:t>
@@ -525,7 +570,7 @@
         <w:t xml:space="preserve"> </w:t>
       </w:r>
       <w:r>
-        <w:t xml:space="preserve">[14]</w:t>
+        <w:t xml:space="preserve">[16]</w:t>
       </w:r>
       <w:r>
         <w:t xml:space="preserve"> </w:t>
@@ -546,7 +591,7 @@
         <w:t xml:space="preserve"> </w:t>
       </w:r>
       <w:r>
-        <w:t xml:space="preserve">[15]</w:t>
+        <w:t xml:space="preserve">[17]</w:t>
       </w:r>
       <w:r>
         <w:t xml:space="preserve">.</w:t>
@@ -567,7 +612,7 @@
         <w:pStyle w:val="FirstParagraph"/>
       </w:pPr>
       <w:r>
-        <w:t xml:space="preserve">The distance metrics differed in their agreement with ML-tree cophenetic</w:t>
+        <w:t xml:space="preserve">The distance metrics differed in their Mantel agreement with ML-tree cophenetic</w:t>
       </w:r>
       <w:r>
         <w:t xml:space="preserve"> </w:t>
@@ -615,19 +660,19 @@
         <w:t xml:space="preserve"> </w:t>
       </w:r>
       <w:r>
-        <w:t xml:space="preserve">distances were strongly correlated with ML-tree distance for both subtypes,</w:t>
-      </w:r>
-      <w:r>
-        <w:t xml:space="preserve"> </w:t>
-      </w:r>
-      <w:r>
-        <w:t xml:space="preserve">while cartographic distance had lower correlations. Temporal distance was</w:t>
-      </w:r>
-      <w:r>
-        <w:t xml:space="preserve"> </w:t>
-      </w:r>
-      <w:r>
-        <w:t xml:space="preserve">strongly correlated with ML-tree distance for H3N2, but not for H1N1. H1N1 has</w:t>
+        <w:t xml:space="preserve">distances were strongly associated with ML-tree distance for both subtypes,</w:t>
+      </w:r>
+      <w:r>
+        <w:t xml:space="preserve"> </w:t>
+      </w:r>
+      <w:r>
+        <w:t xml:space="preserve">while cartographic distance had lower matrix correlations. Temporal distance was</w:t>
+      </w:r>
+      <w:r>
+        <w:t xml:space="preserve"> </w:t>
+      </w:r>
+      <w:r>
+        <w:t xml:space="preserve">strongly associated with ML-tree distance for H3N2, but not for H1N1. H1N1 has</w:t>
       </w:r>
       <w:r>
         <w:t xml:space="preserve"> </w:t>
@@ -769,7 +814,7 @@
               <w:pStyle w:val="ImageCaption"/>
             </w:pPr>
             <w:r>
-              <w:t xml:space="preserve">Table 1: Descriptive Pearson correlations between each distance metric and ML-tree cophenetic distance, overall and by subtype.</w:t>
+              <w:t xml:space="preserve">Table 1: Mantel correlations between each distance metric and ML-tree cophenetic distance, overall and by subtype. Intervals are Bayesian bootstrap 95% intervals over strain units. P-values are two-sided matrix-permutation p-values for the observed strain panel.</w:t>
             </w:r>
           </w:p>
           <w:tbl xmlns:w="http://schemas.openxmlformats.org/wordprocessingml/2006/main" xmlns:r="http://schemas.openxmlformats.org/officeDocument/2006/relationships" xmlns:w14="http://schemas.microsoft.com/office/word/2010/wordml" xmlns:wp="http://schemas.openxmlformats.org/drawingml/2006/wordprocessingDrawing" xmlns:a="http://schemas.openxmlformats.org/drawingml/2006/main" xmlns:pic="http://schemas.openxmlformats.org/drawingml/2006/picture">
@@ -782,8 +827,10 @@
               <w:gridCol w:w="2551"/>
               <w:gridCol w:w="1108"/>
               <w:gridCol w:w="2550"/>
-              <w:gridCol w:w="1364"/>
+              <w:gridCol w:w="1205"/>
               <w:gridCol w:w="1536"/>
+              <w:gridCol w:w="2379"/>
+              <w:gridCol w:w="1707"/>
             </w:tblGrid>
             <w:tr>
               <w:trPr>
@@ -1002,7 +1049,7 @@
                       <w:szCs w:val="22"/>
                       <w:color w:val="000000"/>
                     </w:rPr>
-                    <w:t xml:space="preserve">Pearson r</w:t>
+                    <w:t xml:space="preserve">Mantel r</w:t>
                   </w:r>
                 </w:p>
               </w:tc>
@@ -1057,6 +1104,114 @@
                       <w:color w:val="000000"/>
                     </w:rPr>
                     <w:t xml:space="preserve">95% CI</w:t>
+                  </w:r>
+                </w:p>
+              </w:tc>
+              <w:tc>
+                <w:tcPr>
+                  <w:tcBorders>
+                    <w:bottom w:val="single" w:sz="12" w:space="0" w:color="666666"/>
+                    <w:top w:val="single" w:sz="12" w:space="0" w:color="666666"/>
+                    <w:left w:val="none" w:sz="0" w:space="0" w:color="000000"/>
+                    <w:right w:val="none" w:sz="0" w:space="0" w:color="000000"/>
+                  </w:tcBorders>
+                  <w:shd w:val="clear" w:color="auto" w:fill="FFFFFF"/>
+                  <w:tcMar>
+                    <w:top w:w="0" w:type="dxa"/>
+                    <w:bottom w:w="0" w:type="dxa"/>
+                    <w:left w:w="0" w:type="dxa"/>
+                    <w:right w:w="0" w:type="dxa"/>
+                  </w:tcMar>
+                  <w:vAlign w:val="center"/>
+                </w:tcPr>
+                <w:p>
+                  <w:pPr>
+                    <w:jc w:val="left"/>
+                    <w:pBdr>
+                      <w:bottom w:val="none" w:sz="0" w:space="0" w:color="000000"/>
+                      <w:top w:val="none" w:sz="0" w:space="0" w:color="000000"/>
+                      <w:left w:val="none" w:sz="0" w:space="0" w:color="000000"/>
+                      <w:right w:val="none" w:sz="0" w:space="0" w:color="000000"/>
+                    </w:pBdr>
+                    <w:spacing w:after="100" w:before="100" w:line="240"/>
+                    <w:ind w:left="100" w:right="100" w:firstLine="0" w:firstLineChars="0"/>
+                    <w:rPr>
+                      <w:rFonts w:ascii="Arial" w:hAnsi="Arial" w:eastAsia="Arial" w:cs="Arial"/>
+                      <w:i w:val="false"/>
+                      <w:b w:val="false"/>
+                      <w:u w:val="none"/>
+                      <w:strike w:val="false"/>
+                      <w:sz w:val="22"/>
+                      <w:szCs w:val="22"/>
+                      <w:color w:val="000000"/>
+                    </w:rPr>
+                  </w:pPr>
+                  <w:r xmlns:w="http://schemas.openxmlformats.org/wordprocessingml/2006/main" xmlns:wp="http://schemas.openxmlformats.org/drawingml/2006/wordprocessingDrawing" xmlns:r="http://schemas.openxmlformats.org/officeDocument/2006/relationships" xmlns:w14="http://schemas.microsoft.com/office/word/2010/wordml">
+                    <w:rPr>
+                      <w:rFonts w:ascii="Arial" w:hAnsi="Arial" w:eastAsia="Arial" w:cs="Arial"/>
+                      <w:i w:val="false"/>
+                      <w:b w:val="false"/>
+                      <w:u w:val="none"/>
+                      <w:strike w:val="false"/>
+                      <w:sz w:val="22"/>
+                      <w:szCs w:val="22"/>
+                      <w:color w:val="000000"/>
+                    </w:rPr>
+                    <w:t xml:space="preserve">Permutation p-value</w:t>
+                  </w:r>
+                </w:p>
+              </w:tc>
+              <w:tc>
+                <w:tcPr>
+                  <w:tcBorders>
+                    <w:bottom w:val="single" w:sz="12" w:space="0" w:color="666666"/>
+                    <w:top w:val="single" w:sz="12" w:space="0" w:color="666666"/>
+                    <w:left w:val="none" w:sz="0" w:space="0" w:color="000000"/>
+                    <w:right w:val="none" w:sz="0" w:space="0" w:color="000000"/>
+                  </w:tcBorders>
+                  <w:shd w:val="clear" w:color="auto" w:fill="FFFFFF"/>
+                  <w:tcMar>
+                    <w:top w:w="0" w:type="dxa"/>
+                    <w:bottom w:w="0" w:type="dxa"/>
+                    <w:left w:w="0" w:type="dxa"/>
+                    <w:right w:w="0" w:type="dxa"/>
+                  </w:tcMar>
+                  <w:vAlign w:val="center"/>
+                </w:tcPr>
+                <w:p>
+                  <w:pPr>
+                    <w:jc w:val="right"/>
+                    <w:pBdr>
+                      <w:bottom w:val="none" w:sz="0" w:space="0" w:color="000000"/>
+                      <w:top w:val="none" w:sz="0" w:space="0" w:color="000000"/>
+                      <w:left w:val="none" w:sz="0" w:space="0" w:color="000000"/>
+                      <w:right w:val="none" w:sz="0" w:space="0" w:color="000000"/>
+                    </w:pBdr>
+                    <w:spacing w:after="100" w:before="100" w:line="240"/>
+                    <w:ind w:left="100" w:right="100" w:firstLine="0" w:firstLineChars="0"/>
+                    <w:rPr>
+                      <w:rFonts w:ascii="Arial" w:hAnsi="Arial" w:eastAsia="Arial" w:cs="Arial"/>
+                      <w:i w:val="false"/>
+                      <w:b w:val="false"/>
+                      <w:u w:val="none"/>
+                      <w:strike w:val="false"/>
+                      <w:sz w:val="22"/>
+                      <w:szCs w:val="22"/>
+                      <w:color w:val="000000"/>
+                    </w:rPr>
+                  </w:pPr>
+                  <w:r xmlns:w="http://schemas.openxmlformats.org/wordprocessingml/2006/main" xmlns:wp="http://schemas.openxmlformats.org/drawingml/2006/wordprocessingDrawing" xmlns:r="http://schemas.openxmlformats.org/officeDocument/2006/relationships" xmlns:w14="http://schemas.microsoft.com/office/word/2010/wordml">
+                    <w:rPr>
+                      <w:rFonts w:ascii="Arial" w:hAnsi="Arial" w:eastAsia="Arial" w:cs="Arial"/>
+                      <w:i w:val="false"/>
+                      <w:b w:val="false"/>
+                      <w:u w:val="none"/>
+                      <w:strike w:val="false"/>
+                      <w:sz w:val="22"/>
+                      <w:szCs w:val="22"/>
+                      <w:color w:val="000000"/>
+                    </w:rPr>
+                    <w:t xml:space="preserve">Permutations</w:t>
                   </w:r>
                 </w:p>
               </w:tc>
@@ -1332,7 +1487,115 @@
                       <w:szCs w:val="22"/>
                       <w:color w:val="000000"/>
                     </w:rPr>
-                    <w:t xml:space="preserve">(0.40, 0.67)</w:t>
+                    <w:t xml:space="preserve">(0.41, 0.71)</w:t>
+                  </w:r>
+                </w:p>
+              </w:tc>
+              <w:tc>
+                <w:tcPr>
+                  <w:tcBorders>
+                    <w:bottom w:val="none" w:sz="0" w:space="0" w:color="000000"/>
+                    <w:top w:val="single" w:sz="12" w:space="0" w:color="666666"/>
+                    <w:left w:val="none" w:sz="0" w:space="0" w:color="000000"/>
+                    <w:right w:val="none" w:sz="0" w:space="0" w:color="000000"/>
+                  </w:tcBorders>
+                  <w:shd w:val="clear" w:color="auto" w:fill="FFFFFF"/>
+                  <w:tcMar>
+                    <w:top w:w="0" w:type="dxa"/>
+                    <w:bottom w:w="0" w:type="dxa"/>
+                    <w:left w:w="0" w:type="dxa"/>
+                    <w:right w:w="0" w:type="dxa"/>
+                  </w:tcMar>
+                  <w:vAlign w:val="center"/>
+                </w:tcPr>
+                <w:p>
+                  <w:pPr>
+                    <w:jc w:val="left"/>
+                    <w:pBdr>
+                      <w:bottom w:val="none" w:sz="0" w:space="0" w:color="000000"/>
+                      <w:top w:val="none" w:sz="0" w:space="0" w:color="000000"/>
+                      <w:left w:val="none" w:sz="0" w:space="0" w:color="000000"/>
+                      <w:right w:val="none" w:sz="0" w:space="0" w:color="000000"/>
+                    </w:pBdr>
+                    <w:spacing w:after="100" w:before="100" w:line="240"/>
+                    <w:ind w:left="100" w:right="100" w:firstLine="0" w:firstLineChars="0"/>
+                    <w:rPr>
+                      <w:rFonts w:ascii="Arial" w:hAnsi="Arial" w:eastAsia="Arial" w:cs="Arial"/>
+                      <w:i w:val="false"/>
+                      <w:b w:val="false"/>
+                      <w:u w:val="none"/>
+                      <w:strike w:val="false"/>
+                      <w:sz w:val="22"/>
+                      <w:szCs w:val="22"/>
+                      <w:color w:val="000000"/>
+                    </w:rPr>
+                  </w:pPr>
+                  <w:r xmlns:w="http://schemas.openxmlformats.org/wordprocessingml/2006/main" xmlns:wp="http://schemas.openxmlformats.org/drawingml/2006/wordprocessingDrawing" xmlns:r="http://schemas.openxmlformats.org/officeDocument/2006/relationships" xmlns:w14="http://schemas.microsoft.com/office/word/2010/wordml">
+                    <w:rPr>
+                      <w:rFonts w:ascii="Arial" w:hAnsi="Arial" w:eastAsia="Arial" w:cs="Arial"/>
+                      <w:i w:val="false"/>
+                      <w:b w:val="false"/>
+                      <w:u w:val="none"/>
+                      <w:strike w:val="false"/>
+                      <w:sz w:val="22"/>
+                      <w:szCs w:val="22"/>
+                      <w:color w:val="000000"/>
+                    </w:rPr>
+                    <w:t xml:space="preserve">0.010</w:t>
+                  </w:r>
+                </w:p>
+              </w:tc>
+              <w:tc>
+                <w:tcPr>
+                  <w:tcBorders>
+                    <w:bottom w:val="none" w:sz="0" w:space="0" w:color="000000"/>
+                    <w:top w:val="single" w:sz="12" w:space="0" w:color="666666"/>
+                    <w:left w:val="none" w:sz="0" w:space="0" w:color="000000"/>
+                    <w:right w:val="none" w:sz="0" w:space="0" w:color="000000"/>
+                  </w:tcBorders>
+                  <w:shd w:val="clear" w:color="auto" w:fill="FFFFFF"/>
+                  <w:tcMar>
+                    <w:top w:w="0" w:type="dxa"/>
+                    <w:bottom w:w="0" w:type="dxa"/>
+                    <w:left w:w="0" w:type="dxa"/>
+                    <w:right w:w="0" w:type="dxa"/>
+                  </w:tcMar>
+                  <w:vAlign w:val="center"/>
+                </w:tcPr>
+                <w:p>
+                  <w:pPr>
+                    <w:jc w:val="right"/>
+                    <w:pBdr>
+                      <w:bottom w:val="none" w:sz="0" w:space="0" w:color="000000"/>
+                      <w:top w:val="none" w:sz="0" w:space="0" w:color="000000"/>
+                      <w:left w:val="none" w:sz="0" w:space="0" w:color="000000"/>
+                      <w:right w:val="none" w:sz="0" w:space="0" w:color="000000"/>
+                    </w:pBdr>
+                    <w:spacing w:after="100" w:before="100" w:line="240"/>
+                    <w:ind w:left="100" w:right="100" w:firstLine="0" w:firstLineChars="0"/>
+                    <w:rPr>
+                      <w:rFonts w:ascii="Arial" w:hAnsi="Arial" w:eastAsia="Arial" w:cs="Arial"/>
+                      <w:i w:val="false"/>
+                      <w:b w:val="false"/>
+                      <w:u w:val="none"/>
+                      <w:strike w:val="false"/>
+                      <w:sz w:val="22"/>
+                      <w:szCs w:val="22"/>
+                      <w:color w:val="000000"/>
+                    </w:rPr>
+                  </w:pPr>
+                  <w:r xmlns:w="http://schemas.openxmlformats.org/wordprocessingml/2006/main" xmlns:wp="http://schemas.openxmlformats.org/drawingml/2006/wordprocessingDrawing" xmlns:r="http://schemas.openxmlformats.org/officeDocument/2006/relationships" xmlns:w14="http://schemas.microsoft.com/office/word/2010/wordml">
+                    <w:rPr>
+                      <w:rFonts w:ascii="Arial" w:hAnsi="Arial" w:eastAsia="Arial" w:cs="Arial"/>
+                      <w:i w:val="false"/>
+                      <w:b w:val="false"/>
+                      <w:u w:val="none"/>
+                      <w:strike w:val="false"/>
+                      <w:sz w:val="22"/>
+                      <w:szCs w:val="22"/>
+                      <w:color w:val="000000"/>
+                    </w:rPr>
+                    <w:t xml:space="preserve">99</w:t>
                   </w:r>
                 </w:p>
               </w:tc>
@@ -1595,7 +1858,115 @@
                       <w:szCs w:val="22"/>
                       <w:color w:val="000000"/>
                     </w:rPr>
-                    <w:t xml:space="preserve">(0.03, 0.51)</w:t>
+                    <w:t xml:space="preserve">(0.02, 0.52)</w:t>
+                  </w:r>
+                </w:p>
+              </w:tc>
+              <w:tc>
+                <w:tcPr>
+                  <w:tcBorders>
+                    <w:bottom w:val="none" w:sz="0" w:space="0" w:color="000000"/>
+                    <w:top w:val="none" w:sz="0" w:space="0" w:color="000000"/>
+                    <w:left w:val="none" w:sz="0" w:space="0" w:color="000000"/>
+                    <w:right w:val="none" w:sz="0" w:space="0" w:color="000000"/>
+                  </w:tcBorders>
+                  <w:shd w:val="clear" w:color="auto" w:fill="FFFFFF"/>
+                  <w:tcMar>
+                    <w:top w:w="0" w:type="dxa"/>
+                    <w:bottom w:w="0" w:type="dxa"/>
+                    <w:left w:w="0" w:type="dxa"/>
+                    <w:right w:w="0" w:type="dxa"/>
+                  </w:tcMar>
+                  <w:vAlign w:val="center"/>
+                </w:tcPr>
+                <w:p>
+                  <w:pPr>
+                    <w:jc w:val="left"/>
+                    <w:pBdr>
+                      <w:bottom w:val="none" w:sz="0" w:space="0" w:color="000000"/>
+                      <w:top w:val="none" w:sz="0" w:space="0" w:color="000000"/>
+                      <w:left w:val="none" w:sz="0" w:space="0" w:color="000000"/>
+                      <w:right w:val="none" w:sz="0" w:space="0" w:color="000000"/>
+                    </w:pBdr>
+                    <w:spacing w:after="100" w:before="100" w:line="240"/>
+                    <w:ind w:left="100" w:right="100" w:firstLine="0" w:firstLineChars="0"/>
+                    <w:rPr>
+                      <w:rFonts w:ascii="Arial" w:hAnsi="Arial" w:eastAsia="Arial" w:cs="Arial"/>
+                      <w:i w:val="false"/>
+                      <w:b w:val="false"/>
+                      <w:u w:val="none"/>
+                      <w:strike w:val="false"/>
+                      <w:sz w:val="22"/>
+                      <w:szCs w:val="22"/>
+                      <w:color w:val="000000"/>
+                    </w:rPr>
+                  </w:pPr>
+                  <w:r xmlns:w="http://schemas.openxmlformats.org/wordprocessingml/2006/main" xmlns:wp="http://schemas.openxmlformats.org/drawingml/2006/wordprocessingDrawing" xmlns:r="http://schemas.openxmlformats.org/officeDocument/2006/relationships" xmlns:w14="http://schemas.microsoft.com/office/word/2010/wordml">
+                    <w:rPr>
+                      <w:rFonts w:ascii="Arial" w:hAnsi="Arial" w:eastAsia="Arial" w:cs="Arial"/>
+                      <w:i w:val="false"/>
+                      <w:b w:val="false"/>
+                      <w:u w:val="none"/>
+                      <w:strike w:val="false"/>
+                      <w:sz w:val="22"/>
+                      <w:szCs w:val="22"/>
+                      <w:color w:val="000000"/>
+                    </w:rPr>
+                    <w:t xml:space="preserve">0.070</w:t>
+                  </w:r>
+                </w:p>
+              </w:tc>
+              <w:tc>
+                <w:tcPr>
+                  <w:tcBorders>
+                    <w:bottom w:val="none" w:sz="0" w:space="0" w:color="000000"/>
+                    <w:top w:val="none" w:sz="0" w:space="0" w:color="000000"/>
+                    <w:left w:val="none" w:sz="0" w:space="0" w:color="000000"/>
+                    <w:right w:val="none" w:sz="0" w:space="0" w:color="000000"/>
+                  </w:tcBorders>
+                  <w:shd w:val="clear" w:color="auto" w:fill="FFFFFF"/>
+                  <w:tcMar>
+                    <w:top w:w="0" w:type="dxa"/>
+                    <w:bottom w:w="0" w:type="dxa"/>
+                    <w:left w:w="0" w:type="dxa"/>
+                    <w:right w:w="0" w:type="dxa"/>
+                  </w:tcMar>
+                  <w:vAlign w:val="center"/>
+                </w:tcPr>
+                <w:p>
+                  <w:pPr>
+                    <w:jc w:val="right"/>
+                    <w:pBdr>
+                      <w:bottom w:val="none" w:sz="0" w:space="0" w:color="000000"/>
+                      <w:top w:val="none" w:sz="0" w:space="0" w:color="000000"/>
+                      <w:left w:val="none" w:sz="0" w:space="0" w:color="000000"/>
+                      <w:right w:val="none" w:sz="0" w:space="0" w:color="000000"/>
+                    </w:pBdr>
+                    <w:spacing w:after="100" w:before="100" w:line="240"/>
+                    <w:ind w:left="100" w:right="100" w:firstLine="0" w:firstLineChars="0"/>
+                    <w:rPr>
+                      <w:rFonts w:ascii="Arial" w:hAnsi="Arial" w:eastAsia="Arial" w:cs="Arial"/>
+                      <w:i w:val="false"/>
+                      <w:b w:val="false"/>
+                      <w:u w:val="none"/>
+                      <w:strike w:val="false"/>
+                      <w:sz w:val="22"/>
+                      <w:szCs w:val="22"/>
+                      <w:color w:val="000000"/>
+                    </w:rPr>
+                  </w:pPr>
+                  <w:r xmlns:w="http://schemas.openxmlformats.org/wordprocessingml/2006/main" xmlns:wp="http://schemas.openxmlformats.org/drawingml/2006/wordprocessingDrawing" xmlns:r="http://schemas.openxmlformats.org/officeDocument/2006/relationships" xmlns:w14="http://schemas.microsoft.com/office/word/2010/wordml">
+                    <w:rPr>
+                      <w:rFonts w:ascii="Arial" w:hAnsi="Arial" w:eastAsia="Arial" w:cs="Arial"/>
+                      <w:i w:val="false"/>
+                      <w:b w:val="false"/>
+                      <w:u w:val="none"/>
+                      <w:strike w:val="false"/>
+                      <w:sz w:val="22"/>
+                      <w:szCs w:val="22"/>
+                      <w:color w:val="000000"/>
+                    </w:rPr>
+                    <w:t xml:space="preserve">99</w:t>
                   </w:r>
                 </w:p>
               </w:tc>
@@ -1858,7 +2229,115 @@
                       <w:szCs w:val="22"/>
                       <w:color w:val="000000"/>
                     </w:rPr>
-                    <w:t xml:space="preserve">(0.97, 0.99)</w:t>
+                    <w:t xml:space="preserve">(0.98, 0.99)</w:t>
+                  </w:r>
+                </w:p>
+              </w:tc>
+              <w:tc>
+                <w:tcPr>
+                  <w:tcBorders>
+                    <w:bottom w:val="none" w:sz="0" w:space="0" w:color="000000"/>
+                    <w:top w:val="none" w:sz="0" w:space="0" w:color="000000"/>
+                    <w:left w:val="none" w:sz="0" w:space="0" w:color="000000"/>
+                    <w:right w:val="none" w:sz="0" w:space="0" w:color="000000"/>
+                  </w:tcBorders>
+                  <w:shd w:val="clear" w:color="auto" w:fill="FFFFFF"/>
+                  <w:tcMar>
+                    <w:top w:w="0" w:type="dxa"/>
+                    <w:bottom w:w="0" w:type="dxa"/>
+                    <w:left w:w="0" w:type="dxa"/>
+                    <w:right w:w="0" w:type="dxa"/>
+                  </w:tcMar>
+                  <w:vAlign w:val="center"/>
+                </w:tcPr>
+                <w:p>
+                  <w:pPr>
+                    <w:jc w:val="left"/>
+                    <w:pBdr>
+                      <w:bottom w:val="none" w:sz="0" w:space="0" w:color="000000"/>
+                      <w:top w:val="none" w:sz="0" w:space="0" w:color="000000"/>
+                      <w:left w:val="none" w:sz="0" w:space="0" w:color="000000"/>
+                      <w:right w:val="none" w:sz="0" w:space="0" w:color="000000"/>
+                    </w:pBdr>
+                    <w:spacing w:after="100" w:before="100" w:line="240"/>
+                    <w:ind w:left="100" w:right="100" w:firstLine="0" w:firstLineChars="0"/>
+                    <w:rPr>
+                      <w:rFonts w:ascii="Arial" w:hAnsi="Arial" w:eastAsia="Arial" w:cs="Arial"/>
+                      <w:i w:val="false"/>
+                      <w:b w:val="false"/>
+                      <w:u w:val="none"/>
+                      <w:strike w:val="false"/>
+                      <w:sz w:val="22"/>
+                      <w:szCs w:val="22"/>
+                      <w:color w:val="000000"/>
+                    </w:rPr>
+                  </w:pPr>
+                  <w:r xmlns:w="http://schemas.openxmlformats.org/wordprocessingml/2006/main" xmlns:wp="http://schemas.openxmlformats.org/drawingml/2006/wordprocessingDrawing" xmlns:r="http://schemas.openxmlformats.org/officeDocument/2006/relationships" xmlns:w14="http://schemas.microsoft.com/office/word/2010/wordml">
+                    <w:rPr>
+                      <w:rFonts w:ascii="Arial" w:hAnsi="Arial" w:eastAsia="Arial" w:cs="Arial"/>
+                      <w:i w:val="false"/>
+                      <w:b w:val="false"/>
+                      <w:u w:val="none"/>
+                      <w:strike w:val="false"/>
+                      <w:sz w:val="22"/>
+                      <w:szCs w:val="22"/>
+                      <w:color w:val="000000"/>
+                    </w:rPr>
+                    <w:t xml:space="preserve">0.010</w:t>
+                  </w:r>
+                </w:p>
+              </w:tc>
+              <w:tc>
+                <w:tcPr>
+                  <w:tcBorders>
+                    <w:bottom w:val="none" w:sz="0" w:space="0" w:color="000000"/>
+                    <w:top w:val="none" w:sz="0" w:space="0" w:color="000000"/>
+                    <w:left w:val="none" w:sz="0" w:space="0" w:color="000000"/>
+                    <w:right w:val="none" w:sz="0" w:space="0" w:color="000000"/>
+                  </w:tcBorders>
+                  <w:shd w:val="clear" w:color="auto" w:fill="FFFFFF"/>
+                  <w:tcMar>
+                    <w:top w:w="0" w:type="dxa"/>
+                    <w:bottom w:w="0" w:type="dxa"/>
+                    <w:left w:w="0" w:type="dxa"/>
+                    <w:right w:w="0" w:type="dxa"/>
+                  </w:tcMar>
+                  <w:vAlign w:val="center"/>
+                </w:tcPr>
+                <w:p>
+                  <w:pPr>
+                    <w:jc w:val="right"/>
+                    <w:pBdr>
+                      <w:bottom w:val="none" w:sz="0" w:space="0" w:color="000000"/>
+                      <w:top w:val="none" w:sz="0" w:space="0" w:color="000000"/>
+                      <w:left w:val="none" w:sz="0" w:space="0" w:color="000000"/>
+                      <w:right w:val="none" w:sz="0" w:space="0" w:color="000000"/>
+                    </w:pBdr>
+                    <w:spacing w:after="100" w:before="100" w:line="240"/>
+                    <w:ind w:left="100" w:right="100" w:firstLine="0" w:firstLineChars="0"/>
+                    <w:rPr>
+                      <w:rFonts w:ascii="Arial" w:hAnsi="Arial" w:eastAsia="Arial" w:cs="Arial"/>
+                      <w:i w:val="false"/>
+                      <w:b w:val="false"/>
+                      <w:u w:val="none"/>
+                      <w:strike w:val="false"/>
+                      <w:sz w:val="22"/>
+                      <w:szCs w:val="22"/>
+                      <w:color w:val="000000"/>
+                    </w:rPr>
+                  </w:pPr>
+                  <w:r xmlns:w="http://schemas.openxmlformats.org/wordprocessingml/2006/main" xmlns:wp="http://schemas.openxmlformats.org/drawingml/2006/wordprocessingDrawing" xmlns:r="http://schemas.openxmlformats.org/officeDocument/2006/relationships" xmlns:w14="http://schemas.microsoft.com/office/word/2010/wordml">
+                    <w:rPr>
+                      <w:rFonts w:ascii="Arial" w:hAnsi="Arial" w:eastAsia="Arial" w:cs="Arial"/>
+                      <w:i w:val="false"/>
+                      <w:b w:val="false"/>
+                      <w:u w:val="none"/>
+                      <w:strike w:val="false"/>
+                      <w:sz w:val="22"/>
+                      <w:szCs w:val="22"/>
+                      <w:color w:val="000000"/>
+                    </w:rPr>
+                    <w:t xml:space="preserve">99</w:t>
                   </w:r>
                 </w:p>
               </w:tc>
@@ -2138,6 +2617,114 @@
                   </w:r>
                 </w:p>
               </w:tc>
+              <w:tc>
+                <w:tcPr>
+                  <w:tcBorders>
+                    <w:bottom w:val="none" w:sz="0" w:space="0" w:color="000000"/>
+                    <w:top w:val="none" w:sz="0" w:space="0" w:color="000000"/>
+                    <w:left w:val="none" w:sz="0" w:space="0" w:color="000000"/>
+                    <w:right w:val="none" w:sz="0" w:space="0" w:color="000000"/>
+                  </w:tcBorders>
+                  <w:shd w:val="clear" w:color="auto" w:fill="FFFFFF"/>
+                  <w:tcMar>
+                    <w:top w:w="0" w:type="dxa"/>
+                    <w:bottom w:w="0" w:type="dxa"/>
+                    <w:left w:w="0" w:type="dxa"/>
+                    <w:right w:w="0" w:type="dxa"/>
+                  </w:tcMar>
+                  <w:vAlign w:val="center"/>
+                </w:tcPr>
+                <w:p>
+                  <w:pPr>
+                    <w:jc w:val="left"/>
+                    <w:pBdr>
+                      <w:bottom w:val="none" w:sz="0" w:space="0" w:color="000000"/>
+                      <w:top w:val="none" w:sz="0" w:space="0" w:color="000000"/>
+                      <w:left w:val="none" w:sz="0" w:space="0" w:color="000000"/>
+                      <w:right w:val="none" w:sz="0" w:space="0" w:color="000000"/>
+                    </w:pBdr>
+                    <w:spacing w:after="100" w:before="100" w:line="240"/>
+                    <w:ind w:left="100" w:right="100" w:firstLine="0" w:firstLineChars="0"/>
+                    <w:rPr>
+                      <w:rFonts w:ascii="Arial" w:hAnsi="Arial" w:eastAsia="Arial" w:cs="Arial"/>
+                      <w:i w:val="false"/>
+                      <w:b w:val="false"/>
+                      <w:u w:val="none"/>
+                      <w:strike w:val="false"/>
+                      <w:sz w:val="22"/>
+                      <w:szCs w:val="22"/>
+                      <w:color w:val="000000"/>
+                    </w:rPr>
+                  </w:pPr>
+                  <w:r xmlns:w="http://schemas.openxmlformats.org/wordprocessingml/2006/main" xmlns:wp="http://schemas.openxmlformats.org/drawingml/2006/wordprocessingDrawing" xmlns:r="http://schemas.openxmlformats.org/officeDocument/2006/relationships" xmlns:w14="http://schemas.microsoft.com/office/word/2010/wordml">
+                    <w:rPr>
+                      <w:rFonts w:ascii="Arial" w:hAnsi="Arial" w:eastAsia="Arial" w:cs="Arial"/>
+                      <w:i w:val="false"/>
+                      <w:b w:val="false"/>
+                      <w:u w:val="none"/>
+                      <w:strike w:val="false"/>
+                      <w:sz w:val="22"/>
+                      <w:szCs w:val="22"/>
+                      <w:color w:val="000000"/>
+                    </w:rPr>
+                    <w:t xml:space="preserve">0.010</w:t>
+                  </w:r>
+                </w:p>
+              </w:tc>
+              <w:tc>
+                <w:tcPr>
+                  <w:tcBorders>
+                    <w:bottom w:val="none" w:sz="0" w:space="0" w:color="000000"/>
+                    <w:top w:val="none" w:sz="0" w:space="0" w:color="000000"/>
+                    <w:left w:val="none" w:sz="0" w:space="0" w:color="000000"/>
+                    <w:right w:val="none" w:sz="0" w:space="0" w:color="000000"/>
+                  </w:tcBorders>
+                  <w:shd w:val="clear" w:color="auto" w:fill="FFFFFF"/>
+                  <w:tcMar>
+                    <w:top w:w="0" w:type="dxa"/>
+                    <w:bottom w:w="0" w:type="dxa"/>
+                    <w:left w:w="0" w:type="dxa"/>
+                    <w:right w:w="0" w:type="dxa"/>
+                  </w:tcMar>
+                  <w:vAlign w:val="center"/>
+                </w:tcPr>
+                <w:p>
+                  <w:pPr>
+                    <w:jc w:val="right"/>
+                    <w:pBdr>
+                      <w:bottom w:val="none" w:sz="0" w:space="0" w:color="000000"/>
+                      <w:top w:val="none" w:sz="0" w:space="0" w:color="000000"/>
+                      <w:left w:val="none" w:sz="0" w:space="0" w:color="000000"/>
+                      <w:right w:val="none" w:sz="0" w:space="0" w:color="000000"/>
+                    </w:pBdr>
+                    <w:spacing w:after="100" w:before="100" w:line="240"/>
+                    <w:ind w:left="100" w:right="100" w:firstLine="0" w:firstLineChars="0"/>
+                    <w:rPr>
+                      <w:rFonts w:ascii="Arial" w:hAnsi="Arial" w:eastAsia="Arial" w:cs="Arial"/>
+                      <w:i w:val="false"/>
+                      <w:b w:val="false"/>
+                      <w:u w:val="none"/>
+                      <w:strike w:val="false"/>
+                      <w:sz w:val="22"/>
+                      <w:szCs w:val="22"/>
+                      <w:color w:val="000000"/>
+                    </w:rPr>
+                  </w:pPr>
+                  <w:r xmlns:w="http://schemas.openxmlformats.org/wordprocessingml/2006/main" xmlns:wp="http://schemas.openxmlformats.org/drawingml/2006/wordprocessingDrawing" xmlns:r="http://schemas.openxmlformats.org/officeDocument/2006/relationships" xmlns:w14="http://schemas.microsoft.com/office/word/2010/wordml">
+                    <w:rPr>
+                      <w:rFonts w:ascii="Arial" w:hAnsi="Arial" w:eastAsia="Arial" w:cs="Arial"/>
+                      <w:i w:val="false"/>
+                      <w:b w:val="false"/>
+                      <w:u w:val="none"/>
+                      <w:strike w:val="false"/>
+                      <w:sz w:val="22"/>
+                      <w:szCs w:val="22"/>
+                      <w:color w:val="000000"/>
+                    </w:rPr>
+                    <w:t xml:space="preserve">99</w:t>
+                  </w:r>
+                </w:p>
+              </w:tc>
             </w:tr>
             <w:tr>
               <w:trPr>
@@ -2397,7 +2984,115 @@
                       <w:szCs w:val="22"/>
                       <w:color w:val="000000"/>
                     </w:rPr>
-                    <w:t xml:space="preserve">(0.97, 0.99)</w:t>
+                    <w:t xml:space="preserve">(0.96, 0.99)</w:t>
+                  </w:r>
+                </w:p>
+              </w:tc>
+              <w:tc>
+                <w:tcPr>
+                  <w:tcBorders>
+                    <w:bottom w:val="none" w:sz="0" w:space="0" w:color="000000"/>
+                    <w:top w:val="none" w:sz="0" w:space="0" w:color="000000"/>
+                    <w:left w:val="none" w:sz="0" w:space="0" w:color="000000"/>
+                    <w:right w:val="none" w:sz="0" w:space="0" w:color="000000"/>
+                  </w:tcBorders>
+                  <w:shd w:val="clear" w:color="auto" w:fill="FFFFFF"/>
+                  <w:tcMar>
+                    <w:top w:w="0" w:type="dxa"/>
+                    <w:bottom w:w="0" w:type="dxa"/>
+                    <w:left w:w="0" w:type="dxa"/>
+                    <w:right w:w="0" w:type="dxa"/>
+                  </w:tcMar>
+                  <w:vAlign w:val="center"/>
+                </w:tcPr>
+                <w:p>
+                  <w:pPr>
+                    <w:jc w:val="left"/>
+                    <w:pBdr>
+                      <w:bottom w:val="none" w:sz="0" w:space="0" w:color="000000"/>
+                      <w:top w:val="none" w:sz="0" w:space="0" w:color="000000"/>
+                      <w:left w:val="none" w:sz="0" w:space="0" w:color="000000"/>
+                      <w:right w:val="none" w:sz="0" w:space="0" w:color="000000"/>
+                    </w:pBdr>
+                    <w:spacing w:after="100" w:before="100" w:line="240"/>
+                    <w:ind w:left="100" w:right="100" w:firstLine="0" w:firstLineChars="0"/>
+                    <w:rPr>
+                      <w:rFonts w:ascii="Arial" w:hAnsi="Arial" w:eastAsia="Arial" w:cs="Arial"/>
+                      <w:i w:val="false"/>
+                      <w:b w:val="false"/>
+                      <w:u w:val="none"/>
+                      <w:strike w:val="false"/>
+                      <w:sz w:val="22"/>
+                      <w:szCs w:val="22"/>
+                      <w:color w:val="000000"/>
+                    </w:rPr>
+                  </w:pPr>
+                  <w:r xmlns:w="http://schemas.openxmlformats.org/wordprocessingml/2006/main" xmlns:wp="http://schemas.openxmlformats.org/drawingml/2006/wordprocessingDrawing" xmlns:r="http://schemas.openxmlformats.org/officeDocument/2006/relationships" xmlns:w14="http://schemas.microsoft.com/office/word/2010/wordml">
+                    <w:rPr>
+                      <w:rFonts w:ascii="Arial" w:hAnsi="Arial" w:eastAsia="Arial" w:cs="Arial"/>
+                      <w:i w:val="false"/>
+                      <w:b w:val="false"/>
+                      <w:u w:val="none"/>
+                      <w:strike w:val="false"/>
+                      <w:sz w:val="22"/>
+                      <w:szCs w:val="22"/>
+                      <w:color w:val="000000"/>
+                    </w:rPr>
+                    <w:t xml:space="preserve">0.010</w:t>
+                  </w:r>
+                </w:p>
+              </w:tc>
+              <w:tc>
+                <w:tcPr>
+                  <w:tcBorders>
+                    <w:bottom w:val="none" w:sz="0" w:space="0" w:color="000000"/>
+                    <w:top w:val="none" w:sz="0" w:space="0" w:color="000000"/>
+                    <w:left w:val="none" w:sz="0" w:space="0" w:color="000000"/>
+                    <w:right w:val="none" w:sz="0" w:space="0" w:color="000000"/>
+                  </w:tcBorders>
+                  <w:shd w:val="clear" w:color="auto" w:fill="FFFFFF"/>
+                  <w:tcMar>
+                    <w:top w:w="0" w:type="dxa"/>
+                    <w:bottom w:w="0" w:type="dxa"/>
+                    <w:left w:w="0" w:type="dxa"/>
+                    <w:right w:w="0" w:type="dxa"/>
+                  </w:tcMar>
+                  <w:vAlign w:val="center"/>
+                </w:tcPr>
+                <w:p>
+                  <w:pPr>
+                    <w:jc w:val="right"/>
+                    <w:pBdr>
+                      <w:bottom w:val="none" w:sz="0" w:space="0" w:color="000000"/>
+                      <w:top w:val="none" w:sz="0" w:space="0" w:color="000000"/>
+                      <w:left w:val="none" w:sz="0" w:space="0" w:color="000000"/>
+                      <w:right w:val="none" w:sz="0" w:space="0" w:color="000000"/>
+                    </w:pBdr>
+                    <w:spacing w:after="100" w:before="100" w:line="240"/>
+                    <w:ind w:left="100" w:right="100" w:firstLine="0" w:firstLineChars="0"/>
+                    <w:rPr>
+                      <w:rFonts w:ascii="Arial" w:hAnsi="Arial" w:eastAsia="Arial" w:cs="Arial"/>
+                      <w:i w:val="false"/>
+                      <w:b w:val="false"/>
+                      <w:u w:val="none"/>
+                      <w:strike w:val="false"/>
+                      <w:sz w:val="22"/>
+                      <w:szCs w:val="22"/>
+                      <w:color w:val="000000"/>
+                    </w:rPr>
+                  </w:pPr>
+                  <w:r xmlns:w="http://schemas.openxmlformats.org/wordprocessingml/2006/main" xmlns:wp="http://schemas.openxmlformats.org/drawingml/2006/wordprocessingDrawing" xmlns:r="http://schemas.openxmlformats.org/officeDocument/2006/relationships" xmlns:w14="http://schemas.microsoft.com/office/word/2010/wordml">
+                    <w:rPr>
+                      <w:rFonts w:ascii="Arial" w:hAnsi="Arial" w:eastAsia="Arial" w:cs="Arial"/>
+                      <w:i w:val="false"/>
+                      <w:b w:val="false"/>
+                      <w:u w:val="none"/>
+                      <w:strike w:val="false"/>
+                      <w:sz w:val="22"/>
+                      <w:szCs w:val="22"/>
+                      <w:color w:val="000000"/>
+                    </w:rPr>
+                    <w:t xml:space="preserve">99</w:t>
                   </w:r>
                 </w:p>
               </w:tc>
@@ -2660,7 +3355,115 @@
                       <w:szCs w:val="22"/>
                       <w:color w:val="000000"/>
                     </w:rPr>
-                    <w:t xml:space="preserve">(0.83, 0.97)</w:t>
+                    <w:t xml:space="preserve">(0.83, 0.96)</w:t>
+                  </w:r>
+                </w:p>
+              </w:tc>
+              <w:tc>
+                <w:tcPr>
+                  <w:tcBorders>
+                    <w:bottom w:val="none" w:sz="0" w:space="0" w:color="000000"/>
+                    <w:top w:val="none" w:sz="0" w:space="0" w:color="000000"/>
+                    <w:left w:val="none" w:sz="0" w:space="0" w:color="000000"/>
+                    <w:right w:val="none" w:sz="0" w:space="0" w:color="000000"/>
+                  </w:tcBorders>
+                  <w:shd w:val="clear" w:color="auto" w:fill="FFFFFF"/>
+                  <w:tcMar>
+                    <w:top w:w="0" w:type="dxa"/>
+                    <w:bottom w:w="0" w:type="dxa"/>
+                    <w:left w:w="0" w:type="dxa"/>
+                    <w:right w:w="0" w:type="dxa"/>
+                  </w:tcMar>
+                  <w:vAlign w:val="center"/>
+                </w:tcPr>
+                <w:p>
+                  <w:pPr>
+                    <w:jc w:val="left"/>
+                    <w:pBdr>
+                      <w:bottom w:val="none" w:sz="0" w:space="0" w:color="000000"/>
+                      <w:top w:val="none" w:sz="0" w:space="0" w:color="000000"/>
+                      <w:left w:val="none" w:sz="0" w:space="0" w:color="000000"/>
+                      <w:right w:val="none" w:sz="0" w:space="0" w:color="000000"/>
+                    </w:pBdr>
+                    <w:spacing w:after="100" w:before="100" w:line="240"/>
+                    <w:ind w:left="100" w:right="100" w:firstLine="0" w:firstLineChars="0"/>
+                    <w:rPr>
+                      <w:rFonts w:ascii="Arial" w:hAnsi="Arial" w:eastAsia="Arial" w:cs="Arial"/>
+                      <w:i w:val="false"/>
+                      <w:b w:val="false"/>
+                      <w:u w:val="none"/>
+                      <w:strike w:val="false"/>
+                      <w:sz w:val="22"/>
+                      <w:szCs w:val="22"/>
+                      <w:color w:val="000000"/>
+                    </w:rPr>
+                  </w:pPr>
+                  <w:r xmlns:w="http://schemas.openxmlformats.org/wordprocessingml/2006/main" xmlns:wp="http://schemas.openxmlformats.org/drawingml/2006/wordprocessingDrawing" xmlns:r="http://schemas.openxmlformats.org/officeDocument/2006/relationships" xmlns:w14="http://schemas.microsoft.com/office/word/2010/wordml">
+                    <w:rPr>
+                      <w:rFonts w:ascii="Arial" w:hAnsi="Arial" w:eastAsia="Arial" w:cs="Arial"/>
+                      <w:i w:val="false"/>
+                      <w:b w:val="false"/>
+                      <w:u w:val="none"/>
+                      <w:strike w:val="false"/>
+                      <w:sz w:val="22"/>
+                      <w:szCs w:val="22"/>
+                      <w:color w:val="000000"/>
+                    </w:rPr>
+                    <w:t xml:space="preserve">0.010</w:t>
+                  </w:r>
+                </w:p>
+              </w:tc>
+              <w:tc>
+                <w:tcPr>
+                  <w:tcBorders>
+                    <w:bottom w:val="none" w:sz="0" w:space="0" w:color="000000"/>
+                    <w:top w:val="none" w:sz="0" w:space="0" w:color="000000"/>
+                    <w:left w:val="none" w:sz="0" w:space="0" w:color="000000"/>
+                    <w:right w:val="none" w:sz="0" w:space="0" w:color="000000"/>
+                  </w:tcBorders>
+                  <w:shd w:val="clear" w:color="auto" w:fill="FFFFFF"/>
+                  <w:tcMar>
+                    <w:top w:w="0" w:type="dxa"/>
+                    <w:bottom w:w="0" w:type="dxa"/>
+                    <w:left w:w="0" w:type="dxa"/>
+                    <w:right w:w="0" w:type="dxa"/>
+                  </w:tcMar>
+                  <w:vAlign w:val="center"/>
+                </w:tcPr>
+                <w:p>
+                  <w:pPr>
+                    <w:jc w:val="right"/>
+                    <w:pBdr>
+                      <w:bottom w:val="none" w:sz="0" w:space="0" w:color="000000"/>
+                      <w:top w:val="none" w:sz="0" w:space="0" w:color="000000"/>
+                      <w:left w:val="none" w:sz="0" w:space="0" w:color="000000"/>
+                      <w:right w:val="none" w:sz="0" w:space="0" w:color="000000"/>
+                    </w:pBdr>
+                    <w:spacing w:after="100" w:before="100" w:line="240"/>
+                    <w:ind w:left="100" w:right="100" w:firstLine="0" w:firstLineChars="0"/>
+                    <w:rPr>
+                      <w:rFonts w:ascii="Arial" w:hAnsi="Arial" w:eastAsia="Arial" w:cs="Arial"/>
+                      <w:i w:val="false"/>
+                      <w:b w:val="false"/>
+                      <w:u w:val="none"/>
+                      <w:strike w:val="false"/>
+                      <w:sz w:val="22"/>
+                      <w:szCs w:val="22"/>
+                      <w:color w:val="000000"/>
+                    </w:rPr>
+                  </w:pPr>
+                  <w:r xmlns:w="http://schemas.openxmlformats.org/wordprocessingml/2006/main" xmlns:wp="http://schemas.openxmlformats.org/drawingml/2006/wordprocessingDrawing" xmlns:r="http://schemas.openxmlformats.org/officeDocument/2006/relationships" xmlns:w14="http://schemas.microsoft.com/office/word/2010/wordml">
+                    <w:rPr>
+                      <w:rFonts w:ascii="Arial" w:hAnsi="Arial" w:eastAsia="Arial" w:cs="Arial"/>
+                      <w:i w:val="false"/>
+                      <w:b w:val="false"/>
+                      <w:u w:val="none"/>
+                      <w:strike w:val="false"/>
+                      <w:sz w:val="22"/>
+                      <w:szCs w:val="22"/>
+                      <w:color w:val="000000"/>
+                    </w:rPr>
+                    <w:t xml:space="preserve">99</w:t>
                   </w:r>
                 </w:p>
               </w:tc>
@@ -2940,6 +3743,114 @@
                   </w:r>
                 </w:p>
               </w:tc>
+              <w:tc>
+                <w:tcPr>
+                  <w:tcBorders>
+                    <w:bottom w:val="none" w:sz="0" w:space="0" w:color="000000"/>
+                    <w:top w:val="none" w:sz="0" w:space="0" w:color="000000"/>
+                    <w:left w:val="none" w:sz="0" w:space="0" w:color="000000"/>
+                    <w:right w:val="none" w:sz="0" w:space="0" w:color="000000"/>
+                  </w:tcBorders>
+                  <w:shd w:val="clear" w:color="auto" w:fill="FFFFFF"/>
+                  <w:tcMar>
+                    <w:top w:w="0" w:type="dxa"/>
+                    <w:bottom w:w="0" w:type="dxa"/>
+                    <w:left w:w="0" w:type="dxa"/>
+                    <w:right w:w="0" w:type="dxa"/>
+                  </w:tcMar>
+                  <w:vAlign w:val="center"/>
+                </w:tcPr>
+                <w:p>
+                  <w:pPr>
+                    <w:jc w:val="left"/>
+                    <w:pBdr>
+                      <w:bottom w:val="none" w:sz="0" w:space="0" w:color="000000"/>
+                      <w:top w:val="none" w:sz="0" w:space="0" w:color="000000"/>
+                      <w:left w:val="none" w:sz="0" w:space="0" w:color="000000"/>
+                      <w:right w:val="none" w:sz="0" w:space="0" w:color="000000"/>
+                    </w:pBdr>
+                    <w:spacing w:after="100" w:before="100" w:line="240"/>
+                    <w:ind w:left="100" w:right="100" w:firstLine="0" w:firstLineChars="0"/>
+                    <w:rPr>
+                      <w:rFonts w:ascii="Arial" w:hAnsi="Arial" w:eastAsia="Arial" w:cs="Arial"/>
+                      <w:i w:val="false"/>
+                      <w:b w:val="false"/>
+                      <w:u w:val="none"/>
+                      <w:strike w:val="false"/>
+                      <w:sz w:val="22"/>
+                      <w:szCs w:val="22"/>
+                      <w:color w:val="000000"/>
+                    </w:rPr>
+                  </w:pPr>
+                  <w:r xmlns:w="http://schemas.openxmlformats.org/wordprocessingml/2006/main" xmlns:wp="http://schemas.openxmlformats.org/drawingml/2006/wordprocessingDrawing" xmlns:r="http://schemas.openxmlformats.org/officeDocument/2006/relationships" xmlns:w14="http://schemas.microsoft.com/office/word/2010/wordml">
+                    <w:rPr>
+                      <w:rFonts w:ascii="Arial" w:hAnsi="Arial" w:eastAsia="Arial" w:cs="Arial"/>
+                      <w:i w:val="false"/>
+                      <w:b w:val="false"/>
+                      <w:u w:val="none"/>
+                      <w:strike w:val="false"/>
+                      <w:sz w:val="22"/>
+                      <w:szCs w:val="22"/>
+                      <w:color w:val="000000"/>
+                    </w:rPr>
+                    <w:t xml:space="preserve">0.010</w:t>
+                  </w:r>
+                </w:p>
+              </w:tc>
+              <w:tc>
+                <w:tcPr>
+                  <w:tcBorders>
+                    <w:bottom w:val="none" w:sz="0" w:space="0" w:color="000000"/>
+                    <w:top w:val="none" w:sz="0" w:space="0" w:color="000000"/>
+                    <w:left w:val="none" w:sz="0" w:space="0" w:color="000000"/>
+                    <w:right w:val="none" w:sz="0" w:space="0" w:color="000000"/>
+                  </w:tcBorders>
+                  <w:shd w:val="clear" w:color="auto" w:fill="FFFFFF"/>
+                  <w:tcMar>
+                    <w:top w:w="0" w:type="dxa"/>
+                    <w:bottom w:w="0" w:type="dxa"/>
+                    <w:left w:w="0" w:type="dxa"/>
+                    <w:right w:w="0" w:type="dxa"/>
+                  </w:tcMar>
+                  <w:vAlign w:val="center"/>
+                </w:tcPr>
+                <w:p>
+                  <w:pPr>
+                    <w:jc w:val="right"/>
+                    <w:pBdr>
+                      <w:bottom w:val="none" w:sz="0" w:space="0" w:color="000000"/>
+                      <w:top w:val="none" w:sz="0" w:space="0" w:color="000000"/>
+                      <w:left w:val="none" w:sz="0" w:space="0" w:color="000000"/>
+                      <w:right w:val="none" w:sz="0" w:space="0" w:color="000000"/>
+                    </w:pBdr>
+                    <w:spacing w:after="100" w:before="100" w:line="240"/>
+                    <w:ind w:left="100" w:right="100" w:firstLine="0" w:firstLineChars="0"/>
+                    <w:rPr>
+                      <w:rFonts w:ascii="Arial" w:hAnsi="Arial" w:eastAsia="Arial" w:cs="Arial"/>
+                      <w:i w:val="false"/>
+                      <w:b w:val="false"/>
+                      <w:u w:val="none"/>
+                      <w:strike w:val="false"/>
+                      <w:sz w:val="22"/>
+                      <w:szCs w:val="22"/>
+                      <w:color w:val="000000"/>
+                    </w:rPr>
+                  </w:pPr>
+                  <w:r xmlns:w="http://schemas.openxmlformats.org/wordprocessingml/2006/main" xmlns:wp="http://schemas.openxmlformats.org/drawingml/2006/wordprocessingDrawing" xmlns:r="http://schemas.openxmlformats.org/officeDocument/2006/relationships" xmlns:w14="http://schemas.microsoft.com/office/word/2010/wordml">
+                    <w:rPr>
+                      <w:rFonts w:ascii="Arial" w:hAnsi="Arial" w:eastAsia="Arial" w:cs="Arial"/>
+                      <w:i w:val="false"/>
+                      <w:b w:val="false"/>
+                      <w:u w:val="none"/>
+                      <w:strike w:val="false"/>
+                      <w:sz w:val="22"/>
+                      <w:szCs w:val="22"/>
+                      <w:color w:val="000000"/>
+                    </w:rPr>
+                    <w:t xml:space="preserve">99</w:t>
+                  </w:r>
+                </w:p>
+              </w:tc>
             </w:tr>
             <w:tr>
               <w:trPr>
@@ -3203,6 +4114,114 @@
                   </w:r>
                 </w:p>
               </w:tc>
+              <w:tc>
+                <w:tcPr>
+                  <w:tcBorders>
+                    <w:bottom w:val="none" w:sz="0" w:space="0" w:color="000000"/>
+                    <w:top w:val="none" w:sz="0" w:space="0" w:color="000000"/>
+                    <w:left w:val="none" w:sz="0" w:space="0" w:color="000000"/>
+                    <w:right w:val="none" w:sz="0" w:space="0" w:color="000000"/>
+                  </w:tcBorders>
+                  <w:shd w:val="clear" w:color="auto" w:fill="FFFFFF"/>
+                  <w:tcMar>
+                    <w:top w:w="0" w:type="dxa"/>
+                    <w:bottom w:w="0" w:type="dxa"/>
+                    <w:left w:w="0" w:type="dxa"/>
+                    <w:right w:w="0" w:type="dxa"/>
+                  </w:tcMar>
+                  <w:vAlign w:val="center"/>
+                </w:tcPr>
+                <w:p>
+                  <w:pPr>
+                    <w:jc w:val="left"/>
+                    <w:pBdr>
+                      <w:bottom w:val="none" w:sz="0" w:space="0" w:color="000000"/>
+                      <w:top w:val="none" w:sz="0" w:space="0" w:color="000000"/>
+                      <w:left w:val="none" w:sz="0" w:space="0" w:color="000000"/>
+                      <w:right w:val="none" w:sz="0" w:space="0" w:color="000000"/>
+                    </w:pBdr>
+                    <w:spacing w:after="100" w:before="100" w:line="240"/>
+                    <w:ind w:left="100" w:right="100" w:firstLine="0" w:firstLineChars="0"/>
+                    <w:rPr>
+                      <w:rFonts w:ascii="Arial" w:hAnsi="Arial" w:eastAsia="Arial" w:cs="Arial"/>
+                      <w:i w:val="false"/>
+                      <w:b w:val="false"/>
+                      <w:u w:val="none"/>
+                      <w:strike w:val="false"/>
+                      <w:sz w:val="22"/>
+                      <w:szCs w:val="22"/>
+                      <w:color w:val="000000"/>
+                    </w:rPr>
+                  </w:pPr>
+                  <w:r xmlns:w="http://schemas.openxmlformats.org/wordprocessingml/2006/main" xmlns:wp="http://schemas.openxmlformats.org/drawingml/2006/wordprocessingDrawing" xmlns:r="http://schemas.openxmlformats.org/officeDocument/2006/relationships" xmlns:w14="http://schemas.microsoft.com/office/word/2010/wordml">
+                    <w:rPr>
+                      <w:rFonts w:ascii="Arial" w:hAnsi="Arial" w:eastAsia="Arial" w:cs="Arial"/>
+                      <w:i w:val="false"/>
+                      <w:b w:val="false"/>
+                      <w:u w:val="none"/>
+                      <w:strike w:val="false"/>
+                      <w:sz w:val="22"/>
+                      <w:szCs w:val="22"/>
+                      <w:color w:val="000000"/>
+                    </w:rPr>
+                    <w:t xml:space="preserve">0.010</w:t>
+                  </w:r>
+                </w:p>
+              </w:tc>
+              <w:tc>
+                <w:tcPr>
+                  <w:tcBorders>
+                    <w:bottom w:val="none" w:sz="0" w:space="0" w:color="000000"/>
+                    <w:top w:val="none" w:sz="0" w:space="0" w:color="000000"/>
+                    <w:left w:val="none" w:sz="0" w:space="0" w:color="000000"/>
+                    <w:right w:val="none" w:sz="0" w:space="0" w:color="000000"/>
+                  </w:tcBorders>
+                  <w:shd w:val="clear" w:color="auto" w:fill="FFFFFF"/>
+                  <w:tcMar>
+                    <w:top w:w="0" w:type="dxa"/>
+                    <w:bottom w:w="0" w:type="dxa"/>
+                    <w:left w:w="0" w:type="dxa"/>
+                    <w:right w:w="0" w:type="dxa"/>
+                  </w:tcMar>
+                  <w:vAlign w:val="center"/>
+                </w:tcPr>
+                <w:p>
+                  <w:pPr>
+                    <w:jc w:val="right"/>
+                    <w:pBdr>
+                      <w:bottom w:val="none" w:sz="0" w:space="0" w:color="000000"/>
+                      <w:top w:val="none" w:sz="0" w:space="0" w:color="000000"/>
+                      <w:left w:val="none" w:sz="0" w:space="0" w:color="000000"/>
+                      <w:right w:val="none" w:sz="0" w:space="0" w:color="000000"/>
+                    </w:pBdr>
+                    <w:spacing w:after="100" w:before="100" w:line="240"/>
+                    <w:ind w:left="100" w:right="100" w:firstLine="0" w:firstLineChars="0"/>
+                    <w:rPr>
+                      <w:rFonts w:ascii="Arial" w:hAnsi="Arial" w:eastAsia="Arial" w:cs="Arial"/>
+                      <w:i w:val="false"/>
+                      <w:b w:val="false"/>
+                      <w:u w:val="none"/>
+                      <w:strike w:val="false"/>
+                      <w:sz w:val="22"/>
+                      <w:szCs w:val="22"/>
+                      <w:color w:val="000000"/>
+                    </w:rPr>
+                  </w:pPr>
+                  <w:r xmlns:w="http://schemas.openxmlformats.org/wordprocessingml/2006/main" xmlns:wp="http://schemas.openxmlformats.org/drawingml/2006/wordprocessingDrawing" xmlns:r="http://schemas.openxmlformats.org/officeDocument/2006/relationships" xmlns:w14="http://schemas.microsoft.com/office/word/2010/wordml">
+                    <w:rPr>
+                      <w:rFonts w:ascii="Arial" w:hAnsi="Arial" w:eastAsia="Arial" w:cs="Arial"/>
+                      <w:i w:val="false"/>
+                      <w:b w:val="false"/>
+                      <w:u w:val="none"/>
+                      <w:strike w:val="false"/>
+                      <w:sz w:val="22"/>
+                      <w:szCs w:val="22"/>
+                      <w:color w:val="000000"/>
+                    </w:rPr>
+                    <w:t xml:space="preserve">99</w:t>
+                  </w:r>
+                </w:p>
+              </w:tc>
             </w:tr>
             <w:tr>
               <w:trPr>
@@ -3462,7 +4481,115 @@
                       <w:szCs w:val="22"/>
                       <w:color w:val="000000"/>
                     </w:rPr>
-                    <w:t xml:space="preserve">(0.90, 0.96)</w:t>
+                    <w:t xml:space="preserve">(0.89, 0.96)</w:t>
+                  </w:r>
+                </w:p>
+              </w:tc>
+              <w:tc>
+                <w:tcPr>
+                  <w:tcBorders>
+                    <w:bottom w:val="none" w:sz="0" w:space="0" w:color="000000"/>
+                    <w:top w:val="none" w:sz="0" w:space="0" w:color="000000"/>
+                    <w:left w:val="none" w:sz="0" w:space="0" w:color="000000"/>
+                    <w:right w:val="none" w:sz="0" w:space="0" w:color="000000"/>
+                  </w:tcBorders>
+                  <w:shd w:val="clear" w:color="auto" w:fill="FFFFFF"/>
+                  <w:tcMar>
+                    <w:top w:w="0" w:type="dxa"/>
+                    <w:bottom w:w="0" w:type="dxa"/>
+                    <w:left w:w="0" w:type="dxa"/>
+                    <w:right w:w="0" w:type="dxa"/>
+                  </w:tcMar>
+                  <w:vAlign w:val="center"/>
+                </w:tcPr>
+                <w:p>
+                  <w:pPr>
+                    <w:jc w:val="left"/>
+                    <w:pBdr>
+                      <w:bottom w:val="none" w:sz="0" w:space="0" w:color="000000"/>
+                      <w:top w:val="none" w:sz="0" w:space="0" w:color="000000"/>
+                      <w:left w:val="none" w:sz="0" w:space="0" w:color="000000"/>
+                      <w:right w:val="none" w:sz="0" w:space="0" w:color="000000"/>
+                    </w:pBdr>
+                    <w:spacing w:after="100" w:before="100" w:line="240"/>
+                    <w:ind w:left="100" w:right="100" w:firstLine="0" w:firstLineChars="0"/>
+                    <w:rPr>
+                      <w:rFonts w:ascii="Arial" w:hAnsi="Arial" w:eastAsia="Arial" w:cs="Arial"/>
+                      <w:i w:val="false"/>
+                      <w:b w:val="false"/>
+                      <w:u w:val="none"/>
+                      <w:strike w:val="false"/>
+                      <w:sz w:val="22"/>
+                      <w:szCs w:val="22"/>
+                      <w:color w:val="000000"/>
+                    </w:rPr>
+                  </w:pPr>
+                  <w:r xmlns:w="http://schemas.openxmlformats.org/wordprocessingml/2006/main" xmlns:wp="http://schemas.openxmlformats.org/drawingml/2006/wordprocessingDrawing" xmlns:r="http://schemas.openxmlformats.org/officeDocument/2006/relationships" xmlns:w14="http://schemas.microsoft.com/office/word/2010/wordml">
+                    <w:rPr>
+                      <w:rFonts w:ascii="Arial" w:hAnsi="Arial" w:eastAsia="Arial" w:cs="Arial"/>
+                      <w:i w:val="false"/>
+                      <w:b w:val="false"/>
+                      <w:u w:val="none"/>
+                      <w:strike w:val="false"/>
+                      <w:sz w:val="22"/>
+                      <w:szCs w:val="22"/>
+                      <w:color w:val="000000"/>
+                    </w:rPr>
+                    <w:t xml:space="preserve">0.010</w:t>
+                  </w:r>
+                </w:p>
+              </w:tc>
+              <w:tc>
+                <w:tcPr>
+                  <w:tcBorders>
+                    <w:bottom w:val="none" w:sz="0" w:space="0" w:color="000000"/>
+                    <w:top w:val="none" w:sz="0" w:space="0" w:color="000000"/>
+                    <w:left w:val="none" w:sz="0" w:space="0" w:color="000000"/>
+                    <w:right w:val="none" w:sz="0" w:space="0" w:color="000000"/>
+                  </w:tcBorders>
+                  <w:shd w:val="clear" w:color="auto" w:fill="FFFFFF"/>
+                  <w:tcMar>
+                    <w:top w:w="0" w:type="dxa"/>
+                    <w:bottom w:w="0" w:type="dxa"/>
+                    <w:left w:w="0" w:type="dxa"/>
+                    <w:right w:w="0" w:type="dxa"/>
+                  </w:tcMar>
+                  <w:vAlign w:val="center"/>
+                </w:tcPr>
+                <w:p>
+                  <w:pPr>
+                    <w:jc w:val="right"/>
+                    <w:pBdr>
+                      <w:bottom w:val="none" w:sz="0" w:space="0" w:color="000000"/>
+                      <w:top w:val="none" w:sz="0" w:space="0" w:color="000000"/>
+                      <w:left w:val="none" w:sz="0" w:space="0" w:color="000000"/>
+                      <w:right w:val="none" w:sz="0" w:space="0" w:color="000000"/>
+                    </w:pBdr>
+                    <w:spacing w:after="100" w:before="100" w:line="240"/>
+                    <w:ind w:left="100" w:right="100" w:firstLine="0" w:firstLineChars="0"/>
+                    <w:rPr>
+                      <w:rFonts w:ascii="Arial" w:hAnsi="Arial" w:eastAsia="Arial" w:cs="Arial"/>
+                      <w:i w:val="false"/>
+                      <w:b w:val="false"/>
+                      <w:u w:val="none"/>
+                      <w:strike w:val="false"/>
+                      <w:sz w:val="22"/>
+                      <w:szCs w:val="22"/>
+                      <w:color w:val="000000"/>
+                    </w:rPr>
+                  </w:pPr>
+                  <w:r xmlns:w="http://schemas.openxmlformats.org/wordprocessingml/2006/main" xmlns:wp="http://schemas.openxmlformats.org/drawingml/2006/wordprocessingDrawing" xmlns:r="http://schemas.openxmlformats.org/officeDocument/2006/relationships" xmlns:w14="http://schemas.microsoft.com/office/word/2010/wordml">
+                    <w:rPr>
+                      <w:rFonts w:ascii="Arial" w:hAnsi="Arial" w:eastAsia="Arial" w:cs="Arial"/>
+                      <w:i w:val="false"/>
+                      <w:b w:val="false"/>
+                      <w:u w:val="none"/>
+                      <w:strike w:val="false"/>
+                      <w:sz w:val="22"/>
+                      <w:szCs w:val="22"/>
+                      <w:color w:val="000000"/>
+                    </w:rPr>
+                    <w:t xml:space="preserve">99</w:t>
                   </w:r>
                 </w:p>
               </w:tc>
@@ -3738,7 +4865,115 @@
                       <w:szCs w:val="22"/>
                       <w:color w:val="000000"/>
                     </w:rPr>
-                    <w:t xml:space="preserve">(0.28, 0.60)</w:t>
+                    <w:t xml:space="preserve">(0.27, 0.61)</w:t>
+                  </w:r>
+                </w:p>
+              </w:tc>
+              <w:tc>
+                <w:tcPr>
+                  <w:tcBorders>
+                    <w:bottom w:val="none" w:sz="0" w:space="0" w:color="000000"/>
+                    <w:top w:val="none" w:sz="0" w:space="0" w:color="000000"/>
+                    <w:left w:val="none" w:sz="0" w:space="0" w:color="000000"/>
+                    <w:right w:val="none" w:sz="0" w:space="0" w:color="000000"/>
+                  </w:tcBorders>
+                  <w:shd w:val="clear" w:color="auto" w:fill="FFFFFF"/>
+                  <w:tcMar>
+                    <w:top w:w="0" w:type="dxa"/>
+                    <w:bottom w:w="0" w:type="dxa"/>
+                    <w:left w:w="0" w:type="dxa"/>
+                    <w:right w:w="0" w:type="dxa"/>
+                  </w:tcMar>
+                  <w:vAlign w:val="center"/>
+                </w:tcPr>
+                <w:p>
+                  <w:pPr>
+                    <w:jc w:val="left"/>
+                    <w:pBdr>
+                      <w:bottom w:val="none" w:sz="0" w:space="0" w:color="000000"/>
+                      <w:top w:val="none" w:sz="0" w:space="0" w:color="000000"/>
+                      <w:left w:val="none" w:sz="0" w:space="0" w:color="000000"/>
+                      <w:right w:val="none" w:sz="0" w:space="0" w:color="000000"/>
+                    </w:pBdr>
+                    <w:spacing w:after="100" w:before="100" w:line="240"/>
+                    <w:ind w:left="100" w:right="100" w:firstLine="0" w:firstLineChars="0"/>
+                    <w:rPr>
+                      <w:rFonts w:ascii="Arial" w:hAnsi="Arial" w:eastAsia="Arial" w:cs="Arial"/>
+                      <w:i w:val="false"/>
+                      <w:b w:val="false"/>
+                      <w:u w:val="none"/>
+                      <w:strike w:val="false"/>
+                      <w:sz w:val="22"/>
+                      <w:szCs w:val="22"/>
+                      <w:color w:val="000000"/>
+                    </w:rPr>
+                  </w:pPr>
+                  <w:r xmlns:w="http://schemas.openxmlformats.org/wordprocessingml/2006/main" xmlns:wp="http://schemas.openxmlformats.org/drawingml/2006/wordprocessingDrawing" xmlns:r="http://schemas.openxmlformats.org/officeDocument/2006/relationships" xmlns:w14="http://schemas.microsoft.com/office/word/2010/wordml">
+                    <w:rPr>
+                      <w:rFonts w:ascii="Arial" w:hAnsi="Arial" w:eastAsia="Arial" w:cs="Arial"/>
+                      <w:i w:val="false"/>
+                      <w:b w:val="false"/>
+                      <w:u w:val="none"/>
+                      <w:strike w:val="false"/>
+                      <w:sz w:val="22"/>
+                      <w:szCs w:val="22"/>
+                      <w:color w:val="000000"/>
+                    </w:rPr>
+                    <w:t xml:space="preserve">0.010</w:t>
+                  </w:r>
+                </w:p>
+              </w:tc>
+              <w:tc>
+                <w:tcPr>
+                  <w:tcBorders>
+                    <w:bottom w:val="none" w:sz="0" w:space="0" w:color="000000"/>
+                    <w:top w:val="none" w:sz="0" w:space="0" w:color="000000"/>
+                    <w:left w:val="none" w:sz="0" w:space="0" w:color="000000"/>
+                    <w:right w:val="none" w:sz="0" w:space="0" w:color="000000"/>
+                  </w:tcBorders>
+                  <w:shd w:val="clear" w:color="auto" w:fill="FFFFFF"/>
+                  <w:tcMar>
+                    <w:top w:w="0" w:type="dxa"/>
+                    <w:bottom w:w="0" w:type="dxa"/>
+                    <w:left w:w="0" w:type="dxa"/>
+                    <w:right w:w="0" w:type="dxa"/>
+                  </w:tcMar>
+                  <w:vAlign w:val="center"/>
+                </w:tcPr>
+                <w:p>
+                  <w:pPr>
+                    <w:jc w:val="right"/>
+                    <w:pBdr>
+                      <w:bottom w:val="none" w:sz="0" w:space="0" w:color="000000"/>
+                      <w:top w:val="none" w:sz="0" w:space="0" w:color="000000"/>
+                      <w:left w:val="none" w:sz="0" w:space="0" w:color="000000"/>
+                      <w:right w:val="none" w:sz="0" w:space="0" w:color="000000"/>
+                    </w:pBdr>
+                    <w:spacing w:after="100" w:before="100" w:line="240"/>
+                    <w:ind w:left="100" w:right="100" w:firstLine="0" w:firstLineChars="0"/>
+                    <w:rPr>
+                      <w:rFonts w:ascii="Arial" w:hAnsi="Arial" w:eastAsia="Arial" w:cs="Arial"/>
+                      <w:i w:val="false"/>
+                      <w:b w:val="false"/>
+                      <w:u w:val="none"/>
+                      <w:strike w:val="false"/>
+                      <w:sz w:val="22"/>
+                      <w:szCs w:val="22"/>
+                      <w:color w:val="000000"/>
+                    </w:rPr>
+                  </w:pPr>
+                  <w:r xmlns:w="http://schemas.openxmlformats.org/wordprocessingml/2006/main" xmlns:wp="http://schemas.openxmlformats.org/drawingml/2006/wordprocessingDrawing" xmlns:r="http://schemas.openxmlformats.org/officeDocument/2006/relationships" xmlns:w14="http://schemas.microsoft.com/office/word/2010/wordml">
+                    <w:rPr>
+                      <w:rFonts w:ascii="Arial" w:hAnsi="Arial" w:eastAsia="Arial" w:cs="Arial"/>
+                      <w:i w:val="false"/>
+                      <w:b w:val="false"/>
+                      <w:u w:val="none"/>
+                      <w:strike w:val="false"/>
+                      <w:sz w:val="22"/>
+                      <w:szCs w:val="22"/>
+                      <w:color w:val="000000"/>
+                    </w:rPr>
+                    <w:t xml:space="preserve">99</w:t>
                   </w:r>
                 </w:p>
               </w:tc>
@@ -4001,7 +5236,115 @@
                       <w:szCs w:val="22"/>
                       <w:color w:val="000000"/>
                     </w:rPr>
-                    <w:t xml:space="preserve">(0.02, 0.61)</w:t>
+                    <w:t xml:space="preserve">(0.05, 0.55)</w:t>
+                  </w:r>
+                </w:p>
+              </w:tc>
+              <w:tc>
+                <w:tcPr>
+                  <w:tcBorders>
+                    <w:bottom w:val="none" w:sz="0" w:space="0" w:color="000000"/>
+                    <w:top w:val="none" w:sz="0" w:space="0" w:color="000000"/>
+                    <w:left w:val="none" w:sz="0" w:space="0" w:color="000000"/>
+                    <w:right w:val="none" w:sz="0" w:space="0" w:color="000000"/>
+                  </w:tcBorders>
+                  <w:shd w:val="clear" w:color="auto" w:fill="FFFFFF"/>
+                  <w:tcMar>
+                    <w:top w:w="0" w:type="dxa"/>
+                    <w:bottom w:w="0" w:type="dxa"/>
+                    <w:left w:w="0" w:type="dxa"/>
+                    <w:right w:w="0" w:type="dxa"/>
+                  </w:tcMar>
+                  <w:vAlign w:val="center"/>
+                </w:tcPr>
+                <w:p>
+                  <w:pPr>
+                    <w:jc w:val="left"/>
+                    <w:pBdr>
+                      <w:bottom w:val="none" w:sz="0" w:space="0" w:color="000000"/>
+                      <w:top w:val="none" w:sz="0" w:space="0" w:color="000000"/>
+                      <w:left w:val="none" w:sz="0" w:space="0" w:color="000000"/>
+                      <w:right w:val="none" w:sz="0" w:space="0" w:color="000000"/>
+                    </w:pBdr>
+                    <w:spacing w:after="100" w:before="100" w:line="240"/>
+                    <w:ind w:left="100" w:right="100" w:firstLine="0" w:firstLineChars="0"/>
+                    <w:rPr>
+                      <w:rFonts w:ascii="Arial" w:hAnsi="Arial" w:eastAsia="Arial" w:cs="Arial"/>
+                      <w:i w:val="false"/>
+                      <w:b w:val="false"/>
+                      <w:u w:val="none"/>
+                      <w:strike w:val="false"/>
+                      <w:sz w:val="22"/>
+                      <w:szCs w:val="22"/>
+                      <w:color w:val="000000"/>
+                    </w:rPr>
+                  </w:pPr>
+                  <w:r xmlns:w="http://schemas.openxmlformats.org/wordprocessingml/2006/main" xmlns:wp="http://schemas.openxmlformats.org/drawingml/2006/wordprocessingDrawing" xmlns:r="http://schemas.openxmlformats.org/officeDocument/2006/relationships" xmlns:w14="http://schemas.microsoft.com/office/word/2010/wordml">
+                    <w:rPr>
+                      <w:rFonts w:ascii="Arial" w:hAnsi="Arial" w:eastAsia="Arial" w:cs="Arial"/>
+                      <w:i w:val="false"/>
+                      <w:b w:val="false"/>
+                      <w:u w:val="none"/>
+                      <w:strike w:val="false"/>
+                      <w:sz w:val="22"/>
+                      <w:szCs w:val="22"/>
+                      <w:color w:val="000000"/>
+                    </w:rPr>
+                    <w:t xml:space="preserve">0.010</w:t>
+                  </w:r>
+                </w:p>
+              </w:tc>
+              <w:tc>
+                <w:tcPr>
+                  <w:tcBorders>
+                    <w:bottom w:val="none" w:sz="0" w:space="0" w:color="000000"/>
+                    <w:top w:val="none" w:sz="0" w:space="0" w:color="000000"/>
+                    <w:left w:val="none" w:sz="0" w:space="0" w:color="000000"/>
+                    <w:right w:val="none" w:sz="0" w:space="0" w:color="000000"/>
+                  </w:tcBorders>
+                  <w:shd w:val="clear" w:color="auto" w:fill="FFFFFF"/>
+                  <w:tcMar>
+                    <w:top w:w="0" w:type="dxa"/>
+                    <w:bottom w:w="0" w:type="dxa"/>
+                    <w:left w:w="0" w:type="dxa"/>
+                    <w:right w:w="0" w:type="dxa"/>
+                  </w:tcMar>
+                  <w:vAlign w:val="center"/>
+                </w:tcPr>
+                <w:p>
+                  <w:pPr>
+                    <w:jc w:val="right"/>
+                    <w:pBdr>
+                      <w:bottom w:val="none" w:sz="0" w:space="0" w:color="000000"/>
+                      <w:top w:val="none" w:sz="0" w:space="0" w:color="000000"/>
+                      <w:left w:val="none" w:sz="0" w:space="0" w:color="000000"/>
+                      <w:right w:val="none" w:sz="0" w:space="0" w:color="000000"/>
+                    </w:pBdr>
+                    <w:spacing w:after="100" w:before="100" w:line="240"/>
+                    <w:ind w:left="100" w:right="100" w:firstLine="0" w:firstLineChars="0"/>
+                    <w:rPr>
+                      <w:rFonts w:ascii="Arial" w:hAnsi="Arial" w:eastAsia="Arial" w:cs="Arial"/>
+                      <w:i w:val="false"/>
+                      <w:b w:val="false"/>
+                      <w:u w:val="none"/>
+                      <w:strike w:val="false"/>
+                      <w:sz w:val="22"/>
+                      <w:szCs w:val="22"/>
+                      <w:color w:val="000000"/>
+                    </w:rPr>
+                  </w:pPr>
+                  <w:r xmlns:w="http://schemas.openxmlformats.org/wordprocessingml/2006/main" xmlns:wp="http://schemas.openxmlformats.org/drawingml/2006/wordprocessingDrawing" xmlns:r="http://schemas.openxmlformats.org/officeDocument/2006/relationships" xmlns:w14="http://schemas.microsoft.com/office/word/2010/wordml">
+                    <w:rPr>
+                      <w:rFonts w:ascii="Arial" w:hAnsi="Arial" w:eastAsia="Arial" w:cs="Arial"/>
+                      <w:i w:val="false"/>
+                      <w:b w:val="false"/>
+                      <w:u w:val="none"/>
+                      <w:strike w:val="false"/>
+                      <w:sz w:val="22"/>
+                      <w:szCs w:val="22"/>
+                      <w:color w:val="000000"/>
+                    </w:rPr>
+                    <w:t xml:space="preserve">99</w:t>
                   </w:r>
                 </w:p>
               </w:tc>
@@ -4264,7 +5607,115 @@
                       <w:szCs w:val="22"/>
                       <w:color w:val="000000"/>
                     </w:rPr>
-                    <w:t xml:space="preserve">(0.74, 0.90)</w:t>
+                    <w:t xml:space="preserve">(0.73, 0.89)</w:t>
+                  </w:r>
+                </w:p>
+              </w:tc>
+              <w:tc>
+                <w:tcPr>
+                  <w:tcBorders>
+                    <w:bottom w:val="single" w:sz="12" w:space="0" w:color="666666"/>
+                    <w:top w:val="none" w:sz="0" w:space="0" w:color="000000"/>
+                    <w:left w:val="none" w:sz="0" w:space="0" w:color="000000"/>
+                    <w:right w:val="none" w:sz="0" w:space="0" w:color="000000"/>
+                  </w:tcBorders>
+                  <w:shd w:val="clear" w:color="auto" w:fill="FFFFFF"/>
+                  <w:tcMar>
+                    <w:top w:w="0" w:type="dxa"/>
+                    <w:bottom w:w="0" w:type="dxa"/>
+                    <w:left w:w="0" w:type="dxa"/>
+                    <w:right w:w="0" w:type="dxa"/>
+                  </w:tcMar>
+                  <w:vAlign w:val="center"/>
+                </w:tcPr>
+                <w:p>
+                  <w:pPr>
+                    <w:jc w:val="left"/>
+                    <w:pBdr>
+                      <w:bottom w:val="none" w:sz="0" w:space="0" w:color="000000"/>
+                      <w:top w:val="none" w:sz="0" w:space="0" w:color="000000"/>
+                      <w:left w:val="none" w:sz="0" w:space="0" w:color="000000"/>
+                      <w:right w:val="none" w:sz="0" w:space="0" w:color="000000"/>
+                    </w:pBdr>
+                    <w:spacing w:after="100" w:before="100" w:line="240"/>
+                    <w:ind w:left="100" w:right="100" w:firstLine="0" w:firstLineChars="0"/>
+                    <w:rPr>
+                      <w:rFonts w:ascii="Arial" w:hAnsi="Arial" w:eastAsia="Arial" w:cs="Arial"/>
+                      <w:i w:val="false"/>
+                      <w:b w:val="false"/>
+                      <w:u w:val="none"/>
+                      <w:strike w:val="false"/>
+                      <w:sz w:val="22"/>
+                      <w:szCs w:val="22"/>
+                      <w:color w:val="000000"/>
+                    </w:rPr>
+                  </w:pPr>
+                  <w:r xmlns:w="http://schemas.openxmlformats.org/wordprocessingml/2006/main" xmlns:wp="http://schemas.openxmlformats.org/drawingml/2006/wordprocessingDrawing" xmlns:r="http://schemas.openxmlformats.org/officeDocument/2006/relationships" xmlns:w14="http://schemas.microsoft.com/office/word/2010/wordml">
+                    <w:rPr>
+                      <w:rFonts w:ascii="Arial" w:hAnsi="Arial" w:eastAsia="Arial" w:cs="Arial"/>
+                      <w:i w:val="false"/>
+                      <w:b w:val="false"/>
+                      <w:u w:val="none"/>
+                      <w:strike w:val="false"/>
+                      <w:sz w:val="22"/>
+                      <w:szCs w:val="22"/>
+                      <w:color w:val="000000"/>
+                    </w:rPr>
+                    <w:t xml:space="preserve">0.010</w:t>
+                  </w:r>
+                </w:p>
+              </w:tc>
+              <w:tc>
+                <w:tcPr>
+                  <w:tcBorders>
+                    <w:bottom w:val="single" w:sz="12" w:space="0" w:color="666666"/>
+                    <w:top w:val="none" w:sz="0" w:space="0" w:color="000000"/>
+                    <w:left w:val="none" w:sz="0" w:space="0" w:color="000000"/>
+                    <w:right w:val="none" w:sz="0" w:space="0" w:color="000000"/>
+                  </w:tcBorders>
+                  <w:shd w:val="clear" w:color="auto" w:fill="FFFFFF"/>
+                  <w:tcMar>
+                    <w:top w:w="0" w:type="dxa"/>
+                    <w:bottom w:w="0" w:type="dxa"/>
+                    <w:left w:w="0" w:type="dxa"/>
+                    <w:right w:w="0" w:type="dxa"/>
+                  </w:tcMar>
+                  <w:vAlign w:val="center"/>
+                </w:tcPr>
+                <w:p>
+                  <w:pPr>
+                    <w:jc w:val="right"/>
+                    <w:pBdr>
+                      <w:bottom w:val="none" w:sz="0" w:space="0" w:color="000000"/>
+                      <w:top w:val="none" w:sz="0" w:space="0" w:color="000000"/>
+                      <w:left w:val="none" w:sz="0" w:space="0" w:color="000000"/>
+                      <w:right w:val="none" w:sz="0" w:space="0" w:color="000000"/>
+                    </w:pBdr>
+                    <w:spacing w:after="100" w:before="100" w:line="240"/>
+                    <w:ind w:left="100" w:right="100" w:firstLine="0" w:firstLineChars="0"/>
+                    <w:rPr>
+                      <w:rFonts w:ascii="Arial" w:hAnsi="Arial" w:eastAsia="Arial" w:cs="Arial"/>
+                      <w:i w:val="false"/>
+                      <w:b w:val="false"/>
+                      <w:u w:val="none"/>
+                      <w:strike w:val="false"/>
+                      <w:sz w:val="22"/>
+                      <w:szCs w:val="22"/>
+                      <w:color w:val="000000"/>
+                    </w:rPr>
+                  </w:pPr>
+                  <w:r xmlns:w="http://schemas.openxmlformats.org/wordprocessingml/2006/main" xmlns:wp="http://schemas.openxmlformats.org/drawingml/2006/wordprocessingDrawing" xmlns:r="http://schemas.openxmlformats.org/officeDocument/2006/relationships" xmlns:w14="http://schemas.microsoft.com/office/word/2010/wordml">
+                    <w:rPr>
+                      <w:rFonts w:ascii="Arial" w:hAnsi="Arial" w:eastAsia="Arial" w:cs="Arial"/>
+                      <w:i w:val="false"/>
+                      <w:b w:val="false"/>
+                      <w:u w:val="none"/>
+                      <w:strike w:val="false"/>
+                      <w:sz w:val="22"/>
+                      <w:szCs w:val="22"/>
+                      <w:color w:val="000000"/>
+                    </w:rPr>
+                    <w:t xml:space="preserve">99</w:t>
                   </w:r>
                 </w:p>
               </w:tc>
@@ -4279,7 +5730,7 @@
         <w:pStyle w:val="BodyText"/>
       </w:pPr>
       <w:r>
-        <w:t xml:space="preserve">The cartographic distance correlation for H1N1 is also moderate, indicating that</w:t>
+        <w:t xml:space="preserve">The cartographic Mantel correlation for H1N1 is also moderate, indicating that</w:t>
       </w:r>
       <w:r>
         <w:t xml:space="preserve"> </w:t>
@@ -4376,7 +5827,7 @@
         <w:t xml:space="preserve"> </w:t>
       </w:r>
       <w:r>
-        <w:t xml:space="preserve">primarily separating by temporal distance, which corroborates the correlations</w:t>
+        <w:t xml:space="preserve">primarily separating by temporal distance, which corroborates the associations</w:t>
       </w:r>
       <w:r>
         <w:t xml:space="preserve"> </w:t>
@@ -8379,7 +9830,7 @@
       </w:r>
     </w:p>
     <w:bookmarkEnd w:id="33"/>
-    <w:bookmarkStart w:id="63" w:name="references"/>
+    <w:bookmarkStart w:id="67" w:name="references"/>
     <w:p>
       <w:pPr>
         <w:pStyle w:val="Heading1"/>
@@ -8388,7 +9839,7 @@
         <w:t xml:space="preserve">References</w:t>
       </w:r>
     </w:p>
-    <w:bookmarkStart w:id="62" w:name="refs"/>
+    <w:bookmarkStart w:id="66" w:name="refs"/>
     <w:bookmarkStart w:id="35" w:name="ref-kim2018"/>
     <w:p>
       <w:pPr>
@@ -8927,7 +10378,7 @@
       </w:hyperlink>
     </w:p>
     <w:bookmarkEnd w:id="56"/>
-    <w:bookmarkStart w:id="57" w:name="ref-rcoreteam2024"/>
+    <w:bookmarkStart w:id="58" w:name="ref-legendre2010MantelAlternatives"/>
     <w:p>
       <w:pPr>
         <w:pStyle w:val="Bibliography"/>
@@ -8942,14 +10393,19 @@
         <w:t xml:space="preserve">	</w:t>
       </w:r>
       <w:r>
-        <w:t xml:space="preserve">R Core Team. R: A language and environment for statistical computing. Vienna, Austria: R Foundation for Statistical Computing; 2024.</w:t>
-      </w:r>
-      <w:r>
-        <w:t xml:space="preserve"> </w:t>
-      </w:r>
+        <w:t xml:space="preserve">Legendre P, Fortin M-J. Comparison of the mantel test and alternative approaches for detecting complex multivariate relationships in the spatial analysis of genetic data. Molecular Ecology Resources. 2010;10: 831–844. doi:</w:t>
+      </w:r>
+      <w:hyperlink r:id="rId57">
+        <w:r>
+          <w:rPr>
+            <w:rStyle w:val="Hyperlink"/>
+          </w:rPr>
+          <w:t xml:space="preserve">10.1111/j.1755-0998.2010.02866.x</w:t>
+        </w:r>
+      </w:hyperlink>
     </w:p>
-    <w:bookmarkEnd w:id="57"/>
-    <w:bookmarkStart w:id="59" w:name="ref-schliep2011"/>
+    <w:bookmarkEnd w:id="58"/>
+    <w:bookmarkStart w:id="60" w:name="ref-legendre2015ShouldMantel"/>
     <w:p>
       <w:pPr>
         <w:pStyle w:val="Bibliography"/>
@@ -8964,6 +10420,55 @@
         <w:t xml:space="preserve">	</w:t>
       </w:r>
       <w:r>
+        <w:t xml:space="preserve">Legendre P, Fortin M-J, Borcard D. Should the mantel test be used in spatial analysis? Methods in Ecology and Evolution. 2015;6: 1239–1247. doi:</w:t>
+      </w:r>
+      <w:hyperlink r:id="rId59">
+        <w:r>
+          <w:rPr>
+            <w:rStyle w:val="Hyperlink"/>
+          </w:rPr>
+          <w:t xml:space="preserve">10.1111/2041-210X.12425</w:t>
+        </w:r>
+      </w:hyperlink>
+    </w:p>
+    <w:bookmarkEnd w:id="60"/>
+    <w:bookmarkStart w:id="61" w:name="ref-rcoreteam2024"/>
+    <w:p>
+      <w:pPr>
+        <w:pStyle w:val="Bibliography"/>
+      </w:pPr>
+      <w:r>
+        <w:t xml:space="preserve">15.</w:t>
+      </w:r>
+      <w:r>
+        <w:t xml:space="preserve"> </w:t>
+      </w:r>
+      <w:r>
+        <w:t xml:space="preserve">	</w:t>
+      </w:r>
+      <w:r>
+        <w:t xml:space="preserve">R Core Team. R: A language and environment for statistical computing. Vienna, Austria: R Foundation for Statistical Computing; 2024.</w:t>
+      </w:r>
+      <w:r>
+        <w:t xml:space="preserve"> </w:t>
+      </w:r>
+    </w:p>
+    <w:bookmarkEnd w:id="61"/>
+    <w:bookmarkStart w:id="63" w:name="ref-schliep2011"/>
+    <w:p>
+      <w:pPr>
+        <w:pStyle w:val="Bibliography"/>
+      </w:pPr>
+      <w:r>
+        <w:t xml:space="preserve">16.</w:t>
+      </w:r>
+      <w:r>
+        <w:t xml:space="preserve"> </w:t>
+      </w:r>
+      <w:r>
+        <w:t xml:space="preserve">	</w:t>
+      </w:r>
+      <w:r>
         <w:t xml:space="preserve">Schliep KP. Phangorn: Phylogenetic analysis in</w:t>
       </w:r>
       <w:r>
@@ -8975,7 +10480,7 @@
       <w:r>
         <w:t xml:space="preserve">. Bioinformatics (Oxford, England). 2011;27: 592–593. doi:</w:t>
       </w:r>
-      <w:hyperlink r:id="rId58">
+      <w:hyperlink r:id="rId62">
         <w:r>
           <w:rPr>
             <w:rStyle w:val="Hyperlink"/>
@@ -8984,14 +10489,14 @@
         </w:r>
       </w:hyperlink>
     </w:p>
-    <w:bookmarkEnd w:id="59"/>
-    <w:bookmarkStart w:id="61" w:name="ref-bodenhofer2015"/>
+    <w:bookmarkEnd w:id="63"/>
+    <w:bookmarkStart w:id="65" w:name="ref-bodenhofer2015"/>
     <w:p>
       <w:pPr>
         <w:pStyle w:val="Bibliography"/>
       </w:pPr>
       <w:r>
-        <w:t xml:space="preserve">15.</w:t>
+        <w:t xml:space="preserve">17.</w:t>
       </w:r>
       <w:r>
         <w:t xml:space="preserve"> </w:t>
@@ -9014,7 +10519,7 @@
       <w:r>
         <w:t xml:space="preserve">package for multiple sequence alignment. Bioinformatics. 2015;31: 3997–3999. doi:</w:t>
       </w:r>
-      <w:hyperlink r:id="rId60">
+      <w:hyperlink r:id="rId64">
         <w:r>
           <w:rPr>
             <w:rStyle w:val="Hyperlink"/>
@@ -9023,9 +10528,9 @@
         </w:r>
       </w:hyperlink>
     </w:p>
-    <w:bookmarkEnd w:id="61"/>
-    <w:bookmarkEnd w:id="62"/>
-    <w:bookmarkEnd w:id="63"/>
+    <w:bookmarkEnd w:id="65"/>
+    <w:bookmarkEnd w:id="66"/>
+    <w:bookmarkEnd w:id="67"/>
     <w:sectPr/>
   </w:body>
 </w:document>

</xml_diff>

<commit_message>
feat: add subtype contrast analysis
</commit_message>
<xml_diff>
--- a/products/manuscript.docx
+++ b/products/manuscript.docx
@@ -31,7 +31,7 @@
         <w:pStyle w:val="Date"/>
       </w:pPr>
       <w:r>
-        <w:t xml:space="preserve">2026-05-29</w:t>
+        <w:t xml:space="preserve">2026-05-30</w:t>
       </w:r>
     </w:p>
     <w:p>
@@ -487,13 +487,40 @@
         <w:t xml:space="preserve"> </w:t>
       </w:r>
       <w:r>
-        <w:t xml:space="preserve">resampling over strain units. Descriptive Pearson correlations using the same</w:t>
-      </w:r>
-      <w:r>
-        <w:t xml:space="preserve"> </w:t>
-      </w:r>
-      <w:r>
-        <w:t xml:space="preserve">unique off-diagonal pair representation are reported in the supplement for</w:t>
+        <w:t xml:space="preserve">resampling over strain units</w:t>
+      </w:r>
+      <w:r>
+        <w:t xml:space="preserve"> </w:t>
+      </w:r>
+      <w:r>
+        <w:t xml:space="preserve">[15]</w:t>
+      </w:r>
+      <w:r>
+        <w:t xml:space="preserve">. To quantify subtype differences,</w:t>
+      </w:r>
+      <w:r>
+        <w:t xml:space="preserve"> </w:t>
+      </w:r>
+      <w:r>
+        <w:t xml:space="preserve">we subtracted the H1N1 Mantel correlation from the H3N2 Mantel correlation for</w:t>
+      </w:r>
+      <w:r>
+        <w:t xml:space="preserve"> </w:t>
+      </w:r>
+      <w:r>
+        <w:t xml:space="preserve">each distance metric, with uncertainty estimated by the same strain-level</w:t>
+      </w:r>
+      <w:r>
+        <w:t xml:space="preserve"> </w:t>
+      </w:r>
+      <w:r>
+        <w:t xml:space="preserve">Bayesian bootstrap. Descriptive Pearson correlations using the same unique</w:t>
+      </w:r>
+      <w:r>
+        <w:t xml:space="preserve"> </w:t>
+      </w:r>
+      <w:r>
+        <w:t xml:space="preserve">off-diagonal pair representation are reported in the supplement for</w:t>
       </w:r>
       <w:r>
         <w:t xml:space="preserve"> </w:t>
@@ -549,7 +576,7 @@
         <w:t xml:space="preserve"> </w:t>
       </w:r>
       <w:r>
-        <w:t xml:space="preserve">[15]</w:t>
+        <w:t xml:space="preserve">[16]</w:t>
       </w:r>
       <w:r>
         <w:t xml:space="preserve"> </w:t>
@@ -570,7 +597,7 @@
         <w:t xml:space="preserve"> </w:t>
       </w:r>
       <w:r>
-        <w:t xml:space="preserve">[16]</w:t>
+        <w:t xml:space="preserve">[17]</w:t>
       </w:r>
       <w:r>
         <w:t xml:space="preserve"> </w:t>
@@ -591,14 +618,14 @@
         <w:t xml:space="preserve"> </w:t>
       </w:r>
       <w:r>
-        <w:t xml:space="preserve">[17]</w:t>
+        <w:t xml:space="preserve">[18]</w:t>
       </w:r>
       <w:r>
         <w:t xml:space="preserve">.</w:t>
       </w:r>
     </w:p>
     <w:bookmarkEnd w:id="20"/>
-    <w:bookmarkStart w:id="31" w:name="study-results"/>
+    <w:bookmarkStart w:id="36" w:name="study-results"/>
     <w:p>
       <w:pPr>
         <w:pStyle w:val="Heading1"/>
@@ -5730,59 +5757,9 @@
         <w:pStyle w:val="BodyText"/>
       </w:pPr>
       <w:r>
-        <w:t xml:space="preserve">The cartographic Mantel correlation for H1N1 is also moderate, indicating that</w:t>
-      </w:r>
-      <w:r>
-        <w:t xml:space="preserve"> </w:t>
-      </w:r>
-      <w:r>
-        <w:t xml:space="preserve">the evolutionary pattern of H1N1 strains does not necessarily explain variation</w:t>
-      </w:r>
-      <w:r>
-        <w:t xml:space="preserve"> </w:t>
-      </w:r>
-      <w:r>
-        <w:t xml:space="preserve">in observed immune responses. For H3N2, the cartographic correlation was the</w:t>
-      </w:r>
-      <w:r>
-        <w:t xml:space="preserve"> </w:t>
-      </w:r>
-      <w:r>
-        <w:t xml:space="preserve">lowest, and the two distances become less correlated as the distance values</w:t>
-      </w:r>
-      <w:r>
-        <w:t xml:space="preserve"> </w:t>
-      </w:r>
-      <w:r>
-        <w:t xml:space="preserve">become larger. For closely related H3N2 strains the ability of the tree distance</w:t>
-      </w:r>
-      <w:r>
-        <w:t xml:space="preserve"> </w:t>
-      </w:r>
-      <w:r>
-        <w:t xml:space="preserve">to predict differences in immune response appears to attenuate as strains drift</w:t>
-      </w:r>
-      <w:r>
-        <w:t xml:space="preserve"> </w:t>
-      </w:r>
-      <w:r>
-        <w:t xml:space="preserve">further away.</w:t>
-      </w:r>
-    </w:p>
-    <w:p>
-      <w:pPr>
-        <w:pStyle w:val="BodyText"/>
-      </w:pPr>
-      <w:r>
-        <w:t xml:space="preserve">The ML trees for both subtypes were able to reconstruct the</w:t>
-      </w:r>
-      <w:r>
-        <w:t xml:space="preserve"> </w:t>
-      </w:r>
-      <w:r>
-        <w:t xml:space="preserve">patterns we expect for H1N1 and H3N2 influenza (</w:t>
-      </w:r>
-      <w:hyperlink w:anchor="fig-mltrees">
+        <w:t xml:space="preserve">Subtype contrasts quantify these patterns directly (</w:t>
+      </w:r>
+      <w:hyperlink w:anchor="fig-subtype-contrasts">
         <w:r>
           <w:rPr>
             <w:rStyle w:val="Hyperlink"/>
@@ -5791,60 +5768,33 @@
         </w:r>
       </w:hyperlink>
       <w:r>
-        <w:t xml:space="preserve">). The H1N1</w:t>
-      </w:r>
-      <w:r>
-        <w:t xml:space="preserve"> </w:t>
-      </w:r>
-      <w:r>
-        <w:t xml:space="preserve">strains form two clades, one pdm-like clade which contains SC/18 (the 1918</w:t>
-      </w:r>
-      <w:r>
-        <w:t xml:space="preserve"> </w:t>
-      </w:r>
-      <w:r>
-        <w:t xml:space="preserve">pandemic strain), NJ/76 swine influenza, and the modern pdm-like strains. The</w:t>
-      </w:r>
-      <w:r>
-        <w:t xml:space="preserve"> </w:t>
-      </w:r>
-      <w:r>
-        <w:t xml:space="preserve">other clade contains the H1N1 strains which circulated between the 1918 pandemic</w:t>
-      </w:r>
-      <w:r>
-        <w:t xml:space="preserve"> </w:t>
-      </w:r>
-      <w:r>
-        <w:t xml:space="preserve">and the 2009 pandemic. The H3N2</w:t>
-      </w:r>
-      <w:r>
-        <w:t xml:space="preserve"> </w:t>
-      </w:r>
-      <w:r>
-        <w:t xml:space="preserve">strains tend to follow a similar ladder-like pattern, beginning with HK/68 and</w:t>
-      </w:r>
-      <w:r>
-        <w:t xml:space="preserve"> </w:t>
-      </w:r>
-      <w:r>
-        <w:t xml:space="preserve">primarily separating by temporal distance, which corroborates the associations</w:t>
-      </w:r>
-      <w:r>
-        <w:t xml:space="preserve"> </w:t>
-      </w:r>
-      <w:r>
-        <w:t xml:space="preserve">between temporal and cophenetic distance (</w:t>
-      </w:r>
-      <w:hyperlink w:anchor="fig-corr">
+        <w:t xml:space="preserve">;</w:t>
+      </w:r>
+      <w:r>
+        <w:t xml:space="preserve"> </w:t>
+      </w:r>
+      <w:hyperlink w:anchor="tbl-subtype-contrasts">
         <w:r>
           <w:rPr>
             <w:rStyle w:val="Hyperlink"/>
           </w:rPr>
-          <w:t xml:space="preserve">Figure 1</w:t>
+          <w:t xml:space="preserve">Table 2</w:t>
         </w:r>
       </w:hyperlink>
       <w:r>
-        <w:t xml:space="preserve">).</w:t>
+        <w:t xml:space="preserve">). Temporal distance and cartographic distance had larger</w:t>
+      </w:r>
+      <w:r>
+        <w:t xml:space="preserve"> </w:t>
+      </w:r>
+      <w:r>
+        <w:t xml:space="preserve">H3N2-than-H1N1 Mantel correlations in this strain panel, while the</w:t>
+      </w:r>
+      <w:r>
+        <w:t xml:space="preserve"> </w:t>
+      </w:r>
+      <w:r>
+        <w:t xml:space="preserve">sequence-derived contrasts were smaller.</w:t>
       </w:r>
     </w:p>
     <w:tbl>
@@ -5860,7 +5810,2454 @@
       <w:tr>
         <w:tc>
           <w:tcPr/>
-          <w:bookmarkStart w:id="29" w:name="fig-mltrees"/>
+          <w:bookmarkStart w:id="29" w:name="fig-subtype-contrasts"/>
+          <w:p>
+            <w:pPr>
+              <w:pStyle w:val="Compact"/>
+              <w:jc w:val="center"/>
+            </w:pPr>
+            <w:r>
+              <w:drawing>
+                <wp:inline>
+                  <wp:extent cx="5334000" cy="3048000"/>
+                  <wp:effectExtent b="0" l="0" r="0" t="0"/>
+                  <wp:docPr descr="" title="" id="27" name="Picture"/>
+                  <a:graphic>
+                    <a:graphicData uri="http://schemas.openxmlformats.org/drawingml/2006/picture">
+                      <pic:pic>
+                        <pic:nvPicPr>
+                          <pic:cNvPr descr="../results/Figures/subtype-mantel-contrast-plot.png" id="28" name="Picture"/>
+                          <pic:cNvPicPr>
+                            <a:picLocks noChangeArrowheads="1" noChangeAspect="1"/>
+                          </pic:cNvPicPr>
+                        </pic:nvPicPr>
+                        <pic:blipFill>
+                          <a:blip r:embed="rId26"/>
+                          <a:stretch>
+                            <a:fillRect/>
+                          </a:stretch>
+                        </pic:blipFill>
+                        <pic:spPr bwMode="auto">
+                          <a:xfrm>
+                            <a:off x="0" y="0"/>
+                            <a:ext cx="5334000" cy="3048000"/>
+                          </a:xfrm>
+                          <a:prstGeom prst="rect">
+                            <a:avLst/>
+                          </a:prstGeom>
+                          <a:noFill/>
+                          <a:ln w="9525">
+                            <a:noFill/>
+                            <a:headEnd/>
+                            <a:tailEnd/>
+                          </a:ln>
+                        </pic:spPr>
+                      </pic:pic>
+                    </a:graphicData>
+                  </a:graphic>
+                </wp:inline>
+              </w:drawing>
+            </w:r>
+          </w:p>
+          <w:p>
+            <w:pPr>
+              <w:jc w:val="center"/>
+            </w:pPr>
+            <w:pPr>
+              <w:jc w:val="start"/>
+              <w:spacing w:before="200"/>
+              <w:pStyle w:val="ImageCaption"/>
+            </w:pPr>
+            <w:r>
+              <w:t xml:space="preserve">Figure 2: Subtype contrasts in Mantel correlation between each distance metric and</w:t>
+            </w:r>
+            <w:r>
+              <w:t xml:space="preserve"> </w:t>
+            </w:r>
+            <w:r>
+              <w:t xml:space="preserve">ML-tree cophenetic distance. Points are H3N2 minus H1N1 differences, with</w:t>
+            </w:r>
+            <w:r>
+              <w:t xml:space="preserve"> </w:t>
+            </w:r>
+            <w:r>
+              <w:t xml:space="preserve">95% Bayesian bootstrap intervals over strain units.</w:t>
+            </w:r>
+          </w:p>
+          <w:bookmarkEnd w:id="29"/>
+        </w:tc>
+      </w:tr>
+    </w:tbl>
+    <w:tbl>
+      <w:tblPr>
+        <w:tblStyle w:val="Table"/>
+        <w:tblW w:type="pct" w:w="5000"/>
+        <w:tblLayout w:type="fixed"/>
+        <w:tblLook w:firstRow="0" w:lastRow="0" w:firstColumn="0" w:lastColumn="0" w:noHBand="0" w:noVBand="0" w:val="0000"/>
+      </w:tblPr>
+      <w:tblGrid>
+        <w:gridCol w:w="7920"/>
+      </w:tblGrid>
+      <w:tr>
+        <w:tc>
+          <w:tcPr/>
+          <w:bookmarkStart w:id="30" w:name="tbl-subtype-contrasts"/>
+          <w:p>
+            <w:pPr>
+              <w:jc w:val="center"/>
+            </w:pPr>
+            <w:pPr>
+              <w:jc w:val="start"/>
+              <w:spacing w:before="200"/>
+              <w:pStyle w:val="ImageCaption"/>
+            </w:pPr>
+            <w:r>
+              <w:t xml:space="preserve">Table 2: H1N1 and H3N2 Mantel correlations and their subtype contrast for each distance metric. Differences are H3N2 minus H1N1. Intervals are Bayesian bootstrap 95% intervals over strain units.</w:t>
+            </w:r>
+          </w:p>
+          <w:tbl xmlns:w="http://schemas.openxmlformats.org/wordprocessingml/2006/main" xmlns:r="http://schemas.openxmlformats.org/officeDocument/2006/relationships" xmlns:w14="http://schemas.microsoft.com/office/word/2010/wordml" xmlns:wp="http://schemas.openxmlformats.org/drawingml/2006/wordprocessingDrawing" xmlns:a="http://schemas.openxmlformats.org/drawingml/2006/main" xmlns:pic="http://schemas.openxmlformats.org/drawingml/2006/picture">
+            <w:tblPr>
+              <w:tblLayout w:type="fixed"/>
+              <w:jc w:val="center"/>
+              <w:tblLook w:firstRow="1" w:lastRow="0" w:firstColumn="0" w:lastColumn="0" w:noHBand="0" w:noVBand="1"/>
+            </w:tblPr>
+            <w:tblGrid>
+              <w:gridCol w:w="2551"/>
+              <w:gridCol w:w="3149"/>
+              <w:gridCol w:w="3149"/>
+              <w:gridCol w:w="1829"/>
+              <w:gridCol w:w="1829"/>
+              <w:gridCol w:w="2941"/>
+              <w:gridCol w:w="1682"/>
+              <w:gridCol w:w="2000"/>
+            </w:tblGrid>
+            <w:tr>
+              <w:trPr>
+                <w:trHeight w:val="617" w:hRule="auto"/>
+                <w:tblHeader/>
+              </w:trPr>
+              <w:tc>
+                <w:tcPr>
+                  <w:tcBorders>
+                    <w:bottom w:val="single" w:sz="12" w:space="0" w:color="666666"/>
+                    <w:top w:val="single" w:sz="12" w:space="0" w:color="666666"/>
+                    <w:left w:val="none" w:sz="0" w:space="0" w:color="000000"/>
+                    <w:right w:val="none" w:sz="0" w:space="0" w:color="000000"/>
+                  </w:tcBorders>
+                  <w:shd w:val="clear" w:color="auto" w:fill="FFFFFF"/>
+                  <w:tcMar>
+                    <w:top w:w="0" w:type="dxa"/>
+                    <w:bottom w:w="0" w:type="dxa"/>
+                    <w:left w:w="0" w:type="dxa"/>
+                    <w:right w:w="0" w:type="dxa"/>
+                  </w:tcMar>
+                  <w:vAlign w:val="center"/>
+                </w:tcPr>
+                <w:p>
+                  <w:pPr>
+                    <w:jc w:val="left"/>
+                    <w:pBdr>
+                      <w:bottom w:val="none" w:sz="0" w:space="0" w:color="000000"/>
+                      <w:top w:val="none" w:sz="0" w:space="0" w:color="000000"/>
+                      <w:left w:val="none" w:sz="0" w:space="0" w:color="000000"/>
+                      <w:right w:val="none" w:sz="0" w:space="0" w:color="000000"/>
+                    </w:pBdr>
+                    <w:spacing w:after="100" w:before="100" w:line="240"/>
+                    <w:ind w:left="100" w:right="100" w:firstLine="0" w:firstLineChars="0"/>
+                    <w:rPr>
+                      <w:rFonts w:ascii="Arial" w:hAnsi="Arial" w:eastAsia="Arial" w:cs="Arial"/>
+                      <w:i w:val="false"/>
+                      <w:b w:val="false"/>
+                      <w:u w:val="none"/>
+                      <w:strike w:val="false"/>
+                      <w:sz w:val="22"/>
+                      <w:szCs w:val="22"/>
+                      <w:color w:val="000000"/>
+                    </w:rPr>
+                  </w:pPr>
+                  <w:r xmlns:w="http://schemas.openxmlformats.org/wordprocessingml/2006/main" xmlns:wp="http://schemas.openxmlformats.org/drawingml/2006/wordprocessingDrawing" xmlns:r="http://schemas.openxmlformats.org/officeDocument/2006/relationships" xmlns:w14="http://schemas.microsoft.com/office/word/2010/wordml">
+                    <w:rPr>
+                      <w:rFonts w:ascii="Arial" w:hAnsi="Arial" w:eastAsia="Arial" w:cs="Arial"/>
+                      <w:i w:val="false"/>
+                      <w:b w:val="false"/>
+                      <w:u w:val="none"/>
+                      <w:strike w:val="false"/>
+                      <w:sz w:val="22"/>
+                      <w:szCs w:val="22"/>
+                      <w:color w:val="000000"/>
+                    </w:rPr>
+                    <w:t xml:space="preserve">Comparison</w:t>
+                  </w:r>
+                </w:p>
+              </w:tc>
+              <w:tc>
+                <w:tcPr>
+                  <w:tcBorders>
+                    <w:bottom w:val="single" w:sz="12" w:space="0" w:color="666666"/>
+                    <w:top w:val="single" w:sz="12" w:space="0" w:color="666666"/>
+                    <w:left w:val="none" w:sz="0" w:space="0" w:color="000000"/>
+                    <w:right w:val="none" w:sz="0" w:space="0" w:color="000000"/>
+                  </w:tcBorders>
+                  <w:shd w:val="clear" w:color="auto" w:fill="FFFFFF"/>
+                  <w:tcMar>
+                    <w:top w:w="0" w:type="dxa"/>
+                    <w:bottom w:w="0" w:type="dxa"/>
+                    <w:left w:w="0" w:type="dxa"/>
+                    <w:right w:w="0" w:type="dxa"/>
+                  </w:tcMar>
+                  <w:vAlign w:val="center"/>
+                </w:tcPr>
+                <w:p>
+                  <w:pPr>
+                    <w:jc w:val="right"/>
+                    <w:pBdr>
+                      <w:bottom w:val="none" w:sz="0" w:space="0" w:color="000000"/>
+                      <w:top w:val="none" w:sz="0" w:space="0" w:color="000000"/>
+                      <w:left w:val="none" w:sz="0" w:space="0" w:color="000000"/>
+                      <w:right w:val="none" w:sz="0" w:space="0" w:color="000000"/>
+                    </w:pBdr>
+                    <w:spacing w:after="100" w:before="100" w:line="240"/>
+                    <w:ind w:left="100" w:right="100" w:firstLine="0" w:firstLineChars="0"/>
+                    <w:rPr>
+                      <w:rFonts w:ascii="Arial" w:hAnsi="Arial" w:eastAsia="Arial" w:cs="Arial"/>
+                      <w:i w:val="false"/>
+                      <w:b w:val="false"/>
+                      <w:u w:val="none"/>
+                      <w:strike w:val="false"/>
+                      <w:sz w:val="22"/>
+                      <w:szCs w:val="22"/>
+                      <w:color w:val="000000"/>
+                    </w:rPr>
+                  </w:pPr>
+                  <w:r xmlns:w="http://schemas.openxmlformats.org/wordprocessingml/2006/main" xmlns:wp="http://schemas.openxmlformats.org/drawingml/2006/wordprocessingDrawing" xmlns:r="http://schemas.openxmlformats.org/officeDocument/2006/relationships" xmlns:w14="http://schemas.microsoft.com/office/word/2010/wordml">
+                    <w:rPr>
+                      <w:rFonts w:ascii="Arial" w:hAnsi="Arial" w:eastAsia="Arial" w:cs="Arial"/>
+                      <w:i w:val="false"/>
+                      <w:b w:val="false"/>
+                      <w:u w:val="none"/>
+                      <w:strike w:val="false"/>
+                      <w:sz w:val="22"/>
+                      <w:szCs w:val="22"/>
+                      <w:color w:val="000000"/>
+                    </w:rPr>
+                    <w:t xml:space="preserve">H1N1 pairwise comparisons</w:t>
+                  </w:r>
+                </w:p>
+              </w:tc>
+              <w:tc>
+                <w:tcPr>
+                  <w:tcBorders>
+                    <w:bottom w:val="single" w:sz="12" w:space="0" w:color="666666"/>
+                    <w:top w:val="single" w:sz="12" w:space="0" w:color="666666"/>
+                    <w:left w:val="none" w:sz="0" w:space="0" w:color="000000"/>
+                    <w:right w:val="none" w:sz="0" w:space="0" w:color="000000"/>
+                  </w:tcBorders>
+                  <w:shd w:val="clear" w:color="auto" w:fill="FFFFFF"/>
+                  <w:tcMar>
+                    <w:top w:w="0" w:type="dxa"/>
+                    <w:bottom w:w="0" w:type="dxa"/>
+                    <w:left w:w="0" w:type="dxa"/>
+                    <w:right w:w="0" w:type="dxa"/>
+                  </w:tcMar>
+                  <w:vAlign w:val="center"/>
+                </w:tcPr>
+                <w:p>
+                  <w:pPr>
+                    <w:jc w:val="right"/>
+                    <w:pBdr>
+                      <w:bottom w:val="none" w:sz="0" w:space="0" w:color="000000"/>
+                      <w:top w:val="none" w:sz="0" w:space="0" w:color="000000"/>
+                      <w:left w:val="none" w:sz="0" w:space="0" w:color="000000"/>
+                      <w:right w:val="none" w:sz="0" w:space="0" w:color="000000"/>
+                    </w:pBdr>
+                    <w:spacing w:after="100" w:before="100" w:line="240"/>
+                    <w:ind w:left="100" w:right="100" w:firstLine="0" w:firstLineChars="0"/>
+                    <w:rPr>
+                      <w:rFonts w:ascii="Arial" w:hAnsi="Arial" w:eastAsia="Arial" w:cs="Arial"/>
+                      <w:i w:val="false"/>
+                      <w:b w:val="false"/>
+                      <w:u w:val="none"/>
+                      <w:strike w:val="false"/>
+                      <w:sz w:val="22"/>
+                      <w:szCs w:val="22"/>
+                      <w:color w:val="000000"/>
+                    </w:rPr>
+                  </w:pPr>
+                  <w:r xmlns:w="http://schemas.openxmlformats.org/wordprocessingml/2006/main" xmlns:wp="http://schemas.openxmlformats.org/drawingml/2006/wordprocessingDrawing" xmlns:r="http://schemas.openxmlformats.org/officeDocument/2006/relationships" xmlns:w14="http://schemas.microsoft.com/office/word/2010/wordml">
+                    <w:rPr>
+                      <w:rFonts w:ascii="Arial" w:hAnsi="Arial" w:eastAsia="Arial" w:cs="Arial"/>
+                      <w:i w:val="false"/>
+                      <w:b w:val="false"/>
+                      <w:u w:val="none"/>
+                      <w:strike w:val="false"/>
+                      <w:sz w:val="22"/>
+                      <w:szCs w:val="22"/>
+                      <w:color w:val="000000"/>
+                    </w:rPr>
+                    <w:t xml:space="preserve">H3N2 pairwise comparisons</w:t>
+                  </w:r>
+                </w:p>
+              </w:tc>
+              <w:tc>
+                <w:tcPr>
+                  <w:tcBorders>
+                    <w:bottom w:val="single" w:sz="12" w:space="0" w:color="666666"/>
+                    <w:top w:val="single" w:sz="12" w:space="0" w:color="666666"/>
+                    <w:left w:val="none" w:sz="0" w:space="0" w:color="000000"/>
+                    <w:right w:val="none" w:sz="0" w:space="0" w:color="000000"/>
+                  </w:tcBorders>
+                  <w:shd w:val="clear" w:color="auto" w:fill="FFFFFF"/>
+                  <w:tcMar>
+                    <w:top w:w="0" w:type="dxa"/>
+                    <w:bottom w:w="0" w:type="dxa"/>
+                    <w:left w:w="0" w:type="dxa"/>
+                    <w:right w:w="0" w:type="dxa"/>
+                  </w:tcMar>
+                  <w:vAlign w:val="center"/>
+                </w:tcPr>
+                <w:p>
+                  <w:pPr>
+                    <w:jc w:val="left"/>
+                    <w:pBdr>
+                      <w:bottom w:val="none" w:sz="0" w:space="0" w:color="000000"/>
+                      <w:top w:val="none" w:sz="0" w:space="0" w:color="000000"/>
+                      <w:left w:val="none" w:sz="0" w:space="0" w:color="000000"/>
+                      <w:right w:val="none" w:sz="0" w:space="0" w:color="000000"/>
+                    </w:pBdr>
+                    <w:spacing w:after="100" w:before="100" w:line="240"/>
+                    <w:ind w:left="100" w:right="100" w:firstLine="0" w:firstLineChars="0"/>
+                    <w:rPr>
+                      <w:rFonts w:ascii="Arial" w:hAnsi="Arial" w:eastAsia="Arial" w:cs="Arial"/>
+                      <w:i w:val="false"/>
+                      <w:b w:val="false"/>
+                      <w:u w:val="none"/>
+                      <w:strike w:val="false"/>
+                      <w:sz w:val="22"/>
+                      <w:szCs w:val="22"/>
+                      <w:color w:val="000000"/>
+                    </w:rPr>
+                  </w:pPr>
+                  <w:r xmlns:w="http://schemas.openxmlformats.org/wordprocessingml/2006/main" xmlns:wp="http://schemas.openxmlformats.org/drawingml/2006/wordprocessingDrawing" xmlns:r="http://schemas.openxmlformats.org/officeDocument/2006/relationships" xmlns:w14="http://schemas.microsoft.com/office/word/2010/wordml">
+                    <w:rPr>
+                      <w:rFonts w:ascii="Arial" w:hAnsi="Arial" w:eastAsia="Arial" w:cs="Arial"/>
+                      <w:i w:val="false"/>
+                      <w:b w:val="false"/>
+                      <w:u w:val="none"/>
+                      <w:strike w:val="false"/>
+                      <w:sz w:val="22"/>
+                      <w:szCs w:val="22"/>
+                      <w:color w:val="000000"/>
+                    </w:rPr>
+                    <w:t xml:space="preserve">H1N1 Mantel r</w:t>
+                  </w:r>
+                </w:p>
+              </w:tc>
+              <w:tc>
+                <w:tcPr>
+                  <w:tcBorders>
+                    <w:bottom w:val="single" w:sz="12" w:space="0" w:color="666666"/>
+                    <w:top w:val="single" w:sz="12" w:space="0" w:color="666666"/>
+                    <w:left w:val="none" w:sz="0" w:space="0" w:color="000000"/>
+                    <w:right w:val="none" w:sz="0" w:space="0" w:color="000000"/>
+                  </w:tcBorders>
+                  <w:shd w:val="clear" w:color="auto" w:fill="FFFFFF"/>
+                  <w:tcMar>
+                    <w:top w:w="0" w:type="dxa"/>
+                    <w:bottom w:w="0" w:type="dxa"/>
+                    <w:left w:w="0" w:type="dxa"/>
+                    <w:right w:w="0" w:type="dxa"/>
+                  </w:tcMar>
+                  <w:vAlign w:val="center"/>
+                </w:tcPr>
+                <w:p>
+                  <w:pPr>
+                    <w:jc w:val="left"/>
+                    <w:pBdr>
+                      <w:bottom w:val="none" w:sz="0" w:space="0" w:color="000000"/>
+                      <w:top w:val="none" w:sz="0" w:space="0" w:color="000000"/>
+                      <w:left w:val="none" w:sz="0" w:space="0" w:color="000000"/>
+                      <w:right w:val="none" w:sz="0" w:space="0" w:color="000000"/>
+                    </w:pBdr>
+                    <w:spacing w:after="100" w:before="100" w:line="240"/>
+                    <w:ind w:left="100" w:right="100" w:firstLine="0" w:firstLineChars="0"/>
+                    <w:rPr>
+                      <w:rFonts w:ascii="Arial" w:hAnsi="Arial" w:eastAsia="Arial" w:cs="Arial"/>
+                      <w:i w:val="false"/>
+                      <w:b w:val="false"/>
+                      <w:u w:val="none"/>
+                      <w:strike w:val="false"/>
+                      <w:sz w:val="22"/>
+                      <w:szCs w:val="22"/>
+                      <w:color w:val="000000"/>
+                    </w:rPr>
+                  </w:pPr>
+                  <w:r xmlns:w="http://schemas.openxmlformats.org/wordprocessingml/2006/main" xmlns:wp="http://schemas.openxmlformats.org/drawingml/2006/wordprocessingDrawing" xmlns:r="http://schemas.openxmlformats.org/officeDocument/2006/relationships" xmlns:w14="http://schemas.microsoft.com/office/word/2010/wordml">
+                    <w:rPr>
+                      <w:rFonts w:ascii="Arial" w:hAnsi="Arial" w:eastAsia="Arial" w:cs="Arial"/>
+                      <w:i w:val="false"/>
+                      <w:b w:val="false"/>
+                      <w:u w:val="none"/>
+                      <w:strike w:val="false"/>
+                      <w:sz w:val="22"/>
+                      <w:szCs w:val="22"/>
+                      <w:color w:val="000000"/>
+                    </w:rPr>
+                    <w:t xml:space="preserve">H3N2 Mantel r</w:t>
+                  </w:r>
+                </w:p>
+              </w:tc>
+              <w:tc>
+                <w:tcPr>
+                  <w:tcBorders>
+                    <w:bottom w:val="single" w:sz="12" w:space="0" w:color="666666"/>
+                    <w:top w:val="single" w:sz="12" w:space="0" w:color="666666"/>
+                    <w:left w:val="none" w:sz="0" w:space="0" w:color="000000"/>
+                    <w:right w:val="none" w:sz="0" w:space="0" w:color="000000"/>
+                  </w:tcBorders>
+                  <w:shd w:val="clear" w:color="auto" w:fill="FFFFFF"/>
+                  <w:tcMar>
+                    <w:top w:w="0" w:type="dxa"/>
+                    <w:bottom w:w="0" w:type="dxa"/>
+                    <w:left w:w="0" w:type="dxa"/>
+                    <w:right w:w="0" w:type="dxa"/>
+                  </w:tcMar>
+                  <w:vAlign w:val="center"/>
+                </w:tcPr>
+                <w:p>
+                  <w:pPr>
+                    <w:jc w:val="left"/>
+                    <w:pBdr>
+                      <w:bottom w:val="none" w:sz="0" w:space="0" w:color="000000"/>
+                      <w:top w:val="none" w:sz="0" w:space="0" w:color="000000"/>
+                      <w:left w:val="none" w:sz="0" w:space="0" w:color="000000"/>
+                      <w:right w:val="none" w:sz="0" w:space="0" w:color="000000"/>
+                    </w:pBdr>
+                    <w:spacing w:after="100" w:before="100" w:line="240"/>
+                    <w:ind w:left="100" w:right="100" w:firstLine="0" w:firstLineChars="0"/>
+                    <w:rPr>
+                      <w:rFonts w:ascii="Arial" w:hAnsi="Arial" w:eastAsia="Arial" w:cs="Arial"/>
+                      <w:i w:val="false"/>
+                      <w:b w:val="false"/>
+                      <w:u w:val="none"/>
+                      <w:strike w:val="false"/>
+                      <w:sz w:val="22"/>
+                      <w:szCs w:val="22"/>
+                      <w:color w:val="000000"/>
+                    </w:rPr>
+                  </w:pPr>
+                  <w:r xmlns:w="http://schemas.openxmlformats.org/wordprocessingml/2006/main" xmlns:wp="http://schemas.openxmlformats.org/drawingml/2006/wordprocessingDrawing" xmlns:r="http://schemas.openxmlformats.org/officeDocument/2006/relationships" xmlns:w14="http://schemas.microsoft.com/office/word/2010/wordml">
+                    <w:rPr>
+                      <w:rFonts w:ascii="Arial" w:hAnsi="Arial" w:eastAsia="Arial" w:cs="Arial"/>
+                      <w:i w:val="false"/>
+                      <w:b w:val="false"/>
+                      <w:u w:val="none"/>
+                      <w:strike w:val="false"/>
+                      <w:sz w:val="22"/>
+                      <w:szCs w:val="22"/>
+                      <w:color w:val="000000"/>
+                    </w:rPr>
+                    <w:t xml:space="preserve">Difference (H3N2 - H1N1)</w:t>
+                  </w:r>
+                </w:p>
+              </w:tc>
+              <w:tc>
+                <w:tcPr>
+                  <w:tcBorders>
+                    <w:bottom w:val="single" w:sz="12" w:space="0" w:color="666666"/>
+                    <w:top w:val="single" w:sz="12" w:space="0" w:color="666666"/>
+                    <w:left w:val="none" w:sz="0" w:space="0" w:color="000000"/>
+                    <w:right w:val="none" w:sz="0" w:space="0" w:color="000000"/>
+                  </w:tcBorders>
+                  <w:shd w:val="clear" w:color="auto" w:fill="FFFFFF"/>
+                  <w:tcMar>
+                    <w:top w:w="0" w:type="dxa"/>
+                    <w:bottom w:w="0" w:type="dxa"/>
+                    <w:left w:w="0" w:type="dxa"/>
+                    <w:right w:w="0" w:type="dxa"/>
+                  </w:tcMar>
+                  <w:vAlign w:val="center"/>
+                </w:tcPr>
+                <w:p>
+                  <w:pPr>
+                    <w:jc w:val="left"/>
+                    <w:pBdr>
+                      <w:bottom w:val="none" w:sz="0" w:space="0" w:color="000000"/>
+                      <w:top w:val="none" w:sz="0" w:space="0" w:color="000000"/>
+                      <w:left w:val="none" w:sz="0" w:space="0" w:color="000000"/>
+                      <w:right w:val="none" w:sz="0" w:space="0" w:color="000000"/>
+                    </w:pBdr>
+                    <w:spacing w:after="100" w:before="100" w:line="240"/>
+                    <w:ind w:left="100" w:right="100" w:firstLine="0" w:firstLineChars="0"/>
+                    <w:rPr>
+                      <w:rFonts w:ascii="Arial" w:hAnsi="Arial" w:eastAsia="Arial" w:cs="Arial"/>
+                      <w:i w:val="false"/>
+                      <w:b w:val="false"/>
+                      <w:u w:val="none"/>
+                      <w:strike w:val="false"/>
+                      <w:sz w:val="22"/>
+                      <w:szCs w:val="22"/>
+                      <w:color w:val="000000"/>
+                    </w:rPr>
+                  </w:pPr>
+                  <w:r xmlns:w="http://schemas.openxmlformats.org/wordprocessingml/2006/main" xmlns:wp="http://schemas.openxmlformats.org/drawingml/2006/wordprocessingDrawing" xmlns:r="http://schemas.openxmlformats.org/officeDocument/2006/relationships" xmlns:w14="http://schemas.microsoft.com/office/word/2010/wordml">
+                    <w:rPr>
+                      <w:rFonts w:ascii="Arial" w:hAnsi="Arial" w:eastAsia="Arial" w:cs="Arial"/>
+                      <w:i w:val="false"/>
+                      <w:b w:val="false"/>
+                      <w:u w:val="none"/>
+                      <w:strike w:val="false"/>
+                      <w:sz w:val="22"/>
+                      <w:szCs w:val="22"/>
+                      <w:color w:val="000000"/>
+                    </w:rPr>
+                    <w:t xml:space="preserve">95% CI</w:t>
+                  </w:r>
+                </w:p>
+              </w:tc>
+              <w:tc>
+                <w:tcPr>
+                  <w:tcBorders>
+                    <w:bottom w:val="single" w:sz="12" w:space="0" w:color="666666"/>
+                    <w:top w:val="single" w:sz="12" w:space="0" w:color="666666"/>
+                    <w:left w:val="none" w:sz="0" w:space="0" w:color="000000"/>
+                    <w:right w:val="none" w:sz="0" w:space="0" w:color="000000"/>
+                  </w:tcBorders>
+                  <w:shd w:val="clear" w:color="auto" w:fill="FFFFFF"/>
+                  <w:tcMar>
+                    <w:top w:w="0" w:type="dxa"/>
+                    <w:bottom w:w="0" w:type="dxa"/>
+                    <w:left w:w="0" w:type="dxa"/>
+                    <w:right w:w="0" w:type="dxa"/>
+                  </w:tcMar>
+                  <w:vAlign w:val="center"/>
+                </w:tcPr>
+                <w:p>
+                  <w:pPr>
+                    <w:jc w:val="right"/>
+                    <w:pBdr>
+                      <w:bottom w:val="none" w:sz="0" w:space="0" w:color="000000"/>
+                      <w:top w:val="none" w:sz="0" w:space="0" w:color="000000"/>
+                      <w:left w:val="none" w:sz="0" w:space="0" w:color="000000"/>
+                      <w:right w:val="none" w:sz="0" w:space="0" w:color="000000"/>
+                    </w:pBdr>
+                    <w:spacing w:after="100" w:before="100" w:line="240"/>
+                    <w:ind w:left="100" w:right="100" w:firstLine="0" w:firstLineChars="0"/>
+                    <w:rPr>
+                      <w:rFonts w:ascii="Arial" w:hAnsi="Arial" w:eastAsia="Arial" w:cs="Arial"/>
+                      <w:i w:val="false"/>
+                      <w:b w:val="false"/>
+                      <w:u w:val="none"/>
+                      <w:strike w:val="false"/>
+                      <w:sz w:val="22"/>
+                      <w:szCs w:val="22"/>
+                      <w:color w:val="000000"/>
+                    </w:rPr>
+                  </w:pPr>
+                  <w:r xmlns:w="http://schemas.openxmlformats.org/wordprocessingml/2006/main" xmlns:wp="http://schemas.openxmlformats.org/drawingml/2006/wordprocessingDrawing" xmlns:r="http://schemas.openxmlformats.org/officeDocument/2006/relationships" xmlns:w14="http://schemas.microsoft.com/office/word/2010/wordml">
+                    <w:rPr>
+                      <w:rFonts w:ascii="Arial" w:hAnsi="Arial" w:eastAsia="Arial" w:cs="Arial"/>
+                      <w:i w:val="false"/>
+                      <w:b w:val="false"/>
+                      <w:u w:val="none"/>
+                      <w:strike w:val="false"/>
+                      <w:sz w:val="22"/>
+                      <w:szCs w:val="22"/>
+                      <w:color w:val="000000"/>
+                    </w:rPr>
+                    <w:t xml:space="preserve">Bootstrap draws</w:t>
+                  </w:r>
+                </w:p>
+              </w:tc>
+            </w:tr>
+            <w:tr>
+              <w:trPr>
+                <w:trHeight w:val="617" w:hRule="auto"/>
+              </w:trPr>
+              <w:tc>
+                <w:tcPr>
+                  <w:tcBorders>
+                    <w:bottom w:val="none" w:sz="0" w:space="0" w:color="000000"/>
+                    <w:top w:val="single" w:sz="12" w:space="0" w:color="666666"/>
+                    <w:left w:val="none" w:sz="0" w:space="0" w:color="000000"/>
+                    <w:right w:val="none" w:sz="0" w:space="0" w:color="000000"/>
+                  </w:tcBorders>
+                  <w:shd w:val="clear" w:color="auto" w:fill="FFFFFF"/>
+                  <w:tcMar>
+                    <w:top w:w="0" w:type="dxa"/>
+                    <w:bottom w:w="0" w:type="dxa"/>
+                    <w:left w:w="0" w:type="dxa"/>
+                    <w:right w:w="0" w:type="dxa"/>
+                  </w:tcMar>
+                  <w:vAlign w:val="center"/>
+                </w:tcPr>
+                <w:p>
+                  <w:pPr>
+                    <w:jc w:val="left"/>
+                    <w:pBdr>
+                      <w:bottom w:val="none" w:sz="0" w:space="0" w:color="000000"/>
+                      <w:top w:val="none" w:sz="0" w:space="0" w:color="000000"/>
+                      <w:left w:val="none" w:sz="0" w:space="0" w:color="000000"/>
+                      <w:right w:val="none" w:sz="0" w:space="0" w:color="000000"/>
+                    </w:pBdr>
+                    <w:spacing w:after="100" w:before="100" w:line="240"/>
+                    <w:ind w:left="100" w:right="100" w:firstLine="0" w:firstLineChars="0"/>
+                    <w:rPr>
+                      <w:rFonts w:ascii="Arial" w:hAnsi="Arial" w:eastAsia="Arial" w:cs="Arial"/>
+                      <w:i w:val="false"/>
+                      <w:b w:val="false"/>
+                      <w:u w:val="none"/>
+                      <w:strike w:val="false"/>
+                      <w:sz w:val="22"/>
+                      <w:szCs w:val="22"/>
+                      <w:color w:val="000000"/>
+                    </w:rPr>
+                  </w:pPr>
+                  <w:r xmlns:w="http://schemas.openxmlformats.org/wordprocessingml/2006/main" xmlns:wp="http://schemas.openxmlformats.org/drawingml/2006/wordprocessingDrawing" xmlns:r="http://schemas.openxmlformats.org/officeDocument/2006/relationships" xmlns:w14="http://schemas.microsoft.com/office/word/2010/wordml">
+                    <w:rPr>
+                      <w:rFonts w:ascii="Arial" w:hAnsi="Arial" w:eastAsia="Arial" w:cs="Arial"/>
+                      <w:i w:val="false"/>
+                      <w:b w:val="false"/>
+                      <w:u w:val="none"/>
+                      <w:strike w:val="false"/>
+                      <w:sz w:val="22"/>
+                      <w:szCs w:val="22"/>
+                      <w:color w:val="000000"/>
+                    </w:rPr>
+                    <w:t xml:space="preserve">Temporal distance</w:t>
+                  </w:r>
+                </w:p>
+              </w:tc>
+              <w:tc>
+                <w:tcPr>
+                  <w:tcBorders>
+                    <w:bottom w:val="none" w:sz="0" w:space="0" w:color="000000"/>
+                    <w:top w:val="single" w:sz="12" w:space="0" w:color="666666"/>
+                    <w:left w:val="none" w:sz="0" w:space="0" w:color="000000"/>
+                    <w:right w:val="none" w:sz="0" w:space="0" w:color="000000"/>
+                  </w:tcBorders>
+                  <w:shd w:val="clear" w:color="auto" w:fill="FFFFFF"/>
+                  <w:tcMar>
+                    <w:top w:w="0" w:type="dxa"/>
+                    <w:bottom w:w="0" w:type="dxa"/>
+                    <w:left w:w="0" w:type="dxa"/>
+                    <w:right w:w="0" w:type="dxa"/>
+                  </w:tcMar>
+                  <w:vAlign w:val="center"/>
+                </w:tcPr>
+                <w:p>
+                  <w:pPr>
+                    <w:jc w:val="right"/>
+                    <w:pBdr>
+                      <w:bottom w:val="none" w:sz="0" w:space="0" w:color="000000"/>
+                      <w:top w:val="none" w:sz="0" w:space="0" w:color="000000"/>
+                      <w:left w:val="none" w:sz="0" w:space="0" w:color="000000"/>
+                      <w:right w:val="none" w:sz="0" w:space="0" w:color="000000"/>
+                    </w:pBdr>
+                    <w:spacing w:after="100" w:before="100" w:line="240"/>
+                    <w:ind w:left="100" w:right="100" w:firstLine="0" w:firstLineChars="0"/>
+                    <w:rPr>
+                      <w:rFonts w:ascii="Arial" w:hAnsi="Arial" w:eastAsia="Arial" w:cs="Arial"/>
+                      <w:i w:val="false"/>
+                      <w:b w:val="false"/>
+                      <w:u w:val="none"/>
+                      <w:strike w:val="false"/>
+                      <w:sz w:val="22"/>
+                      <w:szCs w:val="22"/>
+                      <w:color w:val="000000"/>
+                    </w:rPr>
+                  </w:pPr>
+                  <w:r xmlns:w="http://schemas.openxmlformats.org/wordprocessingml/2006/main" xmlns:wp="http://schemas.openxmlformats.org/drawingml/2006/wordprocessingDrawing" xmlns:r="http://schemas.openxmlformats.org/officeDocument/2006/relationships" xmlns:w14="http://schemas.microsoft.com/office/word/2010/wordml">
+                    <w:rPr>
+                      <w:rFonts w:ascii="Arial" w:hAnsi="Arial" w:eastAsia="Arial" w:cs="Arial"/>
+                      <w:i w:val="false"/>
+                      <w:b w:val="false"/>
+                      <w:u w:val="none"/>
+                      <w:strike w:val="false"/>
+                      <w:sz w:val="22"/>
+                      <w:szCs w:val="22"/>
+                      <w:color w:val="000000"/>
+                    </w:rPr>
+                    <w:t xml:space="preserve">153</w:t>
+                  </w:r>
+                </w:p>
+              </w:tc>
+              <w:tc>
+                <w:tcPr>
+                  <w:tcBorders>
+                    <w:bottom w:val="none" w:sz="0" w:space="0" w:color="000000"/>
+                    <w:top w:val="single" w:sz="12" w:space="0" w:color="666666"/>
+                    <w:left w:val="none" w:sz="0" w:space="0" w:color="000000"/>
+                    <w:right w:val="none" w:sz="0" w:space="0" w:color="000000"/>
+                  </w:tcBorders>
+                  <w:shd w:val="clear" w:color="auto" w:fill="FFFFFF"/>
+                  <w:tcMar>
+                    <w:top w:w="0" w:type="dxa"/>
+                    <w:bottom w:w="0" w:type="dxa"/>
+                    <w:left w:w="0" w:type="dxa"/>
+                    <w:right w:w="0" w:type="dxa"/>
+                  </w:tcMar>
+                  <w:vAlign w:val="center"/>
+                </w:tcPr>
+                <w:p>
+                  <w:pPr>
+                    <w:jc w:val="right"/>
+                    <w:pBdr>
+                      <w:bottom w:val="none" w:sz="0" w:space="0" w:color="000000"/>
+                      <w:top w:val="none" w:sz="0" w:space="0" w:color="000000"/>
+                      <w:left w:val="none" w:sz="0" w:space="0" w:color="000000"/>
+                      <w:right w:val="none" w:sz="0" w:space="0" w:color="000000"/>
+                    </w:pBdr>
+                    <w:spacing w:after="100" w:before="100" w:line="240"/>
+                    <w:ind w:left="100" w:right="100" w:firstLine="0" w:firstLineChars="0"/>
+                    <w:rPr>
+                      <w:rFonts w:ascii="Arial" w:hAnsi="Arial" w:eastAsia="Arial" w:cs="Arial"/>
+                      <w:i w:val="false"/>
+                      <w:b w:val="false"/>
+                      <w:u w:val="none"/>
+                      <w:strike w:val="false"/>
+                      <w:sz w:val="22"/>
+                      <w:szCs w:val="22"/>
+                      <w:color w:val="000000"/>
+                    </w:rPr>
+                  </w:pPr>
+                  <w:r xmlns:w="http://schemas.openxmlformats.org/wordprocessingml/2006/main" xmlns:wp="http://schemas.openxmlformats.org/drawingml/2006/wordprocessingDrawing" xmlns:r="http://schemas.openxmlformats.org/officeDocument/2006/relationships" xmlns:w14="http://schemas.microsoft.com/office/word/2010/wordml">
+                    <w:rPr>
+                      <w:rFonts w:ascii="Arial" w:hAnsi="Arial" w:eastAsia="Arial" w:cs="Arial"/>
+                      <w:i w:val="false"/>
+                      <w:b w:val="false"/>
+                      <w:u w:val="none"/>
+                      <w:strike w:val="false"/>
+                      <w:sz w:val="22"/>
+                      <w:szCs w:val="22"/>
+                      <w:color w:val="000000"/>
+                    </w:rPr>
+                    <w:t xml:space="preserve">210</w:t>
+                  </w:r>
+                </w:p>
+              </w:tc>
+              <w:tc>
+                <w:tcPr>
+                  <w:tcBorders>
+                    <w:bottom w:val="none" w:sz="0" w:space="0" w:color="000000"/>
+                    <w:top w:val="single" w:sz="12" w:space="0" w:color="666666"/>
+                    <w:left w:val="none" w:sz="0" w:space="0" w:color="000000"/>
+                    <w:right w:val="none" w:sz="0" w:space="0" w:color="000000"/>
+                  </w:tcBorders>
+                  <w:shd w:val="clear" w:color="auto" w:fill="FFFFFF"/>
+                  <w:tcMar>
+                    <w:top w:w="0" w:type="dxa"/>
+                    <w:bottom w:w="0" w:type="dxa"/>
+                    <w:left w:w="0" w:type="dxa"/>
+                    <w:right w:w="0" w:type="dxa"/>
+                  </w:tcMar>
+                  <w:vAlign w:val="center"/>
+                </w:tcPr>
+                <w:p>
+                  <w:pPr>
+                    <w:jc w:val="left"/>
+                    <w:pBdr>
+                      <w:bottom w:val="none" w:sz="0" w:space="0" w:color="000000"/>
+                      <w:top w:val="none" w:sz="0" w:space="0" w:color="000000"/>
+                      <w:left w:val="none" w:sz="0" w:space="0" w:color="000000"/>
+                      <w:right w:val="none" w:sz="0" w:space="0" w:color="000000"/>
+                    </w:pBdr>
+                    <w:spacing w:after="100" w:before="100" w:line="240"/>
+                    <w:ind w:left="100" w:right="100" w:firstLine="0" w:firstLineChars="0"/>
+                    <w:rPr>
+                      <w:rFonts w:ascii="Arial" w:hAnsi="Arial" w:eastAsia="Arial" w:cs="Arial"/>
+                      <w:i w:val="false"/>
+                      <w:b w:val="false"/>
+                      <w:u w:val="none"/>
+                      <w:strike w:val="false"/>
+                      <w:sz w:val="22"/>
+                      <w:szCs w:val="22"/>
+                      <w:color w:val="000000"/>
+                    </w:rPr>
+                  </w:pPr>
+                  <w:r xmlns:w="http://schemas.openxmlformats.org/wordprocessingml/2006/main" xmlns:wp="http://schemas.openxmlformats.org/drawingml/2006/wordprocessingDrawing" xmlns:r="http://schemas.openxmlformats.org/officeDocument/2006/relationships" xmlns:w14="http://schemas.microsoft.com/office/word/2010/wordml">
+                    <w:rPr>
+                      <w:rFonts w:ascii="Arial" w:hAnsi="Arial" w:eastAsia="Arial" w:cs="Arial"/>
+                      <w:i w:val="false"/>
+                      <w:b w:val="false"/>
+                      <w:u w:val="none"/>
+                      <w:strike w:val="false"/>
+                      <w:sz w:val="22"/>
+                      <w:szCs w:val="22"/>
+                      <w:color w:val="000000"/>
+                    </w:rPr>
+                    <w:t xml:space="preserve">0.25</w:t>
+                  </w:r>
+                </w:p>
+              </w:tc>
+              <w:tc>
+                <w:tcPr>
+                  <w:tcBorders>
+                    <w:bottom w:val="none" w:sz="0" w:space="0" w:color="000000"/>
+                    <w:top w:val="single" w:sz="12" w:space="0" w:color="666666"/>
+                    <w:left w:val="none" w:sz="0" w:space="0" w:color="000000"/>
+                    <w:right w:val="none" w:sz="0" w:space="0" w:color="000000"/>
+                  </w:tcBorders>
+                  <w:shd w:val="clear" w:color="auto" w:fill="FFFFFF"/>
+                  <w:tcMar>
+                    <w:top w:w="0" w:type="dxa"/>
+                    <w:bottom w:w="0" w:type="dxa"/>
+                    <w:left w:w="0" w:type="dxa"/>
+                    <w:right w:w="0" w:type="dxa"/>
+                  </w:tcMar>
+                  <w:vAlign w:val="center"/>
+                </w:tcPr>
+                <w:p>
+                  <w:pPr>
+                    <w:jc w:val="left"/>
+                    <w:pBdr>
+                      <w:bottom w:val="none" w:sz="0" w:space="0" w:color="000000"/>
+                      <w:top w:val="none" w:sz="0" w:space="0" w:color="000000"/>
+                      <w:left w:val="none" w:sz="0" w:space="0" w:color="000000"/>
+                      <w:right w:val="none" w:sz="0" w:space="0" w:color="000000"/>
+                    </w:pBdr>
+                    <w:spacing w:after="100" w:before="100" w:line="240"/>
+                    <w:ind w:left="100" w:right="100" w:firstLine="0" w:firstLineChars="0"/>
+                    <w:rPr>
+                      <w:rFonts w:ascii="Arial" w:hAnsi="Arial" w:eastAsia="Arial" w:cs="Arial"/>
+                      <w:i w:val="false"/>
+                      <w:b w:val="false"/>
+                      <w:u w:val="none"/>
+                      <w:strike w:val="false"/>
+                      <w:sz w:val="22"/>
+                      <w:szCs w:val="22"/>
+                      <w:color w:val="000000"/>
+                    </w:rPr>
+                  </w:pPr>
+                  <w:r xmlns:w="http://schemas.openxmlformats.org/wordprocessingml/2006/main" xmlns:wp="http://schemas.openxmlformats.org/drawingml/2006/wordprocessingDrawing" xmlns:r="http://schemas.openxmlformats.org/officeDocument/2006/relationships" xmlns:w14="http://schemas.microsoft.com/office/word/2010/wordml">
+                    <w:rPr>
+                      <w:rFonts w:ascii="Arial" w:hAnsi="Arial" w:eastAsia="Arial" w:cs="Arial"/>
+                      <w:i w:val="false"/>
+                      <w:b w:val="false"/>
+                      <w:u w:val="none"/>
+                      <w:strike w:val="false"/>
+                      <w:sz w:val="22"/>
+                      <w:szCs w:val="22"/>
+                      <w:color w:val="000000"/>
+                    </w:rPr>
+                    <w:t xml:space="preserve">0.99</w:t>
+                  </w:r>
+                </w:p>
+              </w:tc>
+              <w:tc>
+                <w:tcPr>
+                  <w:tcBorders>
+                    <w:bottom w:val="none" w:sz="0" w:space="0" w:color="000000"/>
+                    <w:top w:val="single" w:sz="12" w:space="0" w:color="666666"/>
+                    <w:left w:val="none" w:sz="0" w:space="0" w:color="000000"/>
+                    <w:right w:val="none" w:sz="0" w:space="0" w:color="000000"/>
+                  </w:tcBorders>
+                  <w:shd w:val="clear" w:color="auto" w:fill="FFFFFF"/>
+                  <w:tcMar>
+                    <w:top w:w="0" w:type="dxa"/>
+                    <w:bottom w:w="0" w:type="dxa"/>
+                    <w:left w:w="0" w:type="dxa"/>
+                    <w:right w:w="0" w:type="dxa"/>
+                  </w:tcMar>
+                  <w:vAlign w:val="center"/>
+                </w:tcPr>
+                <w:p>
+                  <w:pPr>
+                    <w:jc w:val="left"/>
+                    <w:pBdr>
+                      <w:bottom w:val="none" w:sz="0" w:space="0" w:color="000000"/>
+                      <w:top w:val="none" w:sz="0" w:space="0" w:color="000000"/>
+                      <w:left w:val="none" w:sz="0" w:space="0" w:color="000000"/>
+                      <w:right w:val="none" w:sz="0" w:space="0" w:color="000000"/>
+                    </w:pBdr>
+                    <w:spacing w:after="100" w:before="100" w:line="240"/>
+                    <w:ind w:left="100" w:right="100" w:firstLine="0" w:firstLineChars="0"/>
+                    <w:rPr>
+                      <w:rFonts w:ascii="Arial" w:hAnsi="Arial" w:eastAsia="Arial" w:cs="Arial"/>
+                      <w:i w:val="false"/>
+                      <w:b w:val="false"/>
+                      <w:u w:val="none"/>
+                      <w:strike w:val="false"/>
+                      <w:sz w:val="22"/>
+                      <w:szCs w:val="22"/>
+                      <w:color w:val="000000"/>
+                    </w:rPr>
+                  </w:pPr>
+                  <w:r xmlns:w="http://schemas.openxmlformats.org/wordprocessingml/2006/main" xmlns:wp="http://schemas.openxmlformats.org/drawingml/2006/wordprocessingDrawing" xmlns:r="http://schemas.openxmlformats.org/officeDocument/2006/relationships" xmlns:w14="http://schemas.microsoft.com/office/word/2010/wordml">
+                    <w:rPr>
+                      <w:rFonts w:ascii="Arial" w:hAnsi="Arial" w:eastAsia="Arial" w:cs="Arial"/>
+                      <w:i w:val="false"/>
+                      <w:b w:val="false"/>
+                      <w:u w:val="none"/>
+                      <w:strike w:val="false"/>
+                      <w:sz w:val="22"/>
+                      <w:szCs w:val="22"/>
+                      <w:color w:val="000000"/>
+                    </w:rPr>
+                    <w:t xml:space="preserve">0.74</w:t>
+                  </w:r>
+                </w:p>
+              </w:tc>
+              <w:tc>
+                <w:tcPr>
+                  <w:tcBorders>
+                    <w:bottom w:val="none" w:sz="0" w:space="0" w:color="000000"/>
+                    <w:top w:val="single" w:sz="12" w:space="0" w:color="666666"/>
+                    <w:left w:val="none" w:sz="0" w:space="0" w:color="000000"/>
+                    <w:right w:val="none" w:sz="0" w:space="0" w:color="000000"/>
+                  </w:tcBorders>
+                  <w:shd w:val="clear" w:color="auto" w:fill="FFFFFF"/>
+                  <w:tcMar>
+                    <w:top w:w="0" w:type="dxa"/>
+                    <w:bottom w:w="0" w:type="dxa"/>
+                    <w:left w:w="0" w:type="dxa"/>
+                    <w:right w:w="0" w:type="dxa"/>
+                  </w:tcMar>
+                  <w:vAlign w:val="center"/>
+                </w:tcPr>
+                <w:p>
+                  <w:pPr>
+                    <w:jc w:val="left"/>
+                    <w:pBdr>
+                      <w:bottom w:val="none" w:sz="0" w:space="0" w:color="000000"/>
+                      <w:top w:val="none" w:sz="0" w:space="0" w:color="000000"/>
+                      <w:left w:val="none" w:sz="0" w:space="0" w:color="000000"/>
+                      <w:right w:val="none" w:sz="0" w:space="0" w:color="000000"/>
+                    </w:pBdr>
+                    <w:spacing w:after="100" w:before="100" w:line="240"/>
+                    <w:ind w:left="100" w:right="100" w:firstLine="0" w:firstLineChars="0"/>
+                    <w:rPr>
+                      <w:rFonts w:ascii="Arial" w:hAnsi="Arial" w:eastAsia="Arial" w:cs="Arial"/>
+                      <w:i w:val="false"/>
+                      <w:b w:val="false"/>
+                      <w:u w:val="none"/>
+                      <w:strike w:val="false"/>
+                      <w:sz w:val="22"/>
+                      <w:szCs w:val="22"/>
+                      <w:color w:val="000000"/>
+                    </w:rPr>
+                  </w:pPr>
+                  <w:r xmlns:w="http://schemas.openxmlformats.org/wordprocessingml/2006/main" xmlns:wp="http://schemas.openxmlformats.org/drawingml/2006/wordprocessingDrawing" xmlns:r="http://schemas.openxmlformats.org/officeDocument/2006/relationships" xmlns:w14="http://schemas.microsoft.com/office/word/2010/wordml">
+                    <w:rPr>
+                      <w:rFonts w:ascii="Arial" w:hAnsi="Arial" w:eastAsia="Arial" w:cs="Arial"/>
+                      <w:i w:val="false"/>
+                      <w:b w:val="false"/>
+                      <w:u w:val="none"/>
+                      <w:strike w:val="false"/>
+                      <w:sz w:val="22"/>
+                      <w:szCs w:val="22"/>
+                      <w:color w:val="000000"/>
+                    </w:rPr>
+                    <w:t xml:space="preserve">(0.52, 0.95)</w:t>
+                  </w:r>
+                </w:p>
+              </w:tc>
+              <w:tc>
+                <w:tcPr>
+                  <w:tcBorders>
+                    <w:bottom w:val="none" w:sz="0" w:space="0" w:color="000000"/>
+                    <w:top w:val="single" w:sz="12" w:space="0" w:color="666666"/>
+                    <w:left w:val="none" w:sz="0" w:space="0" w:color="000000"/>
+                    <w:right w:val="none" w:sz="0" w:space="0" w:color="000000"/>
+                  </w:tcBorders>
+                  <w:shd w:val="clear" w:color="auto" w:fill="FFFFFF"/>
+                  <w:tcMar>
+                    <w:top w:w="0" w:type="dxa"/>
+                    <w:bottom w:w="0" w:type="dxa"/>
+                    <w:left w:w="0" w:type="dxa"/>
+                    <w:right w:w="0" w:type="dxa"/>
+                  </w:tcMar>
+                  <w:vAlign w:val="center"/>
+                </w:tcPr>
+                <w:p>
+                  <w:pPr>
+                    <w:jc w:val="right"/>
+                    <w:pBdr>
+                      <w:bottom w:val="none" w:sz="0" w:space="0" w:color="000000"/>
+                      <w:top w:val="none" w:sz="0" w:space="0" w:color="000000"/>
+                      <w:left w:val="none" w:sz="0" w:space="0" w:color="000000"/>
+                      <w:right w:val="none" w:sz="0" w:space="0" w:color="000000"/>
+                    </w:pBdr>
+                    <w:spacing w:after="100" w:before="100" w:line="240"/>
+                    <w:ind w:left="100" w:right="100" w:firstLine="0" w:firstLineChars="0"/>
+                    <w:rPr>
+                      <w:rFonts w:ascii="Arial" w:hAnsi="Arial" w:eastAsia="Arial" w:cs="Arial"/>
+                      <w:i w:val="false"/>
+                      <w:b w:val="false"/>
+                      <w:u w:val="none"/>
+                      <w:strike w:val="false"/>
+                      <w:sz w:val="22"/>
+                      <w:szCs w:val="22"/>
+                      <w:color w:val="000000"/>
+                    </w:rPr>
+                  </w:pPr>
+                  <w:r xmlns:w="http://schemas.openxmlformats.org/wordprocessingml/2006/main" xmlns:wp="http://schemas.openxmlformats.org/drawingml/2006/wordprocessingDrawing" xmlns:r="http://schemas.openxmlformats.org/officeDocument/2006/relationships" xmlns:w14="http://schemas.microsoft.com/office/word/2010/wordml">
+                    <w:rPr>
+                      <w:rFonts w:ascii="Arial" w:hAnsi="Arial" w:eastAsia="Arial" w:cs="Arial"/>
+                      <w:i w:val="false"/>
+                      <w:b w:val="false"/>
+                      <w:u w:val="none"/>
+                      <w:strike w:val="false"/>
+                      <w:sz w:val="22"/>
+                      <w:szCs w:val="22"/>
+                      <w:color w:val="000000"/>
+                    </w:rPr>
+                    <w:t xml:space="preserve">199</w:t>
+                  </w:r>
+                </w:p>
+              </w:tc>
+            </w:tr>
+            <w:tr>
+              <w:trPr>
+                <w:trHeight w:val="617" w:hRule="auto"/>
+              </w:trPr>
+              <w:tc>
+                <w:tcPr>
+                  <w:tcBorders>
+                    <w:bottom w:val="none" w:sz="0" w:space="0" w:color="000000"/>
+                    <w:top w:val="none" w:sz="0" w:space="0" w:color="000000"/>
+                    <w:left w:val="none" w:sz="0" w:space="0" w:color="000000"/>
+                    <w:right w:val="none" w:sz="0" w:space="0" w:color="000000"/>
+                  </w:tcBorders>
+                  <w:shd w:val="clear" w:color="auto" w:fill="FFFFFF"/>
+                  <w:tcMar>
+                    <w:top w:w="0" w:type="dxa"/>
+                    <w:bottom w:w="0" w:type="dxa"/>
+                    <w:left w:w="0" w:type="dxa"/>
+                    <w:right w:w="0" w:type="dxa"/>
+                  </w:tcMar>
+                  <w:vAlign w:val="center"/>
+                </w:tcPr>
+                <w:p>
+                  <w:pPr>
+                    <w:jc w:val="left"/>
+                    <w:pBdr>
+                      <w:bottom w:val="none" w:sz="0" w:space="0" w:color="000000"/>
+                      <w:top w:val="none" w:sz="0" w:space="0" w:color="000000"/>
+                      <w:left w:val="none" w:sz="0" w:space="0" w:color="000000"/>
+                      <w:right w:val="none" w:sz="0" w:space="0" w:color="000000"/>
+                    </w:pBdr>
+                    <w:spacing w:after="100" w:before="100" w:line="240"/>
+                    <w:ind w:left="100" w:right="100" w:firstLine="0" w:firstLineChars="0"/>
+                    <w:rPr>
+                      <w:rFonts w:ascii="Arial" w:hAnsi="Arial" w:eastAsia="Arial" w:cs="Arial"/>
+                      <w:i w:val="false"/>
+                      <w:b w:val="false"/>
+                      <w:u w:val="none"/>
+                      <w:strike w:val="false"/>
+                      <w:sz w:val="22"/>
+                      <w:szCs w:val="22"/>
+                      <w:color w:val="000000"/>
+                    </w:rPr>
+                  </w:pPr>
+                  <w:r xmlns:w="http://schemas.openxmlformats.org/wordprocessingml/2006/main" xmlns:wp="http://schemas.openxmlformats.org/drawingml/2006/wordprocessingDrawing" xmlns:r="http://schemas.openxmlformats.org/officeDocument/2006/relationships" xmlns:w14="http://schemas.microsoft.com/office/word/2010/wordml">
+                    <w:rPr>
+                      <w:rFonts w:ascii="Arial" w:hAnsi="Arial" w:eastAsia="Arial" w:cs="Arial"/>
+                      <w:i w:val="false"/>
+                      <w:b w:val="false"/>
+                      <w:u w:val="none"/>
+                      <w:strike w:val="false"/>
+                      <w:sz w:val="22"/>
+                      <w:szCs w:val="22"/>
+                      <w:color w:val="000000"/>
+                    </w:rPr>
+                    <w:t xml:space="preserve">Grantham distance</w:t>
+                  </w:r>
+                </w:p>
+              </w:tc>
+              <w:tc>
+                <w:tcPr>
+                  <w:tcBorders>
+                    <w:bottom w:val="none" w:sz="0" w:space="0" w:color="000000"/>
+                    <w:top w:val="none" w:sz="0" w:space="0" w:color="000000"/>
+                    <w:left w:val="none" w:sz="0" w:space="0" w:color="000000"/>
+                    <w:right w:val="none" w:sz="0" w:space="0" w:color="000000"/>
+                  </w:tcBorders>
+                  <w:shd w:val="clear" w:color="auto" w:fill="FFFFFF"/>
+                  <w:tcMar>
+                    <w:top w:w="0" w:type="dxa"/>
+                    <w:bottom w:w="0" w:type="dxa"/>
+                    <w:left w:w="0" w:type="dxa"/>
+                    <w:right w:w="0" w:type="dxa"/>
+                  </w:tcMar>
+                  <w:vAlign w:val="center"/>
+                </w:tcPr>
+                <w:p>
+                  <w:pPr>
+                    <w:jc w:val="right"/>
+                    <w:pBdr>
+                      <w:bottom w:val="none" w:sz="0" w:space="0" w:color="000000"/>
+                      <w:top w:val="none" w:sz="0" w:space="0" w:color="000000"/>
+                      <w:left w:val="none" w:sz="0" w:space="0" w:color="000000"/>
+                      <w:right w:val="none" w:sz="0" w:space="0" w:color="000000"/>
+                    </w:pBdr>
+                    <w:spacing w:after="100" w:before="100" w:line="240"/>
+                    <w:ind w:left="100" w:right="100" w:firstLine="0" w:firstLineChars="0"/>
+                    <w:rPr>
+                      <w:rFonts w:ascii="Arial" w:hAnsi="Arial" w:eastAsia="Arial" w:cs="Arial"/>
+                      <w:i w:val="false"/>
+                      <w:b w:val="false"/>
+                      <w:u w:val="none"/>
+                      <w:strike w:val="false"/>
+                      <w:sz w:val="22"/>
+                      <w:szCs w:val="22"/>
+                      <w:color w:val="000000"/>
+                    </w:rPr>
+                  </w:pPr>
+                  <w:r xmlns:w="http://schemas.openxmlformats.org/wordprocessingml/2006/main" xmlns:wp="http://schemas.openxmlformats.org/drawingml/2006/wordprocessingDrawing" xmlns:r="http://schemas.openxmlformats.org/officeDocument/2006/relationships" xmlns:w14="http://schemas.microsoft.com/office/word/2010/wordml">
+                    <w:rPr>
+                      <w:rFonts w:ascii="Arial" w:hAnsi="Arial" w:eastAsia="Arial" w:cs="Arial"/>
+                      <w:i w:val="false"/>
+                      <w:b w:val="false"/>
+                      <w:u w:val="none"/>
+                      <w:strike w:val="false"/>
+                      <w:sz w:val="22"/>
+                      <w:szCs w:val="22"/>
+                      <w:color w:val="000000"/>
+                    </w:rPr>
+                    <w:t xml:space="preserve">153</w:t>
+                  </w:r>
+                </w:p>
+              </w:tc>
+              <w:tc>
+                <w:tcPr>
+                  <w:tcBorders>
+                    <w:bottom w:val="none" w:sz="0" w:space="0" w:color="000000"/>
+                    <w:top w:val="none" w:sz="0" w:space="0" w:color="000000"/>
+                    <w:left w:val="none" w:sz="0" w:space="0" w:color="000000"/>
+                    <w:right w:val="none" w:sz="0" w:space="0" w:color="000000"/>
+                  </w:tcBorders>
+                  <w:shd w:val="clear" w:color="auto" w:fill="FFFFFF"/>
+                  <w:tcMar>
+                    <w:top w:w="0" w:type="dxa"/>
+                    <w:bottom w:w="0" w:type="dxa"/>
+                    <w:left w:w="0" w:type="dxa"/>
+                    <w:right w:w="0" w:type="dxa"/>
+                  </w:tcMar>
+                  <w:vAlign w:val="center"/>
+                </w:tcPr>
+                <w:p>
+                  <w:pPr>
+                    <w:jc w:val="right"/>
+                    <w:pBdr>
+                      <w:bottom w:val="none" w:sz="0" w:space="0" w:color="000000"/>
+                      <w:top w:val="none" w:sz="0" w:space="0" w:color="000000"/>
+                      <w:left w:val="none" w:sz="0" w:space="0" w:color="000000"/>
+                      <w:right w:val="none" w:sz="0" w:space="0" w:color="000000"/>
+                    </w:pBdr>
+                    <w:spacing w:after="100" w:before="100" w:line="240"/>
+                    <w:ind w:left="100" w:right="100" w:firstLine="0" w:firstLineChars="0"/>
+                    <w:rPr>
+                      <w:rFonts w:ascii="Arial" w:hAnsi="Arial" w:eastAsia="Arial" w:cs="Arial"/>
+                      <w:i w:val="false"/>
+                      <w:b w:val="false"/>
+                      <w:u w:val="none"/>
+                      <w:strike w:val="false"/>
+                      <w:sz w:val="22"/>
+                      <w:szCs w:val="22"/>
+                      <w:color w:val="000000"/>
+                    </w:rPr>
+                  </w:pPr>
+                  <w:r xmlns:w="http://schemas.openxmlformats.org/wordprocessingml/2006/main" xmlns:wp="http://schemas.openxmlformats.org/drawingml/2006/wordprocessingDrawing" xmlns:r="http://schemas.openxmlformats.org/officeDocument/2006/relationships" xmlns:w14="http://schemas.microsoft.com/office/word/2010/wordml">
+                    <w:rPr>
+                      <w:rFonts w:ascii="Arial" w:hAnsi="Arial" w:eastAsia="Arial" w:cs="Arial"/>
+                      <w:i w:val="false"/>
+                      <w:b w:val="false"/>
+                      <w:u w:val="none"/>
+                      <w:strike w:val="false"/>
+                      <w:sz w:val="22"/>
+                      <w:szCs w:val="22"/>
+                      <w:color w:val="000000"/>
+                    </w:rPr>
+                    <w:t xml:space="preserve">210</w:t>
+                  </w:r>
+                </w:p>
+              </w:tc>
+              <w:tc>
+                <w:tcPr>
+                  <w:tcBorders>
+                    <w:bottom w:val="none" w:sz="0" w:space="0" w:color="000000"/>
+                    <w:top w:val="none" w:sz="0" w:space="0" w:color="000000"/>
+                    <w:left w:val="none" w:sz="0" w:space="0" w:color="000000"/>
+                    <w:right w:val="none" w:sz="0" w:space="0" w:color="000000"/>
+                  </w:tcBorders>
+                  <w:shd w:val="clear" w:color="auto" w:fill="FFFFFF"/>
+                  <w:tcMar>
+                    <w:top w:w="0" w:type="dxa"/>
+                    <w:bottom w:w="0" w:type="dxa"/>
+                    <w:left w:w="0" w:type="dxa"/>
+                    <w:right w:w="0" w:type="dxa"/>
+                  </w:tcMar>
+                  <w:vAlign w:val="center"/>
+                </w:tcPr>
+                <w:p>
+                  <w:pPr>
+                    <w:jc w:val="left"/>
+                    <w:pBdr>
+                      <w:bottom w:val="none" w:sz="0" w:space="0" w:color="000000"/>
+                      <w:top w:val="none" w:sz="0" w:space="0" w:color="000000"/>
+                      <w:left w:val="none" w:sz="0" w:space="0" w:color="000000"/>
+                      <w:right w:val="none" w:sz="0" w:space="0" w:color="000000"/>
+                    </w:pBdr>
+                    <w:spacing w:after="100" w:before="100" w:line="240"/>
+                    <w:ind w:left="100" w:right="100" w:firstLine="0" w:firstLineChars="0"/>
+                    <w:rPr>
+                      <w:rFonts w:ascii="Arial" w:hAnsi="Arial" w:eastAsia="Arial" w:cs="Arial"/>
+                      <w:i w:val="false"/>
+                      <w:b w:val="false"/>
+                      <w:u w:val="none"/>
+                      <w:strike w:val="false"/>
+                      <w:sz w:val="22"/>
+                      <w:szCs w:val="22"/>
+                      <w:color w:val="000000"/>
+                    </w:rPr>
+                  </w:pPr>
+                  <w:r xmlns:w="http://schemas.openxmlformats.org/wordprocessingml/2006/main" xmlns:wp="http://schemas.openxmlformats.org/drawingml/2006/wordprocessingDrawing" xmlns:r="http://schemas.openxmlformats.org/officeDocument/2006/relationships" xmlns:w14="http://schemas.microsoft.com/office/word/2010/wordml">
+                    <w:rPr>
+                      <w:rFonts w:ascii="Arial" w:hAnsi="Arial" w:eastAsia="Arial" w:cs="Arial"/>
+                      <w:i w:val="false"/>
+                      <w:b w:val="false"/>
+                      <w:u w:val="none"/>
+                      <w:strike w:val="false"/>
+                      <w:sz w:val="22"/>
+                      <w:szCs w:val="22"/>
+                      <w:color w:val="000000"/>
+                    </w:rPr>
+                    <w:t xml:space="preserve">0.98</w:t>
+                  </w:r>
+                </w:p>
+              </w:tc>
+              <w:tc>
+                <w:tcPr>
+                  <w:tcBorders>
+                    <w:bottom w:val="none" w:sz="0" w:space="0" w:color="000000"/>
+                    <w:top w:val="none" w:sz="0" w:space="0" w:color="000000"/>
+                    <w:left w:val="none" w:sz="0" w:space="0" w:color="000000"/>
+                    <w:right w:val="none" w:sz="0" w:space="0" w:color="000000"/>
+                  </w:tcBorders>
+                  <w:shd w:val="clear" w:color="auto" w:fill="FFFFFF"/>
+                  <w:tcMar>
+                    <w:top w:w="0" w:type="dxa"/>
+                    <w:bottom w:w="0" w:type="dxa"/>
+                    <w:left w:w="0" w:type="dxa"/>
+                    <w:right w:w="0" w:type="dxa"/>
+                  </w:tcMar>
+                  <w:vAlign w:val="center"/>
+                </w:tcPr>
+                <w:p>
+                  <w:pPr>
+                    <w:jc w:val="left"/>
+                    <w:pBdr>
+                      <w:bottom w:val="none" w:sz="0" w:space="0" w:color="000000"/>
+                      <w:top w:val="none" w:sz="0" w:space="0" w:color="000000"/>
+                      <w:left w:val="none" w:sz="0" w:space="0" w:color="000000"/>
+                      <w:right w:val="none" w:sz="0" w:space="0" w:color="000000"/>
+                    </w:pBdr>
+                    <w:spacing w:after="100" w:before="100" w:line="240"/>
+                    <w:ind w:left="100" w:right="100" w:firstLine="0" w:firstLineChars="0"/>
+                    <w:rPr>
+                      <w:rFonts w:ascii="Arial" w:hAnsi="Arial" w:eastAsia="Arial" w:cs="Arial"/>
+                      <w:i w:val="false"/>
+                      <w:b w:val="false"/>
+                      <w:u w:val="none"/>
+                      <w:strike w:val="false"/>
+                      <w:sz w:val="22"/>
+                      <w:szCs w:val="22"/>
+                      <w:color w:val="000000"/>
+                    </w:rPr>
+                  </w:pPr>
+                  <w:r xmlns:w="http://schemas.openxmlformats.org/wordprocessingml/2006/main" xmlns:wp="http://schemas.openxmlformats.org/drawingml/2006/wordprocessingDrawing" xmlns:r="http://schemas.openxmlformats.org/officeDocument/2006/relationships" xmlns:w14="http://schemas.microsoft.com/office/word/2010/wordml">
+                    <w:rPr>
+                      <w:rFonts w:ascii="Arial" w:hAnsi="Arial" w:eastAsia="Arial" w:cs="Arial"/>
+                      <w:i w:val="false"/>
+                      <w:b w:val="false"/>
+                      <w:u w:val="none"/>
+                      <w:strike w:val="false"/>
+                      <w:sz w:val="22"/>
+                      <w:szCs w:val="22"/>
+                      <w:color w:val="000000"/>
+                    </w:rPr>
+                    <w:t xml:space="preserve">0.90</w:t>
+                  </w:r>
+                </w:p>
+              </w:tc>
+              <w:tc>
+                <w:tcPr>
+                  <w:tcBorders>
+                    <w:bottom w:val="none" w:sz="0" w:space="0" w:color="000000"/>
+                    <w:top w:val="none" w:sz="0" w:space="0" w:color="000000"/>
+                    <w:left w:val="none" w:sz="0" w:space="0" w:color="000000"/>
+                    <w:right w:val="none" w:sz="0" w:space="0" w:color="000000"/>
+                  </w:tcBorders>
+                  <w:shd w:val="clear" w:color="auto" w:fill="FFFFFF"/>
+                  <w:tcMar>
+                    <w:top w:w="0" w:type="dxa"/>
+                    <w:bottom w:w="0" w:type="dxa"/>
+                    <w:left w:w="0" w:type="dxa"/>
+                    <w:right w:w="0" w:type="dxa"/>
+                  </w:tcMar>
+                  <w:vAlign w:val="center"/>
+                </w:tcPr>
+                <w:p>
+                  <w:pPr>
+                    <w:jc w:val="left"/>
+                    <w:pBdr>
+                      <w:bottom w:val="none" w:sz="0" w:space="0" w:color="000000"/>
+                      <w:top w:val="none" w:sz="0" w:space="0" w:color="000000"/>
+                      <w:left w:val="none" w:sz="0" w:space="0" w:color="000000"/>
+                      <w:right w:val="none" w:sz="0" w:space="0" w:color="000000"/>
+                    </w:pBdr>
+                    <w:spacing w:after="100" w:before="100" w:line="240"/>
+                    <w:ind w:left="100" w:right="100" w:firstLine="0" w:firstLineChars="0"/>
+                    <w:rPr>
+                      <w:rFonts w:ascii="Arial" w:hAnsi="Arial" w:eastAsia="Arial" w:cs="Arial"/>
+                      <w:i w:val="false"/>
+                      <w:b w:val="false"/>
+                      <w:u w:val="none"/>
+                      <w:strike w:val="false"/>
+                      <w:sz w:val="22"/>
+                      <w:szCs w:val="22"/>
+                      <w:color w:val="000000"/>
+                    </w:rPr>
+                  </w:pPr>
+                  <w:r xmlns:w="http://schemas.openxmlformats.org/wordprocessingml/2006/main" xmlns:wp="http://schemas.openxmlformats.org/drawingml/2006/wordprocessingDrawing" xmlns:r="http://schemas.openxmlformats.org/officeDocument/2006/relationships" xmlns:w14="http://schemas.microsoft.com/office/word/2010/wordml">
+                    <w:rPr>
+                      <w:rFonts w:ascii="Arial" w:hAnsi="Arial" w:eastAsia="Arial" w:cs="Arial"/>
+                      <w:i w:val="false"/>
+                      <w:b w:val="false"/>
+                      <w:u w:val="none"/>
+                      <w:strike w:val="false"/>
+                      <w:sz w:val="22"/>
+                      <w:szCs w:val="22"/>
+                      <w:color w:val="000000"/>
+                    </w:rPr>
+                    <w:t xml:space="preserve">-0.08</w:t>
+                  </w:r>
+                </w:p>
+              </w:tc>
+              <w:tc>
+                <w:tcPr>
+                  <w:tcBorders>
+                    <w:bottom w:val="none" w:sz="0" w:space="0" w:color="000000"/>
+                    <w:top w:val="none" w:sz="0" w:space="0" w:color="000000"/>
+                    <w:left w:val="none" w:sz="0" w:space="0" w:color="000000"/>
+                    <w:right w:val="none" w:sz="0" w:space="0" w:color="000000"/>
+                  </w:tcBorders>
+                  <w:shd w:val="clear" w:color="auto" w:fill="FFFFFF"/>
+                  <w:tcMar>
+                    <w:top w:w="0" w:type="dxa"/>
+                    <w:bottom w:w="0" w:type="dxa"/>
+                    <w:left w:w="0" w:type="dxa"/>
+                    <w:right w:w="0" w:type="dxa"/>
+                  </w:tcMar>
+                  <w:vAlign w:val="center"/>
+                </w:tcPr>
+                <w:p>
+                  <w:pPr>
+                    <w:jc w:val="left"/>
+                    <w:pBdr>
+                      <w:bottom w:val="none" w:sz="0" w:space="0" w:color="000000"/>
+                      <w:top w:val="none" w:sz="0" w:space="0" w:color="000000"/>
+                      <w:left w:val="none" w:sz="0" w:space="0" w:color="000000"/>
+                      <w:right w:val="none" w:sz="0" w:space="0" w:color="000000"/>
+                    </w:pBdr>
+                    <w:spacing w:after="100" w:before="100" w:line="240"/>
+                    <w:ind w:left="100" w:right="100" w:firstLine="0" w:firstLineChars="0"/>
+                    <w:rPr>
+                      <w:rFonts w:ascii="Arial" w:hAnsi="Arial" w:eastAsia="Arial" w:cs="Arial"/>
+                      <w:i w:val="false"/>
+                      <w:b w:val="false"/>
+                      <w:u w:val="none"/>
+                      <w:strike w:val="false"/>
+                      <w:sz w:val="22"/>
+                      <w:szCs w:val="22"/>
+                      <w:color w:val="000000"/>
+                    </w:rPr>
+                  </w:pPr>
+                  <w:r xmlns:w="http://schemas.openxmlformats.org/wordprocessingml/2006/main" xmlns:wp="http://schemas.openxmlformats.org/drawingml/2006/wordprocessingDrawing" xmlns:r="http://schemas.openxmlformats.org/officeDocument/2006/relationships" xmlns:w14="http://schemas.microsoft.com/office/word/2010/wordml">
+                    <w:rPr>
+                      <w:rFonts w:ascii="Arial" w:hAnsi="Arial" w:eastAsia="Arial" w:cs="Arial"/>
+                      <w:i w:val="false"/>
+                      <w:b w:val="false"/>
+                      <w:u w:val="none"/>
+                      <w:strike w:val="false"/>
+                      <w:sz w:val="22"/>
+                      <w:szCs w:val="22"/>
+                      <w:color w:val="000000"/>
+                    </w:rPr>
+                    <w:t xml:space="preserve">(-0.14, -0.02)</w:t>
+                  </w:r>
+                </w:p>
+              </w:tc>
+              <w:tc>
+                <w:tcPr>
+                  <w:tcBorders>
+                    <w:bottom w:val="none" w:sz="0" w:space="0" w:color="000000"/>
+                    <w:top w:val="none" w:sz="0" w:space="0" w:color="000000"/>
+                    <w:left w:val="none" w:sz="0" w:space="0" w:color="000000"/>
+                    <w:right w:val="none" w:sz="0" w:space="0" w:color="000000"/>
+                  </w:tcBorders>
+                  <w:shd w:val="clear" w:color="auto" w:fill="FFFFFF"/>
+                  <w:tcMar>
+                    <w:top w:w="0" w:type="dxa"/>
+                    <w:bottom w:w="0" w:type="dxa"/>
+                    <w:left w:w="0" w:type="dxa"/>
+                    <w:right w:w="0" w:type="dxa"/>
+                  </w:tcMar>
+                  <w:vAlign w:val="center"/>
+                </w:tcPr>
+                <w:p>
+                  <w:pPr>
+                    <w:jc w:val="right"/>
+                    <w:pBdr>
+                      <w:bottom w:val="none" w:sz="0" w:space="0" w:color="000000"/>
+                      <w:top w:val="none" w:sz="0" w:space="0" w:color="000000"/>
+                      <w:left w:val="none" w:sz="0" w:space="0" w:color="000000"/>
+                      <w:right w:val="none" w:sz="0" w:space="0" w:color="000000"/>
+                    </w:pBdr>
+                    <w:spacing w:after="100" w:before="100" w:line="240"/>
+                    <w:ind w:left="100" w:right="100" w:firstLine="0" w:firstLineChars="0"/>
+                    <w:rPr>
+                      <w:rFonts w:ascii="Arial" w:hAnsi="Arial" w:eastAsia="Arial" w:cs="Arial"/>
+                      <w:i w:val="false"/>
+                      <w:b w:val="false"/>
+                      <w:u w:val="none"/>
+                      <w:strike w:val="false"/>
+                      <w:sz w:val="22"/>
+                      <w:szCs w:val="22"/>
+                      <w:color w:val="000000"/>
+                    </w:rPr>
+                  </w:pPr>
+                  <w:r xmlns:w="http://schemas.openxmlformats.org/wordprocessingml/2006/main" xmlns:wp="http://schemas.openxmlformats.org/drawingml/2006/wordprocessingDrawing" xmlns:r="http://schemas.openxmlformats.org/officeDocument/2006/relationships" xmlns:w14="http://schemas.microsoft.com/office/word/2010/wordml">
+                    <w:rPr>
+                      <w:rFonts w:ascii="Arial" w:hAnsi="Arial" w:eastAsia="Arial" w:cs="Arial"/>
+                      <w:i w:val="false"/>
+                      <w:b w:val="false"/>
+                      <w:u w:val="none"/>
+                      <w:strike w:val="false"/>
+                      <w:sz w:val="22"/>
+                      <w:szCs w:val="22"/>
+                      <w:color w:val="000000"/>
+                    </w:rPr>
+                    <w:t xml:space="preserve">199</w:t>
+                  </w:r>
+                </w:p>
+              </w:tc>
+            </w:tr>
+            <w:tr>
+              <w:trPr>
+                <w:trHeight w:val="617" w:hRule="auto"/>
+              </w:trPr>
+              <w:tc>
+                <w:tcPr>
+                  <w:tcBorders>
+                    <w:bottom w:val="none" w:sz="0" w:space="0" w:color="000000"/>
+                    <w:top w:val="none" w:sz="0" w:space="0" w:color="000000"/>
+                    <w:left w:val="none" w:sz="0" w:space="0" w:color="000000"/>
+                    <w:right w:val="none" w:sz="0" w:space="0" w:color="000000"/>
+                  </w:tcBorders>
+                  <w:shd w:val="clear" w:color="auto" w:fill="FFFFFF"/>
+                  <w:tcMar>
+                    <w:top w:w="0" w:type="dxa"/>
+                    <w:bottom w:w="0" w:type="dxa"/>
+                    <w:left w:w="0" w:type="dxa"/>
+                    <w:right w:w="0" w:type="dxa"/>
+                  </w:tcMar>
+                  <w:vAlign w:val="center"/>
+                </w:tcPr>
+                <w:p>
+                  <w:pPr>
+                    <w:jc w:val="left"/>
+                    <w:pBdr>
+                      <w:bottom w:val="none" w:sz="0" w:space="0" w:color="000000"/>
+                      <w:top w:val="none" w:sz="0" w:space="0" w:color="000000"/>
+                      <w:left w:val="none" w:sz="0" w:space="0" w:color="000000"/>
+                      <w:right w:val="none" w:sz="0" w:space="0" w:color="000000"/>
+                    </w:pBdr>
+                    <w:spacing w:after="100" w:before="100" w:line="240"/>
+                    <w:ind w:left="100" w:right="100" w:firstLine="0" w:firstLineChars="0"/>
+                    <w:rPr>
+                      <w:rFonts w:ascii="Arial" w:hAnsi="Arial" w:eastAsia="Arial" w:cs="Arial"/>
+                      <w:i w:val="false"/>
+                      <w:b w:val="false"/>
+                      <w:u w:val="none"/>
+                      <w:strike w:val="false"/>
+                      <w:sz w:val="22"/>
+                      <w:szCs w:val="22"/>
+                      <w:color w:val="000000"/>
+                    </w:rPr>
+                  </w:pPr>
+                  <w:r xmlns:w="http://schemas.openxmlformats.org/wordprocessingml/2006/main" xmlns:wp="http://schemas.openxmlformats.org/drawingml/2006/wordprocessingDrawing" xmlns:r="http://schemas.openxmlformats.org/officeDocument/2006/relationships" xmlns:w14="http://schemas.microsoft.com/office/word/2010/wordml">
+                    <w:rPr>
+                      <w:rFonts w:ascii="Arial" w:hAnsi="Arial" w:eastAsia="Arial" w:cs="Arial"/>
+                      <w:i w:val="false"/>
+                      <w:b w:val="false"/>
+                      <w:u w:val="none"/>
+                      <w:strike w:val="false"/>
+                      <w:sz w:val="22"/>
+                      <w:szCs w:val="22"/>
+                      <w:color w:val="000000"/>
+                    </w:rPr>
+                    <w:t xml:space="preserve">p-Epitope distance</w:t>
+                  </w:r>
+                </w:p>
+              </w:tc>
+              <w:tc>
+                <w:tcPr>
+                  <w:tcBorders>
+                    <w:bottom w:val="none" w:sz="0" w:space="0" w:color="000000"/>
+                    <w:top w:val="none" w:sz="0" w:space="0" w:color="000000"/>
+                    <w:left w:val="none" w:sz="0" w:space="0" w:color="000000"/>
+                    <w:right w:val="none" w:sz="0" w:space="0" w:color="000000"/>
+                  </w:tcBorders>
+                  <w:shd w:val="clear" w:color="auto" w:fill="FFFFFF"/>
+                  <w:tcMar>
+                    <w:top w:w="0" w:type="dxa"/>
+                    <w:bottom w:w="0" w:type="dxa"/>
+                    <w:left w:w="0" w:type="dxa"/>
+                    <w:right w:w="0" w:type="dxa"/>
+                  </w:tcMar>
+                  <w:vAlign w:val="center"/>
+                </w:tcPr>
+                <w:p>
+                  <w:pPr>
+                    <w:jc w:val="right"/>
+                    <w:pBdr>
+                      <w:bottom w:val="none" w:sz="0" w:space="0" w:color="000000"/>
+                      <w:top w:val="none" w:sz="0" w:space="0" w:color="000000"/>
+                      <w:left w:val="none" w:sz="0" w:space="0" w:color="000000"/>
+                      <w:right w:val="none" w:sz="0" w:space="0" w:color="000000"/>
+                    </w:pBdr>
+                    <w:spacing w:after="100" w:before="100" w:line="240"/>
+                    <w:ind w:left="100" w:right="100" w:firstLine="0" w:firstLineChars="0"/>
+                    <w:rPr>
+                      <w:rFonts w:ascii="Arial" w:hAnsi="Arial" w:eastAsia="Arial" w:cs="Arial"/>
+                      <w:i w:val="false"/>
+                      <w:b w:val="false"/>
+                      <w:u w:val="none"/>
+                      <w:strike w:val="false"/>
+                      <w:sz w:val="22"/>
+                      <w:szCs w:val="22"/>
+                      <w:color w:val="000000"/>
+                    </w:rPr>
+                  </w:pPr>
+                  <w:r xmlns:w="http://schemas.openxmlformats.org/wordprocessingml/2006/main" xmlns:wp="http://schemas.openxmlformats.org/drawingml/2006/wordprocessingDrawing" xmlns:r="http://schemas.openxmlformats.org/officeDocument/2006/relationships" xmlns:w14="http://schemas.microsoft.com/office/word/2010/wordml">
+                    <w:rPr>
+                      <w:rFonts w:ascii="Arial" w:hAnsi="Arial" w:eastAsia="Arial" w:cs="Arial"/>
+                      <w:i w:val="false"/>
+                      <w:b w:val="false"/>
+                      <w:u w:val="none"/>
+                      <w:strike w:val="false"/>
+                      <w:sz w:val="22"/>
+                      <w:szCs w:val="22"/>
+                      <w:color w:val="000000"/>
+                    </w:rPr>
+                    <w:t xml:space="preserve">153</w:t>
+                  </w:r>
+                </w:p>
+              </w:tc>
+              <w:tc>
+                <w:tcPr>
+                  <w:tcBorders>
+                    <w:bottom w:val="none" w:sz="0" w:space="0" w:color="000000"/>
+                    <w:top w:val="none" w:sz="0" w:space="0" w:color="000000"/>
+                    <w:left w:val="none" w:sz="0" w:space="0" w:color="000000"/>
+                    <w:right w:val="none" w:sz="0" w:space="0" w:color="000000"/>
+                  </w:tcBorders>
+                  <w:shd w:val="clear" w:color="auto" w:fill="FFFFFF"/>
+                  <w:tcMar>
+                    <w:top w:w="0" w:type="dxa"/>
+                    <w:bottom w:w="0" w:type="dxa"/>
+                    <w:left w:w="0" w:type="dxa"/>
+                    <w:right w:w="0" w:type="dxa"/>
+                  </w:tcMar>
+                  <w:vAlign w:val="center"/>
+                </w:tcPr>
+                <w:p>
+                  <w:pPr>
+                    <w:jc w:val="right"/>
+                    <w:pBdr>
+                      <w:bottom w:val="none" w:sz="0" w:space="0" w:color="000000"/>
+                      <w:top w:val="none" w:sz="0" w:space="0" w:color="000000"/>
+                      <w:left w:val="none" w:sz="0" w:space="0" w:color="000000"/>
+                      <w:right w:val="none" w:sz="0" w:space="0" w:color="000000"/>
+                    </w:pBdr>
+                    <w:spacing w:after="100" w:before="100" w:line="240"/>
+                    <w:ind w:left="100" w:right="100" w:firstLine="0" w:firstLineChars="0"/>
+                    <w:rPr>
+                      <w:rFonts w:ascii="Arial" w:hAnsi="Arial" w:eastAsia="Arial" w:cs="Arial"/>
+                      <w:i w:val="false"/>
+                      <w:b w:val="false"/>
+                      <w:u w:val="none"/>
+                      <w:strike w:val="false"/>
+                      <w:sz w:val="22"/>
+                      <w:szCs w:val="22"/>
+                      <w:color w:val="000000"/>
+                    </w:rPr>
+                  </w:pPr>
+                  <w:r xmlns:w="http://schemas.openxmlformats.org/wordprocessingml/2006/main" xmlns:wp="http://schemas.openxmlformats.org/drawingml/2006/wordprocessingDrawing" xmlns:r="http://schemas.openxmlformats.org/officeDocument/2006/relationships" xmlns:w14="http://schemas.microsoft.com/office/word/2010/wordml">
+                    <w:rPr>
+                      <w:rFonts w:ascii="Arial" w:hAnsi="Arial" w:eastAsia="Arial" w:cs="Arial"/>
+                      <w:i w:val="false"/>
+                      <w:b w:val="false"/>
+                      <w:u w:val="none"/>
+                      <w:strike w:val="false"/>
+                      <w:sz w:val="22"/>
+                      <w:szCs w:val="22"/>
+                      <w:color w:val="000000"/>
+                    </w:rPr>
+                    <w:t xml:space="preserve">210</w:t>
+                  </w:r>
+                </w:p>
+              </w:tc>
+              <w:tc>
+                <w:tcPr>
+                  <w:tcBorders>
+                    <w:bottom w:val="none" w:sz="0" w:space="0" w:color="000000"/>
+                    <w:top w:val="none" w:sz="0" w:space="0" w:color="000000"/>
+                    <w:left w:val="none" w:sz="0" w:space="0" w:color="000000"/>
+                    <w:right w:val="none" w:sz="0" w:space="0" w:color="000000"/>
+                  </w:tcBorders>
+                  <w:shd w:val="clear" w:color="auto" w:fill="FFFFFF"/>
+                  <w:tcMar>
+                    <w:top w:w="0" w:type="dxa"/>
+                    <w:bottom w:w="0" w:type="dxa"/>
+                    <w:left w:w="0" w:type="dxa"/>
+                    <w:right w:w="0" w:type="dxa"/>
+                  </w:tcMar>
+                  <w:vAlign w:val="center"/>
+                </w:tcPr>
+                <w:p>
+                  <w:pPr>
+                    <w:jc w:val="left"/>
+                    <w:pBdr>
+                      <w:bottom w:val="none" w:sz="0" w:space="0" w:color="000000"/>
+                      <w:top w:val="none" w:sz="0" w:space="0" w:color="000000"/>
+                      <w:left w:val="none" w:sz="0" w:space="0" w:color="000000"/>
+                      <w:right w:val="none" w:sz="0" w:space="0" w:color="000000"/>
+                    </w:pBdr>
+                    <w:spacing w:after="100" w:before="100" w:line="240"/>
+                    <w:ind w:left="100" w:right="100" w:firstLine="0" w:firstLineChars="0"/>
+                    <w:rPr>
+                      <w:rFonts w:ascii="Arial" w:hAnsi="Arial" w:eastAsia="Arial" w:cs="Arial"/>
+                      <w:i w:val="false"/>
+                      <w:b w:val="false"/>
+                      <w:u w:val="none"/>
+                      <w:strike w:val="false"/>
+                      <w:sz w:val="22"/>
+                      <w:szCs w:val="22"/>
+                      <w:color w:val="000000"/>
+                    </w:rPr>
+                  </w:pPr>
+                  <w:r xmlns:w="http://schemas.openxmlformats.org/wordprocessingml/2006/main" xmlns:wp="http://schemas.openxmlformats.org/drawingml/2006/wordprocessingDrawing" xmlns:r="http://schemas.openxmlformats.org/officeDocument/2006/relationships" xmlns:w14="http://schemas.microsoft.com/office/word/2010/wordml">
+                    <w:rPr>
+                      <w:rFonts w:ascii="Arial" w:hAnsi="Arial" w:eastAsia="Arial" w:cs="Arial"/>
+                      <w:i w:val="false"/>
+                      <w:b w:val="false"/>
+                      <w:u w:val="none"/>
+                      <w:strike w:val="false"/>
+                      <w:sz w:val="22"/>
+                      <w:szCs w:val="22"/>
+                      <w:color w:val="000000"/>
+                    </w:rPr>
+                    <w:t xml:space="preserve">0.93</w:t>
+                  </w:r>
+                </w:p>
+              </w:tc>
+              <w:tc>
+                <w:tcPr>
+                  <w:tcBorders>
+                    <w:bottom w:val="none" w:sz="0" w:space="0" w:color="000000"/>
+                    <w:top w:val="none" w:sz="0" w:space="0" w:color="000000"/>
+                    <w:left w:val="none" w:sz="0" w:space="0" w:color="000000"/>
+                    <w:right w:val="none" w:sz="0" w:space="0" w:color="000000"/>
+                  </w:tcBorders>
+                  <w:shd w:val="clear" w:color="auto" w:fill="FFFFFF"/>
+                  <w:tcMar>
+                    <w:top w:w="0" w:type="dxa"/>
+                    <w:bottom w:w="0" w:type="dxa"/>
+                    <w:left w:w="0" w:type="dxa"/>
+                    <w:right w:w="0" w:type="dxa"/>
+                  </w:tcMar>
+                  <w:vAlign w:val="center"/>
+                </w:tcPr>
+                <w:p>
+                  <w:pPr>
+                    <w:jc w:val="left"/>
+                    <w:pBdr>
+                      <w:bottom w:val="none" w:sz="0" w:space="0" w:color="000000"/>
+                      <w:top w:val="none" w:sz="0" w:space="0" w:color="000000"/>
+                      <w:left w:val="none" w:sz="0" w:space="0" w:color="000000"/>
+                      <w:right w:val="none" w:sz="0" w:space="0" w:color="000000"/>
+                    </w:pBdr>
+                    <w:spacing w:after="100" w:before="100" w:line="240"/>
+                    <w:ind w:left="100" w:right="100" w:firstLine="0" w:firstLineChars="0"/>
+                    <w:rPr>
+                      <w:rFonts w:ascii="Arial" w:hAnsi="Arial" w:eastAsia="Arial" w:cs="Arial"/>
+                      <w:i w:val="false"/>
+                      <w:b w:val="false"/>
+                      <w:u w:val="none"/>
+                      <w:strike w:val="false"/>
+                      <w:sz w:val="22"/>
+                      <w:szCs w:val="22"/>
+                      <w:color w:val="000000"/>
+                    </w:rPr>
+                  </w:pPr>
+                  <w:r xmlns:w="http://schemas.openxmlformats.org/wordprocessingml/2006/main" xmlns:wp="http://schemas.openxmlformats.org/drawingml/2006/wordprocessingDrawing" xmlns:r="http://schemas.openxmlformats.org/officeDocument/2006/relationships" xmlns:w14="http://schemas.microsoft.com/office/word/2010/wordml">
+                    <w:rPr>
+                      <w:rFonts w:ascii="Arial" w:hAnsi="Arial" w:eastAsia="Arial" w:cs="Arial"/>
+                      <w:i w:val="false"/>
+                      <w:b w:val="false"/>
+                      <w:u w:val="none"/>
+                      <w:strike w:val="false"/>
+                      <w:sz w:val="22"/>
+                      <w:szCs w:val="22"/>
+                      <w:color w:val="000000"/>
+                    </w:rPr>
+                    <w:t xml:space="preserve">0.93</w:t>
+                  </w:r>
+                </w:p>
+              </w:tc>
+              <w:tc>
+                <w:tcPr>
+                  <w:tcBorders>
+                    <w:bottom w:val="none" w:sz="0" w:space="0" w:color="000000"/>
+                    <w:top w:val="none" w:sz="0" w:space="0" w:color="000000"/>
+                    <w:left w:val="none" w:sz="0" w:space="0" w:color="000000"/>
+                    <w:right w:val="none" w:sz="0" w:space="0" w:color="000000"/>
+                  </w:tcBorders>
+                  <w:shd w:val="clear" w:color="auto" w:fill="FFFFFF"/>
+                  <w:tcMar>
+                    <w:top w:w="0" w:type="dxa"/>
+                    <w:bottom w:w="0" w:type="dxa"/>
+                    <w:left w:w="0" w:type="dxa"/>
+                    <w:right w:w="0" w:type="dxa"/>
+                  </w:tcMar>
+                  <w:vAlign w:val="center"/>
+                </w:tcPr>
+                <w:p>
+                  <w:pPr>
+                    <w:jc w:val="left"/>
+                    <w:pBdr>
+                      <w:bottom w:val="none" w:sz="0" w:space="0" w:color="000000"/>
+                      <w:top w:val="none" w:sz="0" w:space="0" w:color="000000"/>
+                      <w:left w:val="none" w:sz="0" w:space="0" w:color="000000"/>
+                      <w:right w:val="none" w:sz="0" w:space="0" w:color="000000"/>
+                    </w:pBdr>
+                    <w:spacing w:after="100" w:before="100" w:line="240"/>
+                    <w:ind w:left="100" w:right="100" w:firstLine="0" w:firstLineChars="0"/>
+                    <w:rPr>
+                      <w:rFonts w:ascii="Arial" w:hAnsi="Arial" w:eastAsia="Arial" w:cs="Arial"/>
+                      <w:i w:val="false"/>
+                      <w:b w:val="false"/>
+                      <w:u w:val="none"/>
+                      <w:strike w:val="false"/>
+                      <w:sz w:val="22"/>
+                      <w:szCs w:val="22"/>
+                      <w:color w:val="000000"/>
+                    </w:rPr>
+                  </w:pPr>
+                  <w:r xmlns:w="http://schemas.openxmlformats.org/wordprocessingml/2006/main" xmlns:wp="http://schemas.openxmlformats.org/drawingml/2006/wordprocessingDrawing" xmlns:r="http://schemas.openxmlformats.org/officeDocument/2006/relationships" xmlns:w14="http://schemas.microsoft.com/office/word/2010/wordml">
+                    <w:rPr>
+                      <w:rFonts w:ascii="Arial" w:hAnsi="Arial" w:eastAsia="Arial" w:cs="Arial"/>
+                      <w:i w:val="false"/>
+                      <w:b w:val="false"/>
+                      <w:u w:val="none"/>
+                      <w:strike w:val="false"/>
+                      <w:sz w:val="22"/>
+                      <w:szCs w:val="22"/>
+                      <w:color w:val="000000"/>
+                    </w:rPr>
+                    <w:t xml:space="preserve">-0.01</w:t>
+                  </w:r>
+                </w:p>
+              </w:tc>
+              <w:tc>
+                <w:tcPr>
+                  <w:tcBorders>
+                    <w:bottom w:val="none" w:sz="0" w:space="0" w:color="000000"/>
+                    <w:top w:val="none" w:sz="0" w:space="0" w:color="000000"/>
+                    <w:left w:val="none" w:sz="0" w:space="0" w:color="000000"/>
+                    <w:right w:val="none" w:sz="0" w:space="0" w:color="000000"/>
+                  </w:tcBorders>
+                  <w:shd w:val="clear" w:color="auto" w:fill="FFFFFF"/>
+                  <w:tcMar>
+                    <w:top w:w="0" w:type="dxa"/>
+                    <w:bottom w:w="0" w:type="dxa"/>
+                    <w:left w:w="0" w:type="dxa"/>
+                    <w:right w:w="0" w:type="dxa"/>
+                  </w:tcMar>
+                  <w:vAlign w:val="center"/>
+                </w:tcPr>
+                <w:p>
+                  <w:pPr>
+                    <w:jc w:val="left"/>
+                    <w:pBdr>
+                      <w:bottom w:val="none" w:sz="0" w:space="0" w:color="000000"/>
+                      <w:top w:val="none" w:sz="0" w:space="0" w:color="000000"/>
+                      <w:left w:val="none" w:sz="0" w:space="0" w:color="000000"/>
+                      <w:right w:val="none" w:sz="0" w:space="0" w:color="000000"/>
+                    </w:pBdr>
+                    <w:spacing w:after="100" w:before="100" w:line="240"/>
+                    <w:ind w:left="100" w:right="100" w:firstLine="0" w:firstLineChars="0"/>
+                    <w:rPr>
+                      <w:rFonts w:ascii="Arial" w:hAnsi="Arial" w:eastAsia="Arial" w:cs="Arial"/>
+                      <w:i w:val="false"/>
+                      <w:b w:val="false"/>
+                      <w:u w:val="none"/>
+                      <w:strike w:val="false"/>
+                      <w:sz w:val="22"/>
+                      <w:szCs w:val="22"/>
+                      <w:color w:val="000000"/>
+                    </w:rPr>
+                  </w:pPr>
+                  <w:r xmlns:w="http://schemas.openxmlformats.org/wordprocessingml/2006/main" xmlns:wp="http://schemas.openxmlformats.org/drawingml/2006/wordprocessingDrawing" xmlns:r="http://schemas.openxmlformats.org/officeDocument/2006/relationships" xmlns:w14="http://schemas.microsoft.com/office/word/2010/wordml">
+                    <w:rPr>
+                      <w:rFonts w:ascii="Arial" w:hAnsi="Arial" w:eastAsia="Arial" w:cs="Arial"/>
+                      <w:i w:val="false"/>
+                      <w:b w:val="false"/>
+                      <w:u w:val="none"/>
+                      <w:strike w:val="false"/>
+                      <w:sz w:val="22"/>
+                      <w:szCs w:val="22"/>
+                      <w:color w:val="000000"/>
+                    </w:rPr>
+                    <w:t xml:space="preserve">(-0.04, 0.04)</w:t>
+                  </w:r>
+                </w:p>
+              </w:tc>
+              <w:tc>
+                <w:tcPr>
+                  <w:tcBorders>
+                    <w:bottom w:val="none" w:sz="0" w:space="0" w:color="000000"/>
+                    <w:top w:val="none" w:sz="0" w:space="0" w:color="000000"/>
+                    <w:left w:val="none" w:sz="0" w:space="0" w:color="000000"/>
+                    <w:right w:val="none" w:sz="0" w:space="0" w:color="000000"/>
+                  </w:tcBorders>
+                  <w:shd w:val="clear" w:color="auto" w:fill="FFFFFF"/>
+                  <w:tcMar>
+                    <w:top w:w="0" w:type="dxa"/>
+                    <w:bottom w:w="0" w:type="dxa"/>
+                    <w:left w:w="0" w:type="dxa"/>
+                    <w:right w:w="0" w:type="dxa"/>
+                  </w:tcMar>
+                  <w:vAlign w:val="center"/>
+                </w:tcPr>
+                <w:p>
+                  <w:pPr>
+                    <w:jc w:val="right"/>
+                    <w:pBdr>
+                      <w:bottom w:val="none" w:sz="0" w:space="0" w:color="000000"/>
+                      <w:top w:val="none" w:sz="0" w:space="0" w:color="000000"/>
+                      <w:left w:val="none" w:sz="0" w:space="0" w:color="000000"/>
+                      <w:right w:val="none" w:sz="0" w:space="0" w:color="000000"/>
+                    </w:pBdr>
+                    <w:spacing w:after="100" w:before="100" w:line="240"/>
+                    <w:ind w:left="100" w:right="100" w:firstLine="0" w:firstLineChars="0"/>
+                    <w:rPr>
+                      <w:rFonts w:ascii="Arial" w:hAnsi="Arial" w:eastAsia="Arial" w:cs="Arial"/>
+                      <w:i w:val="false"/>
+                      <w:b w:val="false"/>
+                      <w:u w:val="none"/>
+                      <w:strike w:val="false"/>
+                      <w:sz w:val="22"/>
+                      <w:szCs w:val="22"/>
+                      <w:color w:val="000000"/>
+                    </w:rPr>
+                  </w:pPr>
+                  <w:r xmlns:w="http://schemas.openxmlformats.org/wordprocessingml/2006/main" xmlns:wp="http://schemas.openxmlformats.org/drawingml/2006/wordprocessingDrawing" xmlns:r="http://schemas.openxmlformats.org/officeDocument/2006/relationships" xmlns:w14="http://schemas.microsoft.com/office/word/2010/wordml">
+                    <w:rPr>
+                      <w:rFonts w:ascii="Arial" w:hAnsi="Arial" w:eastAsia="Arial" w:cs="Arial"/>
+                      <w:i w:val="false"/>
+                      <w:b w:val="false"/>
+                      <w:u w:val="none"/>
+                      <w:strike w:val="false"/>
+                      <w:sz w:val="22"/>
+                      <w:szCs w:val="22"/>
+                      <w:color w:val="000000"/>
+                    </w:rPr>
+                    <w:t xml:space="preserve">199</w:t>
+                  </w:r>
+                </w:p>
+              </w:tc>
+            </w:tr>
+            <w:tr>
+              <w:trPr>
+                <w:trHeight w:val="617" w:hRule="auto"/>
+              </w:trPr>
+              <w:tc>
+                <w:tcPr>
+                  <w:tcBorders>
+                    <w:bottom w:val="single" w:sz="12" w:space="0" w:color="666666"/>
+                    <w:top w:val="none" w:sz="0" w:space="0" w:color="000000"/>
+                    <w:left w:val="none" w:sz="0" w:space="0" w:color="000000"/>
+                    <w:right w:val="none" w:sz="0" w:space="0" w:color="000000"/>
+                  </w:tcBorders>
+                  <w:shd w:val="clear" w:color="auto" w:fill="FFFFFF"/>
+                  <w:tcMar>
+                    <w:top w:w="0" w:type="dxa"/>
+                    <w:bottom w:w="0" w:type="dxa"/>
+                    <w:left w:w="0" w:type="dxa"/>
+                    <w:right w:w="0" w:type="dxa"/>
+                  </w:tcMar>
+                  <w:vAlign w:val="center"/>
+                </w:tcPr>
+                <w:p>
+                  <w:pPr>
+                    <w:jc w:val="left"/>
+                    <w:pBdr>
+                      <w:bottom w:val="none" w:sz="0" w:space="0" w:color="000000"/>
+                      <w:top w:val="none" w:sz="0" w:space="0" w:color="000000"/>
+                      <w:left w:val="none" w:sz="0" w:space="0" w:color="000000"/>
+                      <w:right w:val="none" w:sz="0" w:space="0" w:color="000000"/>
+                    </w:pBdr>
+                    <w:spacing w:after="100" w:before="100" w:line="240"/>
+                    <w:ind w:left="100" w:right="100" w:firstLine="0" w:firstLineChars="0"/>
+                    <w:rPr>
+                      <w:rFonts w:ascii="Arial" w:hAnsi="Arial" w:eastAsia="Arial" w:cs="Arial"/>
+                      <w:i w:val="false"/>
+                      <w:b w:val="false"/>
+                      <w:u w:val="none"/>
+                      <w:strike w:val="false"/>
+                      <w:sz w:val="22"/>
+                      <w:szCs w:val="22"/>
+                      <w:color w:val="000000"/>
+                    </w:rPr>
+                  </w:pPr>
+                  <w:r xmlns:w="http://schemas.openxmlformats.org/wordprocessingml/2006/main" xmlns:wp="http://schemas.openxmlformats.org/drawingml/2006/wordprocessingDrawing" xmlns:r="http://schemas.openxmlformats.org/officeDocument/2006/relationships" xmlns:w14="http://schemas.microsoft.com/office/word/2010/wordml">
+                    <w:rPr>
+                      <w:rFonts w:ascii="Arial" w:hAnsi="Arial" w:eastAsia="Arial" w:cs="Arial"/>
+                      <w:i w:val="false"/>
+                      <w:b w:val="false"/>
+                      <w:u w:val="none"/>
+                      <w:strike w:val="false"/>
+                      <w:sz w:val="22"/>
+                      <w:szCs w:val="22"/>
+                      <w:color w:val="000000"/>
+                    </w:rPr>
+                    <w:t xml:space="preserve">Cartographic distance</w:t>
+                  </w:r>
+                </w:p>
+              </w:tc>
+              <w:tc>
+                <w:tcPr>
+                  <w:tcBorders>
+                    <w:bottom w:val="single" w:sz="12" w:space="0" w:color="666666"/>
+                    <w:top w:val="none" w:sz="0" w:space="0" w:color="000000"/>
+                    <w:left w:val="none" w:sz="0" w:space="0" w:color="000000"/>
+                    <w:right w:val="none" w:sz="0" w:space="0" w:color="000000"/>
+                  </w:tcBorders>
+                  <w:shd w:val="clear" w:color="auto" w:fill="FFFFFF"/>
+                  <w:tcMar>
+                    <w:top w:w="0" w:type="dxa"/>
+                    <w:bottom w:w="0" w:type="dxa"/>
+                    <w:left w:w="0" w:type="dxa"/>
+                    <w:right w:w="0" w:type="dxa"/>
+                  </w:tcMar>
+                  <w:vAlign w:val="center"/>
+                </w:tcPr>
+                <w:p>
+                  <w:pPr>
+                    <w:jc w:val="right"/>
+                    <w:pBdr>
+                      <w:bottom w:val="none" w:sz="0" w:space="0" w:color="000000"/>
+                      <w:top w:val="none" w:sz="0" w:space="0" w:color="000000"/>
+                      <w:left w:val="none" w:sz="0" w:space="0" w:color="000000"/>
+                      <w:right w:val="none" w:sz="0" w:space="0" w:color="000000"/>
+                    </w:pBdr>
+                    <w:spacing w:after="100" w:before="100" w:line="240"/>
+                    <w:ind w:left="100" w:right="100" w:firstLine="0" w:firstLineChars="0"/>
+                    <w:rPr>
+                      <w:rFonts w:ascii="Arial" w:hAnsi="Arial" w:eastAsia="Arial" w:cs="Arial"/>
+                      <w:i w:val="false"/>
+                      <w:b w:val="false"/>
+                      <w:u w:val="none"/>
+                      <w:strike w:val="false"/>
+                      <w:sz w:val="22"/>
+                      <w:szCs w:val="22"/>
+                      <w:color w:val="000000"/>
+                    </w:rPr>
+                  </w:pPr>
+                  <w:r xmlns:w="http://schemas.openxmlformats.org/wordprocessingml/2006/main" xmlns:wp="http://schemas.openxmlformats.org/drawingml/2006/wordprocessingDrawing" xmlns:r="http://schemas.openxmlformats.org/officeDocument/2006/relationships" xmlns:w14="http://schemas.microsoft.com/office/word/2010/wordml">
+                    <w:rPr>
+                      <w:rFonts w:ascii="Arial" w:hAnsi="Arial" w:eastAsia="Arial" w:cs="Arial"/>
+                      <w:i w:val="false"/>
+                      <w:b w:val="false"/>
+                      <w:u w:val="none"/>
+                      <w:strike w:val="false"/>
+                      <w:sz w:val="22"/>
+                      <w:szCs w:val="22"/>
+                      <w:color w:val="000000"/>
+                    </w:rPr>
+                    <w:t xml:space="preserve">153</w:t>
+                  </w:r>
+                </w:p>
+              </w:tc>
+              <w:tc>
+                <w:tcPr>
+                  <w:tcBorders>
+                    <w:bottom w:val="single" w:sz="12" w:space="0" w:color="666666"/>
+                    <w:top w:val="none" w:sz="0" w:space="0" w:color="000000"/>
+                    <w:left w:val="none" w:sz="0" w:space="0" w:color="000000"/>
+                    <w:right w:val="none" w:sz="0" w:space="0" w:color="000000"/>
+                  </w:tcBorders>
+                  <w:shd w:val="clear" w:color="auto" w:fill="FFFFFF"/>
+                  <w:tcMar>
+                    <w:top w:w="0" w:type="dxa"/>
+                    <w:bottom w:w="0" w:type="dxa"/>
+                    <w:left w:w="0" w:type="dxa"/>
+                    <w:right w:w="0" w:type="dxa"/>
+                  </w:tcMar>
+                  <w:vAlign w:val="center"/>
+                </w:tcPr>
+                <w:p>
+                  <w:pPr>
+                    <w:jc w:val="right"/>
+                    <w:pBdr>
+                      <w:bottom w:val="none" w:sz="0" w:space="0" w:color="000000"/>
+                      <w:top w:val="none" w:sz="0" w:space="0" w:color="000000"/>
+                      <w:left w:val="none" w:sz="0" w:space="0" w:color="000000"/>
+                      <w:right w:val="none" w:sz="0" w:space="0" w:color="000000"/>
+                    </w:pBdr>
+                    <w:spacing w:after="100" w:before="100" w:line="240"/>
+                    <w:ind w:left="100" w:right="100" w:firstLine="0" w:firstLineChars="0"/>
+                    <w:rPr>
+                      <w:rFonts w:ascii="Arial" w:hAnsi="Arial" w:eastAsia="Arial" w:cs="Arial"/>
+                      <w:i w:val="false"/>
+                      <w:b w:val="false"/>
+                      <w:u w:val="none"/>
+                      <w:strike w:val="false"/>
+                      <w:sz w:val="22"/>
+                      <w:szCs w:val="22"/>
+                      <w:color w:val="000000"/>
+                    </w:rPr>
+                  </w:pPr>
+                  <w:r xmlns:w="http://schemas.openxmlformats.org/wordprocessingml/2006/main" xmlns:wp="http://schemas.openxmlformats.org/drawingml/2006/wordprocessingDrawing" xmlns:r="http://schemas.openxmlformats.org/officeDocument/2006/relationships" xmlns:w14="http://schemas.microsoft.com/office/word/2010/wordml">
+                    <w:rPr>
+                      <w:rFonts w:ascii="Arial" w:hAnsi="Arial" w:eastAsia="Arial" w:cs="Arial"/>
+                      <w:i w:val="false"/>
+                      <w:b w:val="false"/>
+                      <w:u w:val="none"/>
+                      <w:strike w:val="false"/>
+                      <w:sz w:val="22"/>
+                      <w:szCs w:val="22"/>
+                      <w:color w:val="000000"/>
+                    </w:rPr>
+                    <w:t xml:space="preserve">210</w:t>
+                  </w:r>
+                </w:p>
+              </w:tc>
+              <w:tc>
+                <w:tcPr>
+                  <w:tcBorders>
+                    <w:bottom w:val="single" w:sz="12" w:space="0" w:color="666666"/>
+                    <w:top w:val="none" w:sz="0" w:space="0" w:color="000000"/>
+                    <w:left w:val="none" w:sz="0" w:space="0" w:color="000000"/>
+                    <w:right w:val="none" w:sz="0" w:space="0" w:color="000000"/>
+                  </w:tcBorders>
+                  <w:shd w:val="clear" w:color="auto" w:fill="FFFFFF"/>
+                  <w:tcMar>
+                    <w:top w:w="0" w:type="dxa"/>
+                    <w:bottom w:w="0" w:type="dxa"/>
+                    <w:left w:w="0" w:type="dxa"/>
+                    <w:right w:w="0" w:type="dxa"/>
+                  </w:tcMar>
+                  <w:vAlign w:val="center"/>
+                </w:tcPr>
+                <w:p>
+                  <w:pPr>
+                    <w:jc w:val="left"/>
+                    <w:pBdr>
+                      <w:bottom w:val="none" w:sz="0" w:space="0" w:color="000000"/>
+                      <w:top w:val="none" w:sz="0" w:space="0" w:color="000000"/>
+                      <w:left w:val="none" w:sz="0" w:space="0" w:color="000000"/>
+                      <w:right w:val="none" w:sz="0" w:space="0" w:color="000000"/>
+                    </w:pBdr>
+                    <w:spacing w:after="100" w:before="100" w:line="240"/>
+                    <w:ind w:left="100" w:right="100" w:firstLine="0" w:firstLineChars="0"/>
+                    <w:rPr>
+                      <w:rFonts w:ascii="Arial" w:hAnsi="Arial" w:eastAsia="Arial" w:cs="Arial"/>
+                      <w:i w:val="false"/>
+                      <w:b w:val="false"/>
+                      <w:u w:val="none"/>
+                      <w:strike w:val="false"/>
+                      <w:sz w:val="22"/>
+                      <w:szCs w:val="22"/>
+                      <w:color w:val="000000"/>
+                    </w:rPr>
+                  </w:pPr>
+                  <w:r xmlns:w="http://schemas.openxmlformats.org/wordprocessingml/2006/main" xmlns:wp="http://schemas.openxmlformats.org/drawingml/2006/wordprocessingDrawing" xmlns:r="http://schemas.openxmlformats.org/officeDocument/2006/relationships" xmlns:w14="http://schemas.microsoft.com/office/word/2010/wordml">
+                    <w:rPr>
+                      <w:rFonts w:ascii="Arial" w:hAnsi="Arial" w:eastAsia="Arial" w:cs="Arial"/>
+                      <w:i w:val="false"/>
+                      <w:b w:val="false"/>
+                      <w:u w:val="none"/>
+                      <w:strike w:val="false"/>
+                      <w:sz w:val="22"/>
+                      <w:szCs w:val="22"/>
+                      <w:color w:val="000000"/>
+                    </w:rPr>
+                    <w:t xml:space="preserve">0.32</w:t>
+                  </w:r>
+                </w:p>
+              </w:tc>
+              <w:tc>
+                <w:tcPr>
+                  <w:tcBorders>
+                    <w:bottom w:val="single" w:sz="12" w:space="0" w:color="666666"/>
+                    <w:top w:val="none" w:sz="0" w:space="0" w:color="000000"/>
+                    <w:left w:val="none" w:sz="0" w:space="0" w:color="000000"/>
+                    <w:right w:val="none" w:sz="0" w:space="0" w:color="000000"/>
+                  </w:tcBorders>
+                  <w:shd w:val="clear" w:color="auto" w:fill="FFFFFF"/>
+                  <w:tcMar>
+                    <w:top w:w="0" w:type="dxa"/>
+                    <w:bottom w:w="0" w:type="dxa"/>
+                    <w:left w:w="0" w:type="dxa"/>
+                    <w:right w:w="0" w:type="dxa"/>
+                  </w:tcMar>
+                  <w:vAlign w:val="center"/>
+                </w:tcPr>
+                <w:p>
+                  <w:pPr>
+                    <w:jc w:val="left"/>
+                    <w:pBdr>
+                      <w:bottom w:val="none" w:sz="0" w:space="0" w:color="000000"/>
+                      <w:top w:val="none" w:sz="0" w:space="0" w:color="000000"/>
+                      <w:left w:val="none" w:sz="0" w:space="0" w:color="000000"/>
+                      <w:right w:val="none" w:sz="0" w:space="0" w:color="000000"/>
+                    </w:pBdr>
+                    <w:spacing w:after="100" w:before="100" w:line="240"/>
+                    <w:ind w:left="100" w:right="100" w:firstLine="0" w:firstLineChars="0"/>
+                    <w:rPr>
+                      <w:rFonts w:ascii="Arial" w:hAnsi="Arial" w:eastAsia="Arial" w:cs="Arial"/>
+                      <w:i w:val="false"/>
+                      <w:b w:val="false"/>
+                      <w:u w:val="none"/>
+                      <w:strike w:val="false"/>
+                      <w:sz w:val="22"/>
+                      <w:szCs w:val="22"/>
+                      <w:color w:val="000000"/>
+                    </w:rPr>
+                  </w:pPr>
+                  <w:r xmlns:w="http://schemas.openxmlformats.org/wordprocessingml/2006/main" xmlns:wp="http://schemas.openxmlformats.org/drawingml/2006/wordprocessingDrawing" xmlns:r="http://schemas.openxmlformats.org/officeDocument/2006/relationships" xmlns:w14="http://schemas.microsoft.com/office/word/2010/wordml">
+                    <w:rPr>
+                      <w:rFonts w:ascii="Arial" w:hAnsi="Arial" w:eastAsia="Arial" w:cs="Arial"/>
+                      <w:i w:val="false"/>
+                      <w:b w:val="false"/>
+                      <w:u w:val="none"/>
+                      <w:strike w:val="false"/>
+                      <w:sz w:val="22"/>
+                      <w:szCs w:val="22"/>
+                      <w:color w:val="000000"/>
+                    </w:rPr>
+                    <w:t xml:space="preserve">0.84</w:t>
+                  </w:r>
+                </w:p>
+              </w:tc>
+              <w:tc>
+                <w:tcPr>
+                  <w:tcBorders>
+                    <w:bottom w:val="single" w:sz="12" w:space="0" w:color="666666"/>
+                    <w:top w:val="none" w:sz="0" w:space="0" w:color="000000"/>
+                    <w:left w:val="none" w:sz="0" w:space="0" w:color="000000"/>
+                    <w:right w:val="none" w:sz="0" w:space="0" w:color="000000"/>
+                  </w:tcBorders>
+                  <w:shd w:val="clear" w:color="auto" w:fill="FFFFFF"/>
+                  <w:tcMar>
+                    <w:top w:w="0" w:type="dxa"/>
+                    <w:bottom w:w="0" w:type="dxa"/>
+                    <w:left w:w="0" w:type="dxa"/>
+                    <w:right w:w="0" w:type="dxa"/>
+                  </w:tcMar>
+                  <w:vAlign w:val="center"/>
+                </w:tcPr>
+                <w:p>
+                  <w:pPr>
+                    <w:jc w:val="left"/>
+                    <w:pBdr>
+                      <w:bottom w:val="none" w:sz="0" w:space="0" w:color="000000"/>
+                      <w:top w:val="none" w:sz="0" w:space="0" w:color="000000"/>
+                      <w:left w:val="none" w:sz="0" w:space="0" w:color="000000"/>
+                      <w:right w:val="none" w:sz="0" w:space="0" w:color="000000"/>
+                    </w:pBdr>
+                    <w:spacing w:after="100" w:before="100" w:line="240"/>
+                    <w:ind w:left="100" w:right="100" w:firstLine="0" w:firstLineChars="0"/>
+                    <w:rPr>
+                      <w:rFonts w:ascii="Arial" w:hAnsi="Arial" w:eastAsia="Arial" w:cs="Arial"/>
+                      <w:i w:val="false"/>
+                      <w:b w:val="false"/>
+                      <w:u w:val="none"/>
+                      <w:strike w:val="false"/>
+                      <w:sz w:val="22"/>
+                      <w:szCs w:val="22"/>
+                      <w:color w:val="000000"/>
+                    </w:rPr>
+                  </w:pPr>
+                  <w:r xmlns:w="http://schemas.openxmlformats.org/wordprocessingml/2006/main" xmlns:wp="http://schemas.openxmlformats.org/drawingml/2006/wordprocessingDrawing" xmlns:r="http://schemas.openxmlformats.org/officeDocument/2006/relationships" xmlns:w14="http://schemas.microsoft.com/office/word/2010/wordml">
+                    <w:rPr>
+                      <w:rFonts w:ascii="Arial" w:hAnsi="Arial" w:eastAsia="Arial" w:cs="Arial"/>
+                      <w:i w:val="false"/>
+                      <w:b w:val="false"/>
+                      <w:u w:val="none"/>
+                      <w:strike w:val="false"/>
+                      <w:sz w:val="22"/>
+                      <w:szCs w:val="22"/>
+                      <w:color w:val="000000"/>
+                    </w:rPr>
+                    <w:t xml:space="preserve">0.52</w:t>
+                  </w:r>
+                </w:p>
+              </w:tc>
+              <w:tc>
+                <w:tcPr>
+                  <w:tcBorders>
+                    <w:bottom w:val="single" w:sz="12" w:space="0" w:color="666666"/>
+                    <w:top w:val="none" w:sz="0" w:space="0" w:color="000000"/>
+                    <w:left w:val="none" w:sz="0" w:space="0" w:color="000000"/>
+                    <w:right w:val="none" w:sz="0" w:space="0" w:color="000000"/>
+                  </w:tcBorders>
+                  <w:shd w:val="clear" w:color="auto" w:fill="FFFFFF"/>
+                  <w:tcMar>
+                    <w:top w:w="0" w:type="dxa"/>
+                    <w:bottom w:w="0" w:type="dxa"/>
+                    <w:left w:w="0" w:type="dxa"/>
+                    <w:right w:w="0" w:type="dxa"/>
+                  </w:tcMar>
+                  <w:vAlign w:val="center"/>
+                </w:tcPr>
+                <w:p>
+                  <w:pPr>
+                    <w:jc w:val="left"/>
+                    <w:pBdr>
+                      <w:bottom w:val="none" w:sz="0" w:space="0" w:color="000000"/>
+                      <w:top w:val="none" w:sz="0" w:space="0" w:color="000000"/>
+                      <w:left w:val="none" w:sz="0" w:space="0" w:color="000000"/>
+                      <w:right w:val="none" w:sz="0" w:space="0" w:color="000000"/>
+                    </w:pBdr>
+                    <w:spacing w:after="100" w:before="100" w:line="240"/>
+                    <w:ind w:left="100" w:right="100" w:firstLine="0" w:firstLineChars="0"/>
+                    <w:rPr>
+                      <w:rFonts w:ascii="Arial" w:hAnsi="Arial" w:eastAsia="Arial" w:cs="Arial"/>
+                      <w:i w:val="false"/>
+                      <w:b w:val="false"/>
+                      <w:u w:val="none"/>
+                      <w:strike w:val="false"/>
+                      <w:sz w:val="22"/>
+                      <w:szCs w:val="22"/>
+                      <w:color w:val="000000"/>
+                    </w:rPr>
+                  </w:pPr>
+                  <w:r xmlns:w="http://schemas.openxmlformats.org/wordprocessingml/2006/main" xmlns:wp="http://schemas.openxmlformats.org/drawingml/2006/wordprocessingDrawing" xmlns:r="http://schemas.openxmlformats.org/officeDocument/2006/relationships" xmlns:w14="http://schemas.microsoft.com/office/word/2010/wordml">
+                    <w:rPr>
+                      <w:rFonts w:ascii="Arial" w:hAnsi="Arial" w:eastAsia="Arial" w:cs="Arial"/>
+                      <w:i w:val="false"/>
+                      <w:b w:val="false"/>
+                      <w:u w:val="none"/>
+                      <w:strike w:val="false"/>
+                      <w:sz w:val="22"/>
+                      <w:szCs w:val="22"/>
+                      <w:color w:val="000000"/>
+                    </w:rPr>
+                    <w:t xml:space="preserve">(0.18, 0.81)</w:t>
+                  </w:r>
+                </w:p>
+              </w:tc>
+              <w:tc>
+                <w:tcPr>
+                  <w:tcBorders>
+                    <w:bottom w:val="single" w:sz="12" w:space="0" w:color="666666"/>
+                    <w:top w:val="none" w:sz="0" w:space="0" w:color="000000"/>
+                    <w:left w:val="none" w:sz="0" w:space="0" w:color="000000"/>
+                    <w:right w:val="none" w:sz="0" w:space="0" w:color="000000"/>
+                  </w:tcBorders>
+                  <w:shd w:val="clear" w:color="auto" w:fill="FFFFFF"/>
+                  <w:tcMar>
+                    <w:top w:w="0" w:type="dxa"/>
+                    <w:bottom w:w="0" w:type="dxa"/>
+                    <w:left w:w="0" w:type="dxa"/>
+                    <w:right w:w="0" w:type="dxa"/>
+                  </w:tcMar>
+                  <w:vAlign w:val="center"/>
+                </w:tcPr>
+                <w:p>
+                  <w:pPr>
+                    <w:jc w:val="right"/>
+                    <w:pBdr>
+                      <w:bottom w:val="none" w:sz="0" w:space="0" w:color="000000"/>
+                      <w:top w:val="none" w:sz="0" w:space="0" w:color="000000"/>
+                      <w:left w:val="none" w:sz="0" w:space="0" w:color="000000"/>
+                      <w:right w:val="none" w:sz="0" w:space="0" w:color="000000"/>
+                    </w:pBdr>
+                    <w:spacing w:after="100" w:before="100" w:line="240"/>
+                    <w:ind w:left="100" w:right="100" w:firstLine="0" w:firstLineChars="0"/>
+                    <w:rPr>
+                      <w:rFonts w:ascii="Arial" w:hAnsi="Arial" w:eastAsia="Arial" w:cs="Arial"/>
+                      <w:i w:val="false"/>
+                      <w:b w:val="false"/>
+                      <w:u w:val="none"/>
+                      <w:strike w:val="false"/>
+                      <w:sz w:val="22"/>
+                      <w:szCs w:val="22"/>
+                      <w:color w:val="000000"/>
+                    </w:rPr>
+                  </w:pPr>
+                  <w:r xmlns:w="http://schemas.openxmlformats.org/wordprocessingml/2006/main" xmlns:wp="http://schemas.openxmlformats.org/drawingml/2006/wordprocessingDrawing" xmlns:r="http://schemas.openxmlformats.org/officeDocument/2006/relationships" xmlns:w14="http://schemas.microsoft.com/office/word/2010/wordml">
+                    <w:rPr>
+                      <w:rFonts w:ascii="Arial" w:hAnsi="Arial" w:eastAsia="Arial" w:cs="Arial"/>
+                      <w:i w:val="false"/>
+                      <w:b w:val="false"/>
+                      <w:u w:val="none"/>
+                      <w:strike w:val="false"/>
+                      <w:sz w:val="22"/>
+                      <w:szCs w:val="22"/>
+                      <w:color w:val="000000"/>
+                    </w:rPr>
+                    <w:t xml:space="preserve">199</w:t>
+                  </w:r>
+                </w:p>
+              </w:tc>
+            </w:tr>
+          </w:tbl>
+          <w:bookmarkEnd w:id="30"/>
+        </w:tc>
+      </w:tr>
+    </w:tbl>
+    <w:p>
+      <w:pPr>
+        <w:pStyle w:val="BodyText"/>
+      </w:pPr>
+      <w:r>
+        <w:t xml:space="preserve">The cartographic Mantel correlation for H1N1 is also moderate, indicating that</w:t>
+      </w:r>
+      <w:r>
+        <w:t xml:space="preserve"> </w:t>
+      </w:r>
+      <w:r>
+        <w:t xml:space="preserve">the evolutionary pattern of H1N1 strains does not necessarily explain variation</w:t>
+      </w:r>
+      <w:r>
+        <w:t xml:space="preserve"> </w:t>
+      </w:r>
+      <w:r>
+        <w:t xml:space="preserve">in observed immune responses. For H3N2, the cartographic correlation was the</w:t>
+      </w:r>
+      <w:r>
+        <w:t xml:space="preserve"> </w:t>
+      </w:r>
+      <w:r>
+        <w:t xml:space="preserve">lowest, and the two distances become less correlated as the distance values</w:t>
+      </w:r>
+      <w:r>
+        <w:t xml:space="preserve"> </w:t>
+      </w:r>
+      <w:r>
+        <w:t xml:space="preserve">become larger. For closely related H3N2 strains the ability of the tree distance</w:t>
+      </w:r>
+      <w:r>
+        <w:t xml:space="preserve"> </w:t>
+      </w:r>
+      <w:r>
+        <w:t xml:space="preserve">to predict differences in immune response appears to attenuate as strains drift</w:t>
+      </w:r>
+      <w:r>
+        <w:t xml:space="preserve"> </w:t>
+      </w:r>
+      <w:r>
+        <w:t xml:space="preserve">further away.</w:t>
+      </w:r>
+    </w:p>
+    <w:p>
+      <w:pPr>
+        <w:pStyle w:val="BodyText"/>
+      </w:pPr>
+      <w:r>
+        <w:t xml:space="preserve">The ML trees for both subtypes were able to reconstruct the</w:t>
+      </w:r>
+      <w:r>
+        <w:t xml:space="preserve"> </w:t>
+      </w:r>
+      <w:r>
+        <w:t xml:space="preserve">patterns we expect for H1N1 and H3N2 influenza (</w:t>
+      </w:r>
+      <w:hyperlink w:anchor="fig-mltrees">
+        <w:r>
+          <w:rPr>
+            <w:rStyle w:val="Hyperlink"/>
+          </w:rPr>
+          <w:t xml:space="preserve">Figure 3</w:t>
+        </w:r>
+      </w:hyperlink>
+      <w:r>
+        <w:t xml:space="preserve">). The H1N1</w:t>
+      </w:r>
+      <w:r>
+        <w:t xml:space="preserve"> </w:t>
+      </w:r>
+      <w:r>
+        <w:t xml:space="preserve">strains form two clades, one pdm-like clade which contains SC/18 (the 1918</w:t>
+      </w:r>
+      <w:r>
+        <w:t xml:space="preserve"> </w:t>
+      </w:r>
+      <w:r>
+        <w:t xml:space="preserve">pandemic strain), NJ/76 swine influenza, and the modern pdm-like strains. The</w:t>
+      </w:r>
+      <w:r>
+        <w:t xml:space="preserve"> </w:t>
+      </w:r>
+      <w:r>
+        <w:t xml:space="preserve">other clade contains the H1N1 strains which circulated between the 1918 pandemic</w:t>
+      </w:r>
+      <w:r>
+        <w:t xml:space="preserve"> </w:t>
+      </w:r>
+      <w:r>
+        <w:t xml:space="preserve">and the 2009 pandemic. The H3N2</w:t>
+      </w:r>
+      <w:r>
+        <w:t xml:space="preserve"> </w:t>
+      </w:r>
+      <w:r>
+        <w:t xml:space="preserve">strains tend to follow a similar ladder-like pattern, beginning with HK/68 and</w:t>
+      </w:r>
+      <w:r>
+        <w:t xml:space="preserve"> </w:t>
+      </w:r>
+      <w:r>
+        <w:t xml:space="preserve">primarily separating by temporal distance, which corroborates the associations</w:t>
+      </w:r>
+      <w:r>
+        <w:t xml:space="preserve"> </w:t>
+      </w:r>
+      <w:r>
+        <w:t xml:space="preserve">between temporal and cophenetic distance (</w:t>
+      </w:r>
+      <w:hyperlink w:anchor="fig-corr">
+        <w:r>
+          <w:rPr>
+            <w:rStyle w:val="Hyperlink"/>
+          </w:rPr>
+          <w:t xml:space="preserve">Figure 1</w:t>
+        </w:r>
+      </w:hyperlink>
+      <w:r>
+        <w:t xml:space="preserve">).</w:t>
+      </w:r>
+    </w:p>
+    <w:tbl>
+      <w:tblPr>
+        <w:tblStyle w:val="Table"/>
+        <w:tblW w:type="pct" w:w="5000"/>
+        <w:tblLayout w:type="fixed"/>
+        <w:tblLook w:firstRow="0" w:lastRow="0" w:firstColumn="0" w:lastColumn="0" w:noHBand="0" w:noVBand="0" w:val="0000"/>
+      </w:tblPr>
+      <w:tblGrid>
+        <w:gridCol w:w="7920"/>
+      </w:tblGrid>
+      <w:tr>
+        <w:tc>
+          <w:tcPr/>
+          <w:bookmarkStart w:id="34" w:name="fig-mltrees"/>
           <w:p>
             <w:pPr>
               <w:pStyle w:val="Compact"/>
@@ -5871,18 +8268,18 @@
                 <wp:inline>
                   <wp:extent cx="5334000" cy="2666309"/>
                   <wp:effectExtent b="0" l="0" r="0" t="0"/>
-                  <wp:docPr descr="" title="" id="27" name="Picture"/>
+                  <wp:docPr descr="" title="" id="32" name="Picture"/>
                   <a:graphic>
                     <a:graphicData uri="http://schemas.openxmlformats.org/drawingml/2006/picture">
                       <pic:pic>
                         <pic:nvPicPr>
-                          <pic:cNvPr descr="../results/Figures/ml-trees.png" id="28" name="Picture"/>
+                          <pic:cNvPr descr="../results/Figures/ml-trees.png" id="33" name="Picture"/>
                           <pic:cNvPicPr>
                             <a:picLocks noChangeArrowheads="1" noChangeAspect="1"/>
                           </pic:cNvPicPr>
                         </pic:nvPicPr>
                         <pic:blipFill>
-                          <a:blip r:embed="rId26"/>
+                          <a:blip r:embed="rId31"/>
                           <a:stretch>
                             <a:fillRect/>
                           </a:stretch>
@@ -5919,7 +8316,7 @@
               <w:pStyle w:val="ImageCaption"/>
             </w:pPr>
             <w:r>
-              <w:t xml:space="preserve">Figure 2: Maximum likelihood phylogenetic trees for H1N1 strains (left) and H3N2</w:t>
+              <w:t xml:space="preserve">Figure 3: Maximum likelihood phylogenetic trees for H1N1 strains (left) and H3N2</w:t>
             </w:r>
             <w:r>
               <w:t xml:space="preserve"> </w:t>
@@ -5934,7 +8331,7 @@
               <w:t xml:space="preserve">purposes, but the root was not optimized during fitting.</w:t>
             </w:r>
           </w:p>
-          <w:bookmarkEnd w:id="29"/>
+          <w:bookmarkEnd w:id="34"/>
         </w:tc>
       </w:tr>
     </w:tbl>
@@ -5968,7 +8365,7 @@
           <w:rPr>
             <w:rStyle w:val="Hyperlink"/>
           </w:rPr>
-          <w:t xml:space="preserve">Table 2</w:t>
+          <w:t xml:space="preserve">Table 3</w:t>
         </w:r>
       </w:hyperlink>
       <w:r>
@@ -6064,7 +8461,7 @@
       <w:tr>
         <w:tc>
           <w:tcPr/>
-          <w:bookmarkStart w:id="30" w:name="tbl-stats"/>
+          <w:bookmarkStart w:id="35" w:name="tbl-stats"/>
           <w:p>
             <w:pPr>
               <w:jc w:val="center"/>
@@ -6075,7 +8472,7 @@
               <w:pStyle w:val="ImageCaption"/>
             </w:pPr>
             <w:r>
-              <w:t xml:space="preserve">Table 2: Log likelihood of all constructed trees, along with the decrease in log likelihood (Δll) from the ML model, the p-value of the Shimodaira-Hasegawa test (SH p-value; evaluated on one million bootstrap resamples), and the Robinson-Foulds distance from the ML tree (RF distance).</w:t>
+              <w:t xml:space="preserve">Table 3: Log likelihood of all constructed trees, along with the decrease in log likelihood (Δll) from the ML model, the p-value of the Shimodaira-Hasegawa test (SH p-value; evaluated on one million bootstrap resamples), and the Robinson-Foulds distance from the ML tree (RF distance).</w:t>
             </w:r>
           </w:p>
           <w:tbl xmlns:w="http://schemas.openxmlformats.org/wordprocessingml/2006/main" xmlns:r="http://schemas.openxmlformats.org/officeDocument/2006/relationships" xmlns:w14="http://schemas.microsoft.com/office/word/2010/wordml" xmlns:wp="http://schemas.openxmlformats.org/drawingml/2006/wordprocessingDrawing" xmlns:a="http://schemas.openxmlformats.org/drawingml/2006/main" xmlns:pic="http://schemas.openxmlformats.org/drawingml/2006/picture">
@@ -9619,12 +12016,12 @@
               </w:tc>
             </w:tr>
           </w:tbl>
-          <w:bookmarkEnd w:id="30"/>
+          <w:bookmarkEnd w:id="35"/>
         </w:tc>
       </w:tr>
     </w:tbl>
-    <w:bookmarkEnd w:id="31"/>
-    <w:bookmarkStart w:id="32" w:name="conclusions"/>
+    <w:bookmarkEnd w:id="36"/>
+    <w:bookmarkStart w:id="37" w:name="conclusions"/>
     <w:p>
       <w:pPr>
         <w:pStyle w:val="Heading1"/>
@@ -9775,8 +12172,8 @@
         <w:t xml:space="preserve">evolution do not always agree.</w:t>
       </w:r>
     </w:p>
-    <w:bookmarkEnd w:id="32"/>
-    <w:bookmarkStart w:id="33" w:name="acknowledgement"/>
+    <w:bookmarkEnd w:id="37"/>
+    <w:bookmarkStart w:id="38" w:name="acknowledgement"/>
     <w:p>
       <w:pPr>
         <w:pStyle w:val="Heading1"/>
@@ -9829,8 +12226,8 @@
         <w:t xml:space="preserve">graduate school for providing funding.</w:t>
       </w:r>
     </w:p>
-    <w:bookmarkEnd w:id="33"/>
-    <w:bookmarkStart w:id="67" w:name="references"/>
+    <w:bookmarkEnd w:id="38"/>
+    <w:bookmarkStart w:id="74" w:name="references"/>
     <w:p>
       <w:pPr>
         <w:pStyle w:val="Heading1"/>
@@ -9839,8 +12236,8 @@
         <w:t xml:space="preserve">References</w:t>
       </w:r>
     </w:p>
-    <w:bookmarkStart w:id="66" w:name="refs"/>
-    <w:bookmarkStart w:id="35" w:name="ref-kim2018"/>
+    <w:bookmarkStart w:id="73" w:name="refs"/>
+    <w:bookmarkStart w:id="40" w:name="ref-kim2018"/>
     <w:p>
       <w:pPr>
         <w:pStyle w:val="Bibliography"/>
@@ -9899,7 +12296,7 @@
       <w:r>
         <w:t xml:space="preserve">. Viral Immunology. 2018;31: 174–183. doi:</w:t>
       </w:r>
-      <w:hyperlink r:id="rId34">
+      <w:hyperlink r:id="rId39">
         <w:r>
           <w:rPr>
             <w:rStyle w:val="Hyperlink"/>
@@ -9908,8 +12305,8 @@
         </w:r>
       </w:hyperlink>
     </w:p>
-    <w:bookmarkEnd w:id="35"/>
-    <w:bookmarkStart w:id="37" w:name="ref-erbelding2018"/>
+    <w:bookmarkEnd w:id="40"/>
+    <w:bookmarkStart w:id="42" w:name="ref-erbelding2018"/>
     <w:p>
       <w:pPr>
         <w:pStyle w:val="Bibliography"/>
@@ -9980,7 +12377,7 @@
       <w:r>
         <w:t xml:space="preserve">. The Journal of Infectious Diseases. 2018;218: 347–354. doi:</w:t>
       </w:r>
-      <w:hyperlink r:id="rId36">
+      <w:hyperlink r:id="rId41">
         <w:r>
           <w:rPr>
             <w:rStyle w:val="Hyperlink"/>
@@ -9989,8 +12386,8 @@
         </w:r>
       </w:hyperlink>
     </w:p>
-    <w:bookmarkEnd w:id="37"/>
-    <w:bookmarkStart w:id="39" w:name="ref-viboud2020a"/>
+    <w:bookmarkEnd w:id="42"/>
+    <w:bookmarkStart w:id="44" w:name="ref-viboud2020a"/>
     <w:p>
       <w:pPr>
         <w:pStyle w:val="Bibliography"/>
@@ -10019,7 +12416,7 @@
       <w:r>
         <w:t xml:space="preserve">and epidemiological considerations for development of a universal influenza vaccine. PLoS pathogens. 2020;16: e1008583. doi:</w:t>
       </w:r>
-      <w:hyperlink r:id="rId38">
+      <w:hyperlink r:id="rId43">
         <w:r>
           <w:rPr>
             <w:rStyle w:val="Hyperlink"/>
@@ -10028,8 +12425,8 @@
         </w:r>
       </w:hyperlink>
     </w:p>
-    <w:bookmarkEnd w:id="39"/>
-    <w:bookmarkStart w:id="41" w:name="ref-durviaux2014"/>
+    <w:bookmarkEnd w:id="44"/>
+    <w:bookmarkStart w:id="46" w:name="ref-durviaux2014"/>
     <w:p>
       <w:pPr>
         <w:pStyle w:val="Bibliography"/>
@@ -10079,7 +12476,7 @@
       <w:r>
         <w:t xml:space="preserve">. Clinical and Vaccine Immunology. 2014;21: 271–279. doi:</w:t>
       </w:r>
-      <w:hyperlink r:id="rId40">
+      <w:hyperlink r:id="rId45">
         <w:r>
           <w:rPr>
             <w:rStyle w:val="Hyperlink"/>
@@ -10088,8 +12485,8 @@
         </w:r>
       </w:hyperlink>
     </w:p>
-    <w:bookmarkEnd w:id="41"/>
-    <w:bookmarkStart w:id="43" w:name="ref-grantham1974"/>
+    <w:bookmarkEnd w:id="46"/>
+    <w:bookmarkStart w:id="48" w:name="ref-grantham1974"/>
     <w:p>
       <w:pPr>
         <w:pStyle w:val="Bibliography"/>
@@ -10106,7 +12503,7 @@
       <w:r>
         <w:t xml:space="preserve">Grantham R. Amino acid difference formula to help explain protein evolution. Science. 1974;185: 862–864. doi:</w:t>
       </w:r>
-      <w:hyperlink r:id="rId42">
+      <w:hyperlink r:id="rId47">
         <w:r>
           <w:rPr>
             <w:rStyle w:val="Hyperlink"/>
@@ -10115,8 +12512,8 @@
         </w:r>
       </w:hyperlink>
     </w:p>
-    <w:bookmarkEnd w:id="43"/>
-    <w:bookmarkStart w:id="45" w:name="ref-gupta2006"/>
+    <w:bookmarkEnd w:id="48"/>
+    <w:bookmarkStart w:id="50" w:name="ref-gupta2006"/>
     <w:p>
       <w:pPr>
         <w:pStyle w:val="Bibliography"/>
@@ -10133,7 +12530,7 @@
       <w:r>
         <w:t xml:space="preserve">Gupta V, Earl DJ, Deem MW. Quantifying influenza vaccine efficacy and antigenic distance. Vaccine. 2006;24: 3881–3888. doi:</w:t>
       </w:r>
-      <w:hyperlink r:id="rId44">
+      <w:hyperlink r:id="rId49">
         <w:r>
           <w:rPr>
             <w:rStyle w:val="Hyperlink"/>
@@ -10142,8 +12539,8 @@
         </w:r>
       </w:hyperlink>
     </w:p>
-    <w:bookmarkEnd w:id="45"/>
-    <w:bookmarkStart w:id="47" w:name="ref-fonville2016"/>
+    <w:bookmarkEnd w:id="50"/>
+    <w:bookmarkStart w:id="52" w:name="ref-fonville2016"/>
     <w:p>
       <w:pPr>
         <w:pStyle w:val="Bibliography"/>
@@ -10196,7 +12593,7 @@
       <w:r>
         <w:t xml:space="preserve">. The Journal of Infectious Diseases. 2016;213: 31–38. doi:</w:t>
       </w:r>
-      <w:hyperlink r:id="rId46">
+      <w:hyperlink r:id="rId51">
         <w:r>
           <w:rPr>
             <w:rStyle w:val="Hyperlink"/>
@@ -10205,8 +12602,8 @@
         </w:r>
       </w:hyperlink>
     </w:p>
-    <w:bookmarkEnd w:id="47"/>
-    <w:bookmarkStart w:id="49" w:name="ref-nunez2017"/>
+    <w:bookmarkEnd w:id="52"/>
+    <w:bookmarkStart w:id="54" w:name="ref-nunez2017"/>
     <w:p>
       <w:pPr>
         <w:pStyle w:val="Bibliography"/>
@@ -10235,7 +12632,7 @@
       <w:r>
         <w:t xml:space="preserve">strains. PloS One. 2017;12: e0185666. doi:</w:t>
       </w:r>
-      <w:hyperlink r:id="rId48">
+      <w:hyperlink r:id="rId53">
         <w:r>
           <w:rPr>
             <w:rStyle w:val="Hyperlink"/>
@@ -10244,8 +12641,8 @@
         </w:r>
       </w:hyperlink>
     </w:p>
-    <w:bookmarkEnd w:id="49"/>
-    <w:bookmarkStart w:id="51" w:name="ref-abreu2020"/>
+    <w:bookmarkEnd w:id="54"/>
+    <w:bookmarkStart w:id="56" w:name="ref-abreu2020"/>
     <w:p>
       <w:pPr>
         <w:pStyle w:val="Bibliography"/>
@@ -10271,7 +12668,7 @@
       <w:r>
         <w:t xml:space="preserve">. Frontiers in Immunology. 2020;11. doi:</w:t>
       </w:r>
-      <w:hyperlink r:id="rId50">
+      <w:hyperlink r:id="rId55">
         <w:r>
           <w:rPr>
             <w:rStyle w:val="Hyperlink"/>
@@ -10280,8 +12677,8 @@
         </w:r>
       </w:hyperlink>
     </w:p>
-    <w:bookmarkEnd w:id="51"/>
-    <w:bookmarkStart w:id="53" w:name="ref-auladell2022"/>
+    <w:bookmarkEnd w:id="56"/>
+    <w:bookmarkStart w:id="58" w:name="ref-auladell2022"/>
     <w:p>
       <w:pPr>
         <w:pStyle w:val="Bibliography"/>
@@ -10298,7 +12695,7 @@
       <w:r>
         <w:t xml:space="preserve">Auladell M, Phuong HVM, Mai LTQ, Tseng Y-Y, Carolan L, Wilks S, et al. Influenza virus infection history shapes antibody responses to influenza vaccination. Nature Medicine. 2022;28: 363–372. doi:</w:t>
       </w:r>
-      <w:hyperlink r:id="rId52">
+      <w:hyperlink r:id="rId57">
         <w:r>
           <w:rPr>
             <w:rStyle w:val="Hyperlink"/>
@@ -10307,8 +12704,8 @@
         </w:r>
       </w:hyperlink>
     </w:p>
-    <w:bookmarkEnd w:id="53"/>
-    <w:bookmarkStart w:id="54" w:name="ref-wilks2023"/>
+    <w:bookmarkEnd w:id="58"/>
+    <w:bookmarkStart w:id="59" w:name="ref-wilks2023"/>
     <w:p>
       <w:pPr>
         <w:pStyle w:val="Bibliography"/>
@@ -10341,8 +12738,8 @@
         <w:t xml:space="preserve"> </w:t>
       </w:r>
     </w:p>
-    <w:bookmarkEnd w:id="54"/>
-    <w:bookmarkStart w:id="56" w:name="ref-edgar2004"/>
+    <w:bookmarkEnd w:id="59"/>
+    <w:bookmarkStart w:id="61" w:name="ref-edgar2004"/>
     <w:p>
       <w:pPr>
         <w:pStyle w:val="Bibliography"/>
@@ -10368,7 +12765,7 @@
       <w:r>
         <w:t xml:space="preserve">: A multiple sequence alignment method with reduced time and space complexity. BMC Bioinformatics. 2004;5: 113. doi:</w:t>
       </w:r>
-      <w:hyperlink r:id="rId55">
+      <w:hyperlink r:id="rId60">
         <w:r>
           <w:rPr>
             <w:rStyle w:val="Hyperlink"/>
@@ -10377,8 +12774,8 @@
         </w:r>
       </w:hyperlink>
     </w:p>
-    <w:bookmarkEnd w:id="56"/>
-    <w:bookmarkStart w:id="58" w:name="ref-legendre2010MantelAlternatives"/>
+    <w:bookmarkEnd w:id="61"/>
+    <w:bookmarkStart w:id="63" w:name="ref-legendre2010MantelAlternatives"/>
     <w:p>
       <w:pPr>
         <w:pStyle w:val="Bibliography"/>
@@ -10395,7 +12792,7 @@
       <w:r>
         <w:t xml:space="preserve">Legendre P, Fortin M-J. Comparison of the mantel test and alternative approaches for detecting complex multivariate relationships in the spatial analysis of genetic data. Molecular Ecology Resources. 2010;10: 831–844. doi:</w:t>
       </w:r>
-      <w:hyperlink r:id="rId57">
+      <w:hyperlink r:id="rId62">
         <w:r>
           <w:rPr>
             <w:rStyle w:val="Hyperlink"/>
@@ -10404,8 +12801,8 @@
         </w:r>
       </w:hyperlink>
     </w:p>
-    <w:bookmarkEnd w:id="58"/>
-    <w:bookmarkStart w:id="60" w:name="ref-legendre2015ShouldMantel"/>
+    <w:bookmarkEnd w:id="63"/>
+    <w:bookmarkStart w:id="65" w:name="ref-legendre2015ShouldMantel"/>
     <w:p>
       <w:pPr>
         <w:pStyle w:val="Bibliography"/>
@@ -10422,7 +12819,7 @@
       <w:r>
         <w:t xml:space="preserve">Legendre P, Fortin M-J, Borcard D. Should the mantel test be used in spatial analysis? Methods in Ecology and Evolution. 2015;6: 1239–1247. doi:</w:t>
       </w:r>
-      <w:hyperlink r:id="rId59">
+      <w:hyperlink r:id="rId64">
         <w:r>
           <w:rPr>
             <w:rStyle w:val="Hyperlink"/>
@@ -10431,8 +12828,8 @@
         </w:r>
       </w:hyperlink>
     </w:p>
-    <w:bookmarkEnd w:id="60"/>
-    <w:bookmarkStart w:id="61" w:name="ref-rcoreteam2024"/>
+    <w:bookmarkEnd w:id="65"/>
+    <w:bookmarkStart w:id="67" w:name="ref-rubin1981"/>
     <w:p>
       <w:pPr>
         <w:pStyle w:val="Bibliography"/>
@@ -10447,14 +12844,19 @@
         <w:t xml:space="preserve">	</w:t>
       </w:r>
       <w:r>
-        <w:t xml:space="preserve">R Core Team. R: A language and environment for statistical computing. Vienna, Austria: R Foundation for Statistical Computing; 2024.</w:t>
-      </w:r>
-      <w:r>
-        <w:t xml:space="preserve"> </w:t>
-      </w:r>
+        <w:t xml:space="preserve">Rubin DB. The bayesian bootstrap. The Annals of Statistics. 1981;9: 130–134. doi:</w:t>
+      </w:r>
+      <w:hyperlink r:id="rId66">
+        <w:r>
+          <w:rPr>
+            <w:rStyle w:val="Hyperlink"/>
+          </w:rPr>
+          <w:t xml:space="preserve">10.1214/aos/1176345338</w:t>
+        </w:r>
+      </w:hyperlink>
     </w:p>
-    <w:bookmarkEnd w:id="61"/>
-    <w:bookmarkStart w:id="63" w:name="ref-schliep2011"/>
+    <w:bookmarkEnd w:id="67"/>
+    <w:bookmarkStart w:id="68" w:name="ref-rcoreteam2024"/>
     <w:p>
       <w:pPr>
         <w:pStyle w:val="Bibliography"/>
@@ -10469,6 +12871,28 @@
         <w:t xml:space="preserve">	</w:t>
       </w:r>
       <w:r>
+        <w:t xml:space="preserve">R Core Team. R: A language and environment for statistical computing. Vienna, Austria: R Foundation for Statistical Computing; 2024.</w:t>
+      </w:r>
+      <w:r>
+        <w:t xml:space="preserve"> </w:t>
+      </w:r>
+    </w:p>
+    <w:bookmarkEnd w:id="68"/>
+    <w:bookmarkStart w:id="70" w:name="ref-schliep2011"/>
+    <w:p>
+      <w:pPr>
+        <w:pStyle w:val="Bibliography"/>
+      </w:pPr>
+      <w:r>
+        <w:t xml:space="preserve">17.</w:t>
+      </w:r>
+      <w:r>
+        <w:t xml:space="preserve"> </w:t>
+      </w:r>
+      <w:r>
+        <w:t xml:space="preserve">	</w:t>
+      </w:r>
+      <w:r>
         <w:t xml:space="preserve">Schliep KP. Phangorn: Phylogenetic analysis in</w:t>
       </w:r>
       <w:r>
@@ -10480,7 +12904,7 @@
       <w:r>
         <w:t xml:space="preserve">. Bioinformatics (Oxford, England). 2011;27: 592–593. doi:</w:t>
       </w:r>
-      <w:hyperlink r:id="rId62">
+      <w:hyperlink r:id="rId69">
         <w:r>
           <w:rPr>
             <w:rStyle w:val="Hyperlink"/>
@@ -10489,14 +12913,14 @@
         </w:r>
       </w:hyperlink>
     </w:p>
-    <w:bookmarkEnd w:id="63"/>
-    <w:bookmarkStart w:id="65" w:name="ref-bodenhofer2015"/>
+    <w:bookmarkEnd w:id="70"/>
+    <w:bookmarkStart w:id="72" w:name="ref-bodenhofer2015"/>
     <w:p>
       <w:pPr>
         <w:pStyle w:val="Bibliography"/>
       </w:pPr>
       <w:r>
-        <w:t xml:space="preserve">17.</w:t>
+        <w:t xml:space="preserve">18.</w:t>
       </w:r>
       <w:r>
         <w:t xml:space="preserve"> </w:t>
@@ -10519,7 +12943,7 @@
       <w:r>
         <w:t xml:space="preserve">package for multiple sequence alignment. Bioinformatics. 2015;31: 3997–3999. doi:</w:t>
       </w:r>
-      <w:hyperlink r:id="rId64">
+      <w:hyperlink r:id="rId71">
         <w:r>
           <w:rPr>
             <w:rStyle w:val="Hyperlink"/>
@@ -10528,9 +12952,9 @@
         </w:r>
       </w:hyperlink>
     </w:p>
-    <w:bookmarkEnd w:id="65"/>
-    <w:bookmarkEnd w:id="66"/>
-    <w:bookmarkEnd w:id="67"/>
+    <w:bookmarkEnd w:id="72"/>
+    <w:bookmarkEnd w:id="73"/>
+    <w:bookmarkEnd w:id="74"/>
     <w:sectPr/>
   </w:body>
 </w:document>

</xml_diff>

<commit_message>
build: regenerate tree comparison outputs
</commit_message>
<xml_diff>
--- a/products/manuscript.docx
+++ b/products/manuscript.docx
@@ -31,7 +31,7 @@
         <w:pStyle w:val="Date"/>
       </w:pPr>
       <w:r>
-        <w:t xml:space="preserve">2026-05-30</w:t>
+        <w:t xml:space="preserve">2026-05-31</w:t>
       </w:r>
     </w:p>
     <w:p>
@@ -431,7 +431,61 @@
         <w:t xml:space="preserve"> </w:t>
       </w:r>
       <w:r>
-        <w:t xml:space="preserve">using the FLU amino acid substitution model. We extracted the</w:t>
+        <w:t xml:space="preserve">using the FLU amino acid substitution model</w:t>
+      </w:r>
+      <w:r>
+        <w:t xml:space="preserve"> </w:t>
+      </w:r>
+      <w:r>
+        <w:t xml:space="preserve">[13]</w:t>
+      </w:r>
+      <w:r>
+        <w:t xml:space="preserve">. For each subtype, we</w:t>
+      </w:r>
+      <w:r>
+        <w:t xml:space="preserve"> </w:t>
+      </w:r>
+      <w:r>
+        <w:t xml:space="preserve">compared FLU-family models with and without invariant sites and discrete gamma</w:t>
+      </w:r>
+      <w:r>
+        <w:t xml:space="preserve"> </w:t>
+      </w:r>
+      <w:r>
+        <w:t xml:space="preserve">rate variation, evaluating gamma category counts from 4 to 32 in increments of</w:t>
+      </w:r>
+      <w:r>
+        <w:t xml:space="preserve"> </w:t>
+      </w:r>
+      <w:r>
+        <w:t xml:space="preserve">4 for the full analysis. Models were compared with AICc</w:t>
+      </w:r>
+      <w:r>
+        <w:t xml:space="preserve"> </w:t>
+      </w:r>
+      <w:r>
+        <w:t xml:space="preserve">[14,15]</w:t>
+      </w:r>
+      <w:r>
+        <w:t xml:space="preserve">. We selected the AICc-supported model within</w:t>
+      </w:r>
+      <w:r>
+        <w:t xml:space="preserve"> </w:t>
+      </w:r>
+      <w:r>
+        <w:t xml:space="preserve">each subtype, but preferred a common model for both subtypes when the common</w:t>
+      </w:r>
+      <w:r>
+        <w:t xml:space="preserve"> </w:t>
+      </w:r>
+      <w:r>
+        <w:t xml:space="preserve">model’s log-likelihood loss was no more than 10% relative to the</w:t>
+      </w:r>
+      <w:r>
+        <w:t xml:space="preserve"> </w:t>
+      </w:r>
+      <w:r>
+        <w:t xml:space="preserve">subtype-specific AICc-supported model. We extracted the</w:t>
       </w:r>
       <w:r>
         <w:t xml:space="preserve"> </w:t>
@@ -466,7 +520,7 @@
         <w:t xml:space="preserve"> </w:t>
       </w:r>
       <w:r>
-        <w:t xml:space="preserve">[13,14]</w:t>
+        <w:t xml:space="preserve">[16,17]</w:t>
       </w:r>
       <w:r>
         <w:t xml:space="preserve">. These comparisons used only unique off-diagonal</w:t>
@@ -493,7 +547,7 @@
         <w:t xml:space="preserve"> </w:t>
       </w:r>
       <w:r>
-        <w:t xml:space="preserve">[15]</w:t>
+        <w:t xml:space="preserve">[18]</w:t>
       </w:r>
       <w:r>
         <w:t xml:space="preserve">. To quantify subtype differences,</w:t>
@@ -540,31 +594,88 @@
         <w:t xml:space="preserve"> </w:t>
       </w:r>
       <w:r>
-        <w:t xml:space="preserve">neighbor joining. To compare the methods, we calculated the likelihood of each</w:t>
-      </w:r>
-      <w:r>
-        <w:t xml:space="preserve"> </w:t>
-      </w:r>
-      <w:r>
-        <w:t xml:space="preserve">of the distance-based trees, then estimated the</w:t>
-      </w:r>
-      <w:r>
-        <w:t xml:space="preserve"> </w:t>
-      </w:r>
-      <w:r>
-        <w:t xml:space="preserve">Shimodaira-Hasegawa test statistic to</w:t>
-      </w:r>
-      <w:r>
-        <w:t xml:space="preserve"> </w:t>
-      </w:r>
-      <w:r>
-        <w:t xml:space="preserve">compare each of the distance trees to the ML tree. Finally, we computed the</w:t>
-      </w:r>
-      <w:r>
-        <w:t xml:space="preserve"> </w:t>
-      </w:r>
-      <w:r>
-        <w:t xml:space="preserve">Robinson-Foulds distance between each set of trees. Our analyses were implemented</w:t>
+        <w:t xml:space="preserve">neighbor joining</w:t>
+      </w:r>
+      <w:r>
+        <w:t xml:space="preserve"> </w:t>
+      </w:r>
+      <w:r>
+        <w:t xml:space="preserve">[19]</w:t>
+      </w:r>
+      <w:r>
+        <w:t xml:space="preserve">. To compare the methods, we</w:t>
+      </w:r>
+      <w:r>
+        <w:t xml:space="preserve"> </w:t>
+      </w:r>
+      <w:r>
+        <w:t xml:space="preserve">calculated the likelihood of each distance-based tree under the selected ML</w:t>
+      </w:r>
+      <w:r>
+        <w:t xml:space="preserve"> </w:t>
+      </w:r>
+      <w:r>
+        <w:t xml:space="preserve">model and treated the decrease in log likelihood from the ML tree as the primary</w:t>
+      </w:r>
+      <w:r>
+        <w:t xml:space="preserve"> </w:t>
+      </w:r>
+      <w:r>
+        <w:t xml:space="preserve">tree-comparison statistic. We did not use a standard likelihood-ratio test</w:t>
+      </w:r>
+      <w:r>
+        <w:t xml:space="preserve"> </w:t>
+      </w:r>
+      <w:r>
+        <w:t xml:space="preserve">because these fixed distance-tree topologies are not nested regular parametric</w:t>
+      </w:r>
+      <w:r>
+        <w:t xml:space="preserve"> </w:t>
+      </w:r>
+      <w:r>
+        <w:t xml:space="preserve">models relative to the optimized ML topology. As secondary checks, we estimated</w:t>
+      </w:r>
+      <w:r>
+        <w:t xml:space="preserve"> </w:t>
+      </w:r>
+      <w:r>
+        <w:t xml:space="preserve">Shimodaira-Hasegawa p-values</w:t>
+      </w:r>
+      <w:r>
+        <w:t xml:space="preserve"> </w:t>
+      </w:r>
+      <w:r>
+        <w:t xml:space="preserve">[20]</w:t>
+      </w:r>
+      <w:r>
+        <w:t xml:space="preserve"> </w:t>
+      </w:r>
+      <w:r>
+        <w:t xml:space="preserve">and computed</w:t>
+      </w:r>
+      <w:r>
+        <w:t xml:space="preserve"> </w:t>
+      </w:r>
+      <w:r>
+        <w:t xml:space="preserve">Robinson-Foulds distances</w:t>
+      </w:r>
+      <w:r>
+        <w:t xml:space="preserve"> </w:t>
+      </w:r>
+      <w:r>
+        <w:t xml:space="preserve">[21]</w:t>
+      </w:r>
+      <w:r>
+        <w:t xml:space="preserve"> </w:t>
+      </w:r>
+      <w:r>
+        <w:t xml:space="preserve">between</w:t>
+      </w:r>
+      <w:r>
+        <w:t xml:space="preserve"> </w:t>
+      </w:r>
+      <w:r>
+        <w:t xml:space="preserve">each distance tree and the ML tree. Our analyses were implemented</w:t>
       </w:r>
       <w:r>
         <w:t xml:space="preserve"> </w:t>
@@ -576,7 +687,7 @@
         <w:t xml:space="preserve"> </w:t>
       </w:r>
       <w:r>
-        <w:t xml:space="preserve">[16]</w:t>
+        <w:t xml:space="preserve">[22]</w:t>
       </w:r>
       <w:r>
         <w:t xml:space="preserve"> </w:t>
@@ -597,7 +708,7 @@
         <w:t xml:space="preserve"> </w:t>
       </w:r>
       <w:r>
-        <w:t xml:space="preserve">[17]</w:t>
+        <w:t xml:space="preserve">[15]</w:t>
       </w:r>
       <w:r>
         <w:t xml:space="preserve"> </w:t>
@@ -618,7 +729,7 @@
         <w:t xml:space="preserve"> </w:t>
       </w:r>
       <w:r>
-        <w:t xml:space="preserve">[18]</w:t>
+        <w:t xml:space="preserve">[23]</w:t>
       </w:r>
       <w:r>
         <w:t xml:space="preserve">.</w:t>
@@ -1460,7 +1571,7 @@
                       <w:szCs w:val="22"/>
                       <w:color w:val="000000"/>
                     </w:rPr>
-                    <w:t xml:space="preserve">0.53</w:t>
+                    <w:t xml:space="preserve">0.52</w:t>
                   </w:r>
                 </w:p>
               </w:tc>
@@ -1514,7 +1625,7 @@
                       <w:szCs w:val="22"/>
                       <w:color w:val="000000"/>
                     </w:rPr>
-                    <w:t xml:space="preserve">(0.41, 0.71)</w:t>
+                    <w:t xml:space="preserve">(0.41, 0.68)</w:t>
                   </w:r>
                 </w:p>
               </w:tc>
@@ -1831,61 +1942,61 @@
                       <w:szCs w:val="22"/>
                       <w:color w:val="000000"/>
                     </w:rPr>
-                    <w:t xml:space="preserve">0.25</w:t>
-                  </w:r>
-                </w:p>
-              </w:tc>
-              <w:tc>
-                <w:tcPr>
-                  <w:tcBorders>
-                    <w:bottom w:val="none" w:sz="0" w:space="0" w:color="000000"/>
-                    <w:top w:val="none" w:sz="0" w:space="0" w:color="000000"/>
-                    <w:left w:val="none" w:sz="0" w:space="0" w:color="000000"/>
-                    <w:right w:val="none" w:sz="0" w:space="0" w:color="000000"/>
-                  </w:tcBorders>
-                  <w:shd w:val="clear" w:color="auto" w:fill="FFFFFF"/>
-                  <w:tcMar>
-                    <w:top w:w="0" w:type="dxa"/>
-                    <w:bottom w:w="0" w:type="dxa"/>
-                    <w:left w:w="0" w:type="dxa"/>
-                    <w:right w:w="0" w:type="dxa"/>
-                  </w:tcMar>
-                  <w:vAlign w:val="center"/>
-                </w:tcPr>
-                <w:p>
-                  <w:pPr>
-                    <w:jc w:val="left"/>
-                    <w:pBdr>
-                      <w:bottom w:val="none" w:sz="0" w:space="0" w:color="000000"/>
-                      <w:top w:val="none" w:sz="0" w:space="0" w:color="000000"/>
-                      <w:left w:val="none" w:sz="0" w:space="0" w:color="000000"/>
-                      <w:right w:val="none" w:sz="0" w:space="0" w:color="000000"/>
-                    </w:pBdr>
-                    <w:spacing w:after="100" w:before="100" w:line="240"/>
-                    <w:ind w:left="100" w:right="100" w:firstLine="0" w:firstLineChars="0"/>
-                    <w:rPr>
-                      <w:rFonts w:ascii="Arial" w:hAnsi="Arial" w:eastAsia="Arial" w:cs="Arial"/>
-                      <w:i w:val="false"/>
-                      <w:b w:val="false"/>
-                      <w:u w:val="none"/>
-                      <w:strike w:val="false"/>
-                      <w:sz w:val="22"/>
-                      <w:szCs w:val="22"/>
-                      <w:color w:val="000000"/>
-                    </w:rPr>
-                  </w:pPr>
-                  <w:r xmlns:w="http://schemas.openxmlformats.org/wordprocessingml/2006/main" xmlns:wp="http://schemas.openxmlformats.org/drawingml/2006/wordprocessingDrawing" xmlns:r="http://schemas.openxmlformats.org/officeDocument/2006/relationships" xmlns:w14="http://schemas.microsoft.com/office/word/2010/wordml">
-                    <w:rPr>
-                      <w:rFonts w:ascii="Arial" w:hAnsi="Arial" w:eastAsia="Arial" w:cs="Arial"/>
-                      <w:i w:val="false"/>
-                      <w:b w:val="false"/>
-                      <w:u w:val="none"/>
-                      <w:strike w:val="false"/>
-                      <w:sz w:val="22"/>
-                      <w:szCs w:val="22"/>
-                      <w:color w:val="000000"/>
-                    </w:rPr>
-                    <w:t xml:space="preserve">(0.02, 0.52)</w:t>
+                    <w:t xml:space="preserve">0.24</w:t>
+                  </w:r>
+                </w:p>
+              </w:tc>
+              <w:tc>
+                <w:tcPr>
+                  <w:tcBorders>
+                    <w:bottom w:val="none" w:sz="0" w:space="0" w:color="000000"/>
+                    <w:top w:val="none" w:sz="0" w:space="0" w:color="000000"/>
+                    <w:left w:val="none" w:sz="0" w:space="0" w:color="000000"/>
+                    <w:right w:val="none" w:sz="0" w:space="0" w:color="000000"/>
+                  </w:tcBorders>
+                  <w:shd w:val="clear" w:color="auto" w:fill="FFFFFF"/>
+                  <w:tcMar>
+                    <w:top w:w="0" w:type="dxa"/>
+                    <w:bottom w:w="0" w:type="dxa"/>
+                    <w:left w:w="0" w:type="dxa"/>
+                    <w:right w:w="0" w:type="dxa"/>
+                  </w:tcMar>
+                  <w:vAlign w:val="center"/>
+                </w:tcPr>
+                <w:p>
+                  <w:pPr>
+                    <w:jc w:val="left"/>
+                    <w:pBdr>
+                      <w:bottom w:val="none" w:sz="0" w:space="0" w:color="000000"/>
+                      <w:top w:val="none" w:sz="0" w:space="0" w:color="000000"/>
+                      <w:left w:val="none" w:sz="0" w:space="0" w:color="000000"/>
+                      <w:right w:val="none" w:sz="0" w:space="0" w:color="000000"/>
+                    </w:pBdr>
+                    <w:spacing w:after="100" w:before="100" w:line="240"/>
+                    <w:ind w:left="100" w:right="100" w:firstLine="0" w:firstLineChars="0"/>
+                    <w:rPr>
+                      <w:rFonts w:ascii="Arial" w:hAnsi="Arial" w:eastAsia="Arial" w:cs="Arial"/>
+                      <w:i w:val="false"/>
+                      <w:b w:val="false"/>
+                      <w:u w:val="none"/>
+                      <w:strike w:val="false"/>
+                      <w:sz w:val="22"/>
+                      <w:szCs w:val="22"/>
+                      <w:color w:val="000000"/>
+                    </w:rPr>
+                  </w:pPr>
+                  <w:r xmlns:w="http://schemas.openxmlformats.org/wordprocessingml/2006/main" xmlns:wp="http://schemas.openxmlformats.org/drawingml/2006/wordprocessingDrawing" xmlns:r="http://schemas.openxmlformats.org/officeDocument/2006/relationships" xmlns:w14="http://schemas.microsoft.com/office/word/2010/wordml">
+                    <w:rPr>
+                      <w:rFonts w:ascii="Arial" w:hAnsi="Arial" w:eastAsia="Arial" w:cs="Arial"/>
+                      <w:i w:val="false"/>
+                      <w:b w:val="false"/>
+                      <w:u w:val="none"/>
+                      <w:strike w:val="false"/>
+                      <w:sz w:val="22"/>
+                      <w:szCs w:val="22"/>
+                      <w:color w:val="000000"/>
+                    </w:rPr>
+                    <w:t xml:space="preserve">(0.02, 0.51)</w:t>
                   </w:r>
                 </w:p>
               </w:tc>
@@ -3011,7 +3122,7 @@
                       <w:szCs w:val="22"/>
                       <w:color w:val="000000"/>
                     </w:rPr>
-                    <w:t xml:space="preserve">(0.96, 0.99)</w:t>
+                    <w:t xml:space="preserve">(0.97, 0.99)</w:t>
                   </w:r>
                 </w:p>
               </w:tc>
@@ -3382,7 +3493,7 @@
                       <w:szCs w:val="22"/>
                       <w:color w:val="000000"/>
                     </w:rPr>
-                    <w:t xml:space="preserve">(0.83, 0.96)</w:t>
+                    <w:t xml:space="preserve">(0.82, 0.96)</w:t>
                   </w:r>
                 </w:p>
               </w:tc>
@@ -4454,61 +4565,61 @@
                       <w:szCs w:val="22"/>
                       <w:color w:val="000000"/>
                     </w:rPr>
-                    <w:t xml:space="preserve">0.93</w:t>
-                  </w:r>
-                </w:p>
-              </w:tc>
-              <w:tc>
-                <w:tcPr>
-                  <w:tcBorders>
-                    <w:bottom w:val="none" w:sz="0" w:space="0" w:color="000000"/>
-                    <w:top w:val="none" w:sz="0" w:space="0" w:color="000000"/>
-                    <w:left w:val="none" w:sz="0" w:space="0" w:color="000000"/>
-                    <w:right w:val="none" w:sz="0" w:space="0" w:color="000000"/>
-                  </w:tcBorders>
-                  <w:shd w:val="clear" w:color="auto" w:fill="FFFFFF"/>
-                  <w:tcMar>
-                    <w:top w:w="0" w:type="dxa"/>
-                    <w:bottom w:w="0" w:type="dxa"/>
-                    <w:left w:w="0" w:type="dxa"/>
-                    <w:right w:w="0" w:type="dxa"/>
-                  </w:tcMar>
-                  <w:vAlign w:val="center"/>
-                </w:tcPr>
-                <w:p>
-                  <w:pPr>
-                    <w:jc w:val="left"/>
-                    <w:pBdr>
-                      <w:bottom w:val="none" w:sz="0" w:space="0" w:color="000000"/>
-                      <w:top w:val="none" w:sz="0" w:space="0" w:color="000000"/>
-                      <w:left w:val="none" w:sz="0" w:space="0" w:color="000000"/>
-                      <w:right w:val="none" w:sz="0" w:space="0" w:color="000000"/>
-                    </w:pBdr>
-                    <w:spacing w:after="100" w:before="100" w:line="240"/>
-                    <w:ind w:left="100" w:right="100" w:firstLine="0" w:firstLineChars="0"/>
-                    <w:rPr>
-                      <w:rFonts w:ascii="Arial" w:hAnsi="Arial" w:eastAsia="Arial" w:cs="Arial"/>
-                      <w:i w:val="false"/>
-                      <w:b w:val="false"/>
-                      <w:u w:val="none"/>
-                      <w:strike w:val="false"/>
-                      <w:sz w:val="22"/>
-                      <w:szCs w:val="22"/>
-                      <w:color w:val="000000"/>
-                    </w:rPr>
-                  </w:pPr>
-                  <w:r xmlns:w="http://schemas.openxmlformats.org/wordprocessingml/2006/main" xmlns:wp="http://schemas.openxmlformats.org/drawingml/2006/wordprocessingDrawing" xmlns:r="http://schemas.openxmlformats.org/officeDocument/2006/relationships" xmlns:w14="http://schemas.microsoft.com/office/word/2010/wordml">
-                    <w:rPr>
-                      <w:rFonts w:ascii="Arial" w:hAnsi="Arial" w:eastAsia="Arial" w:cs="Arial"/>
-                      <w:i w:val="false"/>
-                      <w:b w:val="false"/>
-                      <w:u w:val="none"/>
-                      <w:strike w:val="false"/>
-                      <w:sz w:val="22"/>
-                      <w:szCs w:val="22"/>
-                      <w:color w:val="000000"/>
-                    </w:rPr>
-                    <w:t xml:space="preserve">(0.89, 0.96)</w:t>
+                    <w:t xml:space="preserve">0.92</w:t>
+                  </w:r>
+                </w:p>
+              </w:tc>
+              <w:tc>
+                <w:tcPr>
+                  <w:tcBorders>
+                    <w:bottom w:val="none" w:sz="0" w:space="0" w:color="000000"/>
+                    <w:top w:val="none" w:sz="0" w:space="0" w:color="000000"/>
+                    <w:left w:val="none" w:sz="0" w:space="0" w:color="000000"/>
+                    <w:right w:val="none" w:sz="0" w:space="0" w:color="000000"/>
+                  </w:tcBorders>
+                  <w:shd w:val="clear" w:color="auto" w:fill="FFFFFF"/>
+                  <w:tcMar>
+                    <w:top w:w="0" w:type="dxa"/>
+                    <w:bottom w:w="0" w:type="dxa"/>
+                    <w:left w:w="0" w:type="dxa"/>
+                    <w:right w:w="0" w:type="dxa"/>
+                  </w:tcMar>
+                  <w:vAlign w:val="center"/>
+                </w:tcPr>
+                <w:p>
+                  <w:pPr>
+                    <w:jc w:val="left"/>
+                    <w:pBdr>
+                      <w:bottom w:val="none" w:sz="0" w:space="0" w:color="000000"/>
+                      <w:top w:val="none" w:sz="0" w:space="0" w:color="000000"/>
+                      <w:left w:val="none" w:sz="0" w:space="0" w:color="000000"/>
+                      <w:right w:val="none" w:sz="0" w:space="0" w:color="000000"/>
+                    </w:pBdr>
+                    <w:spacing w:after="100" w:before="100" w:line="240"/>
+                    <w:ind w:left="100" w:right="100" w:firstLine="0" w:firstLineChars="0"/>
+                    <w:rPr>
+                      <w:rFonts w:ascii="Arial" w:hAnsi="Arial" w:eastAsia="Arial" w:cs="Arial"/>
+                      <w:i w:val="false"/>
+                      <w:b w:val="false"/>
+                      <w:u w:val="none"/>
+                      <w:strike w:val="false"/>
+                      <w:sz w:val="22"/>
+                      <w:szCs w:val="22"/>
+                      <w:color w:val="000000"/>
+                    </w:rPr>
+                  </w:pPr>
+                  <w:r xmlns:w="http://schemas.openxmlformats.org/wordprocessingml/2006/main" xmlns:wp="http://schemas.openxmlformats.org/drawingml/2006/wordprocessingDrawing" xmlns:r="http://schemas.openxmlformats.org/officeDocument/2006/relationships" xmlns:w14="http://schemas.microsoft.com/office/word/2010/wordml">
+                    <w:rPr>
+                      <w:rFonts w:ascii="Arial" w:hAnsi="Arial" w:eastAsia="Arial" w:cs="Arial"/>
+                      <w:i w:val="false"/>
+                      <w:b w:val="false"/>
+                      <w:u w:val="none"/>
+                      <w:strike w:val="false"/>
+                      <w:sz w:val="22"/>
+                      <w:szCs w:val="22"/>
+                      <w:color w:val="000000"/>
+                    </w:rPr>
+                    <w:t xml:space="preserve">(0.88, 0.96)</w:t>
                   </w:r>
                 </w:p>
               </w:tc>
@@ -4838,61 +4949,61 @@
                       <w:szCs w:val="22"/>
                       <w:color w:val="000000"/>
                     </w:rPr>
-                    <w:t xml:space="preserve">0.44</w:t>
-                  </w:r>
-                </w:p>
-              </w:tc>
-              <w:tc>
-                <w:tcPr>
-                  <w:tcBorders>
-                    <w:bottom w:val="none" w:sz="0" w:space="0" w:color="000000"/>
-                    <w:top w:val="none" w:sz="0" w:space="0" w:color="000000"/>
-                    <w:left w:val="none" w:sz="0" w:space="0" w:color="000000"/>
-                    <w:right w:val="none" w:sz="0" w:space="0" w:color="000000"/>
-                  </w:tcBorders>
-                  <w:shd w:val="clear" w:color="auto" w:fill="FFFFFF"/>
-                  <w:tcMar>
-                    <w:top w:w="0" w:type="dxa"/>
-                    <w:bottom w:w="0" w:type="dxa"/>
-                    <w:left w:w="0" w:type="dxa"/>
-                    <w:right w:w="0" w:type="dxa"/>
-                  </w:tcMar>
-                  <w:vAlign w:val="center"/>
-                </w:tcPr>
-                <w:p>
-                  <w:pPr>
-                    <w:jc w:val="left"/>
-                    <w:pBdr>
-                      <w:bottom w:val="none" w:sz="0" w:space="0" w:color="000000"/>
-                      <w:top w:val="none" w:sz="0" w:space="0" w:color="000000"/>
-                      <w:left w:val="none" w:sz="0" w:space="0" w:color="000000"/>
-                      <w:right w:val="none" w:sz="0" w:space="0" w:color="000000"/>
-                    </w:pBdr>
-                    <w:spacing w:after="100" w:before="100" w:line="240"/>
-                    <w:ind w:left="100" w:right="100" w:firstLine="0" w:firstLineChars="0"/>
-                    <w:rPr>
-                      <w:rFonts w:ascii="Arial" w:hAnsi="Arial" w:eastAsia="Arial" w:cs="Arial"/>
-                      <w:i w:val="false"/>
-                      <w:b w:val="false"/>
-                      <w:u w:val="none"/>
-                      <w:strike w:val="false"/>
-                      <w:sz w:val="22"/>
-                      <w:szCs w:val="22"/>
-                      <w:color w:val="000000"/>
-                    </w:rPr>
-                  </w:pPr>
-                  <w:r xmlns:w="http://schemas.openxmlformats.org/wordprocessingml/2006/main" xmlns:wp="http://schemas.openxmlformats.org/drawingml/2006/wordprocessingDrawing" xmlns:r="http://schemas.openxmlformats.org/officeDocument/2006/relationships" xmlns:w14="http://schemas.microsoft.com/office/word/2010/wordml">
-                    <w:rPr>
-                      <w:rFonts w:ascii="Arial" w:hAnsi="Arial" w:eastAsia="Arial" w:cs="Arial"/>
-                      <w:i w:val="false"/>
-                      <w:b w:val="false"/>
-                      <w:u w:val="none"/>
-                      <w:strike w:val="false"/>
-                      <w:sz w:val="22"/>
-                      <w:szCs w:val="22"/>
-                      <w:color w:val="000000"/>
-                    </w:rPr>
-                    <w:t xml:space="preserve">(0.27, 0.61)</w:t>
+                    <w:t xml:space="preserve">0.46</w:t>
+                  </w:r>
+                </w:p>
+              </w:tc>
+              <w:tc>
+                <w:tcPr>
+                  <w:tcBorders>
+                    <w:bottom w:val="none" w:sz="0" w:space="0" w:color="000000"/>
+                    <w:top w:val="none" w:sz="0" w:space="0" w:color="000000"/>
+                    <w:left w:val="none" w:sz="0" w:space="0" w:color="000000"/>
+                    <w:right w:val="none" w:sz="0" w:space="0" w:color="000000"/>
+                  </w:tcBorders>
+                  <w:shd w:val="clear" w:color="auto" w:fill="FFFFFF"/>
+                  <w:tcMar>
+                    <w:top w:w="0" w:type="dxa"/>
+                    <w:bottom w:w="0" w:type="dxa"/>
+                    <w:left w:w="0" w:type="dxa"/>
+                    <w:right w:w="0" w:type="dxa"/>
+                  </w:tcMar>
+                  <w:vAlign w:val="center"/>
+                </w:tcPr>
+                <w:p>
+                  <w:pPr>
+                    <w:jc w:val="left"/>
+                    <w:pBdr>
+                      <w:bottom w:val="none" w:sz="0" w:space="0" w:color="000000"/>
+                      <w:top w:val="none" w:sz="0" w:space="0" w:color="000000"/>
+                      <w:left w:val="none" w:sz="0" w:space="0" w:color="000000"/>
+                      <w:right w:val="none" w:sz="0" w:space="0" w:color="000000"/>
+                    </w:pBdr>
+                    <w:spacing w:after="100" w:before="100" w:line="240"/>
+                    <w:ind w:left="100" w:right="100" w:firstLine="0" w:firstLineChars="0"/>
+                    <w:rPr>
+                      <w:rFonts w:ascii="Arial" w:hAnsi="Arial" w:eastAsia="Arial" w:cs="Arial"/>
+                      <w:i w:val="false"/>
+                      <w:b w:val="false"/>
+                      <w:u w:val="none"/>
+                      <w:strike w:val="false"/>
+                      <w:sz w:val="22"/>
+                      <w:szCs w:val="22"/>
+                      <w:color w:val="000000"/>
+                    </w:rPr>
+                  </w:pPr>
+                  <w:r xmlns:w="http://schemas.openxmlformats.org/wordprocessingml/2006/main" xmlns:wp="http://schemas.openxmlformats.org/drawingml/2006/wordprocessingDrawing" xmlns:r="http://schemas.openxmlformats.org/officeDocument/2006/relationships" xmlns:w14="http://schemas.microsoft.com/office/word/2010/wordml">
+                    <w:rPr>
+                      <w:rFonts w:ascii="Arial" w:hAnsi="Arial" w:eastAsia="Arial" w:cs="Arial"/>
+                      <w:i w:val="false"/>
+                      <w:b w:val="false"/>
+                      <w:u w:val="none"/>
+                      <w:strike w:val="false"/>
+                      <w:sz w:val="22"/>
+                      <w:szCs w:val="22"/>
+                      <w:color w:val="000000"/>
+                    </w:rPr>
+                    <w:t xml:space="preserve">(0.29, 0.63)</w:t>
                   </w:r>
                 </w:p>
               </w:tc>
@@ -5634,7 +5745,7 @@
                       <w:szCs w:val="22"/>
                       <w:color w:val="000000"/>
                     </w:rPr>
-                    <w:t xml:space="preserve">(0.73, 0.89)</w:t>
+                    <w:t xml:space="preserve">(0.74, 0.90)</w:t>
                   </w:r>
                 </w:p>
               </w:tc>
@@ -6585,7 +6696,7 @@
                       <w:szCs w:val="22"/>
                       <w:color w:val="000000"/>
                     </w:rPr>
-                    <w:t xml:space="preserve">0.25</w:t>
+                    <w:t xml:space="preserve">0.24</w:t>
                   </w:r>
                 </w:p>
               </w:tc>
@@ -6693,7 +6804,7 @@
                       <w:szCs w:val="22"/>
                       <w:color w:val="000000"/>
                     </w:rPr>
-                    <w:t xml:space="preserve">0.74</w:t>
+                    <w:t xml:space="preserve">0.75</w:t>
                   </w:r>
                 </w:p>
               </w:tc>
@@ -6747,7 +6858,7 @@
                       <w:szCs w:val="22"/>
                       <w:color w:val="000000"/>
                     </w:rPr>
-                    <w:t xml:space="preserve">(0.52, 0.95)</w:t>
+                    <w:t xml:space="preserve">(0.53, 0.95)</w:t>
                   </w:r>
                 </w:p>
               </w:tc>
@@ -7184,7 +7295,7 @@
                       <w:szCs w:val="22"/>
                       <w:color w:val="000000"/>
                     </w:rPr>
-                    <w:t xml:space="preserve">(-0.14, -0.02)</w:t>
+                    <w:t xml:space="preserve">(-0.15, -0.02)</w:t>
                   </w:r>
                 </w:p>
               </w:tc>
@@ -7513,7 +7624,7 @@
                       <w:szCs w:val="22"/>
                       <w:color w:val="000000"/>
                     </w:rPr>
-                    <w:t xml:space="preserve">0.93</w:t>
+                    <w:t xml:space="preserve">0.92</w:t>
                   </w:r>
                 </w:p>
               </w:tc>
@@ -7621,7 +7732,7 @@
                       <w:szCs w:val="22"/>
                       <w:color w:val="000000"/>
                     </w:rPr>
-                    <w:t xml:space="preserve">(-0.04, 0.04)</w:t>
+                    <w:t xml:space="preserve">(-0.05, 0.04)</w:t>
                   </w:r>
                 </w:p>
               </w:tc>
@@ -8058,7 +8169,7 @@
                       <w:szCs w:val="22"/>
                       <w:color w:val="000000"/>
                     </w:rPr>
-                    <w:t xml:space="preserve">(0.18, 0.81)</w:t>
+                    <w:t xml:space="preserve">(0.19, 0.81)</w:t>
                   </w:r>
                 </w:p>
               </w:tc>
@@ -8346,21 +8457,21 @@
         <w:t xml:space="preserve"> </w:t>
       </w:r>
       <w:r>
-        <w:t xml:space="preserve">phylogenies. However, we conducted SH tests and computed</w:t>
-      </w:r>
-      <w:r>
-        <w:t xml:space="preserve"> </w:t>
-      </w:r>
-      <w:r>
-        <w:t xml:space="preserve">the RF distance between each of the distance-based trees and the</w:t>
-      </w:r>
-      <w:r>
-        <w:t xml:space="preserve"> </w:t>
-      </w:r>
-      <w:r>
-        <w:t xml:space="preserve">ML tree for the same subtype (</w:t>
-      </w:r>
-      <w:hyperlink w:anchor="tbl-stats">
+        <w:t xml:space="preserve">phylogenies. Instead, we summarize their likelihood support relative to the ML</w:t>
+      </w:r>
+      <w:r>
+        <w:t xml:space="preserve"> </w:t>
+      </w:r>
+      <w:r>
+        <w:t xml:space="preserve">tree, with SH p-values and RF distances as secondary checks</w:t>
+      </w:r>
+      <w:r>
+        <w:t xml:space="preserve"> </w:t>
+      </w:r>
+      <w:r>
+        <w:t xml:space="preserve">(</w:t>
+      </w:r>
+      <w:hyperlink w:anchor="tbl-tree-comparison">
         <w:r>
           <w:rPr>
             <w:rStyle w:val="Hyperlink"/>
@@ -8369,25 +8480,13 @@
         </w:r>
       </w:hyperlink>
       <w:r>
-        <w:t xml:space="preserve">). For the H1N1 strains, the temporal</w:t>
-      </w:r>
-      <w:r>
-        <w:t xml:space="preserve"> </w:t>
-      </w:r>
-      <w:r>
-        <w:t xml:space="preserve">distance and cartographic distance trees were different from</w:t>
-      </w:r>
-      <w:r>
-        <w:t xml:space="preserve"> </w:t>
-      </w:r>
-      <w:r>
-        <w:t xml:space="preserve">the maximum likelihood tree based on the SH test, and these trees also had</w:t>
-      </w:r>
-      <w:r>
-        <w:t xml:space="preserve"> </w:t>
-      </w:r>
-      <w:r>
-        <w:t xml:space="preserve">higher RF distance from the ML tree than the Grantham and</w:t>
+        <w:t xml:space="preserve">). For the H1N1 strains, the temporal and cartographic</w:t>
+      </w:r>
+      <w:r>
+        <w:t xml:space="preserve"> </w:t>
+      </w:r>
+      <w:r>
+        <w:t xml:space="preserve">distance trees had larger decreases in log likelihood than the Grantham and</w:t>
       </w:r>
       <w:r>
         <w:t xml:space="preserve"> </w:t>
@@ -8398,54 +8497,31 @@
         </m:r>
       </m:oMath>
       <w:r>
-        <w:t xml:space="preserve">-Epitope distance</w:t>
-      </w:r>
-      <w:r>
-        <w:t xml:space="preserve"> </w:t>
-      </w:r>
-      <w:r>
-        <w:t xml:space="preserve">trees. For the H3N2 strains, the temporal and Grantham distance trees were</w:t>
-      </w:r>
-      <w:r>
-        <w:t xml:space="preserve"> </w:t>
-      </w:r>
-      <w:r>
-        <w:t xml:space="preserve">similar to the ML tree, the</w:t>
-      </w:r>
-      <w:r>
-        <w:t xml:space="preserve"> </w:t>
-      </w:r>
-      <m:oMath>
-        <m:r>
-          <m:t>p</m:t>
-        </m:r>
-      </m:oMath>
-      <w:r>
-        <w:t xml:space="preserve">-Epitope tree had a larger likelihood decrease,</w:t>
-      </w:r>
-      <w:r>
-        <w:t xml:space="preserve"> </w:t>
-      </w:r>
-      <w:r>
-        <w:t xml:space="preserve">and the cartographic tree was very different from the ML tree. All of the</w:t>
-      </w:r>
-      <w:r>
-        <w:t xml:space="preserve"> </w:t>
-      </w:r>
-      <w:r>
-        <w:t xml:space="preserve">changes in log likelihood for the H3N2 trees were smaller in magnitude than for</w:t>
-      </w:r>
-      <w:r>
-        <w:t xml:space="preserve"> </w:t>
-      </w:r>
-      <w:r>
-        <w:t xml:space="preserve">H1N1. Notably, the temporal distance tree had a much lower likelihood than the</w:t>
-      </w:r>
-      <w:r>
-        <w:t xml:space="preserve"> </w:t>
-      </w:r>
-      <w:r>
-        <w:t xml:space="preserve">ML model for H1N1.</w:t>
+        <w:t xml:space="preserve">-Epitope distance trees. For the H3N2 strains, the cartographic tree had the</w:t>
+      </w:r>
+      <w:r>
+        <w:t xml:space="preserve"> </w:t>
+      </w:r>
+      <w:r>
+        <w:t xml:space="preserve">largest likelihood decrease, while the temporal and Grantham distance trees</w:t>
+      </w:r>
+      <w:r>
+        <w:t xml:space="preserve"> </w:t>
+      </w:r>
+      <w:r>
+        <w:t xml:space="preserve">remained closer to the ML tree. The temporal distance tree was therefore much</w:t>
+      </w:r>
+      <w:r>
+        <w:t xml:space="preserve"> </w:t>
+      </w:r>
+      <w:r>
+        <w:t xml:space="preserve">less compatible with the sequence alignment for H1N1 than for H3N2, consistent</w:t>
+      </w:r>
+      <w:r>
+        <w:t xml:space="preserve"> </w:t>
+      </w:r>
+      <w:r>
+        <w:t xml:space="preserve">with the subtype-specific temporal patterns above.</w:t>
       </w:r>
     </w:p>
     <w:tbl>
@@ -8461,7 +8537,7 @@
       <w:tr>
         <w:tc>
           <w:tcPr/>
-          <w:bookmarkStart w:id="35" w:name="tbl-stats"/>
+          <w:bookmarkStart w:id="35" w:name="tbl-tree-comparison"/>
           <w:p>
             <w:pPr>
               <w:jc w:val="center"/>
@@ -8472,7 +8548,7 @@
               <w:pStyle w:val="ImageCaption"/>
             </w:pPr>
             <w:r>
-              <w:t xml:space="preserve">Table 3: Log likelihood of all constructed trees, along with the decrease in log likelihood (Δll) from the ML model, the p-value of the Shimodaira-Hasegawa test (SH p-value; evaluated on one million bootstrap resamples), and the Robinson-Foulds distance from the ML tree (RF distance).</w:t>
+              <w:t xml:space="preserve">Table 3: Distance-tree likelihood comparison against the optimized ML tree. Delta log likelihood is the decrease in log likelihood from the ML tree. SH p-values and RF distances are secondary topology checks.</w:t>
             </w:r>
           </w:p>
           <w:tbl xmlns:w="http://schemas.openxmlformats.org/wordprocessingml/2006/main" xmlns:r="http://schemas.openxmlformats.org/officeDocument/2006/relationships" xmlns:w14="http://schemas.microsoft.com/office/word/2010/wordml" xmlns:wp="http://schemas.openxmlformats.org/drawingml/2006/wordprocessingDrawing" xmlns:a="http://schemas.openxmlformats.org/drawingml/2006/main" xmlns:pic="http://schemas.openxmlformats.org/drawingml/2006/picture">
@@ -8483,7 +8559,8 @@
             </w:tblPr>
             <w:tblGrid>
               <w:gridCol w:w="1080"/>
-              <w:gridCol w:w="2520"/>
+              <w:gridCol w:w="2160"/>
+              <w:gridCol w:w="1440"/>
               <w:gridCol w:w="1440"/>
               <w:gridCol w:w="1440"/>
               <w:gridCol w:w="1440"/>
@@ -8598,7 +8675,7 @@
                       <w:szCs w:val="22"/>
                       <w:color w:val="000000"/>
                     </w:rPr>
-                    <w:t xml:space="preserve">Tree</w:t>
+                    <w:t xml:space="preserve">Distance tree</w:t>
                   </w:r>
                 </w:p>
               </w:tc>
@@ -8652,7 +8729,7 @@
                       <w:szCs w:val="22"/>
                       <w:color w:val="000000"/>
                     </w:rPr>
-                    <w:t xml:space="preserve">log likelihood</w:t>
+                    <w:t xml:space="preserve">Delta log likelihood</w:t>
                   </w:r>
                 </w:p>
               </w:tc>
@@ -8706,7 +8783,7 @@
                       <w:szCs w:val="22"/>
                       <w:color w:val="000000"/>
                     </w:rPr>
-                    <w:t xml:space="preserve">Delta log likelihood</w:t>
+                    <w:t xml:space="preserve">Tree log likelihood</w:t>
                   </w:r>
                 </w:p>
               </w:tc>
@@ -8760,7 +8837,7 @@
                       <w:szCs w:val="22"/>
                       <w:color w:val="000000"/>
                     </w:rPr>
-                    <w:t xml:space="preserve">SH p-value</w:t>
+                    <w:t xml:space="preserve">ML log likelihood</w:t>
                   </w:r>
                 </w:p>
               </w:tc>
@@ -8814,337 +8891,61 @@
                       <w:szCs w:val="22"/>
                       <w:color w:val="000000"/>
                     </w:rPr>
+                    <w:t xml:space="preserve">SH p-value</w:t>
+                  </w:r>
+                </w:p>
+              </w:tc>
+              <w:tc>
+                <w:tcPr>
+                  <w:tcBorders>
+                    <w:bottom w:val="single" w:sz="12" w:space="0" w:color="666666"/>
+                    <w:top w:val="single" w:sz="12" w:space="0" w:color="666666"/>
+                    <w:left w:val="none" w:sz="0" w:space="0" w:color="000000"/>
+                    <w:right w:val="none" w:sz="0" w:space="0" w:color="000000"/>
+                  </w:tcBorders>
+                  <w:shd w:val="clear" w:color="auto" w:fill="FFFFFF"/>
+                  <w:tcMar>
+                    <w:top w:w="0" w:type="dxa"/>
+                    <w:bottom w:w="0" w:type="dxa"/>
+                    <w:left w:w="0" w:type="dxa"/>
+                    <w:right w:w="0" w:type="dxa"/>
+                  </w:tcMar>
+                  <w:vAlign w:val="center"/>
+                </w:tcPr>
+                <w:p>
+                  <w:pPr>
+                    <w:jc w:val="left"/>
+                    <w:pBdr>
+                      <w:bottom w:val="none" w:sz="0" w:space="0" w:color="000000"/>
+                      <w:top w:val="none" w:sz="0" w:space="0" w:color="000000"/>
+                      <w:left w:val="none" w:sz="0" w:space="0" w:color="000000"/>
+                      <w:right w:val="none" w:sz="0" w:space="0" w:color="000000"/>
+                    </w:pBdr>
+                    <w:spacing w:after="100" w:before="100" w:line="240"/>
+                    <w:ind w:left="100" w:right="100" w:firstLine="0" w:firstLineChars="0"/>
+                    <w:rPr>
+                      <w:rFonts w:ascii="Arial" w:hAnsi="Arial" w:eastAsia="Arial" w:cs="Arial"/>
+                      <w:i w:val="false"/>
+                      <w:b w:val="false"/>
+                      <w:u w:val="none"/>
+                      <w:strike w:val="false"/>
+                      <w:sz w:val="22"/>
+                      <w:szCs w:val="22"/>
+                      <w:color w:val="000000"/>
+                    </w:rPr>
+                  </w:pPr>
+                  <w:r xmlns:w="http://schemas.openxmlformats.org/wordprocessingml/2006/main" xmlns:wp="http://schemas.openxmlformats.org/drawingml/2006/wordprocessingDrawing" xmlns:r="http://schemas.openxmlformats.org/officeDocument/2006/relationships" xmlns:w14="http://schemas.microsoft.com/office/word/2010/wordml">
+                    <w:rPr>
+                      <w:rFonts w:ascii="Arial" w:hAnsi="Arial" w:eastAsia="Arial" w:cs="Arial"/>
+                      <w:i w:val="false"/>
+                      <w:b w:val="false"/>
+                      <w:u w:val="none"/>
+                      <w:strike w:val="false"/>
+                      <w:sz w:val="22"/>
+                      <w:szCs w:val="22"/>
+                      <w:color w:val="000000"/>
+                    </w:rPr>
                     <w:t xml:space="preserve">RF distance</w:t>
-                  </w:r>
-                </w:p>
-              </w:tc>
-            </w:tr>
-            <w:tr>
-              <w:trPr>
-                <w:trHeight w:val="572" w:hRule="auto"/>
-              </w:trPr>
-              <w:tc>
-                <w:tcPr>
-                  <w:vMerge w:val="restart"/>
-                  <w:tcBorders>
-                    <w:bottom w:val="none" w:sz="0" w:space="0" w:color="000000"/>
-                    <w:top w:val="single" w:sz="12" w:space="0" w:color="666666"/>
-                    <w:left w:val="none" w:sz="0" w:space="0" w:color="000000"/>
-                    <w:right w:val="none" w:sz="0" w:space="0" w:color="000000"/>
-                  </w:tcBorders>
-                  <w:shd w:val="clear" w:color="auto" w:fill="FFFFFF"/>
-                  <w:tcMar>
-                    <w:top w:w="0" w:type="dxa"/>
-                    <w:bottom w:w="0" w:type="dxa"/>
-                    <w:left w:w="0" w:type="dxa"/>
-                    <w:right w:w="0" w:type="dxa"/>
-                  </w:tcMar>
-                  <w:vAlign w:val="top"/>
-                </w:tcPr>
-                <w:p>
-                  <w:pPr>
-                    <w:jc w:val="left"/>
-                    <w:pBdr>
-                      <w:bottom w:val="none" w:sz="0" w:space="0" w:color="000000"/>
-                      <w:top w:val="none" w:sz="0" w:space="0" w:color="000000"/>
-                      <w:left w:val="none" w:sz="0" w:space="0" w:color="000000"/>
-                      <w:right w:val="none" w:sz="0" w:space="0" w:color="000000"/>
-                    </w:pBdr>
-                    <w:spacing w:after="100" w:before="100" w:line="240"/>
-                    <w:ind w:left="100" w:right="100" w:firstLine="0" w:firstLineChars="0"/>
-                    <w:rPr>
-                      <w:rFonts w:ascii="Arial" w:hAnsi="Arial" w:eastAsia="Arial" w:cs="Arial"/>
-                      <w:i w:val="false"/>
-                      <w:b w:val="false"/>
-                      <w:u w:val="none"/>
-                      <w:strike w:val="false"/>
-                      <w:sz w:val="22"/>
-                      <w:szCs w:val="22"/>
-                      <w:color w:val="000000"/>
-                    </w:rPr>
-                  </w:pPr>
-                  <w:r xmlns:w="http://schemas.openxmlformats.org/wordprocessingml/2006/main" xmlns:wp="http://schemas.openxmlformats.org/drawingml/2006/wordprocessingDrawing" xmlns:r="http://schemas.openxmlformats.org/officeDocument/2006/relationships" xmlns:w14="http://schemas.microsoft.com/office/word/2010/wordml">
-                    <w:rPr>
-                      <w:rFonts w:ascii="Arial" w:hAnsi="Arial" w:eastAsia="Arial" w:cs="Arial"/>
-                      <w:i w:val="false"/>
-                      <w:b w:val="false"/>
-                      <w:u w:val="none"/>
-                      <w:strike w:val="false"/>
-                      <w:sz w:val="22"/>
-                      <w:szCs w:val="22"/>
-                      <w:color w:val="000000"/>
-                    </w:rPr>
-                    <w:t xml:space="preserve">H1N1</w:t>
-                  </w:r>
-                </w:p>
-              </w:tc>
-              <w:tc>
-                <w:tcPr>
-                  <w:tcBorders>
-                    <w:bottom w:val="none" w:sz="0" w:space="0" w:color="000000"/>
-                    <w:top w:val="single" w:sz="12" w:space="0" w:color="666666"/>
-                    <w:left w:val="none" w:sz="0" w:space="0" w:color="000000"/>
-                    <w:right w:val="none" w:sz="0" w:space="0" w:color="000000"/>
-                  </w:tcBorders>
-                  <w:shd w:val="clear" w:color="auto" w:fill="FFFFFF"/>
-                  <w:tcMar>
-                    <w:top w:w="0" w:type="dxa"/>
-                    <w:bottom w:w="0" w:type="dxa"/>
-                    <w:left w:w="0" w:type="dxa"/>
-                    <w:right w:w="0" w:type="dxa"/>
-                  </w:tcMar>
-                  <w:vAlign w:val="center"/>
-                </w:tcPr>
-                <w:p>
-                  <w:pPr>
-                    <w:jc w:val="left"/>
-                    <w:pBdr>
-                      <w:bottom w:val="none" w:sz="0" w:space="0" w:color="000000"/>
-                      <w:top w:val="none" w:sz="0" w:space="0" w:color="000000"/>
-                      <w:left w:val="none" w:sz="0" w:space="0" w:color="000000"/>
-                      <w:right w:val="none" w:sz="0" w:space="0" w:color="000000"/>
-                    </w:pBdr>
-                    <w:spacing w:after="100" w:before="100" w:line="240"/>
-                    <w:ind w:left="100" w:right="100" w:firstLine="0" w:firstLineChars="0"/>
-                    <w:rPr>
-                      <w:rFonts w:ascii="Arial" w:hAnsi="Arial" w:eastAsia="Arial" w:cs="Arial"/>
-                      <w:i w:val="false"/>
-                      <w:b w:val="false"/>
-                      <w:u w:val="none"/>
-                      <w:strike w:val="false"/>
-                      <w:sz w:val="22"/>
-                      <w:szCs w:val="22"/>
-                      <w:color w:val="000000"/>
-                    </w:rPr>
-                  </w:pPr>
-                  <w:r xmlns:w="http://schemas.openxmlformats.org/wordprocessingml/2006/main" xmlns:wp="http://schemas.openxmlformats.org/drawingml/2006/wordprocessingDrawing" xmlns:r="http://schemas.openxmlformats.org/officeDocument/2006/relationships" xmlns:w14="http://schemas.microsoft.com/office/word/2010/wordml">
-                    <w:rPr>
-                      <w:rFonts w:ascii="Arial" w:hAnsi="Arial" w:eastAsia="Arial" w:cs="Arial"/>
-                      <w:i w:val="false"/>
-                      <w:b w:val="false"/>
-                      <w:u w:val="none"/>
-                      <w:strike w:val="false"/>
-                      <w:sz w:val="22"/>
-                      <w:szCs w:val="22"/>
-                      <w:color w:val="000000"/>
-                    </w:rPr>
-                    <w:t xml:space="preserve">Maximum likelihood baseline</w:t>
-                  </w:r>
-                </w:p>
-              </w:tc>
-              <w:tc>
-                <w:tcPr>
-                  <w:tcBorders>
-                    <w:bottom w:val="none" w:sz="0" w:space="0" w:color="000000"/>
-                    <w:top w:val="single" w:sz="12" w:space="0" w:color="666666"/>
-                    <w:left w:val="none" w:sz="0" w:space="0" w:color="000000"/>
-                    <w:right w:val="none" w:sz="0" w:space="0" w:color="000000"/>
-                  </w:tcBorders>
-                  <w:shd w:val="clear" w:color="auto" w:fill="FFFFFF"/>
-                  <w:tcMar>
-                    <w:top w:w="0" w:type="dxa"/>
-                    <w:bottom w:w="0" w:type="dxa"/>
-                    <w:left w:w="0" w:type="dxa"/>
-                    <w:right w:w="0" w:type="dxa"/>
-                  </w:tcMar>
-                  <w:vAlign w:val="center"/>
-                </w:tcPr>
-                <w:p>
-                  <w:pPr>
-                    <w:jc w:val="left"/>
-                    <w:pBdr>
-                      <w:bottom w:val="none" w:sz="0" w:space="0" w:color="000000"/>
-                      <w:top w:val="none" w:sz="0" w:space="0" w:color="000000"/>
-                      <w:left w:val="none" w:sz="0" w:space="0" w:color="000000"/>
-                      <w:right w:val="none" w:sz="0" w:space="0" w:color="000000"/>
-                    </w:pBdr>
-                    <w:spacing w:after="100" w:before="100" w:line="240"/>
-                    <w:ind w:left="100" w:right="100" w:firstLine="0" w:firstLineChars="0"/>
-                    <w:rPr>
-                      <w:rFonts w:ascii="Arial" w:hAnsi="Arial" w:eastAsia="Arial" w:cs="Arial"/>
-                      <w:i w:val="false"/>
-                      <w:b w:val="false"/>
-                      <w:u w:val="none"/>
-                      <w:strike w:val="false"/>
-                      <w:sz w:val="22"/>
-                      <w:szCs w:val="22"/>
-                      <w:color w:val="000000"/>
-                    </w:rPr>
-                  </w:pPr>
-                  <w:r xmlns:w="http://schemas.openxmlformats.org/wordprocessingml/2006/main" xmlns:wp="http://schemas.openxmlformats.org/drawingml/2006/wordprocessingDrawing" xmlns:r="http://schemas.openxmlformats.org/officeDocument/2006/relationships" xmlns:w14="http://schemas.microsoft.com/office/word/2010/wordml">
-                    <w:rPr>
-                      <w:rFonts w:ascii="Arial" w:hAnsi="Arial" w:eastAsia="Arial" w:cs="Arial"/>
-                      <w:i w:val="false"/>
-                      <w:b w:val="false"/>
-                      <w:u w:val="none"/>
-                      <w:strike w:val="false"/>
-                      <w:sz w:val="22"/>
-                      <w:szCs w:val="22"/>
-                      <w:color w:val="000000"/>
-                    </w:rPr>
-                    <w:t xml:space="preserve">-3543.9</w:t>
-                  </w:r>
-                </w:p>
-              </w:tc>
-              <w:tc>
-                <w:tcPr>
-                  <w:tcBorders>
-                    <w:bottom w:val="none" w:sz="0" w:space="0" w:color="000000"/>
-                    <w:top w:val="single" w:sz="12" w:space="0" w:color="666666"/>
-                    <w:left w:val="none" w:sz="0" w:space="0" w:color="000000"/>
-                    <w:right w:val="none" w:sz="0" w:space="0" w:color="000000"/>
-                  </w:tcBorders>
-                  <w:shd w:val="clear" w:color="auto" w:fill="FFFFFF"/>
-                  <w:tcMar>
-                    <w:top w:w="0" w:type="dxa"/>
-                    <w:bottom w:w="0" w:type="dxa"/>
-                    <w:left w:w="0" w:type="dxa"/>
-                    <w:right w:w="0" w:type="dxa"/>
-                  </w:tcMar>
-                  <w:vAlign w:val="center"/>
-                </w:tcPr>
-                <w:p>
-                  <w:pPr>
-                    <w:jc w:val="left"/>
-                    <w:pBdr>
-                      <w:bottom w:val="none" w:sz="0" w:space="0" w:color="000000"/>
-                      <w:top w:val="none" w:sz="0" w:space="0" w:color="000000"/>
-                      <w:left w:val="none" w:sz="0" w:space="0" w:color="000000"/>
-                      <w:right w:val="none" w:sz="0" w:space="0" w:color="000000"/>
-                    </w:pBdr>
-                    <w:spacing w:after="100" w:before="100" w:line="240"/>
-                    <w:ind w:left="100" w:right="100" w:firstLine="0" w:firstLineChars="0"/>
-                    <w:rPr>
-                      <w:rFonts w:ascii="Arial" w:hAnsi="Arial" w:eastAsia="Arial" w:cs="Arial"/>
-                      <w:i w:val="false"/>
-                      <w:b w:val="false"/>
-                      <w:u w:val="none"/>
-                      <w:strike w:val="false"/>
-                      <w:sz w:val="22"/>
-                      <w:szCs w:val="22"/>
-                      <w:color w:val="000000"/>
-                    </w:rPr>
-                  </w:pPr>
-                  <w:r xmlns:w="http://schemas.openxmlformats.org/wordprocessingml/2006/main" xmlns:wp="http://schemas.openxmlformats.org/drawingml/2006/wordprocessingDrawing" xmlns:r="http://schemas.openxmlformats.org/officeDocument/2006/relationships" xmlns:w14="http://schemas.microsoft.com/office/word/2010/wordml">
-                    <w:rPr>
-                      <w:rFonts w:ascii="Arial" w:hAnsi="Arial" w:eastAsia="Arial" w:cs="Arial"/>
-                      <w:i w:val="false"/>
-                      <w:b w:val="false"/>
-                      <w:u w:val="none"/>
-                      <w:strike w:val="false"/>
-                      <w:sz w:val="22"/>
-                      <w:szCs w:val="22"/>
-                      <w:color w:val="000000"/>
-                    </w:rPr>
-                    <w:t xml:space="preserve">0.0</w:t>
-                  </w:r>
-                </w:p>
-              </w:tc>
-              <w:tc>
-                <w:tcPr>
-                  <w:tcBorders>
-                    <w:bottom w:val="none" w:sz="0" w:space="0" w:color="000000"/>
-                    <w:top w:val="single" w:sz="12" w:space="0" w:color="666666"/>
-                    <w:left w:val="none" w:sz="0" w:space="0" w:color="000000"/>
-                    <w:right w:val="none" w:sz="0" w:space="0" w:color="000000"/>
-                  </w:tcBorders>
-                  <w:shd w:val="clear" w:color="auto" w:fill="FFFFFF"/>
-                  <w:tcMar>
-                    <w:top w:w="0" w:type="dxa"/>
-                    <w:bottom w:w="0" w:type="dxa"/>
-                    <w:left w:w="0" w:type="dxa"/>
-                    <w:right w:w="0" w:type="dxa"/>
-                  </w:tcMar>
-                  <w:vAlign w:val="center"/>
-                </w:tcPr>
-                <w:p>
-                  <w:pPr>
-                    <w:jc w:val="left"/>
-                    <w:pBdr>
-                      <w:bottom w:val="none" w:sz="0" w:space="0" w:color="000000"/>
-                      <w:top w:val="none" w:sz="0" w:space="0" w:color="000000"/>
-                      <w:left w:val="none" w:sz="0" w:space="0" w:color="000000"/>
-                      <w:right w:val="none" w:sz="0" w:space="0" w:color="000000"/>
-                    </w:pBdr>
-                    <w:spacing w:after="100" w:before="100" w:line="240"/>
-                    <w:ind w:left="100" w:right="100" w:firstLine="0" w:firstLineChars="0"/>
-                    <w:rPr>
-                      <w:rFonts w:ascii="Arial" w:hAnsi="Arial" w:eastAsia="Arial" w:cs="Arial"/>
-                      <w:i w:val="false"/>
-                      <w:b w:val="false"/>
-                      <w:u w:val="none"/>
-                      <w:strike w:val="false"/>
-                      <w:sz w:val="22"/>
-                      <w:szCs w:val="22"/>
-                      <w:color w:val="000000"/>
-                    </w:rPr>
-                  </w:pPr>
-                  <w:r xmlns:w="http://schemas.openxmlformats.org/wordprocessingml/2006/main" xmlns:wp="http://schemas.openxmlformats.org/drawingml/2006/wordprocessingDrawing" xmlns:r="http://schemas.openxmlformats.org/officeDocument/2006/relationships" xmlns:w14="http://schemas.microsoft.com/office/word/2010/wordml">
-                    <w:rPr>
-                      <w:rFonts w:ascii="Arial" w:hAnsi="Arial" w:eastAsia="Arial" w:cs="Arial"/>
-                      <w:i w:val="false"/>
-                      <w:b w:val="false"/>
-                      <w:u w:val="none"/>
-                      <w:strike w:val="false"/>
-                      <w:sz w:val="22"/>
-                      <w:szCs w:val="22"/>
-                      <w:color w:val="000000"/>
-                    </w:rPr>
-                    <w:t xml:space="preserve">0.850</w:t>
-                  </w:r>
-                </w:p>
-              </w:tc>
-              <w:tc>
-                <w:tcPr>
-                  <w:tcBorders>
-                    <w:bottom w:val="none" w:sz="0" w:space="0" w:color="000000"/>
-                    <w:top w:val="single" w:sz="12" w:space="0" w:color="666666"/>
-                    <w:left w:val="none" w:sz="0" w:space="0" w:color="000000"/>
-                    <w:right w:val="none" w:sz="0" w:space="0" w:color="000000"/>
-                  </w:tcBorders>
-                  <w:shd w:val="clear" w:color="auto" w:fill="FFFFFF"/>
-                  <w:tcMar>
-                    <w:top w:w="0" w:type="dxa"/>
-                    <w:bottom w:w="0" w:type="dxa"/>
-                    <w:left w:w="0" w:type="dxa"/>
-                    <w:right w:w="0" w:type="dxa"/>
-                  </w:tcMar>
-                  <w:vAlign w:val="center"/>
-                </w:tcPr>
-                <w:p>
-                  <w:pPr>
-                    <w:jc w:val="left"/>
-                    <w:pBdr>
-                      <w:bottom w:val="none" w:sz="0" w:space="0" w:color="000000"/>
-                      <w:top w:val="none" w:sz="0" w:space="0" w:color="000000"/>
-                      <w:left w:val="none" w:sz="0" w:space="0" w:color="000000"/>
-                      <w:right w:val="none" w:sz="0" w:space="0" w:color="000000"/>
-                    </w:pBdr>
-                    <w:spacing w:after="100" w:before="100" w:line="240"/>
-                    <w:ind w:left="100" w:right="100" w:firstLine="0" w:firstLineChars="0"/>
-                    <w:rPr>
-                      <w:rFonts w:ascii="Arial" w:hAnsi="Arial" w:eastAsia="Arial" w:cs="Arial"/>
-                      <w:i w:val="false"/>
-                      <w:b w:val="false"/>
-                      <w:u w:val="none"/>
-                      <w:strike w:val="false"/>
-                      <w:sz w:val="22"/>
-                      <w:szCs w:val="22"/>
-                      <w:color w:val="000000"/>
-                    </w:rPr>
-                  </w:pPr>
-                  <w:r xmlns:w="http://schemas.openxmlformats.org/wordprocessingml/2006/main" xmlns:wp="http://schemas.openxmlformats.org/drawingml/2006/wordprocessingDrawing" xmlns:r="http://schemas.openxmlformats.org/officeDocument/2006/relationships" xmlns:w14="http://schemas.microsoft.com/office/word/2010/wordml">
-                    <w:rPr>
-                      <w:rFonts w:ascii="Arial" w:hAnsi="Arial" w:eastAsia="Arial" w:cs="Arial"/>
-                      <w:i w:val="false"/>
-                      <w:b w:val="false"/>
-                      <w:u w:val="none"/>
-                      <w:strike w:val="false"/>
-                      <w:sz w:val="22"/>
-                      <w:szCs w:val="22"/>
-                      <w:color w:val="000000"/>
-                    </w:rPr>
-                    <w:t xml:space="preserve">NA</w:t>
                   </w:r>
                 </w:p>
               </w:tc>
@@ -9155,10 +8956,10 @@
               </w:trPr>
               <w:tc>
                 <w:tcPr>
-                  <w:vMerge/>
-                  <w:tcBorders>
-                    <w:bottom w:val="none" w:sz="0" w:space="0" w:color="000000"/>
-                    <w:top w:val="none" w:sz="0" w:space="0" w:color="000000"/>
+                  <w:vMerge w:val="restart"/>
+                  <w:tcBorders>
+                    <w:bottom w:val="none" w:sz="0" w:space="0" w:color="000000"/>
+                    <w:top w:val="single" w:sz="12" w:space="0" w:color="666666"/>
                     <w:left w:val="none" w:sz="0" w:space="0" w:color="000000"/>
                     <w:right w:val="none" w:sz="0" w:space="0" w:color="000000"/>
                   </w:tcBorders>
@@ -9193,13 +8994,26 @@
                       <w:color w:val="000000"/>
                     </w:rPr>
                   </w:pPr>
-                </w:p>
-              </w:tc>
-              <w:tc>
-                <w:tcPr>
-                  <w:tcBorders>
-                    <w:bottom w:val="none" w:sz="0" w:space="0" w:color="000000"/>
-                    <w:top w:val="none" w:sz="0" w:space="0" w:color="000000"/>
+                  <w:r xmlns:w="http://schemas.openxmlformats.org/wordprocessingml/2006/main" xmlns:wp="http://schemas.openxmlformats.org/drawingml/2006/wordprocessingDrawing" xmlns:r="http://schemas.openxmlformats.org/officeDocument/2006/relationships" xmlns:w14="http://schemas.microsoft.com/office/word/2010/wordml">
+                    <w:rPr>
+                      <w:rFonts w:ascii="Arial" w:hAnsi="Arial" w:eastAsia="Arial" w:cs="Arial"/>
+                      <w:i w:val="false"/>
+                      <w:b w:val="false"/>
+                      <w:u w:val="none"/>
+                      <w:strike w:val="false"/>
+                      <w:sz w:val="22"/>
+                      <w:szCs w:val="22"/>
+                      <w:color w:val="000000"/>
+                    </w:rPr>
+                    <w:t xml:space="preserve">H1N1</w:t>
+                  </w:r>
+                </w:p>
+              </w:tc>
+              <w:tc>
+                <w:tcPr>
+                  <w:tcBorders>
+                    <w:bottom w:val="none" w:sz="0" w:space="0" w:color="000000"/>
+                    <w:top w:val="single" w:sz="12" w:space="0" w:color="666666"/>
                     <w:left w:val="none" w:sz="0" w:space="0" w:color="000000"/>
                     <w:right w:val="none" w:sz="0" w:space="0" w:color="000000"/>
                   </w:tcBorders>
@@ -9253,115 +9067,170 @@
                 <w:tcPr>
                   <w:tcBorders>
                     <w:bottom w:val="none" w:sz="0" w:space="0" w:color="000000"/>
-                    <w:top w:val="none" w:sz="0" w:space="0" w:color="000000"/>
-                    <w:left w:val="none" w:sz="0" w:space="0" w:color="000000"/>
-                    <w:right w:val="none" w:sz="0" w:space="0" w:color="000000"/>
-                  </w:tcBorders>
-                  <w:shd w:val="clear" w:color="auto" w:fill="FFFFFF"/>
-                  <w:tcMar>
-                    <w:top w:w="0" w:type="dxa"/>
-                    <w:bottom w:w="0" w:type="dxa"/>
-                    <w:left w:w="0" w:type="dxa"/>
-                    <w:right w:w="0" w:type="dxa"/>
-                  </w:tcMar>
-                  <w:vAlign w:val="center"/>
-                </w:tcPr>
-                <w:p>
-                  <w:pPr>
-                    <w:jc w:val="left"/>
-                    <w:pBdr>
-                      <w:bottom w:val="none" w:sz="0" w:space="0" w:color="000000"/>
-                      <w:top w:val="none" w:sz="0" w:space="0" w:color="000000"/>
-                      <w:left w:val="none" w:sz="0" w:space="0" w:color="000000"/>
-                      <w:right w:val="none" w:sz="0" w:space="0" w:color="000000"/>
-                    </w:pBdr>
-                    <w:spacing w:after="100" w:before="100" w:line="240"/>
-                    <w:ind w:left="100" w:right="100" w:firstLine="0" w:firstLineChars="0"/>
-                    <w:rPr>
-                      <w:rFonts w:ascii="Arial" w:hAnsi="Arial" w:eastAsia="Arial" w:cs="Arial"/>
-                      <w:i w:val="false"/>
-                      <w:b w:val="false"/>
-                      <w:u w:val="none"/>
-                      <w:strike w:val="false"/>
-                      <w:sz w:val="22"/>
-                      <w:szCs w:val="22"/>
-                      <w:color w:val="000000"/>
-                    </w:rPr>
-                  </w:pPr>
-                  <w:r xmlns:w="http://schemas.openxmlformats.org/wordprocessingml/2006/main" xmlns:wp="http://schemas.openxmlformats.org/drawingml/2006/wordprocessingDrawing" xmlns:r="http://schemas.openxmlformats.org/officeDocument/2006/relationships" xmlns:w14="http://schemas.microsoft.com/office/word/2010/wordml">
-                    <w:rPr>
-                      <w:rFonts w:ascii="Arial" w:hAnsi="Arial" w:eastAsia="Arial" w:cs="Arial"/>
-                      <w:i w:val="false"/>
-                      <w:b w:val="false"/>
-                      <w:u w:val="none"/>
-                      <w:strike w:val="false"/>
-                      <w:sz w:val="22"/>
-                      <w:szCs w:val="22"/>
-                      <w:color w:val="000000"/>
-                    </w:rPr>
-                    <w:t xml:space="preserve">-4016.6</w:t>
-                  </w:r>
-                </w:p>
-              </w:tc>
-              <w:tc>
-                <w:tcPr>
-                  <w:tcBorders>
-                    <w:bottom w:val="none" w:sz="0" w:space="0" w:color="000000"/>
-                    <w:top w:val="none" w:sz="0" w:space="0" w:color="000000"/>
-                    <w:left w:val="none" w:sz="0" w:space="0" w:color="000000"/>
-                    <w:right w:val="none" w:sz="0" w:space="0" w:color="000000"/>
-                  </w:tcBorders>
-                  <w:shd w:val="clear" w:color="auto" w:fill="FFFFFF"/>
-                  <w:tcMar>
-                    <w:top w:w="0" w:type="dxa"/>
-                    <w:bottom w:w="0" w:type="dxa"/>
-                    <w:left w:w="0" w:type="dxa"/>
-                    <w:right w:w="0" w:type="dxa"/>
-                  </w:tcMar>
-                  <w:vAlign w:val="center"/>
-                </w:tcPr>
-                <w:p>
-                  <w:pPr>
-                    <w:jc w:val="left"/>
-                    <w:pBdr>
-                      <w:bottom w:val="none" w:sz="0" w:space="0" w:color="000000"/>
-                      <w:top w:val="none" w:sz="0" w:space="0" w:color="000000"/>
-                      <w:left w:val="none" w:sz="0" w:space="0" w:color="000000"/>
-                      <w:right w:val="none" w:sz="0" w:space="0" w:color="000000"/>
-                    </w:pBdr>
-                    <w:spacing w:after="100" w:before="100" w:line="240"/>
-                    <w:ind w:left="100" w:right="100" w:firstLine="0" w:firstLineChars="0"/>
-                    <w:rPr>
-                      <w:rFonts w:ascii="Arial" w:hAnsi="Arial" w:eastAsia="Arial" w:cs="Arial"/>
-                      <w:i w:val="false"/>
-                      <w:b w:val="false"/>
-                      <w:u w:val="none"/>
-                      <w:strike w:val="false"/>
-                      <w:sz w:val="22"/>
-                      <w:szCs w:val="22"/>
-                      <w:color w:val="000000"/>
-                    </w:rPr>
-                  </w:pPr>
-                  <w:r xmlns:w="http://schemas.openxmlformats.org/wordprocessingml/2006/main" xmlns:wp="http://schemas.openxmlformats.org/drawingml/2006/wordprocessingDrawing" xmlns:r="http://schemas.openxmlformats.org/officeDocument/2006/relationships" xmlns:w14="http://schemas.microsoft.com/office/word/2010/wordml">
-                    <w:rPr>
-                      <w:rFonts w:ascii="Arial" w:hAnsi="Arial" w:eastAsia="Arial" w:cs="Arial"/>
-                      <w:i w:val="false"/>
-                      <w:b w:val="false"/>
-                      <w:u w:val="none"/>
-                      <w:strike w:val="false"/>
-                      <w:sz w:val="22"/>
-                      <w:szCs w:val="22"/>
-                      <w:color w:val="000000"/>
-                    </w:rPr>
-                    <w:t xml:space="preserve">472.7</w:t>
-                  </w:r>
-                </w:p>
-              </w:tc>
-              <w:tc>
-                <w:tcPr>
-                  <w:tcBorders>
-                    <w:bottom w:val="none" w:sz="0" w:space="0" w:color="000000"/>
-                    <w:top w:val="none" w:sz="0" w:space="0" w:color="000000"/>
+                    <w:top w:val="single" w:sz="12" w:space="0" w:color="666666"/>
+                    <w:left w:val="none" w:sz="0" w:space="0" w:color="000000"/>
+                    <w:right w:val="none" w:sz="0" w:space="0" w:color="000000"/>
+                  </w:tcBorders>
+                  <w:shd w:val="clear" w:color="auto" w:fill="FFFFFF"/>
+                  <w:tcMar>
+                    <w:top w:w="0" w:type="dxa"/>
+                    <w:bottom w:w="0" w:type="dxa"/>
+                    <w:left w:w="0" w:type="dxa"/>
+                    <w:right w:w="0" w:type="dxa"/>
+                  </w:tcMar>
+                  <w:vAlign w:val="center"/>
+                </w:tcPr>
+                <w:p>
+                  <w:pPr>
+                    <w:jc w:val="left"/>
+                    <w:pBdr>
+                      <w:bottom w:val="none" w:sz="0" w:space="0" w:color="000000"/>
+                      <w:top w:val="none" w:sz="0" w:space="0" w:color="000000"/>
+                      <w:left w:val="none" w:sz="0" w:space="0" w:color="000000"/>
+                      <w:right w:val="none" w:sz="0" w:space="0" w:color="000000"/>
+                    </w:pBdr>
+                    <w:spacing w:after="100" w:before="100" w:line="240"/>
+                    <w:ind w:left="100" w:right="100" w:firstLine="0" w:firstLineChars="0"/>
+                    <w:rPr>
+                      <w:rFonts w:ascii="Arial" w:hAnsi="Arial" w:eastAsia="Arial" w:cs="Arial"/>
+                      <w:i w:val="false"/>
+                      <w:b w:val="false"/>
+                      <w:u w:val="none"/>
+                      <w:strike w:val="false"/>
+                      <w:sz w:val="22"/>
+                      <w:szCs w:val="22"/>
+                      <w:color w:val="000000"/>
+                    </w:rPr>
+                  </w:pPr>
+                  <w:r xmlns:w="http://schemas.openxmlformats.org/wordprocessingml/2006/main" xmlns:wp="http://schemas.openxmlformats.org/drawingml/2006/wordprocessingDrawing" xmlns:r="http://schemas.openxmlformats.org/officeDocument/2006/relationships" xmlns:w14="http://schemas.microsoft.com/office/word/2010/wordml">
+                    <w:rPr>
+                      <w:rFonts w:ascii="Arial" w:hAnsi="Arial" w:eastAsia="Arial" w:cs="Arial"/>
+                      <w:i w:val="false"/>
+                      <w:b w:val="false"/>
+                      <w:u w:val="none"/>
+                      <w:strike w:val="false"/>
+                      <w:sz w:val="22"/>
+                      <w:szCs w:val="22"/>
+                      <w:color w:val="000000"/>
+                    </w:rPr>
+                    <w:t xml:space="preserve">1160.4</w:t>
+                  </w:r>
+                </w:p>
+              </w:tc>
+              <w:tc>
+                <w:tcPr>
+                  <w:tcBorders>
+                    <w:bottom w:val="none" w:sz="0" w:space="0" w:color="000000"/>
+                    <w:top w:val="single" w:sz="12" w:space="0" w:color="666666"/>
+                    <w:left w:val="none" w:sz="0" w:space="0" w:color="000000"/>
+                    <w:right w:val="none" w:sz="0" w:space="0" w:color="000000"/>
+                  </w:tcBorders>
+                  <w:shd w:val="clear" w:color="auto" w:fill="FFFFFF"/>
+                  <w:tcMar>
+                    <w:top w:w="0" w:type="dxa"/>
+                    <w:bottom w:w="0" w:type="dxa"/>
+                    <w:left w:w="0" w:type="dxa"/>
+                    <w:right w:w="0" w:type="dxa"/>
+                  </w:tcMar>
+                  <w:vAlign w:val="center"/>
+                </w:tcPr>
+                <w:p>
+                  <w:pPr>
+                    <w:jc w:val="left"/>
+                    <w:pBdr>
+                      <w:bottom w:val="none" w:sz="0" w:space="0" w:color="000000"/>
+                      <w:top w:val="none" w:sz="0" w:space="0" w:color="000000"/>
+                      <w:left w:val="none" w:sz="0" w:space="0" w:color="000000"/>
+                      <w:right w:val="none" w:sz="0" w:space="0" w:color="000000"/>
+                    </w:pBdr>
+                    <w:spacing w:after="100" w:before="100" w:line="240"/>
+                    <w:ind w:left="100" w:right="100" w:firstLine="0" w:firstLineChars="0"/>
+                    <w:rPr>
+                      <w:rFonts w:ascii="Arial" w:hAnsi="Arial" w:eastAsia="Arial" w:cs="Arial"/>
+                      <w:i w:val="false"/>
+                      <w:b w:val="false"/>
+                      <w:u w:val="none"/>
+                      <w:strike w:val="false"/>
+                      <w:sz w:val="22"/>
+                      <w:szCs w:val="22"/>
+                      <w:color w:val="000000"/>
+                    </w:rPr>
+                  </w:pPr>
+                  <w:r xmlns:w="http://schemas.openxmlformats.org/wordprocessingml/2006/main" xmlns:wp="http://schemas.openxmlformats.org/drawingml/2006/wordprocessingDrawing" xmlns:r="http://schemas.openxmlformats.org/officeDocument/2006/relationships" xmlns:w14="http://schemas.microsoft.com/office/word/2010/wordml">
+                    <w:rPr>
+                      <w:rFonts w:ascii="Arial" w:hAnsi="Arial" w:eastAsia="Arial" w:cs="Arial"/>
+                      <w:i w:val="false"/>
+                      <w:b w:val="false"/>
+                      <w:u w:val="none"/>
+                      <w:strike w:val="false"/>
+                      <w:sz w:val="22"/>
+                      <w:szCs w:val="22"/>
+                      <w:color w:val="000000"/>
+                    </w:rPr>
+                    <w:t xml:space="preserve">-4629.2</w:t>
+                  </w:r>
+                </w:p>
+              </w:tc>
+              <w:tc>
+                <w:tcPr>
+                  <w:vMerge w:val="restart"/>
+                  <w:tcBorders>
+                    <w:bottom w:val="none" w:sz="0" w:space="0" w:color="000000"/>
+                    <w:top w:val="single" w:sz="12" w:space="0" w:color="666666"/>
+                    <w:left w:val="none" w:sz="0" w:space="0" w:color="000000"/>
+                    <w:right w:val="none" w:sz="0" w:space="0" w:color="000000"/>
+                  </w:tcBorders>
+                  <w:shd w:val="clear" w:color="auto" w:fill="FFFFFF"/>
+                  <w:tcMar>
+                    <w:top w:w="0" w:type="dxa"/>
+                    <w:bottom w:w="0" w:type="dxa"/>
+                    <w:left w:w="0" w:type="dxa"/>
+                    <w:right w:w="0" w:type="dxa"/>
+                  </w:tcMar>
+                  <w:vAlign w:val="top"/>
+                </w:tcPr>
+                <w:p>
+                  <w:pPr>
+                    <w:jc w:val="left"/>
+                    <w:pBdr>
+                      <w:bottom w:val="none" w:sz="0" w:space="0" w:color="000000"/>
+                      <w:top w:val="none" w:sz="0" w:space="0" w:color="000000"/>
+                      <w:left w:val="none" w:sz="0" w:space="0" w:color="000000"/>
+                      <w:right w:val="none" w:sz="0" w:space="0" w:color="000000"/>
+                    </w:pBdr>
+                    <w:spacing w:after="100" w:before="100" w:line="240"/>
+                    <w:ind w:left="100" w:right="100" w:firstLine="0" w:firstLineChars="0"/>
+                    <w:rPr>
+                      <w:rFonts w:ascii="Arial" w:hAnsi="Arial" w:eastAsia="Arial" w:cs="Arial"/>
+                      <w:i w:val="false"/>
+                      <w:b w:val="false"/>
+                      <w:u w:val="none"/>
+                      <w:strike w:val="false"/>
+                      <w:sz w:val="22"/>
+                      <w:szCs w:val="22"/>
+                      <w:color w:val="000000"/>
+                    </w:rPr>
+                  </w:pPr>
+                  <w:r xmlns:w="http://schemas.openxmlformats.org/wordprocessingml/2006/main" xmlns:wp="http://schemas.openxmlformats.org/drawingml/2006/wordprocessingDrawing" xmlns:r="http://schemas.openxmlformats.org/officeDocument/2006/relationships" xmlns:w14="http://schemas.microsoft.com/office/word/2010/wordml">
+                    <w:rPr>
+                      <w:rFonts w:ascii="Arial" w:hAnsi="Arial" w:eastAsia="Arial" w:cs="Arial"/>
+                      <w:i w:val="false"/>
+                      <w:b w:val="false"/>
+                      <w:u w:val="none"/>
+                      <w:strike w:val="false"/>
+                      <w:sz w:val="22"/>
+                      <w:szCs w:val="22"/>
+                      <w:color w:val="000000"/>
+                    </w:rPr>
+                    <w:t xml:space="preserve">-3468.8</w:t>
+                  </w:r>
+                </w:p>
+              </w:tc>
+              <w:tc>
+                <w:tcPr>
+                  <w:tcBorders>
+                    <w:bottom w:val="none" w:sz="0" w:space="0" w:color="000000"/>
+                    <w:top w:val="single" w:sz="12" w:space="0" w:color="666666"/>
                     <w:left w:val="none" w:sz="0" w:space="0" w:color="000000"/>
                     <w:right w:val="none" w:sz="0" w:space="0" w:color="000000"/>
                   </w:tcBorders>
@@ -9415,7 +9284,7 @@
                 <w:tcPr>
                   <w:tcBorders>
                     <w:bottom w:val="none" w:sz="0" w:space="0" w:color="000000"/>
-                    <w:top w:val="none" w:sz="0" w:space="0" w:color="000000"/>
+                    <w:top w:val="single" w:sz="12" w:space="0" w:color="666666"/>
                     <w:left w:val="none" w:sz="0" w:space="0" w:color="000000"/>
                     <w:right w:val="none" w:sz="0" w:space="0" w:color="000000"/>
                   </w:tcBorders>
@@ -9616,115 +9485,157 @@
                       <w:szCs w:val="22"/>
                       <w:color w:val="000000"/>
                     </w:rPr>
-                    <w:t xml:space="preserve">-3560.6</w:t>
-                  </w:r>
-                </w:p>
-              </w:tc>
-              <w:tc>
-                <w:tcPr>
-                  <w:tcBorders>
-                    <w:bottom w:val="none" w:sz="0" w:space="0" w:color="000000"/>
-                    <w:top w:val="none" w:sz="0" w:space="0" w:color="000000"/>
-                    <w:left w:val="none" w:sz="0" w:space="0" w:color="000000"/>
-                    <w:right w:val="none" w:sz="0" w:space="0" w:color="000000"/>
-                  </w:tcBorders>
-                  <w:shd w:val="clear" w:color="auto" w:fill="FFFFFF"/>
-                  <w:tcMar>
-                    <w:top w:w="0" w:type="dxa"/>
-                    <w:bottom w:w="0" w:type="dxa"/>
-                    <w:left w:w="0" w:type="dxa"/>
-                    <w:right w:w="0" w:type="dxa"/>
-                  </w:tcMar>
-                  <w:vAlign w:val="center"/>
-                </w:tcPr>
-                <w:p>
-                  <w:pPr>
-                    <w:jc w:val="left"/>
-                    <w:pBdr>
-                      <w:bottom w:val="none" w:sz="0" w:space="0" w:color="000000"/>
-                      <w:top w:val="none" w:sz="0" w:space="0" w:color="000000"/>
-                      <w:left w:val="none" w:sz="0" w:space="0" w:color="000000"/>
-                      <w:right w:val="none" w:sz="0" w:space="0" w:color="000000"/>
-                    </w:pBdr>
-                    <w:spacing w:after="100" w:before="100" w:line="240"/>
-                    <w:ind w:left="100" w:right="100" w:firstLine="0" w:firstLineChars="0"/>
-                    <w:rPr>
-                      <w:rFonts w:ascii="Arial" w:hAnsi="Arial" w:eastAsia="Arial" w:cs="Arial"/>
-                      <w:i w:val="false"/>
-                      <w:b w:val="false"/>
-                      <w:u w:val="none"/>
-                      <w:strike w:val="false"/>
-                      <w:sz w:val="22"/>
-                      <w:szCs w:val="22"/>
-                      <w:color w:val="000000"/>
-                    </w:rPr>
-                  </w:pPr>
-                  <w:r xmlns:w="http://schemas.openxmlformats.org/wordprocessingml/2006/main" xmlns:wp="http://schemas.openxmlformats.org/drawingml/2006/wordprocessingDrawing" xmlns:r="http://schemas.openxmlformats.org/officeDocument/2006/relationships" xmlns:w14="http://schemas.microsoft.com/office/word/2010/wordml">
-                    <w:rPr>
-                      <w:rFonts w:ascii="Arial" w:hAnsi="Arial" w:eastAsia="Arial" w:cs="Arial"/>
-                      <w:i w:val="false"/>
-                      <w:b w:val="false"/>
-                      <w:u w:val="none"/>
-                      <w:strike w:val="false"/>
-                      <w:sz w:val="22"/>
-                      <w:szCs w:val="22"/>
-                      <w:color w:val="000000"/>
-                    </w:rPr>
-                    <w:t xml:space="preserve">16.8</w:t>
-                  </w:r>
-                </w:p>
-              </w:tc>
-              <w:tc>
-                <w:tcPr>
-                  <w:tcBorders>
-                    <w:bottom w:val="none" w:sz="0" w:space="0" w:color="000000"/>
-                    <w:top w:val="none" w:sz="0" w:space="0" w:color="000000"/>
-                    <w:left w:val="none" w:sz="0" w:space="0" w:color="000000"/>
-                    <w:right w:val="none" w:sz="0" w:space="0" w:color="000000"/>
-                  </w:tcBorders>
-                  <w:shd w:val="clear" w:color="auto" w:fill="FFFFFF"/>
-                  <w:tcMar>
-                    <w:top w:w="0" w:type="dxa"/>
-                    <w:bottom w:w="0" w:type="dxa"/>
-                    <w:left w:w="0" w:type="dxa"/>
-                    <w:right w:w="0" w:type="dxa"/>
-                  </w:tcMar>
-                  <w:vAlign w:val="center"/>
-                </w:tcPr>
-                <w:p>
-                  <w:pPr>
-                    <w:jc w:val="left"/>
-                    <w:pBdr>
-                      <w:bottom w:val="none" w:sz="0" w:space="0" w:color="000000"/>
-                      <w:top w:val="none" w:sz="0" w:space="0" w:color="000000"/>
-                      <w:left w:val="none" w:sz="0" w:space="0" w:color="000000"/>
-                      <w:right w:val="none" w:sz="0" w:space="0" w:color="000000"/>
-                    </w:pBdr>
-                    <w:spacing w:after="100" w:before="100" w:line="240"/>
-                    <w:ind w:left="100" w:right="100" w:firstLine="0" w:firstLineChars="0"/>
-                    <w:rPr>
-                      <w:rFonts w:ascii="Arial" w:hAnsi="Arial" w:eastAsia="Arial" w:cs="Arial"/>
-                      <w:i w:val="false"/>
-                      <w:b w:val="false"/>
-                      <w:u w:val="none"/>
-                      <w:strike w:val="false"/>
-                      <w:sz w:val="22"/>
-                      <w:szCs w:val="22"/>
-                      <w:color w:val="000000"/>
-                    </w:rPr>
-                  </w:pPr>
-                  <w:r xmlns:w="http://schemas.openxmlformats.org/wordprocessingml/2006/main" xmlns:wp="http://schemas.openxmlformats.org/drawingml/2006/wordprocessingDrawing" xmlns:r="http://schemas.openxmlformats.org/officeDocument/2006/relationships" xmlns:w14="http://schemas.microsoft.com/office/word/2010/wordml">
-                    <w:rPr>
-                      <w:rFonts w:ascii="Arial" w:hAnsi="Arial" w:eastAsia="Arial" w:cs="Arial"/>
-                      <w:i w:val="false"/>
-                      <w:b w:val="false"/>
-                      <w:u w:val="none"/>
-                      <w:strike w:val="false"/>
-                      <w:sz w:val="22"/>
-                      <w:szCs w:val="22"/>
-                      <w:color w:val="000000"/>
-                    </w:rPr>
-                    <w:t xml:space="preserve">0.550</w:t>
+                    <w:t xml:space="preserve">29.1</w:t>
+                  </w:r>
+                </w:p>
+              </w:tc>
+              <w:tc>
+                <w:tcPr>
+                  <w:tcBorders>
+                    <w:bottom w:val="none" w:sz="0" w:space="0" w:color="000000"/>
+                    <w:top w:val="none" w:sz="0" w:space="0" w:color="000000"/>
+                    <w:left w:val="none" w:sz="0" w:space="0" w:color="000000"/>
+                    <w:right w:val="none" w:sz="0" w:space="0" w:color="000000"/>
+                  </w:tcBorders>
+                  <w:shd w:val="clear" w:color="auto" w:fill="FFFFFF"/>
+                  <w:tcMar>
+                    <w:top w:w="0" w:type="dxa"/>
+                    <w:bottom w:w="0" w:type="dxa"/>
+                    <w:left w:w="0" w:type="dxa"/>
+                    <w:right w:w="0" w:type="dxa"/>
+                  </w:tcMar>
+                  <w:vAlign w:val="center"/>
+                </w:tcPr>
+                <w:p>
+                  <w:pPr>
+                    <w:jc w:val="left"/>
+                    <w:pBdr>
+                      <w:bottom w:val="none" w:sz="0" w:space="0" w:color="000000"/>
+                      <w:top w:val="none" w:sz="0" w:space="0" w:color="000000"/>
+                      <w:left w:val="none" w:sz="0" w:space="0" w:color="000000"/>
+                      <w:right w:val="none" w:sz="0" w:space="0" w:color="000000"/>
+                    </w:pBdr>
+                    <w:spacing w:after="100" w:before="100" w:line="240"/>
+                    <w:ind w:left="100" w:right="100" w:firstLine="0" w:firstLineChars="0"/>
+                    <w:rPr>
+                      <w:rFonts w:ascii="Arial" w:hAnsi="Arial" w:eastAsia="Arial" w:cs="Arial"/>
+                      <w:i w:val="false"/>
+                      <w:b w:val="false"/>
+                      <w:u w:val="none"/>
+                      <w:strike w:val="false"/>
+                      <w:sz w:val="22"/>
+                      <w:szCs w:val="22"/>
+                      <w:color w:val="000000"/>
+                    </w:rPr>
+                  </w:pPr>
+                  <w:r xmlns:w="http://schemas.openxmlformats.org/wordprocessingml/2006/main" xmlns:wp="http://schemas.openxmlformats.org/drawingml/2006/wordprocessingDrawing" xmlns:r="http://schemas.openxmlformats.org/officeDocument/2006/relationships" xmlns:w14="http://schemas.microsoft.com/office/word/2010/wordml">
+                    <w:rPr>
+                      <w:rFonts w:ascii="Arial" w:hAnsi="Arial" w:eastAsia="Arial" w:cs="Arial"/>
+                      <w:i w:val="false"/>
+                      <w:b w:val="false"/>
+                      <w:u w:val="none"/>
+                      <w:strike w:val="false"/>
+                      <w:sz w:val="22"/>
+                      <w:szCs w:val="22"/>
+                      <w:color w:val="000000"/>
+                    </w:rPr>
+                    <w:t xml:space="preserve">-3498.0</w:t>
+                  </w:r>
+                </w:p>
+              </w:tc>
+              <w:tc>
+                <w:tcPr>
+                  <w:vMerge/>
+                  <w:tcBorders>
+                    <w:bottom w:val="none" w:sz="0" w:space="0" w:color="000000"/>
+                    <w:top w:val="none" w:sz="0" w:space="0" w:color="000000"/>
+                    <w:left w:val="none" w:sz="0" w:space="0" w:color="000000"/>
+                    <w:right w:val="none" w:sz="0" w:space="0" w:color="000000"/>
+                  </w:tcBorders>
+                  <w:shd w:val="clear" w:color="auto" w:fill="FFFFFF"/>
+                  <w:tcMar>
+                    <w:top w:w="0" w:type="dxa"/>
+                    <w:bottom w:w="0" w:type="dxa"/>
+                    <w:left w:w="0" w:type="dxa"/>
+                    <w:right w:w="0" w:type="dxa"/>
+                  </w:tcMar>
+                  <w:vAlign w:val="top"/>
+                </w:tcPr>
+                <w:p>
+                  <w:pPr>
+                    <w:jc w:val="left"/>
+                    <w:pBdr>
+                      <w:bottom w:val="none" w:sz="0" w:space="0" w:color="000000"/>
+                      <w:top w:val="none" w:sz="0" w:space="0" w:color="000000"/>
+                      <w:left w:val="none" w:sz="0" w:space="0" w:color="000000"/>
+                      <w:right w:val="none" w:sz="0" w:space="0" w:color="000000"/>
+                    </w:pBdr>
+                    <w:spacing w:after="100" w:before="100" w:line="240"/>
+                    <w:ind w:left="100" w:right="100" w:firstLine="0" w:firstLineChars="0"/>
+                    <w:rPr>
+                      <w:rFonts w:ascii="Arial" w:hAnsi="Arial" w:eastAsia="Arial" w:cs="Arial"/>
+                      <w:i w:val="false"/>
+                      <w:b w:val="false"/>
+                      <w:u w:val="none"/>
+                      <w:strike w:val="false"/>
+                      <w:sz w:val="22"/>
+                      <w:szCs w:val="22"/>
+                      <w:color w:val="000000"/>
+                    </w:rPr>
+                  </w:pPr>
+                </w:p>
+              </w:tc>
+              <w:tc>
+                <w:tcPr>
+                  <w:tcBorders>
+                    <w:bottom w:val="none" w:sz="0" w:space="0" w:color="000000"/>
+                    <w:top w:val="none" w:sz="0" w:space="0" w:color="000000"/>
+                    <w:left w:val="none" w:sz="0" w:space="0" w:color="000000"/>
+                    <w:right w:val="none" w:sz="0" w:space="0" w:color="000000"/>
+                  </w:tcBorders>
+                  <w:shd w:val="clear" w:color="auto" w:fill="FFFFFF"/>
+                  <w:tcMar>
+                    <w:top w:w="0" w:type="dxa"/>
+                    <w:bottom w:w="0" w:type="dxa"/>
+                    <w:left w:w="0" w:type="dxa"/>
+                    <w:right w:w="0" w:type="dxa"/>
+                  </w:tcMar>
+                  <w:vAlign w:val="center"/>
+                </w:tcPr>
+                <w:p>
+                  <w:pPr>
+                    <w:jc w:val="left"/>
+                    <w:pBdr>
+                      <w:bottom w:val="none" w:sz="0" w:space="0" w:color="000000"/>
+                      <w:top w:val="none" w:sz="0" w:space="0" w:color="000000"/>
+                      <w:left w:val="none" w:sz="0" w:space="0" w:color="000000"/>
+                      <w:right w:val="none" w:sz="0" w:space="0" w:color="000000"/>
+                    </w:pBdr>
+                    <w:spacing w:after="100" w:before="100" w:line="240"/>
+                    <w:ind w:left="100" w:right="100" w:firstLine="0" w:firstLineChars="0"/>
+                    <w:rPr>
+                      <w:rFonts w:ascii="Arial" w:hAnsi="Arial" w:eastAsia="Arial" w:cs="Arial"/>
+                      <w:i w:val="false"/>
+                      <w:b w:val="false"/>
+                      <w:u w:val="none"/>
+                      <w:strike w:val="false"/>
+                      <w:sz w:val="22"/>
+                      <w:szCs w:val="22"/>
+                      <w:color w:val="000000"/>
+                    </w:rPr>
+                  </w:pPr>
+                  <w:r xmlns:w="http://schemas.openxmlformats.org/wordprocessingml/2006/main" xmlns:wp="http://schemas.openxmlformats.org/drawingml/2006/wordprocessingDrawing" xmlns:r="http://schemas.openxmlformats.org/officeDocument/2006/relationships" xmlns:w14="http://schemas.microsoft.com/office/word/2010/wordml">
+                    <w:rPr>
+                      <w:rFonts w:ascii="Arial" w:hAnsi="Arial" w:eastAsia="Arial" w:cs="Arial"/>
+                      <w:i w:val="false"/>
+                      <w:b w:val="false"/>
+                      <w:u w:val="none"/>
+                      <w:strike w:val="false"/>
+                      <w:sz w:val="22"/>
+                      <w:szCs w:val="22"/>
+                      <w:color w:val="000000"/>
+                    </w:rPr>
+                    <w:t xml:space="preserve">0.450</w:t>
                   </w:r>
                 </w:p>
               </w:tc>
@@ -9933,115 +9844,157 @@
                       <w:szCs w:val="22"/>
                       <w:color w:val="000000"/>
                     </w:rPr>
-                    <w:t xml:space="preserve">-3627.6</w:t>
-                  </w:r>
-                </w:p>
-              </w:tc>
-              <w:tc>
-                <w:tcPr>
-                  <w:tcBorders>
-                    <w:bottom w:val="none" w:sz="0" w:space="0" w:color="000000"/>
-                    <w:top w:val="none" w:sz="0" w:space="0" w:color="000000"/>
-                    <w:left w:val="none" w:sz="0" w:space="0" w:color="000000"/>
-                    <w:right w:val="none" w:sz="0" w:space="0" w:color="000000"/>
-                  </w:tcBorders>
-                  <w:shd w:val="clear" w:color="auto" w:fill="FFFFFF"/>
-                  <w:tcMar>
-                    <w:top w:w="0" w:type="dxa"/>
-                    <w:bottom w:w="0" w:type="dxa"/>
-                    <w:left w:w="0" w:type="dxa"/>
-                    <w:right w:w="0" w:type="dxa"/>
-                  </w:tcMar>
-                  <w:vAlign w:val="center"/>
-                </w:tcPr>
-                <w:p>
-                  <w:pPr>
-                    <w:jc w:val="left"/>
-                    <w:pBdr>
-                      <w:bottom w:val="none" w:sz="0" w:space="0" w:color="000000"/>
-                      <w:top w:val="none" w:sz="0" w:space="0" w:color="000000"/>
-                      <w:left w:val="none" w:sz="0" w:space="0" w:color="000000"/>
-                      <w:right w:val="none" w:sz="0" w:space="0" w:color="000000"/>
-                    </w:pBdr>
-                    <w:spacing w:after="100" w:before="100" w:line="240"/>
-                    <w:ind w:left="100" w:right="100" w:firstLine="0" w:firstLineChars="0"/>
-                    <w:rPr>
-                      <w:rFonts w:ascii="Arial" w:hAnsi="Arial" w:eastAsia="Arial" w:cs="Arial"/>
-                      <w:i w:val="false"/>
-                      <w:b w:val="false"/>
-                      <w:u w:val="none"/>
-                      <w:strike w:val="false"/>
-                      <w:sz w:val="22"/>
-                      <w:szCs w:val="22"/>
-                      <w:color w:val="000000"/>
-                    </w:rPr>
-                  </w:pPr>
-                  <w:r xmlns:w="http://schemas.openxmlformats.org/wordprocessingml/2006/main" xmlns:wp="http://schemas.openxmlformats.org/drawingml/2006/wordprocessingDrawing" xmlns:r="http://schemas.openxmlformats.org/officeDocument/2006/relationships" xmlns:w14="http://schemas.microsoft.com/office/word/2010/wordml">
-                    <w:rPr>
-                      <w:rFonts w:ascii="Arial" w:hAnsi="Arial" w:eastAsia="Arial" w:cs="Arial"/>
-                      <w:i w:val="false"/>
-                      <w:b w:val="false"/>
-                      <w:u w:val="none"/>
-                      <w:strike w:val="false"/>
-                      <w:sz w:val="22"/>
-                      <w:szCs w:val="22"/>
-                      <w:color w:val="000000"/>
-                    </w:rPr>
-                    <w:t xml:space="preserve">83.7</w:t>
-                  </w:r>
-                </w:p>
-              </w:tc>
-              <w:tc>
-                <w:tcPr>
-                  <w:tcBorders>
-                    <w:bottom w:val="none" w:sz="0" w:space="0" w:color="000000"/>
-                    <w:top w:val="none" w:sz="0" w:space="0" w:color="000000"/>
-                    <w:left w:val="none" w:sz="0" w:space="0" w:color="000000"/>
-                    <w:right w:val="none" w:sz="0" w:space="0" w:color="000000"/>
-                  </w:tcBorders>
-                  <w:shd w:val="clear" w:color="auto" w:fill="FFFFFF"/>
-                  <w:tcMar>
-                    <w:top w:w="0" w:type="dxa"/>
-                    <w:bottom w:w="0" w:type="dxa"/>
-                    <w:left w:w="0" w:type="dxa"/>
-                    <w:right w:w="0" w:type="dxa"/>
-                  </w:tcMar>
-                  <w:vAlign w:val="center"/>
-                </w:tcPr>
-                <w:p>
-                  <w:pPr>
-                    <w:jc w:val="left"/>
-                    <w:pBdr>
-                      <w:bottom w:val="none" w:sz="0" w:space="0" w:color="000000"/>
-                      <w:top w:val="none" w:sz="0" w:space="0" w:color="000000"/>
-                      <w:left w:val="none" w:sz="0" w:space="0" w:color="000000"/>
-                      <w:right w:val="none" w:sz="0" w:space="0" w:color="000000"/>
-                    </w:pBdr>
-                    <w:spacing w:after="100" w:before="100" w:line="240"/>
-                    <w:ind w:left="100" w:right="100" w:firstLine="0" w:firstLineChars="0"/>
-                    <w:rPr>
-                      <w:rFonts w:ascii="Arial" w:hAnsi="Arial" w:eastAsia="Arial" w:cs="Arial"/>
-                      <w:i w:val="false"/>
-                      <w:b w:val="false"/>
-                      <w:u w:val="none"/>
-                      <w:strike w:val="false"/>
-                      <w:sz w:val="22"/>
-                      <w:szCs w:val="22"/>
-                      <w:color w:val="000000"/>
-                    </w:rPr>
-                  </w:pPr>
-                  <w:r xmlns:w="http://schemas.openxmlformats.org/wordprocessingml/2006/main" xmlns:wp="http://schemas.openxmlformats.org/drawingml/2006/wordprocessingDrawing" xmlns:r="http://schemas.openxmlformats.org/officeDocument/2006/relationships" xmlns:w14="http://schemas.microsoft.com/office/word/2010/wordml">
-                    <w:rPr>
-                      <w:rFonts w:ascii="Arial" w:hAnsi="Arial" w:eastAsia="Arial" w:cs="Arial"/>
-                      <w:i w:val="false"/>
-                      <w:b w:val="false"/>
-                      <w:u w:val="none"/>
-                      <w:strike w:val="false"/>
-                      <w:sz w:val="22"/>
-                      <w:szCs w:val="22"/>
-                      <w:color w:val="000000"/>
-                    </w:rPr>
-                    <w:t xml:space="preserve">0.120</w:t>
+                    <w:t xml:space="preserve">78.8</w:t>
+                  </w:r>
+                </w:p>
+              </w:tc>
+              <w:tc>
+                <w:tcPr>
+                  <w:tcBorders>
+                    <w:bottom w:val="none" w:sz="0" w:space="0" w:color="000000"/>
+                    <w:top w:val="none" w:sz="0" w:space="0" w:color="000000"/>
+                    <w:left w:val="none" w:sz="0" w:space="0" w:color="000000"/>
+                    <w:right w:val="none" w:sz="0" w:space="0" w:color="000000"/>
+                  </w:tcBorders>
+                  <w:shd w:val="clear" w:color="auto" w:fill="FFFFFF"/>
+                  <w:tcMar>
+                    <w:top w:w="0" w:type="dxa"/>
+                    <w:bottom w:w="0" w:type="dxa"/>
+                    <w:left w:w="0" w:type="dxa"/>
+                    <w:right w:w="0" w:type="dxa"/>
+                  </w:tcMar>
+                  <w:vAlign w:val="center"/>
+                </w:tcPr>
+                <w:p>
+                  <w:pPr>
+                    <w:jc w:val="left"/>
+                    <w:pBdr>
+                      <w:bottom w:val="none" w:sz="0" w:space="0" w:color="000000"/>
+                      <w:top w:val="none" w:sz="0" w:space="0" w:color="000000"/>
+                      <w:left w:val="none" w:sz="0" w:space="0" w:color="000000"/>
+                      <w:right w:val="none" w:sz="0" w:space="0" w:color="000000"/>
+                    </w:pBdr>
+                    <w:spacing w:after="100" w:before="100" w:line="240"/>
+                    <w:ind w:left="100" w:right="100" w:firstLine="0" w:firstLineChars="0"/>
+                    <w:rPr>
+                      <w:rFonts w:ascii="Arial" w:hAnsi="Arial" w:eastAsia="Arial" w:cs="Arial"/>
+                      <w:i w:val="false"/>
+                      <w:b w:val="false"/>
+                      <w:u w:val="none"/>
+                      <w:strike w:val="false"/>
+                      <w:sz w:val="22"/>
+                      <w:szCs w:val="22"/>
+                      <w:color w:val="000000"/>
+                    </w:rPr>
+                  </w:pPr>
+                  <w:r xmlns:w="http://schemas.openxmlformats.org/wordprocessingml/2006/main" xmlns:wp="http://schemas.openxmlformats.org/drawingml/2006/wordprocessingDrawing" xmlns:r="http://schemas.openxmlformats.org/officeDocument/2006/relationships" xmlns:w14="http://schemas.microsoft.com/office/word/2010/wordml">
+                    <w:rPr>
+                      <w:rFonts w:ascii="Arial" w:hAnsi="Arial" w:eastAsia="Arial" w:cs="Arial"/>
+                      <w:i w:val="false"/>
+                      <w:b w:val="false"/>
+                      <w:u w:val="none"/>
+                      <w:strike w:val="false"/>
+                      <w:sz w:val="22"/>
+                      <w:szCs w:val="22"/>
+                      <w:color w:val="000000"/>
+                    </w:rPr>
+                    <w:t xml:space="preserve">-3547.6</w:t>
+                  </w:r>
+                </w:p>
+              </w:tc>
+              <w:tc>
+                <w:tcPr>
+                  <w:vMerge/>
+                  <w:tcBorders>
+                    <w:bottom w:val="none" w:sz="0" w:space="0" w:color="000000"/>
+                    <w:top w:val="none" w:sz="0" w:space="0" w:color="000000"/>
+                    <w:left w:val="none" w:sz="0" w:space="0" w:color="000000"/>
+                    <w:right w:val="none" w:sz="0" w:space="0" w:color="000000"/>
+                  </w:tcBorders>
+                  <w:shd w:val="clear" w:color="auto" w:fill="FFFFFF"/>
+                  <w:tcMar>
+                    <w:top w:w="0" w:type="dxa"/>
+                    <w:bottom w:w="0" w:type="dxa"/>
+                    <w:left w:w="0" w:type="dxa"/>
+                    <w:right w:w="0" w:type="dxa"/>
+                  </w:tcMar>
+                  <w:vAlign w:val="top"/>
+                </w:tcPr>
+                <w:p>
+                  <w:pPr>
+                    <w:jc w:val="left"/>
+                    <w:pBdr>
+                      <w:bottom w:val="none" w:sz="0" w:space="0" w:color="000000"/>
+                      <w:top w:val="none" w:sz="0" w:space="0" w:color="000000"/>
+                      <w:left w:val="none" w:sz="0" w:space="0" w:color="000000"/>
+                      <w:right w:val="none" w:sz="0" w:space="0" w:color="000000"/>
+                    </w:pBdr>
+                    <w:spacing w:after="100" w:before="100" w:line="240"/>
+                    <w:ind w:left="100" w:right="100" w:firstLine="0" w:firstLineChars="0"/>
+                    <w:rPr>
+                      <w:rFonts w:ascii="Arial" w:hAnsi="Arial" w:eastAsia="Arial" w:cs="Arial"/>
+                      <w:i w:val="false"/>
+                      <w:b w:val="false"/>
+                      <w:u w:val="none"/>
+                      <w:strike w:val="false"/>
+                      <w:sz w:val="22"/>
+                      <w:szCs w:val="22"/>
+                      <w:color w:val="000000"/>
+                    </w:rPr>
+                  </w:pPr>
+                </w:p>
+              </w:tc>
+              <w:tc>
+                <w:tcPr>
+                  <w:tcBorders>
+                    <w:bottom w:val="none" w:sz="0" w:space="0" w:color="000000"/>
+                    <w:top w:val="none" w:sz="0" w:space="0" w:color="000000"/>
+                    <w:left w:val="none" w:sz="0" w:space="0" w:color="000000"/>
+                    <w:right w:val="none" w:sz="0" w:space="0" w:color="000000"/>
+                  </w:tcBorders>
+                  <w:shd w:val="clear" w:color="auto" w:fill="FFFFFF"/>
+                  <w:tcMar>
+                    <w:top w:w="0" w:type="dxa"/>
+                    <w:bottom w:w="0" w:type="dxa"/>
+                    <w:left w:w="0" w:type="dxa"/>
+                    <w:right w:w="0" w:type="dxa"/>
+                  </w:tcMar>
+                  <w:vAlign w:val="center"/>
+                </w:tcPr>
+                <w:p>
+                  <w:pPr>
+                    <w:jc w:val="left"/>
+                    <w:pBdr>
+                      <w:bottom w:val="none" w:sz="0" w:space="0" w:color="000000"/>
+                      <w:top w:val="none" w:sz="0" w:space="0" w:color="000000"/>
+                      <w:left w:val="none" w:sz="0" w:space="0" w:color="000000"/>
+                      <w:right w:val="none" w:sz="0" w:space="0" w:color="000000"/>
+                    </w:pBdr>
+                    <w:spacing w:after="100" w:before="100" w:line="240"/>
+                    <w:ind w:left="100" w:right="100" w:firstLine="0" w:firstLineChars="0"/>
+                    <w:rPr>
+                      <w:rFonts w:ascii="Arial" w:hAnsi="Arial" w:eastAsia="Arial" w:cs="Arial"/>
+                      <w:i w:val="false"/>
+                      <w:b w:val="false"/>
+                      <w:u w:val="none"/>
+                      <w:strike w:val="false"/>
+                      <w:sz w:val="22"/>
+                      <w:szCs w:val="22"/>
+                      <w:color w:val="000000"/>
+                    </w:rPr>
+                  </w:pPr>
+                  <w:r xmlns:w="http://schemas.openxmlformats.org/wordprocessingml/2006/main" xmlns:wp="http://schemas.openxmlformats.org/drawingml/2006/wordprocessingDrawing" xmlns:r="http://schemas.openxmlformats.org/officeDocument/2006/relationships" xmlns:w14="http://schemas.microsoft.com/office/word/2010/wordml">
+                    <w:rPr>
+                      <w:rFonts w:ascii="Arial" w:hAnsi="Arial" w:eastAsia="Arial" w:cs="Arial"/>
+                      <w:i w:val="false"/>
+                      <w:b w:val="false"/>
+                      <w:u w:val="none"/>
+                      <w:strike w:val="false"/>
+                      <w:sz w:val="22"/>
+                      <w:szCs w:val="22"/>
+                      <w:color w:val="000000"/>
+                    </w:rPr>
+                    <w:t xml:space="preserve">0.230</w:t>
                   </w:r>
                 </w:p>
               </w:tc>
@@ -10250,62 +10203,104 @@
                       <w:szCs w:val="22"/>
                       <w:color w:val="000000"/>
                     </w:rPr>
-                    <w:t xml:space="preserve">-4043.9</w:t>
-                  </w:r>
-                </w:p>
-              </w:tc>
-              <w:tc>
-                <w:tcPr>
-                  <w:tcBorders>
-                    <w:bottom w:val="none" w:sz="0" w:space="0" w:color="000000"/>
-                    <w:top w:val="none" w:sz="0" w:space="0" w:color="000000"/>
-                    <w:left w:val="none" w:sz="0" w:space="0" w:color="000000"/>
-                    <w:right w:val="none" w:sz="0" w:space="0" w:color="000000"/>
-                  </w:tcBorders>
-                  <w:shd w:val="clear" w:color="auto" w:fill="FFFFFF"/>
-                  <w:tcMar>
-                    <w:top w:w="0" w:type="dxa"/>
-                    <w:bottom w:w="0" w:type="dxa"/>
-                    <w:left w:w="0" w:type="dxa"/>
-                    <w:right w:w="0" w:type="dxa"/>
-                  </w:tcMar>
-                  <w:vAlign w:val="center"/>
-                </w:tcPr>
-                <w:p>
-                  <w:pPr>
-                    <w:jc w:val="left"/>
-                    <w:pBdr>
-                      <w:bottom w:val="none" w:sz="0" w:space="0" w:color="000000"/>
-                      <w:top w:val="none" w:sz="0" w:space="0" w:color="000000"/>
-                      <w:left w:val="none" w:sz="0" w:space="0" w:color="000000"/>
-                      <w:right w:val="none" w:sz="0" w:space="0" w:color="000000"/>
-                    </w:pBdr>
-                    <w:spacing w:after="100" w:before="100" w:line="240"/>
-                    <w:ind w:left="100" w:right="100" w:firstLine="0" w:firstLineChars="0"/>
-                    <w:rPr>
-                      <w:rFonts w:ascii="Arial" w:hAnsi="Arial" w:eastAsia="Arial" w:cs="Arial"/>
-                      <w:i w:val="false"/>
-                      <w:b w:val="false"/>
-                      <w:u w:val="none"/>
-                      <w:strike w:val="false"/>
-                      <w:sz w:val="22"/>
-                      <w:szCs w:val="22"/>
-                      <w:color w:val="000000"/>
-                    </w:rPr>
-                  </w:pPr>
-                  <w:r xmlns:w="http://schemas.openxmlformats.org/wordprocessingml/2006/main" xmlns:wp="http://schemas.openxmlformats.org/drawingml/2006/wordprocessingDrawing" xmlns:r="http://schemas.openxmlformats.org/officeDocument/2006/relationships" xmlns:w14="http://schemas.microsoft.com/office/word/2010/wordml">
-                    <w:rPr>
-                      <w:rFonts w:ascii="Arial" w:hAnsi="Arial" w:eastAsia="Arial" w:cs="Arial"/>
-                      <w:i w:val="false"/>
-                      <w:b w:val="false"/>
-                      <w:u w:val="none"/>
-                      <w:strike w:val="false"/>
-                      <w:sz w:val="22"/>
-                      <w:szCs w:val="22"/>
-                      <w:color w:val="000000"/>
-                    </w:rPr>
-                    <w:t xml:space="preserve">500.0</w:t>
-                  </w:r>
+                    <w:t xml:space="preserve">395.1</w:t>
+                  </w:r>
+                </w:p>
+              </w:tc>
+              <w:tc>
+                <w:tcPr>
+                  <w:tcBorders>
+                    <w:bottom w:val="none" w:sz="0" w:space="0" w:color="000000"/>
+                    <w:top w:val="none" w:sz="0" w:space="0" w:color="000000"/>
+                    <w:left w:val="none" w:sz="0" w:space="0" w:color="000000"/>
+                    <w:right w:val="none" w:sz="0" w:space="0" w:color="000000"/>
+                  </w:tcBorders>
+                  <w:shd w:val="clear" w:color="auto" w:fill="FFFFFF"/>
+                  <w:tcMar>
+                    <w:top w:w="0" w:type="dxa"/>
+                    <w:bottom w:w="0" w:type="dxa"/>
+                    <w:left w:w="0" w:type="dxa"/>
+                    <w:right w:w="0" w:type="dxa"/>
+                  </w:tcMar>
+                  <w:vAlign w:val="center"/>
+                </w:tcPr>
+                <w:p>
+                  <w:pPr>
+                    <w:jc w:val="left"/>
+                    <w:pBdr>
+                      <w:bottom w:val="none" w:sz="0" w:space="0" w:color="000000"/>
+                      <w:top w:val="none" w:sz="0" w:space="0" w:color="000000"/>
+                      <w:left w:val="none" w:sz="0" w:space="0" w:color="000000"/>
+                      <w:right w:val="none" w:sz="0" w:space="0" w:color="000000"/>
+                    </w:pBdr>
+                    <w:spacing w:after="100" w:before="100" w:line="240"/>
+                    <w:ind w:left="100" w:right="100" w:firstLine="0" w:firstLineChars="0"/>
+                    <w:rPr>
+                      <w:rFonts w:ascii="Arial" w:hAnsi="Arial" w:eastAsia="Arial" w:cs="Arial"/>
+                      <w:i w:val="false"/>
+                      <w:b w:val="false"/>
+                      <w:u w:val="none"/>
+                      <w:strike w:val="false"/>
+                      <w:sz w:val="22"/>
+                      <w:szCs w:val="22"/>
+                      <w:color w:val="000000"/>
+                    </w:rPr>
+                  </w:pPr>
+                  <w:r xmlns:w="http://schemas.openxmlformats.org/wordprocessingml/2006/main" xmlns:wp="http://schemas.openxmlformats.org/drawingml/2006/wordprocessingDrawing" xmlns:r="http://schemas.openxmlformats.org/officeDocument/2006/relationships" xmlns:w14="http://schemas.microsoft.com/office/word/2010/wordml">
+                    <w:rPr>
+                      <w:rFonts w:ascii="Arial" w:hAnsi="Arial" w:eastAsia="Arial" w:cs="Arial"/>
+                      <w:i w:val="false"/>
+                      <w:b w:val="false"/>
+                      <w:u w:val="none"/>
+                      <w:strike w:val="false"/>
+                      <w:sz w:val="22"/>
+                      <w:szCs w:val="22"/>
+                      <w:color w:val="000000"/>
+                    </w:rPr>
+                    <w:t xml:space="preserve">-3863.9</w:t>
+                  </w:r>
+                </w:p>
+              </w:tc>
+              <w:tc>
+                <w:tcPr>
+                  <w:vMerge/>
+                  <w:tcBorders>
+                    <w:bottom w:val="none" w:sz="0" w:space="0" w:color="000000"/>
+                    <w:top w:val="none" w:sz="0" w:space="0" w:color="000000"/>
+                    <w:left w:val="none" w:sz="0" w:space="0" w:color="000000"/>
+                    <w:right w:val="none" w:sz="0" w:space="0" w:color="000000"/>
+                  </w:tcBorders>
+                  <w:shd w:val="clear" w:color="auto" w:fill="FFFFFF"/>
+                  <w:tcMar>
+                    <w:top w:w="0" w:type="dxa"/>
+                    <w:bottom w:w="0" w:type="dxa"/>
+                    <w:left w:w="0" w:type="dxa"/>
+                    <w:right w:w="0" w:type="dxa"/>
+                  </w:tcMar>
+                  <w:vAlign w:val="top"/>
+                </w:tcPr>
+                <w:p>
+                  <w:pPr>
+                    <w:jc w:val="left"/>
+                    <w:pBdr>
+                      <w:bottom w:val="none" w:sz="0" w:space="0" w:color="000000"/>
+                      <w:top w:val="none" w:sz="0" w:space="0" w:color="000000"/>
+                      <w:left w:val="none" w:sz="0" w:space="0" w:color="000000"/>
+                      <w:right w:val="none" w:sz="0" w:space="0" w:color="000000"/>
+                    </w:pBdr>
+                    <w:spacing w:after="100" w:before="100" w:line="240"/>
+                    <w:ind w:left="100" w:right="100" w:firstLine="0" w:firstLineChars="0"/>
+                    <w:rPr>
+                      <w:rFonts w:ascii="Arial" w:hAnsi="Arial" w:eastAsia="Arial" w:cs="Arial"/>
+                      <w:i w:val="false"/>
+                      <w:b w:val="false"/>
+                      <w:u w:val="none"/>
+                      <w:strike w:val="false"/>
+                      <w:sz w:val="22"/>
+                      <w:szCs w:val="22"/>
+                      <w:color w:val="000000"/>
+                    </w:rPr>
+                  </w:pPr>
                 </w:p>
               </w:tc>
               <w:tc>
@@ -10413,336 +10408,6 @@
                       <w:color w:val="000000"/>
                     </w:rPr>
                     <w:t xml:space="preserve">24</w:t>
-                  </w:r>
-                </w:p>
-              </w:tc>
-            </w:tr>
-            <w:tr>
-              <w:trPr>
-                <w:trHeight w:val="572" w:hRule="auto"/>
-              </w:trPr>
-              <w:tc>
-                <w:tcPr>
-                  <w:vMerge w:val="restart"/>
-                  <w:tcBorders>
-                    <w:bottom w:val="single" w:sz="12" w:space="0" w:color="666666"/>
-                    <w:top w:val="none" w:sz="0" w:space="0" w:color="000000"/>
-                    <w:left w:val="none" w:sz="0" w:space="0" w:color="000000"/>
-                    <w:right w:val="none" w:sz="0" w:space="0" w:color="000000"/>
-                  </w:tcBorders>
-                  <w:shd w:val="clear" w:color="auto" w:fill="FFFFFF"/>
-                  <w:tcMar>
-                    <w:top w:w="0" w:type="dxa"/>
-                    <w:bottom w:w="0" w:type="dxa"/>
-                    <w:left w:w="0" w:type="dxa"/>
-                    <w:right w:w="0" w:type="dxa"/>
-                  </w:tcMar>
-                  <w:vAlign w:val="top"/>
-                </w:tcPr>
-                <w:p>
-                  <w:pPr>
-                    <w:jc w:val="left"/>
-                    <w:pBdr>
-                      <w:bottom w:val="none" w:sz="0" w:space="0" w:color="000000"/>
-                      <w:top w:val="none" w:sz="0" w:space="0" w:color="000000"/>
-                      <w:left w:val="none" w:sz="0" w:space="0" w:color="000000"/>
-                      <w:right w:val="none" w:sz="0" w:space="0" w:color="000000"/>
-                    </w:pBdr>
-                    <w:spacing w:after="100" w:before="100" w:line="240"/>
-                    <w:ind w:left="100" w:right="100" w:firstLine="0" w:firstLineChars="0"/>
-                    <w:rPr>
-                      <w:rFonts w:ascii="Arial" w:hAnsi="Arial" w:eastAsia="Arial" w:cs="Arial"/>
-                      <w:i w:val="false"/>
-                      <w:b w:val="false"/>
-                      <w:u w:val="none"/>
-                      <w:strike w:val="false"/>
-                      <w:sz w:val="22"/>
-                      <w:szCs w:val="22"/>
-                      <w:color w:val="000000"/>
-                    </w:rPr>
-                  </w:pPr>
-                  <w:r xmlns:w="http://schemas.openxmlformats.org/wordprocessingml/2006/main" xmlns:wp="http://schemas.openxmlformats.org/drawingml/2006/wordprocessingDrawing" xmlns:r="http://schemas.openxmlformats.org/officeDocument/2006/relationships" xmlns:w14="http://schemas.microsoft.com/office/word/2010/wordml">
-                    <w:rPr>
-                      <w:rFonts w:ascii="Arial" w:hAnsi="Arial" w:eastAsia="Arial" w:cs="Arial"/>
-                      <w:i w:val="false"/>
-                      <w:b w:val="false"/>
-                      <w:u w:val="none"/>
-                      <w:strike w:val="false"/>
-                      <w:sz w:val="22"/>
-                      <w:szCs w:val="22"/>
-                      <w:color w:val="000000"/>
-                    </w:rPr>
-                    <w:t xml:space="preserve">H3N2</w:t>
-                  </w:r>
-                </w:p>
-              </w:tc>
-              <w:tc>
-                <w:tcPr>
-                  <w:tcBorders>
-                    <w:bottom w:val="none" w:sz="0" w:space="0" w:color="000000"/>
-                    <w:top w:val="none" w:sz="0" w:space="0" w:color="000000"/>
-                    <w:left w:val="none" w:sz="0" w:space="0" w:color="000000"/>
-                    <w:right w:val="none" w:sz="0" w:space="0" w:color="000000"/>
-                  </w:tcBorders>
-                  <w:shd w:val="clear" w:color="auto" w:fill="FFFFFF"/>
-                  <w:tcMar>
-                    <w:top w:w="0" w:type="dxa"/>
-                    <w:bottom w:w="0" w:type="dxa"/>
-                    <w:left w:w="0" w:type="dxa"/>
-                    <w:right w:w="0" w:type="dxa"/>
-                  </w:tcMar>
-                  <w:vAlign w:val="center"/>
-                </w:tcPr>
-                <w:p>
-                  <w:pPr>
-                    <w:jc w:val="left"/>
-                    <w:pBdr>
-                      <w:bottom w:val="none" w:sz="0" w:space="0" w:color="000000"/>
-                      <w:top w:val="none" w:sz="0" w:space="0" w:color="000000"/>
-                      <w:left w:val="none" w:sz="0" w:space="0" w:color="000000"/>
-                      <w:right w:val="none" w:sz="0" w:space="0" w:color="000000"/>
-                    </w:pBdr>
-                    <w:spacing w:after="100" w:before="100" w:line="240"/>
-                    <w:ind w:left="100" w:right="100" w:firstLine="0" w:firstLineChars="0"/>
-                    <w:rPr>
-                      <w:rFonts w:ascii="Arial" w:hAnsi="Arial" w:eastAsia="Arial" w:cs="Arial"/>
-                      <w:i w:val="false"/>
-                      <w:b w:val="false"/>
-                      <w:u w:val="none"/>
-                      <w:strike w:val="false"/>
-                      <w:sz w:val="22"/>
-                      <w:szCs w:val="22"/>
-                      <w:color w:val="000000"/>
-                    </w:rPr>
-                  </w:pPr>
-                  <w:r xmlns:w="http://schemas.openxmlformats.org/wordprocessingml/2006/main" xmlns:wp="http://schemas.openxmlformats.org/drawingml/2006/wordprocessingDrawing" xmlns:r="http://schemas.openxmlformats.org/officeDocument/2006/relationships" xmlns:w14="http://schemas.microsoft.com/office/word/2010/wordml">
-                    <w:rPr>
-                      <w:rFonts w:ascii="Arial" w:hAnsi="Arial" w:eastAsia="Arial" w:cs="Arial"/>
-                      <w:i w:val="false"/>
-                      <w:b w:val="false"/>
-                      <w:u w:val="none"/>
-                      <w:strike w:val="false"/>
-                      <w:sz w:val="22"/>
-                      <w:szCs w:val="22"/>
-                      <w:color w:val="000000"/>
-                    </w:rPr>
-                    <w:t xml:space="preserve">Maximum likelihood baseline</w:t>
-                  </w:r>
-                </w:p>
-              </w:tc>
-              <w:tc>
-                <w:tcPr>
-                  <w:tcBorders>
-                    <w:bottom w:val="none" w:sz="0" w:space="0" w:color="000000"/>
-                    <w:top w:val="none" w:sz="0" w:space="0" w:color="000000"/>
-                    <w:left w:val="none" w:sz="0" w:space="0" w:color="000000"/>
-                    <w:right w:val="none" w:sz="0" w:space="0" w:color="000000"/>
-                  </w:tcBorders>
-                  <w:shd w:val="clear" w:color="auto" w:fill="FFFFFF"/>
-                  <w:tcMar>
-                    <w:top w:w="0" w:type="dxa"/>
-                    <w:bottom w:w="0" w:type="dxa"/>
-                    <w:left w:w="0" w:type="dxa"/>
-                    <w:right w:w="0" w:type="dxa"/>
-                  </w:tcMar>
-                  <w:vAlign w:val="center"/>
-                </w:tcPr>
-                <w:p>
-                  <w:pPr>
-                    <w:jc w:val="left"/>
-                    <w:pBdr>
-                      <w:bottom w:val="none" w:sz="0" w:space="0" w:color="000000"/>
-                      <w:top w:val="none" w:sz="0" w:space="0" w:color="000000"/>
-                      <w:left w:val="none" w:sz="0" w:space="0" w:color="000000"/>
-                      <w:right w:val="none" w:sz="0" w:space="0" w:color="000000"/>
-                    </w:pBdr>
-                    <w:spacing w:after="100" w:before="100" w:line="240"/>
-                    <w:ind w:left="100" w:right="100" w:firstLine="0" w:firstLineChars="0"/>
-                    <w:rPr>
-                      <w:rFonts w:ascii="Arial" w:hAnsi="Arial" w:eastAsia="Arial" w:cs="Arial"/>
-                      <w:i w:val="false"/>
-                      <w:b w:val="false"/>
-                      <w:u w:val="none"/>
-                      <w:strike w:val="false"/>
-                      <w:sz w:val="22"/>
-                      <w:szCs w:val="22"/>
-                      <w:color w:val="000000"/>
-                    </w:rPr>
-                  </w:pPr>
-                  <w:r xmlns:w="http://schemas.openxmlformats.org/wordprocessingml/2006/main" xmlns:wp="http://schemas.openxmlformats.org/drawingml/2006/wordprocessingDrawing" xmlns:r="http://schemas.openxmlformats.org/officeDocument/2006/relationships" xmlns:w14="http://schemas.microsoft.com/office/word/2010/wordml">
-                    <w:rPr>
-                      <w:rFonts w:ascii="Arial" w:hAnsi="Arial" w:eastAsia="Arial" w:cs="Arial"/>
-                      <w:i w:val="false"/>
-                      <w:b w:val="false"/>
-                      <w:u w:val="none"/>
-                      <w:strike w:val="false"/>
-                      <w:sz w:val="22"/>
-                      <w:szCs w:val="22"/>
-                      <w:color w:val="000000"/>
-                    </w:rPr>
-                    <w:t xml:space="preserve">-3152.6</w:t>
-                  </w:r>
-                </w:p>
-              </w:tc>
-              <w:tc>
-                <w:tcPr>
-                  <w:tcBorders>
-                    <w:bottom w:val="none" w:sz="0" w:space="0" w:color="000000"/>
-                    <w:top w:val="none" w:sz="0" w:space="0" w:color="000000"/>
-                    <w:left w:val="none" w:sz="0" w:space="0" w:color="000000"/>
-                    <w:right w:val="none" w:sz="0" w:space="0" w:color="000000"/>
-                  </w:tcBorders>
-                  <w:shd w:val="clear" w:color="auto" w:fill="FFFFFF"/>
-                  <w:tcMar>
-                    <w:top w:w="0" w:type="dxa"/>
-                    <w:bottom w:w="0" w:type="dxa"/>
-                    <w:left w:w="0" w:type="dxa"/>
-                    <w:right w:w="0" w:type="dxa"/>
-                  </w:tcMar>
-                  <w:vAlign w:val="center"/>
-                </w:tcPr>
-                <w:p>
-                  <w:pPr>
-                    <w:jc w:val="left"/>
-                    <w:pBdr>
-                      <w:bottom w:val="none" w:sz="0" w:space="0" w:color="000000"/>
-                      <w:top w:val="none" w:sz="0" w:space="0" w:color="000000"/>
-                      <w:left w:val="none" w:sz="0" w:space="0" w:color="000000"/>
-                      <w:right w:val="none" w:sz="0" w:space="0" w:color="000000"/>
-                    </w:pBdr>
-                    <w:spacing w:after="100" w:before="100" w:line="240"/>
-                    <w:ind w:left="100" w:right="100" w:firstLine="0" w:firstLineChars="0"/>
-                    <w:rPr>
-                      <w:rFonts w:ascii="Arial" w:hAnsi="Arial" w:eastAsia="Arial" w:cs="Arial"/>
-                      <w:i w:val="false"/>
-                      <w:b w:val="false"/>
-                      <w:u w:val="none"/>
-                      <w:strike w:val="false"/>
-                      <w:sz w:val="22"/>
-                      <w:szCs w:val="22"/>
-                      <w:color w:val="000000"/>
-                    </w:rPr>
-                  </w:pPr>
-                  <w:r xmlns:w="http://schemas.openxmlformats.org/wordprocessingml/2006/main" xmlns:wp="http://schemas.openxmlformats.org/drawingml/2006/wordprocessingDrawing" xmlns:r="http://schemas.openxmlformats.org/officeDocument/2006/relationships" xmlns:w14="http://schemas.microsoft.com/office/word/2010/wordml">
-                    <w:rPr>
-                      <w:rFonts w:ascii="Arial" w:hAnsi="Arial" w:eastAsia="Arial" w:cs="Arial"/>
-                      <w:i w:val="false"/>
-                      <w:b w:val="false"/>
-                      <w:u w:val="none"/>
-                      <w:strike w:val="false"/>
-                      <w:sz w:val="22"/>
-                      <w:szCs w:val="22"/>
-                      <w:color w:val="000000"/>
-                    </w:rPr>
-                    <w:t xml:space="preserve">0.0</w:t>
-                  </w:r>
-                </w:p>
-              </w:tc>
-              <w:tc>
-                <w:tcPr>
-                  <w:tcBorders>
-                    <w:bottom w:val="none" w:sz="0" w:space="0" w:color="000000"/>
-                    <w:top w:val="none" w:sz="0" w:space="0" w:color="000000"/>
-                    <w:left w:val="none" w:sz="0" w:space="0" w:color="000000"/>
-                    <w:right w:val="none" w:sz="0" w:space="0" w:color="000000"/>
-                  </w:tcBorders>
-                  <w:shd w:val="clear" w:color="auto" w:fill="FFFFFF"/>
-                  <w:tcMar>
-                    <w:top w:w="0" w:type="dxa"/>
-                    <w:bottom w:w="0" w:type="dxa"/>
-                    <w:left w:w="0" w:type="dxa"/>
-                    <w:right w:w="0" w:type="dxa"/>
-                  </w:tcMar>
-                  <w:vAlign w:val="center"/>
-                </w:tcPr>
-                <w:p>
-                  <w:pPr>
-                    <w:jc w:val="left"/>
-                    <w:pBdr>
-                      <w:bottom w:val="none" w:sz="0" w:space="0" w:color="000000"/>
-                      <w:top w:val="none" w:sz="0" w:space="0" w:color="000000"/>
-                      <w:left w:val="none" w:sz="0" w:space="0" w:color="000000"/>
-                      <w:right w:val="none" w:sz="0" w:space="0" w:color="000000"/>
-                    </w:pBdr>
-                    <w:spacing w:after="100" w:before="100" w:line="240"/>
-                    <w:ind w:left="100" w:right="100" w:firstLine="0" w:firstLineChars="0"/>
-                    <w:rPr>
-                      <w:rFonts w:ascii="Arial" w:hAnsi="Arial" w:eastAsia="Arial" w:cs="Arial"/>
-                      <w:i w:val="false"/>
-                      <w:b w:val="false"/>
-                      <w:u w:val="none"/>
-                      <w:strike w:val="false"/>
-                      <w:sz w:val="22"/>
-                      <w:szCs w:val="22"/>
-                      <w:color w:val="000000"/>
-                    </w:rPr>
-                  </w:pPr>
-                  <w:r xmlns:w="http://schemas.openxmlformats.org/wordprocessingml/2006/main" xmlns:wp="http://schemas.openxmlformats.org/drawingml/2006/wordprocessingDrawing" xmlns:r="http://schemas.openxmlformats.org/officeDocument/2006/relationships" xmlns:w14="http://schemas.microsoft.com/office/word/2010/wordml">
-                    <w:rPr>
-                      <w:rFonts w:ascii="Arial" w:hAnsi="Arial" w:eastAsia="Arial" w:cs="Arial"/>
-                      <w:i w:val="false"/>
-                      <w:b w:val="false"/>
-                      <w:u w:val="none"/>
-                      <w:strike w:val="false"/>
-                      <w:sz w:val="22"/>
-                      <w:szCs w:val="22"/>
-                      <w:color w:val="000000"/>
-                    </w:rPr>
-                    <w:t xml:space="preserve">0.840</w:t>
-                  </w:r>
-                </w:p>
-              </w:tc>
-              <w:tc>
-                <w:tcPr>
-                  <w:tcBorders>
-                    <w:bottom w:val="none" w:sz="0" w:space="0" w:color="000000"/>
-                    <w:top w:val="none" w:sz="0" w:space="0" w:color="000000"/>
-                    <w:left w:val="none" w:sz="0" w:space="0" w:color="000000"/>
-                    <w:right w:val="none" w:sz="0" w:space="0" w:color="000000"/>
-                  </w:tcBorders>
-                  <w:shd w:val="clear" w:color="auto" w:fill="FFFFFF"/>
-                  <w:tcMar>
-                    <w:top w:w="0" w:type="dxa"/>
-                    <w:bottom w:w="0" w:type="dxa"/>
-                    <w:left w:w="0" w:type="dxa"/>
-                    <w:right w:w="0" w:type="dxa"/>
-                  </w:tcMar>
-                  <w:vAlign w:val="center"/>
-                </w:tcPr>
-                <w:p>
-                  <w:pPr>
-                    <w:jc w:val="left"/>
-                    <w:pBdr>
-                      <w:bottom w:val="none" w:sz="0" w:space="0" w:color="000000"/>
-                      <w:top w:val="none" w:sz="0" w:space="0" w:color="000000"/>
-                      <w:left w:val="none" w:sz="0" w:space="0" w:color="000000"/>
-                      <w:right w:val="none" w:sz="0" w:space="0" w:color="000000"/>
-                    </w:pBdr>
-                    <w:spacing w:after="100" w:before="100" w:line="240"/>
-                    <w:ind w:left="100" w:right="100" w:firstLine="0" w:firstLineChars="0"/>
-                    <w:rPr>
-                      <w:rFonts w:ascii="Arial" w:hAnsi="Arial" w:eastAsia="Arial" w:cs="Arial"/>
-                      <w:i w:val="false"/>
-                      <w:b w:val="false"/>
-                      <w:u w:val="none"/>
-                      <w:strike w:val="false"/>
-                      <w:sz w:val="22"/>
-                      <w:szCs w:val="22"/>
-                      <w:color w:val="000000"/>
-                    </w:rPr>
-                  </w:pPr>
-                  <w:r xmlns:w="http://schemas.openxmlformats.org/wordprocessingml/2006/main" xmlns:wp="http://schemas.openxmlformats.org/drawingml/2006/wordprocessingDrawing" xmlns:r="http://schemas.openxmlformats.org/officeDocument/2006/relationships" xmlns:w14="http://schemas.microsoft.com/office/word/2010/wordml">
-                    <w:rPr>
-                      <w:rFonts w:ascii="Arial" w:hAnsi="Arial" w:eastAsia="Arial" w:cs="Arial"/>
-                      <w:i w:val="false"/>
-                      <w:b w:val="false"/>
-                      <w:u w:val="none"/>
-                      <w:strike w:val="false"/>
-                      <w:sz w:val="22"/>
-                      <w:szCs w:val="22"/>
-                      <w:color w:val="000000"/>
-                    </w:rPr>
-                    <w:t xml:space="preserve">NA</w:t>
                   </w:r>
                 </w:p>
               </w:tc>
@@ -10753,10 +10418,10 @@
               </w:trPr>
               <w:tc>
                 <w:tcPr>
-                  <w:vMerge/>
-                  <w:tcBorders>
-                    <w:bottom w:val="none" w:sz="0" w:space="0" w:color="000000"/>
-                    <w:top w:val="single" w:sz="12" w:space="0" w:color="666666"/>
+                  <w:vMerge w:val="restart"/>
+                  <w:tcBorders>
+                    <w:bottom w:val="single" w:sz="12" w:space="0" w:color="666666"/>
+                    <w:top w:val="none" w:sz="0" w:space="0" w:color="000000"/>
                     <w:left w:val="none" w:sz="0" w:space="0" w:color="000000"/>
                     <w:right w:val="none" w:sz="0" w:space="0" w:color="000000"/>
                   </w:tcBorders>
@@ -10791,6 +10456,19 @@
                       <w:color w:val="000000"/>
                     </w:rPr>
                   </w:pPr>
+                  <w:r xmlns:w="http://schemas.openxmlformats.org/wordprocessingml/2006/main" xmlns:wp="http://schemas.openxmlformats.org/drawingml/2006/wordprocessingDrawing" xmlns:r="http://schemas.openxmlformats.org/officeDocument/2006/relationships" xmlns:w14="http://schemas.microsoft.com/office/word/2010/wordml">
+                    <w:rPr>
+                      <w:rFonts w:ascii="Arial" w:hAnsi="Arial" w:eastAsia="Arial" w:cs="Arial"/>
+                      <w:i w:val="false"/>
+                      <w:b w:val="false"/>
+                      <w:u w:val="none"/>
+                      <w:strike w:val="false"/>
+                      <w:sz w:val="22"/>
+                      <w:szCs w:val="22"/>
+                      <w:color w:val="000000"/>
+                    </w:rPr>
+                    <w:t xml:space="preserve">H3N2</w:t>
+                  </w:r>
                 </w:p>
               </w:tc>
               <w:tc>
@@ -10897,115 +10575,170 @@
                       <w:szCs w:val="22"/>
                       <w:color w:val="000000"/>
                     </w:rPr>
-                    <w:t xml:space="preserve">-3200.1</w:t>
-                  </w:r>
-                </w:p>
-              </w:tc>
-              <w:tc>
-                <w:tcPr>
-                  <w:tcBorders>
-                    <w:bottom w:val="none" w:sz="0" w:space="0" w:color="000000"/>
-                    <w:top w:val="none" w:sz="0" w:space="0" w:color="000000"/>
-                    <w:left w:val="none" w:sz="0" w:space="0" w:color="000000"/>
-                    <w:right w:val="none" w:sz="0" w:space="0" w:color="000000"/>
-                  </w:tcBorders>
-                  <w:shd w:val="clear" w:color="auto" w:fill="FFFFFF"/>
-                  <w:tcMar>
-                    <w:top w:w="0" w:type="dxa"/>
-                    <w:bottom w:w="0" w:type="dxa"/>
-                    <w:left w:w="0" w:type="dxa"/>
-                    <w:right w:w="0" w:type="dxa"/>
-                  </w:tcMar>
-                  <w:vAlign w:val="center"/>
-                </w:tcPr>
-                <w:p>
-                  <w:pPr>
-                    <w:jc w:val="left"/>
-                    <w:pBdr>
-                      <w:bottom w:val="none" w:sz="0" w:space="0" w:color="000000"/>
-                      <w:top w:val="none" w:sz="0" w:space="0" w:color="000000"/>
-                      <w:left w:val="none" w:sz="0" w:space="0" w:color="000000"/>
-                      <w:right w:val="none" w:sz="0" w:space="0" w:color="000000"/>
-                    </w:pBdr>
-                    <w:spacing w:after="100" w:before="100" w:line="240"/>
-                    <w:ind w:left="100" w:right="100" w:firstLine="0" w:firstLineChars="0"/>
-                    <w:rPr>
-                      <w:rFonts w:ascii="Arial" w:hAnsi="Arial" w:eastAsia="Arial" w:cs="Arial"/>
-                      <w:i w:val="false"/>
-                      <w:b w:val="false"/>
-                      <w:u w:val="none"/>
-                      <w:strike w:val="false"/>
-                      <w:sz w:val="22"/>
-                      <w:szCs w:val="22"/>
-                      <w:color w:val="000000"/>
-                    </w:rPr>
-                  </w:pPr>
-                  <w:r xmlns:w="http://schemas.openxmlformats.org/wordprocessingml/2006/main" xmlns:wp="http://schemas.openxmlformats.org/drawingml/2006/wordprocessingDrawing" xmlns:r="http://schemas.openxmlformats.org/officeDocument/2006/relationships" xmlns:w14="http://schemas.microsoft.com/office/word/2010/wordml">
-                    <w:rPr>
-                      <w:rFonts w:ascii="Arial" w:hAnsi="Arial" w:eastAsia="Arial" w:cs="Arial"/>
-                      <w:i w:val="false"/>
-                      <w:b w:val="false"/>
-                      <w:u w:val="none"/>
-                      <w:strike w:val="false"/>
-                      <w:sz w:val="22"/>
-                      <w:szCs w:val="22"/>
-                      <w:color w:val="000000"/>
-                    </w:rPr>
-                    <w:t xml:space="preserve">47.5</w:t>
-                  </w:r>
-                </w:p>
-              </w:tc>
-              <w:tc>
-                <w:tcPr>
-                  <w:tcBorders>
-                    <w:bottom w:val="none" w:sz="0" w:space="0" w:color="000000"/>
-                    <w:top w:val="none" w:sz="0" w:space="0" w:color="000000"/>
-                    <w:left w:val="none" w:sz="0" w:space="0" w:color="000000"/>
-                    <w:right w:val="none" w:sz="0" w:space="0" w:color="000000"/>
-                  </w:tcBorders>
-                  <w:shd w:val="clear" w:color="auto" w:fill="FFFFFF"/>
-                  <w:tcMar>
-                    <w:top w:w="0" w:type="dxa"/>
-                    <w:bottom w:w="0" w:type="dxa"/>
-                    <w:left w:w="0" w:type="dxa"/>
-                    <w:right w:w="0" w:type="dxa"/>
-                  </w:tcMar>
-                  <w:vAlign w:val="center"/>
-                </w:tcPr>
-                <w:p>
-                  <w:pPr>
-                    <w:jc w:val="left"/>
-                    <w:pBdr>
-                      <w:bottom w:val="none" w:sz="0" w:space="0" w:color="000000"/>
-                      <w:top w:val="none" w:sz="0" w:space="0" w:color="000000"/>
-                      <w:left w:val="none" w:sz="0" w:space="0" w:color="000000"/>
-                      <w:right w:val="none" w:sz="0" w:space="0" w:color="000000"/>
-                    </w:pBdr>
-                    <w:spacing w:after="100" w:before="100" w:line="240"/>
-                    <w:ind w:left="100" w:right="100" w:firstLine="0" w:firstLineChars="0"/>
-                    <w:rPr>
-                      <w:rFonts w:ascii="Arial" w:hAnsi="Arial" w:eastAsia="Arial" w:cs="Arial"/>
-                      <w:i w:val="false"/>
-                      <w:b w:val="false"/>
-                      <w:u w:val="none"/>
-                      <w:strike w:val="false"/>
-                      <w:sz w:val="22"/>
-                      <w:szCs w:val="22"/>
-                      <w:color w:val="000000"/>
-                    </w:rPr>
-                  </w:pPr>
-                  <w:r xmlns:w="http://schemas.openxmlformats.org/wordprocessingml/2006/main" xmlns:wp="http://schemas.openxmlformats.org/drawingml/2006/wordprocessingDrawing" xmlns:r="http://schemas.openxmlformats.org/officeDocument/2006/relationships" xmlns:w14="http://schemas.microsoft.com/office/word/2010/wordml">
-                    <w:rPr>
-                      <w:rFonts w:ascii="Arial" w:hAnsi="Arial" w:eastAsia="Arial" w:cs="Arial"/>
-                      <w:i w:val="false"/>
-                      <w:b w:val="false"/>
-                      <w:u w:val="none"/>
-                      <w:strike w:val="false"/>
-                      <w:sz w:val="22"/>
-                      <w:szCs w:val="22"/>
-                      <w:color w:val="000000"/>
-                    </w:rPr>
-                    <w:t xml:space="preserve">0.300</w:t>
+                    <w:t xml:space="preserve">220.1</w:t>
+                  </w:r>
+                </w:p>
+              </w:tc>
+              <w:tc>
+                <w:tcPr>
+                  <w:tcBorders>
+                    <w:bottom w:val="none" w:sz="0" w:space="0" w:color="000000"/>
+                    <w:top w:val="none" w:sz="0" w:space="0" w:color="000000"/>
+                    <w:left w:val="none" w:sz="0" w:space="0" w:color="000000"/>
+                    <w:right w:val="none" w:sz="0" w:space="0" w:color="000000"/>
+                  </w:tcBorders>
+                  <w:shd w:val="clear" w:color="auto" w:fill="FFFFFF"/>
+                  <w:tcMar>
+                    <w:top w:w="0" w:type="dxa"/>
+                    <w:bottom w:w="0" w:type="dxa"/>
+                    <w:left w:w="0" w:type="dxa"/>
+                    <w:right w:w="0" w:type="dxa"/>
+                  </w:tcMar>
+                  <w:vAlign w:val="center"/>
+                </w:tcPr>
+                <w:p>
+                  <w:pPr>
+                    <w:jc w:val="left"/>
+                    <w:pBdr>
+                      <w:bottom w:val="none" w:sz="0" w:space="0" w:color="000000"/>
+                      <w:top w:val="none" w:sz="0" w:space="0" w:color="000000"/>
+                      <w:left w:val="none" w:sz="0" w:space="0" w:color="000000"/>
+                      <w:right w:val="none" w:sz="0" w:space="0" w:color="000000"/>
+                    </w:pBdr>
+                    <w:spacing w:after="100" w:before="100" w:line="240"/>
+                    <w:ind w:left="100" w:right="100" w:firstLine="0" w:firstLineChars="0"/>
+                    <w:rPr>
+                      <w:rFonts w:ascii="Arial" w:hAnsi="Arial" w:eastAsia="Arial" w:cs="Arial"/>
+                      <w:i w:val="false"/>
+                      <w:b w:val="false"/>
+                      <w:u w:val="none"/>
+                      <w:strike w:val="false"/>
+                      <w:sz w:val="22"/>
+                      <w:szCs w:val="22"/>
+                      <w:color w:val="000000"/>
+                    </w:rPr>
+                  </w:pPr>
+                  <w:r xmlns:w="http://schemas.openxmlformats.org/wordprocessingml/2006/main" xmlns:wp="http://schemas.openxmlformats.org/drawingml/2006/wordprocessingDrawing" xmlns:r="http://schemas.openxmlformats.org/officeDocument/2006/relationships" xmlns:w14="http://schemas.microsoft.com/office/word/2010/wordml">
+                    <w:rPr>
+                      <w:rFonts w:ascii="Arial" w:hAnsi="Arial" w:eastAsia="Arial" w:cs="Arial"/>
+                      <w:i w:val="false"/>
+                      <w:b w:val="false"/>
+                      <w:u w:val="none"/>
+                      <w:strike w:val="false"/>
+                      <w:sz w:val="22"/>
+                      <w:szCs w:val="22"/>
+                      <w:color w:val="000000"/>
+                    </w:rPr>
+                    <w:t xml:space="preserve">-3288.5</w:t>
+                  </w:r>
+                </w:p>
+              </w:tc>
+              <w:tc>
+                <w:tcPr>
+                  <w:vMerge w:val="restart"/>
+                  <w:tcBorders>
+                    <w:bottom w:val="single" w:sz="12" w:space="0" w:color="666666"/>
+                    <w:top w:val="none" w:sz="0" w:space="0" w:color="000000"/>
+                    <w:left w:val="none" w:sz="0" w:space="0" w:color="000000"/>
+                    <w:right w:val="none" w:sz="0" w:space="0" w:color="000000"/>
+                  </w:tcBorders>
+                  <w:shd w:val="clear" w:color="auto" w:fill="FFFFFF"/>
+                  <w:tcMar>
+                    <w:top w:w="0" w:type="dxa"/>
+                    <w:bottom w:w="0" w:type="dxa"/>
+                    <w:left w:w="0" w:type="dxa"/>
+                    <w:right w:w="0" w:type="dxa"/>
+                  </w:tcMar>
+                  <w:vAlign w:val="top"/>
+                </w:tcPr>
+                <w:p>
+                  <w:pPr>
+                    <w:jc w:val="left"/>
+                    <w:pBdr>
+                      <w:bottom w:val="none" w:sz="0" w:space="0" w:color="000000"/>
+                      <w:top w:val="none" w:sz="0" w:space="0" w:color="000000"/>
+                      <w:left w:val="none" w:sz="0" w:space="0" w:color="000000"/>
+                      <w:right w:val="none" w:sz="0" w:space="0" w:color="000000"/>
+                    </w:pBdr>
+                    <w:spacing w:after="100" w:before="100" w:line="240"/>
+                    <w:ind w:left="100" w:right="100" w:firstLine="0" w:firstLineChars="0"/>
+                    <w:rPr>
+                      <w:rFonts w:ascii="Arial" w:hAnsi="Arial" w:eastAsia="Arial" w:cs="Arial"/>
+                      <w:i w:val="false"/>
+                      <w:b w:val="false"/>
+                      <w:u w:val="none"/>
+                      <w:strike w:val="false"/>
+                      <w:sz w:val="22"/>
+                      <w:szCs w:val="22"/>
+                      <w:color w:val="000000"/>
+                    </w:rPr>
+                  </w:pPr>
+                  <w:r xmlns:w="http://schemas.openxmlformats.org/wordprocessingml/2006/main" xmlns:wp="http://schemas.openxmlformats.org/drawingml/2006/wordprocessingDrawing" xmlns:r="http://schemas.openxmlformats.org/officeDocument/2006/relationships" xmlns:w14="http://schemas.microsoft.com/office/word/2010/wordml">
+                    <w:rPr>
+                      <w:rFonts w:ascii="Arial" w:hAnsi="Arial" w:eastAsia="Arial" w:cs="Arial"/>
+                      <w:i w:val="false"/>
+                      <w:b w:val="false"/>
+                      <w:u w:val="none"/>
+                      <w:strike w:val="false"/>
+                      <w:sz w:val="22"/>
+                      <w:szCs w:val="22"/>
+                      <w:color w:val="000000"/>
+                    </w:rPr>
+                    <w:t xml:space="preserve">-3068.5</w:t>
+                  </w:r>
+                </w:p>
+              </w:tc>
+              <w:tc>
+                <w:tcPr>
+                  <w:tcBorders>
+                    <w:bottom w:val="none" w:sz="0" w:space="0" w:color="000000"/>
+                    <w:top w:val="none" w:sz="0" w:space="0" w:color="000000"/>
+                    <w:left w:val="none" w:sz="0" w:space="0" w:color="000000"/>
+                    <w:right w:val="none" w:sz="0" w:space="0" w:color="000000"/>
+                  </w:tcBorders>
+                  <w:shd w:val="clear" w:color="auto" w:fill="FFFFFF"/>
+                  <w:tcMar>
+                    <w:top w:w="0" w:type="dxa"/>
+                    <w:bottom w:w="0" w:type="dxa"/>
+                    <w:left w:w="0" w:type="dxa"/>
+                    <w:right w:w="0" w:type="dxa"/>
+                  </w:tcMar>
+                  <w:vAlign w:val="center"/>
+                </w:tcPr>
+                <w:p>
+                  <w:pPr>
+                    <w:jc w:val="left"/>
+                    <w:pBdr>
+                      <w:bottom w:val="none" w:sz="0" w:space="0" w:color="000000"/>
+                      <w:top w:val="none" w:sz="0" w:space="0" w:color="000000"/>
+                      <w:left w:val="none" w:sz="0" w:space="0" w:color="000000"/>
+                      <w:right w:val="none" w:sz="0" w:space="0" w:color="000000"/>
+                    </w:pBdr>
+                    <w:spacing w:after="100" w:before="100" w:line="240"/>
+                    <w:ind w:left="100" w:right="100" w:firstLine="0" w:firstLineChars="0"/>
+                    <w:rPr>
+                      <w:rFonts w:ascii="Arial" w:hAnsi="Arial" w:eastAsia="Arial" w:cs="Arial"/>
+                      <w:i w:val="false"/>
+                      <w:b w:val="false"/>
+                      <w:u w:val="none"/>
+                      <w:strike w:val="false"/>
+                      <w:sz w:val="22"/>
+                      <w:szCs w:val="22"/>
+                      <w:color w:val="000000"/>
+                    </w:rPr>
+                  </w:pPr>
+                  <w:r xmlns:w="http://schemas.openxmlformats.org/wordprocessingml/2006/main" xmlns:wp="http://schemas.openxmlformats.org/drawingml/2006/wordprocessingDrawing" xmlns:r="http://schemas.openxmlformats.org/officeDocument/2006/relationships" xmlns:w14="http://schemas.microsoft.com/office/word/2010/wordml">
+                    <w:rPr>
+                      <w:rFonts w:ascii="Arial" w:hAnsi="Arial" w:eastAsia="Arial" w:cs="Arial"/>
+                      <w:i w:val="false"/>
+                      <w:b w:val="false"/>
+                      <w:u w:val="none"/>
+                      <w:strike w:val="false"/>
+                      <w:sz w:val="22"/>
+                      <w:szCs w:val="22"/>
+                      <w:color w:val="000000"/>
+                    </w:rPr>
+                    <w:t xml:space="preserve">&lt; 0.001</w:t>
                   </w:r>
                 </w:p>
               </w:tc>
@@ -11073,7 +10806,7 @@
                   <w:vMerge/>
                   <w:tcBorders>
                     <w:bottom w:val="none" w:sz="0" w:space="0" w:color="000000"/>
-                    <w:top w:val="none" w:sz="0" w:space="0" w:color="000000"/>
+                    <w:top w:val="single" w:sz="12" w:space="0" w:color="666666"/>
                     <w:left w:val="none" w:sz="0" w:space="0" w:color="000000"/>
                     <w:right w:val="none" w:sz="0" w:space="0" w:color="000000"/>
                   </w:tcBorders>
@@ -11214,115 +10947,157 @@
                       <w:szCs w:val="22"/>
                       <w:color w:val="000000"/>
                     </w:rPr>
-                    <w:t xml:space="preserve">-3158.3</w:t>
-                  </w:r>
-                </w:p>
-              </w:tc>
-              <w:tc>
-                <w:tcPr>
-                  <w:tcBorders>
-                    <w:bottom w:val="none" w:sz="0" w:space="0" w:color="000000"/>
-                    <w:top w:val="none" w:sz="0" w:space="0" w:color="000000"/>
-                    <w:left w:val="none" w:sz="0" w:space="0" w:color="000000"/>
-                    <w:right w:val="none" w:sz="0" w:space="0" w:color="000000"/>
-                  </w:tcBorders>
-                  <w:shd w:val="clear" w:color="auto" w:fill="FFFFFF"/>
-                  <w:tcMar>
-                    <w:top w:w="0" w:type="dxa"/>
-                    <w:bottom w:w="0" w:type="dxa"/>
-                    <w:left w:w="0" w:type="dxa"/>
-                    <w:right w:w="0" w:type="dxa"/>
-                  </w:tcMar>
-                  <w:vAlign w:val="center"/>
-                </w:tcPr>
-                <w:p>
-                  <w:pPr>
-                    <w:jc w:val="left"/>
-                    <w:pBdr>
-                      <w:bottom w:val="none" w:sz="0" w:space="0" w:color="000000"/>
-                      <w:top w:val="none" w:sz="0" w:space="0" w:color="000000"/>
-                      <w:left w:val="none" w:sz="0" w:space="0" w:color="000000"/>
-                      <w:right w:val="none" w:sz="0" w:space="0" w:color="000000"/>
-                    </w:pBdr>
-                    <w:spacing w:after="100" w:before="100" w:line="240"/>
-                    <w:ind w:left="100" w:right="100" w:firstLine="0" w:firstLineChars="0"/>
-                    <w:rPr>
-                      <w:rFonts w:ascii="Arial" w:hAnsi="Arial" w:eastAsia="Arial" w:cs="Arial"/>
-                      <w:i w:val="false"/>
-                      <w:b w:val="false"/>
-                      <w:u w:val="none"/>
-                      <w:strike w:val="false"/>
-                      <w:sz w:val="22"/>
-                      <w:szCs w:val="22"/>
-                      <w:color w:val="000000"/>
-                    </w:rPr>
-                  </w:pPr>
-                  <w:r xmlns:w="http://schemas.openxmlformats.org/wordprocessingml/2006/main" xmlns:wp="http://schemas.openxmlformats.org/drawingml/2006/wordprocessingDrawing" xmlns:r="http://schemas.openxmlformats.org/officeDocument/2006/relationships" xmlns:w14="http://schemas.microsoft.com/office/word/2010/wordml">
-                    <w:rPr>
-                      <w:rFonts w:ascii="Arial" w:hAnsi="Arial" w:eastAsia="Arial" w:cs="Arial"/>
-                      <w:i w:val="false"/>
-                      <w:b w:val="false"/>
-                      <w:u w:val="none"/>
-                      <w:strike w:val="false"/>
-                      <w:sz w:val="22"/>
-                      <w:szCs w:val="22"/>
-                      <w:color w:val="000000"/>
-                    </w:rPr>
-                    <w:t xml:space="preserve">5.7</w:t>
-                  </w:r>
-                </w:p>
-              </w:tc>
-              <w:tc>
-                <w:tcPr>
-                  <w:tcBorders>
-                    <w:bottom w:val="none" w:sz="0" w:space="0" w:color="000000"/>
-                    <w:top w:val="none" w:sz="0" w:space="0" w:color="000000"/>
-                    <w:left w:val="none" w:sz="0" w:space="0" w:color="000000"/>
-                    <w:right w:val="none" w:sz="0" w:space="0" w:color="000000"/>
-                  </w:tcBorders>
-                  <w:shd w:val="clear" w:color="auto" w:fill="FFFFFF"/>
-                  <w:tcMar>
-                    <w:top w:w="0" w:type="dxa"/>
-                    <w:bottom w:w="0" w:type="dxa"/>
-                    <w:left w:w="0" w:type="dxa"/>
-                    <w:right w:w="0" w:type="dxa"/>
-                  </w:tcMar>
-                  <w:vAlign w:val="center"/>
-                </w:tcPr>
-                <w:p>
-                  <w:pPr>
-                    <w:jc w:val="left"/>
-                    <w:pBdr>
-                      <w:bottom w:val="none" w:sz="0" w:space="0" w:color="000000"/>
-                      <w:top w:val="none" w:sz="0" w:space="0" w:color="000000"/>
-                      <w:left w:val="none" w:sz="0" w:space="0" w:color="000000"/>
-                      <w:right w:val="none" w:sz="0" w:space="0" w:color="000000"/>
-                    </w:pBdr>
-                    <w:spacing w:after="100" w:before="100" w:line="240"/>
-                    <w:ind w:left="100" w:right="100" w:firstLine="0" w:firstLineChars="0"/>
-                    <w:rPr>
-                      <w:rFonts w:ascii="Arial" w:hAnsi="Arial" w:eastAsia="Arial" w:cs="Arial"/>
-                      <w:i w:val="false"/>
-                      <w:b w:val="false"/>
-                      <w:u w:val="none"/>
-                      <w:strike w:val="false"/>
-                      <w:sz w:val="22"/>
-                      <w:szCs w:val="22"/>
-                      <w:color w:val="000000"/>
-                    </w:rPr>
-                  </w:pPr>
-                  <w:r xmlns:w="http://schemas.openxmlformats.org/wordprocessingml/2006/main" xmlns:wp="http://schemas.openxmlformats.org/drawingml/2006/wordprocessingDrawing" xmlns:r="http://schemas.openxmlformats.org/officeDocument/2006/relationships" xmlns:w14="http://schemas.microsoft.com/office/word/2010/wordml">
-                    <w:rPr>
-                      <w:rFonts w:ascii="Arial" w:hAnsi="Arial" w:eastAsia="Arial" w:cs="Arial"/>
-                      <w:i w:val="false"/>
-                      <w:b w:val="false"/>
-                      <w:u w:val="none"/>
-                      <w:strike w:val="false"/>
-                      <w:sz w:val="22"/>
-                      <w:szCs w:val="22"/>
-                      <w:color w:val="000000"/>
-                    </w:rPr>
-                    <w:t xml:space="preserve">0.740</w:t>
+                    <w:t xml:space="preserve">61.3</w:t>
+                  </w:r>
+                </w:p>
+              </w:tc>
+              <w:tc>
+                <w:tcPr>
+                  <w:tcBorders>
+                    <w:bottom w:val="none" w:sz="0" w:space="0" w:color="000000"/>
+                    <w:top w:val="none" w:sz="0" w:space="0" w:color="000000"/>
+                    <w:left w:val="none" w:sz="0" w:space="0" w:color="000000"/>
+                    <w:right w:val="none" w:sz="0" w:space="0" w:color="000000"/>
+                  </w:tcBorders>
+                  <w:shd w:val="clear" w:color="auto" w:fill="FFFFFF"/>
+                  <w:tcMar>
+                    <w:top w:w="0" w:type="dxa"/>
+                    <w:bottom w:w="0" w:type="dxa"/>
+                    <w:left w:w="0" w:type="dxa"/>
+                    <w:right w:w="0" w:type="dxa"/>
+                  </w:tcMar>
+                  <w:vAlign w:val="center"/>
+                </w:tcPr>
+                <w:p>
+                  <w:pPr>
+                    <w:jc w:val="left"/>
+                    <w:pBdr>
+                      <w:bottom w:val="none" w:sz="0" w:space="0" w:color="000000"/>
+                      <w:top w:val="none" w:sz="0" w:space="0" w:color="000000"/>
+                      <w:left w:val="none" w:sz="0" w:space="0" w:color="000000"/>
+                      <w:right w:val="none" w:sz="0" w:space="0" w:color="000000"/>
+                    </w:pBdr>
+                    <w:spacing w:after="100" w:before="100" w:line="240"/>
+                    <w:ind w:left="100" w:right="100" w:firstLine="0" w:firstLineChars="0"/>
+                    <w:rPr>
+                      <w:rFonts w:ascii="Arial" w:hAnsi="Arial" w:eastAsia="Arial" w:cs="Arial"/>
+                      <w:i w:val="false"/>
+                      <w:b w:val="false"/>
+                      <w:u w:val="none"/>
+                      <w:strike w:val="false"/>
+                      <w:sz w:val="22"/>
+                      <w:szCs w:val="22"/>
+                      <w:color w:val="000000"/>
+                    </w:rPr>
+                  </w:pPr>
+                  <w:r xmlns:w="http://schemas.openxmlformats.org/wordprocessingml/2006/main" xmlns:wp="http://schemas.openxmlformats.org/drawingml/2006/wordprocessingDrawing" xmlns:r="http://schemas.openxmlformats.org/officeDocument/2006/relationships" xmlns:w14="http://schemas.microsoft.com/office/word/2010/wordml">
+                    <w:rPr>
+                      <w:rFonts w:ascii="Arial" w:hAnsi="Arial" w:eastAsia="Arial" w:cs="Arial"/>
+                      <w:i w:val="false"/>
+                      <w:b w:val="false"/>
+                      <w:u w:val="none"/>
+                      <w:strike w:val="false"/>
+                      <w:sz w:val="22"/>
+                      <w:szCs w:val="22"/>
+                      <w:color w:val="000000"/>
+                    </w:rPr>
+                    <w:t xml:space="preserve">-3129.8</w:t>
+                  </w:r>
+                </w:p>
+              </w:tc>
+              <w:tc>
+                <w:tcPr>
+                  <w:vMerge/>
+                  <w:tcBorders>
+                    <w:bottom w:val="none" w:sz="0" w:space="0" w:color="000000"/>
+                    <w:top w:val="single" w:sz="12" w:space="0" w:color="666666"/>
+                    <w:left w:val="none" w:sz="0" w:space="0" w:color="000000"/>
+                    <w:right w:val="none" w:sz="0" w:space="0" w:color="000000"/>
+                  </w:tcBorders>
+                  <w:shd w:val="clear" w:color="auto" w:fill="FFFFFF"/>
+                  <w:tcMar>
+                    <w:top w:w="0" w:type="dxa"/>
+                    <w:bottom w:w="0" w:type="dxa"/>
+                    <w:left w:w="0" w:type="dxa"/>
+                    <w:right w:w="0" w:type="dxa"/>
+                  </w:tcMar>
+                  <w:vAlign w:val="top"/>
+                </w:tcPr>
+                <w:p>
+                  <w:pPr>
+                    <w:jc w:val="left"/>
+                    <w:pBdr>
+                      <w:bottom w:val="none" w:sz="0" w:space="0" w:color="000000"/>
+                      <w:top w:val="none" w:sz="0" w:space="0" w:color="000000"/>
+                      <w:left w:val="none" w:sz="0" w:space="0" w:color="000000"/>
+                      <w:right w:val="none" w:sz="0" w:space="0" w:color="000000"/>
+                    </w:pBdr>
+                    <w:spacing w:after="100" w:before="100" w:line="240"/>
+                    <w:ind w:left="100" w:right="100" w:firstLine="0" w:firstLineChars="0"/>
+                    <w:rPr>
+                      <w:rFonts w:ascii="Arial" w:hAnsi="Arial" w:eastAsia="Arial" w:cs="Arial"/>
+                      <w:i w:val="false"/>
+                      <w:b w:val="false"/>
+                      <w:u w:val="none"/>
+                      <w:strike w:val="false"/>
+                      <w:sz w:val="22"/>
+                      <w:szCs w:val="22"/>
+                      <w:color w:val="000000"/>
+                    </w:rPr>
+                  </w:pPr>
+                </w:p>
+              </w:tc>
+              <w:tc>
+                <w:tcPr>
+                  <w:tcBorders>
+                    <w:bottom w:val="none" w:sz="0" w:space="0" w:color="000000"/>
+                    <w:top w:val="none" w:sz="0" w:space="0" w:color="000000"/>
+                    <w:left w:val="none" w:sz="0" w:space="0" w:color="000000"/>
+                    <w:right w:val="none" w:sz="0" w:space="0" w:color="000000"/>
+                  </w:tcBorders>
+                  <w:shd w:val="clear" w:color="auto" w:fill="FFFFFF"/>
+                  <w:tcMar>
+                    <w:top w:w="0" w:type="dxa"/>
+                    <w:bottom w:w="0" w:type="dxa"/>
+                    <w:left w:w="0" w:type="dxa"/>
+                    <w:right w:w="0" w:type="dxa"/>
+                  </w:tcMar>
+                  <w:vAlign w:val="center"/>
+                </w:tcPr>
+                <w:p>
+                  <w:pPr>
+                    <w:jc w:val="left"/>
+                    <w:pBdr>
+                      <w:bottom w:val="none" w:sz="0" w:space="0" w:color="000000"/>
+                      <w:top w:val="none" w:sz="0" w:space="0" w:color="000000"/>
+                      <w:left w:val="none" w:sz="0" w:space="0" w:color="000000"/>
+                      <w:right w:val="none" w:sz="0" w:space="0" w:color="000000"/>
+                    </w:pBdr>
+                    <w:spacing w:after="100" w:before="100" w:line="240"/>
+                    <w:ind w:left="100" w:right="100" w:firstLine="0" w:firstLineChars="0"/>
+                    <w:rPr>
+                      <w:rFonts w:ascii="Arial" w:hAnsi="Arial" w:eastAsia="Arial" w:cs="Arial"/>
+                      <w:i w:val="false"/>
+                      <w:b w:val="false"/>
+                      <w:u w:val="none"/>
+                      <w:strike w:val="false"/>
+                      <w:sz w:val="22"/>
+                      <w:szCs w:val="22"/>
+                      <w:color w:val="000000"/>
+                    </w:rPr>
+                  </w:pPr>
+                  <w:r xmlns:w="http://schemas.openxmlformats.org/wordprocessingml/2006/main" xmlns:wp="http://schemas.openxmlformats.org/drawingml/2006/wordprocessingDrawing" xmlns:r="http://schemas.openxmlformats.org/officeDocument/2006/relationships" xmlns:w14="http://schemas.microsoft.com/office/word/2010/wordml">
+                    <w:rPr>
+                      <w:rFonts w:ascii="Arial" w:hAnsi="Arial" w:eastAsia="Arial" w:cs="Arial"/>
+                      <w:i w:val="false"/>
+                      <w:b w:val="false"/>
+                      <w:u w:val="none"/>
+                      <w:strike w:val="false"/>
+                      <w:sz w:val="22"/>
+                      <w:szCs w:val="22"/>
+                      <w:color w:val="000000"/>
+                    </w:rPr>
+                    <w:t xml:space="preserve">0.140</w:t>
                   </w:r>
                 </w:p>
               </w:tc>
@@ -11531,115 +11306,157 @@
                       <w:szCs w:val="22"/>
                       <w:color w:val="000000"/>
                     </w:rPr>
-                    <w:t xml:space="preserve">-3265.1</w:t>
-                  </w:r>
-                </w:p>
-              </w:tc>
-              <w:tc>
-                <w:tcPr>
-                  <w:tcBorders>
-                    <w:bottom w:val="none" w:sz="0" w:space="0" w:color="000000"/>
-                    <w:top w:val="none" w:sz="0" w:space="0" w:color="000000"/>
-                    <w:left w:val="none" w:sz="0" w:space="0" w:color="000000"/>
-                    <w:right w:val="none" w:sz="0" w:space="0" w:color="000000"/>
-                  </w:tcBorders>
-                  <w:shd w:val="clear" w:color="auto" w:fill="FFFFFF"/>
-                  <w:tcMar>
-                    <w:top w:w="0" w:type="dxa"/>
-                    <w:bottom w:w="0" w:type="dxa"/>
-                    <w:left w:w="0" w:type="dxa"/>
-                    <w:right w:w="0" w:type="dxa"/>
-                  </w:tcMar>
-                  <w:vAlign w:val="center"/>
-                </w:tcPr>
-                <w:p>
-                  <w:pPr>
-                    <w:jc w:val="left"/>
-                    <w:pBdr>
-                      <w:bottom w:val="none" w:sz="0" w:space="0" w:color="000000"/>
-                      <w:top w:val="none" w:sz="0" w:space="0" w:color="000000"/>
-                      <w:left w:val="none" w:sz="0" w:space="0" w:color="000000"/>
-                      <w:right w:val="none" w:sz="0" w:space="0" w:color="000000"/>
-                    </w:pBdr>
-                    <w:spacing w:after="100" w:before="100" w:line="240"/>
-                    <w:ind w:left="100" w:right="100" w:firstLine="0" w:firstLineChars="0"/>
-                    <w:rPr>
-                      <w:rFonts w:ascii="Arial" w:hAnsi="Arial" w:eastAsia="Arial" w:cs="Arial"/>
-                      <w:i w:val="false"/>
-                      <w:b w:val="false"/>
-                      <w:u w:val="none"/>
-                      <w:strike w:val="false"/>
-                      <w:sz w:val="22"/>
-                      <w:szCs w:val="22"/>
-                      <w:color w:val="000000"/>
-                    </w:rPr>
-                  </w:pPr>
-                  <w:r xmlns:w="http://schemas.openxmlformats.org/wordprocessingml/2006/main" xmlns:wp="http://schemas.openxmlformats.org/drawingml/2006/wordprocessingDrawing" xmlns:r="http://schemas.openxmlformats.org/officeDocument/2006/relationships" xmlns:w14="http://schemas.microsoft.com/office/word/2010/wordml">
-                    <w:rPr>
-                      <w:rFonts w:ascii="Arial" w:hAnsi="Arial" w:eastAsia="Arial" w:cs="Arial"/>
-                      <w:i w:val="false"/>
-                      <w:b w:val="false"/>
-                      <w:u w:val="none"/>
-                      <w:strike w:val="false"/>
-                      <w:sz w:val="22"/>
-                      <w:szCs w:val="22"/>
-                      <w:color w:val="000000"/>
-                    </w:rPr>
-                    <w:t xml:space="preserve">112.6</w:t>
-                  </w:r>
-                </w:p>
-              </w:tc>
-              <w:tc>
-                <w:tcPr>
-                  <w:tcBorders>
-                    <w:bottom w:val="none" w:sz="0" w:space="0" w:color="000000"/>
-                    <w:top w:val="none" w:sz="0" w:space="0" w:color="000000"/>
-                    <w:left w:val="none" w:sz="0" w:space="0" w:color="000000"/>
-                    <w:right w:val="none" w:sz="0" w:space="0" w:color="000000"/>
-                  </w:tcBorders>
-                  <w:shd w:val="clear" w:color="auto" w:fill="FFFFFF"/>
-                  <w:tcMar>
-                    <w:top w:w="0" w:type="dxa"/>
-                    <w:bottom w:w="0" w:type="dxa"/>
-                    <w:left w:w="0" w:type="dxa"/>
-                    <w:right w:w="0" w:type="dxa"/>
-                  </w:tcMar>
-                  <w:vAlign w:val="center"/>
-                </w:tcPr>
-                <w:p>
-                  <w:pPr>
-                    <w:jc w:val="left"/>
-                    <w:pBdr>
-                      <w:bottom w:val="none" w:sz="0" w:space="0" w:color="000000"/>
-                      <w:top w:val="none" w:sz="0" w:space="0" w:color="000000"/>
-                      <w:left w:val="none" w:sz="0" w:space="0" w:color="000000"/>
-                      <w:right w:val="none" w:sz="0" w:space="0" w:color="000000"/>
-                    </w:pBdr>
-                    <w:spacing w:after="100" w:before="100" w:line="240"/>
-                    <w:ind w:left="100" w:right="100" w:firstLine="0" w:firstLineChars="0"/>
-                    <w:rPr>
-                      <w:rFonts w:ascii="Arial" w:hAnsi="Arial" w:eastAsia="Arial" w:cs="Arial"/>
-                      <w:i w:val="false"/>
-                      <w:b w:val="false"/>
-                      <w:u w:val="none"/>
-                      <w:strike w:val="false"/>
-                      <w:sz w:val="22"/>
-                      <w:szCs w:val="22"/>
-                      <w:color w:val="000000"/>
-                    </w:rPr>
-                  </w:pPr>
-                  <w:r xmlns:w="http://schemas.openxmlformats.org/wordprocessingml/2006/main" xmlns:wp="http://schemas.openxmlformats.org/drawingml/2006/wordprocessingDrawing" xmlns:r="http://schemas.openxmlformats.org/officeDocument/2006/relationships" xmlns:w14="http://schemas.microsoft.com/office/word/2010/wordml">
-                    <w:rPr>
-                      <w:rFonts w:ascii="Arial" w:hAnsi="Arial" w:eastAsia="Arial" w:cs="Arial"/>
-                      <w:i w:val="false"/>
-                      <w:b w:val="false"/>
-                      <w:u w:val="none"/>
-                      <w:strike w:val="false"/>
-                      <w:sz w:val="22"/>
-                      <w:szCs w:val="22"/>
-                      <w:color w:val="000000"/>
-                    </w:rPr>
-                    <w:t xml:space="preserve">0.050</w:t>
+                    <w:t xml:space="preserve">78.9</w:t>
+                  </w:r>
+                </w:p>
+              </w:tc>
+              <w:tc>
+                <w:tcPr>
+                  <w:tcBorders>
+                    <w:bottom w:val="none" w:sz="0" w:space="0" w:color="000000"/>
+                    <w:top w:val="none" w:sz="0" w:space="0" w:color="000000"/>
+                    <w:left w:val="none" w:sz="0" w:space="0" w:color="000000"/>
+                    <w:right w:val="none" w:sz="0" w:space="0" w:color="000000"/>
+                  </w:tcBorders>
+                  <w:shd w:val="clear" w:color="auto" w:fill="FFFFFF"/>
+                  <w:tcMar>
+                    <w:top w:w="0" w:type="dxa"/>
+                    <w:bottom w:w="0" w:type="dxa"/>
+                    <w:left w:w="0" w:type="dxa"/>
+                    <w:right w:w="0" w:type="dxa"/>
+                  </w:tcMar>
+                  <w:vAlign w:val="center"/>
+                </w:tcPr>
+                <w:p>
+                  <w:pPr>
+                    <w:jc w:val="left"/>
+                    <w:pBdr>
+                      <w:bottom w:val="none" w:sz="0" w:space="0" w:color="000000"/>
+                      <w:top w:val="none" w:sz="0" w:space="0" w:color="000000"/>
+                      <w:left w:val="none" w:sz="0" w:space="0" w:color="000000"/>
+                      <w:right w:val="none" w:sz="0" w:space="0" w:color="000000"/>
+                    </w:pBdr>
+                    <w:spacing w:after="100" w:before="100" w:line="240"/>
+                    <w:ind w:left="100" w:right="100" w:firstLine="0" w:firstLineChars="0"/>
+                    <w:rPr>
+                      <w:rFonts w:ascii="Arial" w:hAnsi="Arial" w:eastAsia="Arial" w:cs="Arial"/>
+                      <w:i w:val="false"/>
+                      <w:b w:val="false"/>
+                      <w:u w:val="none"/>
+                      <w:strike w:val="false"/>
+                      <w:sz w:val="22"/>
+                      <w:szCs w:val="22"/>
+                      <w:color w:val="000000"/>
+                    </w:rPr>
+                  </w:pPr>
+                  <w:r xmlns:w="http://schemas.openxmlformats.org/wordprocessingml/2006/main" xmlns:wp="http://schemas.openxmlformats.org/drawingml/2006/wordprocessingDrawing" xmlns:r="http://schemas.openxmlformats.org/officeDocument/2006/relationships" xmlns:w14="http://schemas.microsoft.com/office/word/2010/wordml">
+                    <w:rPr>
+                      <w:rFonts w:ascii="Arial" w:hAnsi="Arial" w:eastAsia="Arial" w:cs="Arial"/>
+                      <w:i w:val="false"/>
+                      <w:b w:val="false"/>
+                      <w:u w:val="none"/>
+                      <w:strike w:val="false"/>
+                      <w:sz w:val="22"/>
+                      <w:szCs w:val="22"/>
+                      <w:color w:val="000000"/>
+                    </w:rPr>
+                    <w:t xml:space="preserve">-3147.4</w:t>
+                  </w:r>
+                </w:p>
+              </w:tc>
+              <w:tc>
+                <w:tcPr>
+                  <w:vMerge/>
+                  <w:tcBorders>
+                    <w:bottom w:val="none" w:sz="0" w:space="0" w:color="000000"/>
+                    <w:top w:val="none" w:sz="0" w:space="0" w:color="000000"/>
+                    <w:left w:val="none" w:sz="0" w:space="0" w:color="000000"/>
+                    <w:right w:val="none" w:sz="0" w:space="0" w:color="000000"/>
+                  </w:tcBorders>
+                  <w:shd w:val="clear" w:color="auto" w:fill="FFFFFF"/>
+                  <w:tcMar>
+                    <w:top w:w="0" w:type="dxa"/>
+                    <w:bottom w:w="0" w:type="dxa"/>
+                    <w:left w:w="0" w:type="dxa"/>
+                    <w:right w:w="0" w:type="dxa"/>
+                  </w:tcMar>
+                  <w:vAlign w:val="top"/>
+                </w:tcPr>
+                <w:p>
+                  <w:pPr>
+                    <w:jc w:val="left"/>
+                    <w:pBdr>
+                      <w:bottom w:val="none" w:sz="0" w:space="0" w:color="000000"/>
+                      <w:top w:val="none" w:sz="0" w:space="0" w:color="000000"/>
+                      <w:left w:val="none" w:sz="0" w:space="0" w:color="000000"/>
+                      <w:right w:val="none" w:sz="0" w:space="0" w:color="000000"/>
+                    </w:pBdr>
+                    <w:spacing w:after="100" w:before="100" w:line="240"/>
+                    <w:ind w:left="100" w:right="100" w:firstLine="0" w:firstLineChars="0"/>
+                    <w:rPr>
+                      <w:rFonts w:ascii="Arial" w:hAnsi="Arial" w:eastAsia="Arial" w:cs="Arial"/>
+                      <w:i w:val="false"/>
+                      <w:b w:val="false"/>
+                      <w:u w:val="none"/>
+                      <w:strike w:val="false"/>
+                      <w:sz w:val="22"/>
+                      <w:szCs w:val="22"/>
+                      <w:color w:val="000000"/>
+                    </w:rPr>
+                  </w:pPr>
+                </w:p>
+              </w:tc>
+              <w:tc>
+                <w:tcPr>
+                  <w:tcBorders>
+                    <w:bottom w:val="none" w:sz="0" w:space="0" w:color="000000"/>
+                    <w:top w:val="none" w:sz="0" w:space="0" w:color="000000"/>
+                    <w:left w:val="none" w:sz="0" w:space="0" w:color="000000"/>
+                    <w:right w:val="none" w:sz="0" w:space="0" w:color="000000"/>
+                  </w:tcBorders>
+                  <w:shd w:val="clear" w:color="auto" w:fill="FFFFFF"/>
+                  <w:tcMar>
+                    <w:top w:w="0" w:type="dxa"/>
+                    <w:bottom w:w="0" w:type="dxa"/>
+                    <w:left w:w="0" w:type="dxa"/>
+                    <w:right w:w="0" w:type="dxa"/>
+                  </w:tcMar>
+                  <w:vAlign w:val="center"/>
+                </w:tcPr>
+                <w:p>
+                  <w:pPr>
+                    <w:jc w:val="left"/>
+                    <w:pBdr>
+                      <w:bottom w:val="none" w:sz="0" w:space="0" w:color="000000"/>
+                      <w:top w:val="none" w:sz="0" w:space="0" w:color="000000"/>
+                      <w:left w:val="none" w:sz="0" w:space="0" w:color="000000"/>
+                      <w:right w:val="none" w:sz="0" w:space="0" w:color="000000"/>
+                    </w:pBdr>
+                    <w:spacing w:after="100" w:before="100" w:line="240"/>
+                    <w:ind w:left="100" w:right="100" w:firstLine="0" w:firstLineChars="0"/>
+                    <w:rPr>
+                      <w:rFonts w:ascii="Arial" w:hAnsi="Arial" w:eastAsia="Arial" w:cs="Arial"/>
+                      <w:i w:val="false"/>
+                      <w:b w:val="false"/>
+                      <w:u w:val="none"/>
+                      <w:strike w:val="false"/>
+                      <w:sz w:val="22"/>
+                      <w:szCs w:val="22"/>
+                      <w:color w:val="000000"/>
+                    </w:rPr>
+                  </w:pPr>
+                  <w:r xmlns:w="http://schemas.openxmlformats.org/wordprocessingml/2006/main" xmlns:wp="http://schemas.openxmlformats.org/drawingml/2006/wordprocessingDrawing" xmlns:r="http://schemas.openxmlformats.org/officeDocument/2006/relationships" xmlns:w14="http://schemas.microsoft.com/office/word/2010/wordml">
+                    <w:rPr>
+                      <w:rFonts w:ascii="Arial" w:hAnsi="Arial" w:eastAsia="Arial" w:cs="Arial"/>
+                      <w:i w:val="false"/>
+                      <w:b w:val="false"/>
+                      <w:u w:val="none"/>
+                      <w:strike w:val="false"/>
+                      <w:sz w:val="22"/>
+                      <w:szCs w:val="22"/>
+                      <w:color w:val="000000"/>
+                    </w:rPr>
+                    <w:t xml:space="preserve">0.070</w:t>
                   </w:r>
                 </w:p>
               </w:tc>
@@ -11848,7 +11665,7 @@
                       <w:szCs w:val="22"/>
                       <w:color w:val="000000"/>
                     </w:rPr>
-                    <w:t xml:space="preserve">-3694.3</w:t>
+                    <w:t xml:space="preserve">384.0</w:t>
                   </w:r>
                 </w:p>
               </w:tc>
@@ -11902,8 +11719,50 @@
                       <w:szCs w:val="22"/>
                       <w:color w:val="000000"/>
                     </w:rPr>
-                    <w:t xml:space="preserve">541.7</w:t>
-                  </w:r>
+                    <w:t xml:space="preserve">-3452.4</w:t>
+                  </w:r>
+                </w:p>
+              </w:tc>
+              <w:tc>
+                <w:tcPr>
+                  <w:vMerge/>
+                  <w:tcBorders>
+                    <w:bottom w:val="single" w:sz="12" w:space="0" w:color="666666"/>
+                    <w:top w:val="none" w:sz="0" w:space="0" w:color="000000"/>
+                    <w:left w:val="none" w:sz="0" w:space="0" w:color="000000"/>
+                    <w:right w:val="none" w:sz="0" w:space="0" w:color="000000"/>
+                  </w:tcBorders>
+                  <w:shd w:val="clear" w:color="auto" w:fill="FFFFFF"/>
+                  <w:tcMar>
+                    <w:top w:w="0" w:type="dxa"/>
+                    <w:bottom w:w="0" w:type="dxa"/>
+                    <w:left w:w="0" w:type="dxa"/>
+                    <w:right w:w="0" w:type="dxa"/>
+                  </w:tcMar>
+                  <w:vAlign w:val="top"/>
+                </w:tcPr>
+                <w:p>
+                  <w:pPr>
+                    <w:jc w:val="left"/>
+                    <w:pBdr>
+                      <w:bottom w:val="none" w:sz="0" w:space="0" w:color="000000"/>
+                      <w:top w:val="none" w:sz="0" w:space="0" w:color="000000"/>
+                      <w:left w:val="none" w:sz="0" w:space="0" w:color="000000"/>
+                      <w:right w:val="none" w:sz="0" w:space="0" w:color="000000"/>
+                    </w:pBdr>
+                    <w:spacing w:after="100" w:before="100" w:line="240"/>
+                    <w:ind w:left="100" w:right="100" w:firstLine="0" w:firstLineChars="0"/>
+                    <w:rPr>
+                      <w:rFonts w:ascii="Arial" w:hAnsi="Arial" w:eastAsia="Arial" w:cs="Arial"/>
+                      <w:i w:val="false"/>
+                      <w:b w:val="false"/>
+                      <w:u w:val="none"/>
+                      <w:strike w:val="false"/>
+                      <w:sz w:val="22"/>
+                      <w:szCs w:val="22"/>
+                      <w:color w:val="000000"/>
+                    </w:rPr>
+                  </w:pPr>
                 </w:p>
               </w:tc>
               <w:tc>
@@ -12227,7 +12086,7 @@
       </w:r>
     </w:p>
     <w:bookmarkEnd w:id="38"/>
-    <w:bookmarkStart w:id="74" w:name="references"/>
+    <w:bookmarkStart w:id="83" w:name="references"/>
     <w:p>
       <w:pPr>
         <w:pStyle w:val="Heading1"/>
@@ -12236,7 +12095,7 @@
         <w:t xml:space="preserve">References</w:t>
       </w:r>
     </w:p>
-    <w:bookmarkStart w:id="73" w:name="refs"/>
+    <w:bookmarkStart w:id="82" w:name="refs"/>
     <w:bookmarkStart w:id="40" w:name="ref-kim2018"/>
     <w:p>
       <w:pPr>
@@ -12775,7 +12634,7 @@
       </w:hyperlink>
     </w:p>
     <w:bookmarkEnd w:id="61"/>
-    <w:bookmarkStart w:id="63" w:name="ref-legendre2010MantelAlternatives"/>
+    <w:bookmarkStart w:id="63" w:name="ref-dang2010"/>
     <w:p>
       <w:pPr>
         <w:pStyle w:val="Bibliography"/>
@@ -12790,9 +12649,103 @@
         <w:t xml:space="preserve">	</w:t>
       </w:r>
       <w:r>
+        <w:t xml:space="preserve">Dang CC, Le QS, Gascuel O, Le VS.</w:t>
+      </w:r>
+      <w:r>
+        <w:t xml:space="preserve"> </w:t>
+      </w:r>
+      <w:r>
+        <w:t xml:space="preserve">FLU</w:t>
+      </w:r>
+      <w:r>
+        <w:t xml:space="preserve">, an amino acid substitution model for influenza proteins. BMC Evolutionary Biology. 2010;10: 99. doi:</w:t>
+      </w:r>
+      <w:hyperlink r:id="rId62">
+        <w:r>
+          <w:rPr>
+            <w:rStyle w:val="Hyperlink"/>
+          </w:rPr>
+          <w:t xml:space="preserve">10.1186/1471-2148-10-99</w:t>
+        </w:r>
+      </w:hyperlink>
+    </w:p>
+    <w:bookmarkEnd w:id="63"/>
+    <w:bookmarkStart w:id="64" w:name="ref-burnham2002model"/>
+    <w:p>
+      <w:pPr>
+        <w:pStyle w:val="Bibliography"/>
+      </w:pPr>
+      <w:r>
+        <w:t xml:space="preserve">14.</w:t>
+      </w:r>
+      <w:r>
+        <w:t xml:space="preserve"> </w:t>
+      </w:r>
+      <w:r>
+        <w:t xml:space="preserve">	</w:t>
+      </w:r>
+      <w:r>
+        <w:t xml:space="preserve">Burnham KP, Anderson DR. Model selection and multimodel inference: A practical information-theoretic approach. 2nd ed. New York: Springer; 2002.</w:t>
+      </w:r>
+      <w:r>
+        <w:t xml:space="preserve"> </w:t>
+      </w:r>
+    </w:p>
+    <w:bookmarkEnd w:id="64"/>
+    <w:bookmarkStart w:id="66" w:name="ref-schliep2011"/>
+    <w:p>
+      <w:pPr>
+        <w:pStyle w:val="Bibliography"/>
+      </w:pPr>
+      <w:r>
+        <w:t xml:space="preserve">15.</w:t>
+      </w:r>
+      <w:r>
+        <w:t xml:space="preserve"> </w:t>
+      </w:r>
+      <w:r>
+        <w:t xml:space="preserve">	</w:t>
+      </w:r>
+      <w:r>
+        <w:t xml:space="preserve">Schliep KP. Phangorn: Phylogenetic analysis in</w:t>
+      </w:r>
+      <w:r>
+        <w:t xml:space="preserve"> </w:t>
+      </w:r>
+      <w:r>
+        <w:t xml:space="preserve">R</w:t>
+      </w:r>
+      <w:r>
+        <w:t xml:space="preserve">. Bioinformatics (Oxford, England). 2011;27: 592–593. doi:</w:t>
+      </w:r>
+      <w:hyperlink r:id="rId65">
+        <w:r>
+          <w:rPr>
+            <w:rStyle w:val="Hyperlink"/>
+          </w:rPr>
+          <w:t xml:space="preserve">10.1093/bioinformatics/btq706</w:t>
+        </w:r>
+      </w:hyperlink>
+    </w:p>
+    <w:bookmarkEnd w:id="66"/>
+    <w:bookmarkStart w:id="68" w:name="ref-legendre2010MantelAlternatives"/>
+    <w:p>
+      <w:pPr>
+        <w:pStyle w:val="Bibliography"/>
+      </w:pPr>
+      <w:r>
+        <w:t xml:space="preserve">16.</w:t>
+      </w:r>
+      <w:r>
+        <w:t xml:space="preserve"> </w:t>
+      </w:r>
+      <w:r>
+        <w:t xml:space="preserve">	</w:t>
+      </w:r>
+      <w:r>
         <w:t xml:space="preserve">Legendre P, Fortin M-J. Comparison of the mantel test and alternative approaches for detecting complex multivariate relationships in the spatial analysis of genetic data. Molecular Ecology Resources. 2010;10: 831–844. doi:</w:t>
       </w:r>
-      <w:hyperlink r:id="rId62">
+      <w:hyperlink r:id="rId67">
         <w:r>
           <w:rPr>
             <w:rStyle w:val="Hyperlink"/>
@@ -12801,14 +12754,14 @@
         </w:r>
       </w:hyperlink>
     </w:p>
-    <w:bookmarkEnd w:id="63"/>
-    <w:bookmarkStart w:id="65" w:name="ref-legendre2015ShouldMantel"/>
+    <w:bookmarkEnd w:id="68"/>
+    <w:bookmarkStart w:id="70" w:name="ref-legendre2015ShouldMantel"/>
     <w:p>
       <w:pPr>
         <w:pStyle w:val="Bibliography"/>
       </w:pPr>
       <w:r>
-        <w:t xml:space="preserve">14.</w:t>
+        <w:t xml:space="preserve">17.</w:t>
       </w:r>
       <w:r>
         <w:t xml:space="preserve"> </w:t>
@@ -12819,7 +12772,7 @@
       <w:r>
         <w:t xml:space="preserve">Legendre P, Fortin M-J, Borcard D. Should the mantel test be used in spatial analysis? Methods in Ecology and Evolution. 2015;6: 1239–1247. doi:</w:t>
       </w:r>
-      <w:hyperlink r:id="rId64">
+      <w:hyperlink r:id="rId69">
         <w:r>
           <w:rPr>
             <w:rStyle w:val="Hyperlink"/>
@@ -12828,14 +12781,14 @@
         </w:r>
       </w:hyperlink>
     </w:p>
-    <w:bookmarkEnd w:id="65"/>
-    <w:bookmarkStart w:id="67" w:name="ref-rubin1981"/>
+    <w:bookmarkEnd w:id="70"/>
+    <w:bookmarkStart w:id="72" w:name="ref-rubin1981"/>
     <w:p>
       <w:pPr>
         <w:pStyle w:val="Bibliography"/>
       </w:pPr>
       <w:r>
-        <w:t xml:space="preserve">15.</w:t>
+        <w:t xml:space="preserve">18.</w:t>
       </w:r>
       <w:r>
         <w:t xml:space="preserve"> </w:t>
@@ -12846,7 +12799,7 @@
       <w:r>
         <w:t xml:space="preserve">Rubin DB. The bayesian bootstrap. The Annals of Statistics. 1981;9: 130–134. doi:</w:t>
       </w:r>
-      <w:hyperlink r:id="rId66">
+      <w:hyperlink r:id="rId71">
         <w:r>
           <w:rPr>
             <w:rStyle w:val="Hyperlink"/>
@@ -12855,14 +12808,14 @@
         </w:r>
       </w:hyperlink>
     </w:p>
-    <w:bookmarkEnd w:id="67"/>
-    <w:bookmarkStart w:id="68" w:name="ref-rcoreteam2024"/>
+    <w:bookmarkEnd w:id="72"/>
+    <w:bookmarkStart w:id="74" w:name="ref-saitou1987NeighborJoining"/>
     <w:p>
       <w:pPr>
         <w:pStyle w:val="Bibliography"/>
       </w:pPr>
       <w:r>
-        <w:t xml:space="preserve">16.</w:t>
+        <w:t xml:space="preserve">19.</w:t>
       </w:r>
       <w:r>
         <w:t xml:space="preserve"> </w:t>
@@ -12871,20 +12824,25 @@
         <w:t xml:space="preserve">	</w:t>
       </w:r>
       <w:r>
-        <w:t xml:space="preserve">R Core Team. R: A language and environment for statistical computing. Vienna, Austria: R Foundation for Statistical Computing; 2024.</w:t>
-      </w:r>
-      <w:r>
-        <w:t xml:space="preserve"> </w:t>
-      </w:r>
+        <w:t xml:space="preserve">Saitou N, Nei M. The neighbor-joining method: A new method for reconstructing phylogenetic trees. Molecular Biology and Evolution. 1987;4: 406–425. doi:</w:t>
+      </w:r>
+      <w:hyperlink r:id="rId73">
+        <w:r>
+          <w:rPr>
+            <w:rStyle w:val="Hyperlink"/>
+          </w:rPr>
+          <w:t xml:space="preserve">10.1093/oxfordjournals.molbev.a040454</w:t>
+        </w:r>
+      </w:hyperlink>
     </w:p>
-    <w:bookmarkEnd w:id="68"/>
-    <w:bookmarkStart w:id="70" w:name="ref-schliep2011"/>
+    <w:bookmarkEnd w:id="74"/>
+    <w:bookmarkStart w:id="76" w:name="ref-shimodaira1999ShTest"/>
     <w:p>
       <w:pPr>
         <w:pStyle w:val="Bibliography"/>
       </w:pPr>
       <w:r>
-        <w:t xml:space="preserve">17.</w:t>
+        <w:t xml:space="preserve">20.</w:t>
       </w:r>
       <w:r>
         <w:t xml:space="preserve"> </w:t>
@@ -12893,34 +12851,25 @@
         <w:t xml:space="preserve">	</w:t>
       </w:r>
       <w:r>
-        <w:t xml:space="preserve">Schliep KP. Phangorn: Phylogenetic analysis in</w:t>
-      </w:r>
-      <w:r>
-        <w:t xml:space="preserve"> </w:t>
-      </w:r>
-      <w:r>
-        <w:t xml:space="preserve">R</w:t>
-      </w:r>
-      <w:r>
-        <w:t xml:space="preserve">. Bioinformatics (Oxford, England). 2011;27: 592–593. doi:</w:t>
-      </w:r>
-      <w:hyperlink r:id="rId69">
+        <w:t xml:space="preserve">Shimodaira H, Hasegawa M. Multiple comparisons of log-likelihoods with applications to phylogenetic inference. Molecular Biology and Evolution. 1999;16: 1114–1116. doi:</w:t>
+      </w:r>
+      <w:hyperlink r:id="rId75">
         <w:r>
           <w:rPr>
             <w:rStyle w:val="Hyperlink"/>
           </w:rPr>
-          <w:t xml:space="preserve">10.1093/bioinformatics/btq706</w:t>
+          <w:t xml:space="preserve">10.1093/oxfordjournals.molbev.a026201</w:t>
         </w:r>
       </w:hyperlink>
     </w:p>
-    <w:bookmarkEnd w:id="70"/>
-    <w:bookmarkStart w:id="72" w:name="ref-bodenhofer2015"/>
+    <w:bookmarkEnd w:id="76"/>
+    <w:bookmarkStart w:id="78" w:name="X8b6875512c705bb343382cbd274febad517fdf3"/>
     <w:p>
       <w:pPr>
         <w:pStyle w:val="Bibliography"/>
       </w:pPr>
       <w:r>
-        <w:t xml:space="preserve">18.</w:t>
+        <w:t xml:space="preserve">21.</w:t>
       </w:r>
       <w:r>
         <w:t xml:space="preserve"> </w:t>
@@ -12929,6 +12878,55 @@
         <w:t xml:space="preserve">	</w:t>
       </w:r>
       <w:r>
+        <w:t xml:space="preserve">Robinson DF, Foulds LR. Comparison of phylogenetic trees. Mathematical Biosciences. 1981;53: 131–147. doi:</w:t>
+      </w:r>
+      <w:hyperlink r:id="rId77">
+        <w:r>
+          <w:rPr>
+            <w:rStyle w:val="Hyperlink"/>
+          </w:rPr>
+          <w:t xml:space="preserve">10.1016/0025-5564(81)90043-2</w:t>
+        </w:r>
+      </w:hyperlink>
+    </w:p>
+    <w:bookmarkEnd w:id="78"/>
+    <w:bookmarkStart w:id="79" w:name="ref-rcoreteam2024"/>
+    <w:p>
+      <w:pPr>
+        <w:pStyle w:val="Bibliography"/>
+      </w:pPr>
+      <w:r>
+        <w:t xml:space="preserve">22.</w:t>
+      </w:r>
+      <w:r>
+        <w:t xml:space="preserve"> </w:t>
+      </w:r>
+      <w:r>
+        <w:t xml:space="preserve">	</w:t>
+      </w:r>
+      <w:r>
+        <w:t xml:space="preserve">R Core Team. R: A language and environment for statistical computing. Vienna, Austria: R Foundation for Statistical Computing; 2024.</w:t>
+      </w:r>
+      <w:r>
+        <w:t xml:space="preserve"> </w:t>
+      </w:r>
+    </w:p>
+    <w:bookmarkEnd w:id="79"/>
+    <w:bookmarkStart w:id="81" w:name="ref-bodenhofer2015"/>
+    <w:p>
+      <w:pPr>
+        <w:pStyle w:val="Bibliography"/>
+      </w:pPr>
+      <w:r>
+        <w:t xml:space="preserve">23.</w:t>
+      </w:r>
+      <w:r>
+        <w:t xml:space="preserve"> </w:t>
+      </w:r>
+      <w:r>
+        <w:t xml:space="preserve">	</w:t>
+      </w:r>
+      <w:r>
         <w:t xml:space="preserve">Bodenhofer U, Bonatesta E, Horejš-Kainrath C, Hochreiter S. Msa: An</w:t>
       </w:r>
       <w:r>
@@ -12943,7 +12941,7 @@
       <w:r>
         <w:t xml:space="preserve">package for multiple sequence alignment. Bioinformatics. 2015;31: 3997–3999. doi:</w:t>
       </w:r>
-      <w:hyperlink r:id="rId71">
+      <w:hyperlink r:id="rId80">
         <w:r>
           <w:rPr>
             <w:rStyle w:val="Hyperlink"/>
@@ -12952,9 +12950,9 @@
         </w:r>
       </w:hyperlink>
     </w:p>
-    <w:bookmarkEnd w:id="72"/>
-    <w:bookmarkEnd w:id="73"/>
-    <w:bookmarkEnd w:id="74"/>
+    <w:bookmarkEnd w:id="81"/>
+    <w:bookmarkEnd w:id="82"/>
+    <w:bookmarkEnd w:id="83"/>
     <w:sectPr/>
   </w:body>
 </w:document>

</xml_diff>

<commit_message>
feat: add ml tree support stability analysis
</commit_message>
<xml_diff>
--- a/products/manuscript.docx
+++ b/products/manuscript.docx
@@ -675,7 +675,25 @@
         <w:t xml:space="preserve"> </w:t>
       </w:r>
       <w:r>
-        <w:t xml:space="preserve">each distance tree and the ML tree. Our analyses were implemented</w:t>
+        <w:t xml:space="preserve">each distance tree and the ML tree. We also evaluated ML-tree robustness with</w:t>
+      </w:r>
+      <w:r>
+        <w:t xml:space="preserve"> </w:t>
+      </w:r>
+      <w:r>
+        <w:t xml:space="preserve">nonparametric site-bootstrap resampling of the fitted ML tree, reporting</w:t>
+      </w:r>
+      <w:r>
+        <w:t xml:space="preserve"> </w:t>
+      </w:r>
+      <w:r>
+        <w:t xml:space="preserve">internal-branch support and bootstrap topology-stability diagnostics in the</w:t>
+      </w:r>
+      <w:r>
+        <w:t xml:space="preserve"> </w:t>
+      </w:r>
+      <w:r>
+        <w:t xml:space="preserve">supplement. Our analyses were implemented</w:t>
       </w:r>
       <w:r>
         <w:t xml:space="preserve"> </w:t>
@@ -8521,7 +8539,25 @@
         <w:t xml:space="preserve"> </w:t>
       </w:r>
       <w:r>
-        <w:t xml:space="preserve">with the subtype-specific temporal patterns above.</w:t>
+        <w:t xml:space="preserve">with the subtype-specific temporal patterns above. ML-tree branch support and</w:t>
+      </w:r>
+      <w:r>
+        <w:t xml:space="preserve"> </w:t>
+      </w:r>
+      <w:r>
+        <w:t xml:space="preserve">bootstrap topology-stability summaries are reported in the supplement as</w:t>
+      </w:r>
+      <w:r>
+        <w:t xml:space="preserve"> </w:t>
+      </w:r>
+      <w:r>
+        <w:t xml:space="preserve">robustness diagnostics; those values should be interpreted from full-mode</w:t>
+      </w:r>
+      <w:r>
+        <w:t xml:space="preserve"> </w:t>
+      </w:r>
+      <w:r>
+        <w:t xml:space="preserve">pipeline outputs rather than reduced test-mode runs.</w:t>
       </w:r>
     </w:p>
     <w:tbl>

</xml_diff>

<commit_message>
feat: add alignment sensitivity analysis
</commit_message>
<xml_diff>
--- a/products/manuscript.docx
+++ b/products/manuscript.docx
@@ -31,7 +31,7 @@
         <w:pStyle w:val="Date"/>
       </w:pPr>
       <w:r>
-        <w:t xml:space="preserve">2026-05-31</w:t>
+        <w:t xml:space="preserve">2026-06-04</w:t>
       </w:r>
     </w:p>
     <w:p>
@@ -334,13 +334,31 @@
         <w:t xml:space="preserve"> </w:t>
       </w:r>
       <w:r>
-        <w:t xml:space="preserve">from the sequences of all influenza viruses used for HAI assays,</w:t>
-      </w:r>
-      <w:r>
-        <w:t xml:space="preserve"> </w:t>
-      </w:r>
-      <w:r>
-        <w:t xml:space="preserve">and used Racmacs to compute antigenic cartography distances from the HAI data</w:t>
+        <w:t xml:space="preserve">from hemagglutinin protein sequences. We restricted the</w:t>
+      </w:r>
+      <w:r>
+        <w:t xml:space="preserve"> </w:t>
+      </w:r>
+      <w:r>
+        <w:t xml:space="preserve">analysis panel to strains present in the stored H1N1 or H3N2 antigenic</w:t>
+      </w:r>
+      <w:r>
+        <w:t xml:space="preserve"> </w:t>
+      </w:r>
+      <w:r>
+        <w:t xml:space="preserve">cartography maps, because comparison with cartographic distance is a central</w:t>
+      </w:r>
+      <w:r>
+        <w:t xml:space="preserve"> </w:t>
+      </w:r>
+      <w:r>
+        <w:t xml:space="preserve">analysis objective. We used Racmacs to compute antigenic cartography distances</w:t>
+      </w:r>
+      <w:r>
+        <w:t xml:space="preserve"> </w:t>
+      </w:r>
+      <w:r>
+        <w:t xml:space="preserve">from the HAI data</w:t>
       </w:r>
       <w:r>
         <w:t xml:space="preserve"> </w:t>
@@ -349,13 +367,64 @@
         <w:t xml:space="preserve">[11]</w:t>
       </w:r>
       <w:r>
-        <w:t xml:space="preserve">. All of our analyses were conducted</w:t>
-      </w:r>
-      <w:r>
-        <w:t xml:space="preserve"> </w:t>
-      </w:r>
-      <w:r>
-        <w:t xml:space="preserve">separately for H1N1 and H3N2 strains.</w:t>
+        <w:t xml:space="preserve">. The stored</w:t>
+      </w:r>
+      <w:r>
+        <w:t xml:space="preserve"> </w:t>
+      </w:r>
+      <w:r>
+        <w:rPr>
+          <w:rStyle w:val="VerbatimChar"/>
+        </w:rPr>
+        <w:t xml:space="preserve">.ace</w:t>
+      </w:r>
+      <w:r>
+        <w:t xml:space="preserve"> </w:t>
+      </w:r>
+      <w:r>
+        <w:t xml:space="preserve">maps were treated as</w:t>
+      </w:r>
+      <w:r>
+        <w:t xml:space="preserve"> </w:t>
+      </w:r>
+      <w:r>
+        <w:t xml:space="preserve">first-pass cartography inputs; map dimensionality, strain and serum counts,</w:t>
+      </w:r>
+      <w:r>
+        <w:t xml:space="preserve"> </w:t>
+      </w:r>
+      <w:r>
+        <w:t xml:space="preserve">stored stress, and titer missingness diagnostics are reported in the</w:t>
+      </w:r>
+      <w:r>
+        <w:t xml:space="preserve"> </w:t>
+      </w:r>
+      <w:r>
+        <w:t xml:space="preserve">supplement. A separate manuscript is planned to describe construction of the</w:t>
+      </w:r>
+      <w:r>
+        <w:t xml:space="preserve"> </w:t>
+      </w:r>
+      <w:r>
+        <w:t xml:space="preserve">human-serum antigenic cartographies. Using the same HAI dataset to build the</w:t>
+      </w:r>
+      <w:r>
+        <w:t xml:space="preserve"> </w:t>
+      </w:r>
+      <w:r>
+        <w:t xml:space="preserve">maps and compare cartographic distances is a limitation, but no comparable</w:t>
+      </w:r>
+      <w:r>
+        <w:t xml:space="preserve"> </w:t>
+      </w:r>
+      <w:r>
+        <w:t xml:space="preserve">alternative is currently available for this strain panel. All of our analyses</w:t>
+      </w:r>
+      <w:r>
+        <w:t xml:space="preserve"> </w:t>
+      </w:r>
+      <w:r>
+        <w:t xml:space="preserve">were conducted separately for H1N1 and H3N2 strains.</w:t>
       </w:r>
     </w:p>
     <w:p>
@@ -395,43 +464,97 @@
         </m:r>
       </m:oMath>
       <w:r>
-        <w:t xml:space="preserve">-Epitope distances were computed based on this MSA. For Grantham</w:t>
-      </w:r>
-      <w:r>
-        <w:t xml:space="preserve"> </w:t>
-      </w:r>
-      <w:r>
-        <w:t xml:space="preserve">distance, aligned positions containing gaps, ambiguous residues, or non-standard</w:t>
-      </w:r>
-      <w:r>
-        <w:t xml:space="preserve"> </w:t>
-      </w:r>
-      <w:r>
-        <w:t xml:space="preserve">amino acids were excluded from the pair-specific denominator rather than treated</w:t>
-      </w:r>
-      <w:r>
-        <w:t xml:space="preserve"> </w:t>
-      </w:r>
-      <w:r>
-        <w:t xml:space="preserve">as zero-distance substitutions. We had 18</w:t>
-      </w:r>
-      <w:r>
-        <w:t xml:space="preserve"> </w:t>
-      </w:r>
-      <w:r>
-        <w:t xml:space="preserve">H1N1 strains and 21 H3N2 strains in total. We then used</w:t>
-      </w:r>
-      <w:r>
-        <w:t xml:space="preserve"> </w:t>
-      </w:r>
-      <w:r>
-        <w:t xml:space="preserve">both alignments to construct maximum likelihood (ML) unrooted phylogenetic trees</w:t>
-      </w:r>
-      <w:r>
-        <w:t xml:space="preserve"> </w:t>
-      </w:r>
-      <w:r>
-        <w:t xml:space="preserve">using the FLU amino acid substitution model</w:t>
+        <w:t xml:space="preserve">-Epitope distances were computed based on this MSA. We evaluated</w:t>
+      </w:r>
+      <w:r>
+        <w:t xml:space="preserve"> </w:t>
+      </w:r>
+      <w:r>
+        <w:t xml:space="preserve">alignment sensitivity with alternative ClustalW and ClustalOmega protein</w:t>
+      </w:r>
+      <w:r>
+        <w:t xml:space="preserve"> </w:t>
+      </w:r>
+      <w:r>
+        <w:t xml:space="preserve">alignments in the supplement. For sequence-derived distances, aligned positions</w:t>
+      </w:r>
+      <w:r>
+        <w:t xml:space="preserve"> </w:t>
+      </w:r>
+      <w:r>
+        <w:t xml:space="preserve">containing gaps, ambiguous or missing residue codes, or non-standard</w:t>
+      </w:r>
+      <w:r>
+        <w:t xml:space="preserve"> </w:t>
+      </w:r>
+      <w:r>
+        <w:t xml:space="preserve">amino-acid codes were excluded from the relevant pair-specific denominator</w:t>
+      </w:r>
+      <w:r>
+        <w:t xml:space="preserve"> </w:t>
+      </w:r>
+      <w:r>
+        <w:t xml:space="preserve">rather than treated as zero-distance substitutions.</w:t>
+      </w:r>
+      <w:r>
+        <w:t xml:space="preserve"> </w:t>
+      </w:r>
+      <w:r>
+        <w:t xml:space="preserve">The source sequence table contains full-length</w:t>
+      </w:r>
+      <w:r>
+        <w:t xml:space="preserve"> </w:t>
+      </w:r>
+      <w:r>
+        <w:t xml:space="preserve">flags and accession/source metadata; after alignment, the pipeline checks</w:t>
+      </w:r>
+      <w:r>
+        <w:t xml:space="preserve"> </w:t>
+      </w:r>
+      <w:r>
+        <w:t xml:space="preserve">non-gap protein lengths against the subtype-specific full-length reference</w:t>
+      </w:r>
+      <w:r>
+        <w:t xml:space="preserve"> </w:t>
+      </w:r>
+      <w:r>
+        <w:t xml:space="preserve">rather than relying on strain-name exceptions. We had 18 H1N1 strains and 21</w:t>
+      </w:r>
+      <w:r>
+        <w:t xml:space="preserve"> </w:t>
+      </w:r>
+      <w:r>
+        <w:t xml:space="preserve">H3N2 strains in total. A full inclusion and provenance audit, including source</w:t>
+      </w:r>
+      <w:r>
+        <w:t xml:space="preserve"> </w:t>
+      </w:r>
+      <w:r>
+        <w:t xml:space="preserve">rows excluded because they were absent from the stored cartography maps,</w:t>
+      </w:r>
+      <w:r>
+        <w:t xml:space="preserve"> </w:t>
+      </w:r>
+      <w:r>
+        <w:t xml:space="preserve">source/accession fields, sequence completeness checks, and pair counts, is</w:t>
+      </w:r>
+      <w:r>
+        <w:t xml:space="preserve"> </w:t>
+      </w:r>
+      <w:r>
+        <w:t xml:space="preserve">reported in the supplement. We then used both protein alignments to construct maximum</w:t>
+      </w:r>
+      <w:r>
+        <w:t xml:space="preserve"> </w:t>
+      </w:r>
+      <w:r>
+        <w:t xml:space="preserve">likelihood (ML) unrooted phylogenetic trees using the FLU amino acid</w:t>
+      </w:r>
+      <w:r>
+        <w:t xml:space="preserve"> </w:t>
+      </w:r>
+      <w:r>
+        <w:t xml:space="preserve">substitution model</w:t>
       </w:r>
       <w:r>
         <w:t xml:space="preserve"> </w:t>
@@ -754,7 +877,7 @@
       </w:r>
     </w:p>
     <w:bookmarkEnd w:id="20"/>
-    <w:bookmarkStart w:id="36" w:name="study-results"/>
+    <w:bookmarkStart w:id="37" w:name="study-results"/>
     <w:p>
       <w:pPr>
         <w:pStyle w:val="Heading1"/>
@@ -8251,6 +8374,200 @@
         </w:tc>
       </w:tr>
     </w:tbl>
+    <w:bookmarkStart w:id="36" w:name="sensitivity-analyses"/>
+    <w:p>
+      <w:pPr>
+        <w:pStyle w:val="Heading2"/>
+      </w:pPr>
+      <w:r>
+        <w:t xml:space="preserve">Sensitivity analyses</w:t>
+      </w:r>
+    </w:p>
+    <w:p>
+      <w:pPr>
+        <w:pStyle w:val="FirstParagraph"/>
+      </w:pPr>
+      <w:r>
+        <w:t xml:space="preserve">We evaluated leave-one-strain-out influence by removing each strain within</w:t>
+      </w:r>
+      <w:r>
+        <w:t xml:space="preserve"> </w:t>
+      </w:r>
+      <w:r>
+        <w:t xml:space="preserve">subtype from the existing distance matrices and recomputing the Mantel</w:t>
+      </w:r>
+      <w:r>
+        <w:t xml:space="preserve"> </w:t>
+      </w:r>
+      <w:r>
+        <w:t xml:space="preserve">association between ML-tree cophenetic distance and each candidate distance</w:t>
+      </w:r>
+      <w:r>
+        <w:t xml:space="preserve"> </w:t>
+      </w:r>
+      <w:r>
+        <w:t xml:space="preserve">metric. This sensitivity analysis flags removals that change the correlation by</w:t>
+      </w:r>
+      <w:r>
+        <w:t xml:space="preserve"> </w:t>
+      </w:r>
+      <w:r>
+        <w:t xml:space="preserve">at least 0.10 absolute correlation units and is reported in the supplement. The</w:t>
+      </w:r>
+      <w:r>
+        <w:t xml:space="preserve"> </w:t>
+      </w:r>
+      <w:r>
+        <w:t xml:space="preserve">analysis is intended to diagnose whether subtype-specific distance-matrix</w:t>
+      </w:r>
+      <w:r>
+        <w:t xml:space="preserve"> </w:t>
+      </w:r>
+      <w:r>
+        <w:t xml:space="preserve">associations are driven by individual strains; it does not refit the sequence</w:t>
+      </w:r>
+      <w:r>
+        <w:t xml:space="preserve"> </w:t>
+      </w:r>
+      <w:r>
+        <w:t xml:space="preserve">alignment, ML tree, or cartography map after each removal.</w:t>
+      </w:r>
+    </w:p>
+    <w:p>
+      <w:pPr>
+        <w:pStyle w:val="BodyText"/>
+      </w:pPr>
+      <w:r>
+        <w:t xml:space="preserve">We also evaluated sequence-completeness and missing-data assumptions directly.</w:t>
+      </w:r>
+      <w:r>
+        <w:t xml:space="preserve"> </w:t>
+      </w:r>
+      <w:r>
+        <w:t xml:space="preserve">This targeted audit identifies non-full-length included strains, compares the</w:t>
+      </w:r>
+      <w:r>
+        <w:t xml:space="preserve"> </w:t>
+      </w:r>
+      <w:r>
+        <w:t xml:space="preserve">existing matrix associations with associations after excluding non-full-length</w:t>
+      </w:r>
+      <w:r>
+        <w:t xml:space="preserve"> </w:t>
+      </w:r>
+      <w:r>
+        <w:t xml:space="preserve">strains, and compares the primary pairwise-deletion rule for sequence-derived</w:t>
+      </w:r>
+      <w:r>
+        <w:t xml:space="preserve"> </w:t>
+      </w:r>
+      <w:r>
+        <w:t xml:space="preserve">distances with a complete-deletion rule that removes non-comparable sites across</w:t>
+      </w:r>
+      <w:r>
+        <w:t xml:space="preserve"> </w:t>
+      </w:r>
+      <w:r>
+        <w:t xml:space="preserve">all included strains within subtype. These sensitivity outputs are reported in</w:t>
+      </w:r>
+      <w:r>
+        <w:t xml:space="preserve"> </w:t>
+      </w:r>
+      <w:r>
+        <w:t xml:space="preserve">the supplement and do not refit alignments, ML trees, or cartography maps. In</w:t>
+      </w:r>
+      <w:r>
+        <w:t xml:space="preserve"> </w:t>
+      </w:r>
+      <w:r>
+        <w:t xml:space="preserve">the current pipeline outputs, these targeted checks did not exceed the</w:t>
+      </w:r>
+      <w:r>
+        <w:t xml:space="preserve"> </w:t>
+      </w:r>
+      <w:r>
+        <w:t xml:space="preserve">prespecified 0.10 absolute-change flag threshold; full-mode outputs should be</w:t>
+      </w:r>
+      <w:r>
+        <w:t xml:space="preserve"> </w:t>
+      </w:r>
+      <w:r>
+        <w:t xml:space="preserve">reviewed before final publication-scale interpretation.</w:t>
+      </w:r>
+    </w:p>
+    <w:p>
+      <w:pPr>
+        <w:pStyle w:val="BodyText"/>
+      </w:pPr>
+      <w:r>
+        <w:t xml:space="preserve">Finally, we evaluated whether the matrix-association results for</w:t>
+      </w:r>
+      <w:r>
+        <w:t xml:space="preserve"> </w:t>
+      </w:r>
+      <w:r>
+        <w:t xml:space="preserve">sequence-derived distances depend on the primary MUSCLE amino-acid alignment.</w:t>
+      </w:r>
+      <w:r>
+        <w:t xml:space="preserve"> </w:t>
+      </w:r>
+      <w:r>
+        <w:t xml:space="preserve">This sensitivity analysis recomputes Grantham and</w:t>
+      </w:r>
+      <w:r>
+        <w:t xml:space="preserve"> </w:t>
+      </w:r>
+      <m:oMath>
+        <m:r>
+          <m:t>p</m:t>
+        </m:r>
+      </m:oMath>
+      <w:r>
+        <w:t xml:space="preserve">-Epitope distance</w:t>
+      </w:r>
+      <w:r>
+        <w:t xml:space="preserve"> </w:t>
+      </w:r>
+      <w:r>
+        <w:t xml:space="preserve">matrices under ClustalW and ClustalOmega alignments, then compares those</w:t>
+      </w:r>
+      <w:r>
+        <w:t xml:space="preserve"> </w:t>
+      </w:r>
+      <w:r>
+        <w:t xml:space="preserve">distance matrices with the existing primary ML-tree cophenetic distances. It</w:t>
+      </w:r>
+      <w:r>
+        <w:t xml:space="preserve"> </w:t>
+      </w:r>
+      <w:r>
+        <w:t xml:space="preserve">does not refit ML trees, distance-based trees, or cartography maps under the</w:t>
+      </w:r>
+      <w:r>
+        <w:t xml:space="preserve"> </w:t>
+      </w:r>
+      <w:r>
+        <w:t xml:space="preserve">alternative alignments. We also compare FLU-family model-test results across</w:t>
+      </w:r>
+      <w:r>
+        <w:t xml:space="preserve"> </w:t>
+      </w:r>
+      <w:r>
+        <w:t xml:space="preserve">alignments and flag cases where the primary selected model is no longer within</w:t>
+      </w:r>
+      <w:r>
+        <w:t xml:space="preserve"> </w:t>
+      </w:r>
+      <w:r>
+        <w:t xml:space="preserve">the approved model-performance tolerance. These outputs are reported in the</w:t>
+      </w:r>
+      <w:r>
+        <w:t xml:space="preserve"> </w:t>
+      </w:r>
+      <w:r>
+        <w:t xml:space="preserve">supplement.</w:t>
+      </w:r>
+    </w:p>
     <w:p>
       <w:pPr>
         <w:pStyle w:val="BodyText"/>
@@ -11916,7 +12233,8 @@
       </w:tr>
     </w:tbl>
     <w:bookmarkEnd w:id="36"/>
-    <w:bookmarkStart w:id="37" w:name="conclusions"/>
+    <w:bookmarkEnd w:id="37"/>
+    <w:bookmarkStart w:id="38" w:name="conclusions"/>
     <w:p>
       <w:pPr>
         <w:pStyle w:val="Heading1"/>
@@ -12067,8 +12385,8 @@
         <w:t xml:space="preserve">evolution do not always agree.</w:t>
       </w:r>
     </w:p>
-    <w:bookmarkEnd w:id="37"/>
-    <w:bookmarkStart w:id="38" w:name="acknowledgement"/>
+    <w:bookmarkEnd w:id="38"/>
+    <w:bookmarkStart w:id="39" w:name="acknowledgement"/>
     <w:p>
       <w:pPr>
         <w:pStyle w:val="Heading1"/>
@@ -12121,8 +12439,8 @@
         <w:t xml:space="preserve">graduate school for providing funding.</w:t>
       </w:r>
     </w:p>
-    <w:bookmarkEnd w:id="38"/>
-    <w:bookmarkStart w:id="83" w:name="references"/>
+    <w:bookmarkEnd w:id="39"/>
+    <w:bookmarkStart w:id="84" w:name="references"/>
     <w:p>
       <w:pPr>
         <w:pStyle w:val="Heading1"/>
@@ -12131,8 +12449,8 @@
         <w:t xml:space="preserve">References</w:t>
       </w:r>
     </w:p>
-    <w:bookmarkStart w:id="82" w:name="refs"/>
-    <w:bookmarkStart w:id="40" w:name="ref-kim2018"/>
+    <w:bookmarkStart w:id="83" w:name="refs"/>
+    <w:bookmarkStart w:id="41" w:name="ref-kim2018"/>
     <w:p>
       <w:pPr>
         <w:pStyle w:val="Bibliography"/>
@@ -12191,7 +12509,7 @@
       <w:r>
         <w:t xml:space="preserve">. Viral Immunology. 2018;31: 174–183. doi:</w:t>
       </w:r>
-      <w:hyperlink r:id="rId39">
+      <w:hyperlink r:id="rId40">
         <w:r>
           <w:rPr>
             <w:rStyle w:val="Hyperlink"/>
@@ -12200,8 +12518,8 @@
         </w:r>
       </w:hyperlink>
     </w:p>
-    <w:bookmarkEnd w:id="40"/>
-    <w:bookmarkStart w:id="42" w:name="ref-erbelding2018"/>
+    <w:bookmarkEnd w:id="41"/>
+    <w:bookmarkStart w:id="43" w:name="ref-erbelding2018"/>
     <w:p>
       <w:pPr>
         <w:pStyle w:val="Bibliography"/>
@@ -12272,7 +12590,7 @@
       <w:r>
         <w:t xml:space="preserve">. The Journal of Infectious Diseases. 2018;218: 347–354. doi:</w:t>
       </w:r>
-      <w:hyperlink r:id="rId41">
+      <w:hyperlink r:id="rId42">
         <w:r>
           <w:rPr>
             <w:rStyle w:val="Hyperlink"/>
@@ -12281,8 +12599,8 @@
         </w:r>
       </w:hyperlink>
     </w:p>
-    <w:bookmarkEnd w:id="42"/>
-    <w:bookmarkStart w:id="44" w:name="ref-viboud2020a"/>
+    <w:bookmarkEnd w:id="43"/>
+    <w:bookmarkStart w:id="45" w:name="ref-viboud2020a"/>
     <w:p>
       <w:pPr>
         <w:pStyle w:val="Bibliography"/>
@@ -12311,7 +12629,7 @@
       <w:r>
         <w:t xml:space="preserve">and epidemiological considerations for development of a universal influenza vaccine. PLoS pathogens. 2020;16: e1008583. doi:</w:t>
       </w:r>
-      <w:hyperlink r:id="rId43">
+      <w:hyperlink r:id="rId44">
         <w:r>
           <w:rPr>
             <w:rStyle w:val="Hyperlink"/>
@@ -12320,8 +12638,8 @@
         </w:r>
       </w:hyperlink>
     </w:p>
-    <w:bookmarkEnd w:id="44"/>
-    <w:bookmarkStart w:id="46" w:name="ref-durviaux2014"/>
+    <w:bookmarkEnd w:id="45"/>
+    <w:bookmarkStart w:id="47" w:name="ref-durviaux2014"/>
     <w:p>
       <w:pPr>
         <w:pStyle w:val="Bibliography"/>
@@ -12371,7 +12689,7 @@
       <w:r>
         <w:t xml:space="preserve">. Clinical and Vaccine Immunology. 2014;21: 271–279. doi:</w:t>
       </w:r>
-      <w:hyperlink r:id="rId45">
+      <w:hyperlink r:id="rId46">
         <w:r>
           <w:rPr>
             <w:rStyle w:val="Hyperlink"/>
@@ -12380,8 +12698,8 @@
         </w:r>
       </w:hyperlink>
     </w:p>
-    <w:bookmarkEnd w:id="46"/>
-    <w:bookmarkStart w:id="48" w:name="ref-grantham1974"/>
+    <w:bookmarkEnd w:id="47"/>
+    <w:bookmarkStart w:id="49" w:name="ref-grantham1974"/>
     <w:p>
       <w:pPr>
         <w:pStyle w:val="Bibliography"/>
@@ -12398,7 +12716,7 @@
       <w:r>
         <w:t xml:space="preserve">Grantham R. Amino acid difference formula to help explain protein evolution. Science. 1974;185: 862–864. doi:</w:t>
       </w:r>
-      <w:hyperlink r:id="rId47">
+      <w:hyperlink r:id="rId48">
         <w:r>
           <w:rPr>
             <w:rStyle w:val="Hyperlink"/>
@@ -12407,8 +12725,8 @@
         </w:r>
       </w:hyperlink>
     </w:p>
-    <w:bookmarkEnd w:id="48"/>
-    <w:bookmarkStart w:id="50" w:name="ref-gupta2006"/>
+    <w:bookmarkEnd w:id="49"/>
+    <w:bookmarkStart w:id="51" w:name="ref-gupta2006"/>
     <w:p>
       <w:pPr>
         <w:pStyle w:val="Bibliography"/>
@@ -12425,7 +12743,7 @@
       <w:r>
         <w:t xml:space="preserve">Gupta V, Earl DJ, Deem MW. Quantifying influenza vaccine efficacy and antigenic distance. Vaccine. 2006;24: 3881–3888. doi:</w:t>
       </w:r>
-      <w:hyperlink r:id="rId49">
+      <w:hyperlink r:id="rId50">
         <w:r>
           <w:rPr>
             <w:rStyle w:val="Hyperlink"/>
@@ -12434,8 +12752,8 @@
         </w:r>
       </w:hyperlink>
     </w:p>
-    <w:bookmarkEnd w:id="50"/>
-    <w:bookmarkStart w:id="52" w:name="ref-fonville2016"/>
+    <w:bookmarkEnd w:id="51"/>
+    <w:bookmarkStart w:id="53" w:name="ref-fonville2016"/>
     <w:p>
       <w:pPr>
         <w:pStyle w:val="Bibliography"/>
@@ -12488,7 +12806,7 @@
       <w:r>
         <w:t xml:space="preserve">. The Journal of Infectious Diseases. 2016;213: 31–38. doi:</w:t>
       </w:r>
-      <w:hyperlink r:id="rId51">
+      <w:hyperlink r:id="rId52">
         <w:r>
           <w:rPr>
             <w:rStyle w:val="Hyperlink"/>
@@ -12497,8 +12815,8 @@
         </w:r>
       </w:hyperlink>
     </w:p>
-    <w:bookmarkEnd w:id="52"/>
-    <w:bookmarkStart w:id="54" w:name="ref-nunez2017"/>
+    <w:bookmarkEnd w:id="53"/>
+    <w:bookmarkStart w:id="55" w:name="ref-nunez2017"/>
     <w:p>
       <w:pPr>
         <w:pStyle w:val="Bibliography"/>
@@ -12527,7 +12845,7 @@
       <w:r>
         <w:t xml:space="preserve">strains. PloS One. 2017;12: e0185666. doi:</w:t>
       </w:r>
-      <w:hyperlink r:id="rId53">
+      <w:hyperlink r:id="rId54">
         <w:r>
           <w:rPr>
             <w:rStyle w:val="Hyperlink"/>
@@ -12536,8 +12854,8 @@
         </w:r>
       </w:hyperlink>
     </w:p>
-    <w:bookmarkEnd w:id="54"/>
-    <w:bookmarkStart w:id="56" w:name="ref-abreu2020"/>
+    <w:bookmarkEnd w:id="55"/>
+    <w:bookmarkStart w:id="57" w:name="ref-abreu2020"/>
     <w:p>
       <w:pPr>
         <w:pStyle w:val="Bibliography"/>
@@ -12563,7 +12881,7 @@
       <w:r>
         <w:t xml:space="preserve">. Frontiers in Immunology. 2020;11. doi:</w:t>
       </w:r>
-      <w:hyperlink r:id="rId55">
+      <w:hyperlink r:id="rId56">
         <w:r>
           <w:rPr>
             <w:rStyle w:val="Hyperlink"/>
@@ -12572,8 +12890,8 @@
         </w:r>
       </w:hyperlink>
     </w:p>
-    <w:bookmarkEnd w:id="56"/>
-    <w:bookmarkStart w:id="58" w:name="ref-auladell2022"/>
+    <w:bookmarkEnd w:id="57"/>
+    <w:bookmarkStart w:id="59" w:name="ref-auladell2022"/>
     <w:p>
       <w:pPr>
         <w:pStyle w:val="Bibliography"/>
@@ -12590,7 +12908,7 @@
       <w:r>
         <w:t xml:space="preserve">Auladell M, Phuong HVM, Mai LTQ, Tseng Y-Y, Carolan L, Wilks S, et al. Influenza virus infection history shapes antibody responses to influenza vaccination. Nature Medicine. 2022;28: 363–372. doi:</w:t>
       </w:r>
-      <w:hyperlink r:id="rId57">
+      <w:hyperlink r:id="rId58">
         <w:r>
           <w:rPr>
             <w:rStyle w:val="Hyperlink"/>
@@ -12599,8 +12917,8 @@
         </w:r>
       </w:hyperlink>
     </w:p>
-    <w:bookmarkEnd w:id="58"/>
-    <w:bookmarkStart w:id="59" w:name="ref-wilks2023"/>
+    <w:bookmarkEnd w:id="59"/>
+    <w:bookmarkStart w:id="60" w:name="ref-wilks2023"/>
     <w:p>
       <w:pPr>
         <w:pStyle w:val="Bibliography"/>
@@ -12633,8 +12951,8 @@
         <w:t xml:space="preserve"> </w:t>
       </w:r>
     </w:p>
-    <w:bookmarkEnd w:id="59"/>
-    <w:bookmarkStart w:id="61" w:name="ref-edgar2004"/>
+    <w:bookmarkEnd w:id="60"/>
+    <w:bookmarkStart w:id="62" w:name="ref-edgar2004"/>
     <w:p>
       <w:pPr>
         <w:pStyle w:val="Bibliography"/>
@@ -12660,7 +12978,7 @@
       <w:r>
         <w:t xml:space="preserve">: A multiple sequence alignment method with reduced time and space complexity. BMC Bioinformatics. 2004;5: 113. doi:</w:t>
       </w:r>
-      <w:hyperlink r:id="rId60">
+      <w:hyperlink r:id="rId61">
         <w:r>
           <w:rPr>
             <w:rStyle w:val="Hyperlink"/>
@@ -12669,8 +12987,8 @@
         </w:r>
       </w:hyperlink>
     </w:p>
-    <w:bookmarkEnd w:id="61"/>
-    <w:bookmarkStart w:id="63" w:name="ref-dang2010"/>
+    <w:bookmarkEnd w:id="62"/>
+    <w:bookmarkStart w:id="64" w:name="ref-dang2010"/>
     <w:p>
       <w:pPr>
         <w:pStyle w:val="Bibliography"/>
@@ -12696,7 +13014,7 @@
       <w:r>
         <w:t xml:space="preserve">, an amino acid substitution model for influenza proteins. BMC Evolutionary Biology. 2010;10: 99. doi:</w:t>
       </w:r>
-      <w:hyperlink r:id="rId62">
+      <w:hyperlink r:id="rId63">
         <w:r>
           <w:rPr>
             <w:rStyle w:val="Hyperlink"/>
@@ -12705,8 +13023,8 @@
         </w:r>
       </w:hyperlink>
     </w:p>
-    <w:bookmarkEnd w:id="63"/>
-    <w:bookmarkStart w:id="64" w:name="ref-burnham2002model"/>
+    <w:bookmarkEnd w:id="64"/>
+    <w:bookmarkStart w:id="65" w:name="ref-burnham2002model"/>
     <w:p>
       <w:pPr>
         <w:pStyle w:val="Bibliography"/>
@@ -12727,8 +13045,8 @@
         <w:t xml:space="preserve"> </w:t>
       </w:r>
     </w:p>
-    <w:bookmarkEnd w:id="64"/>
-    <w:bookmarkStart w:id="66" w:name="ref-schliep2011"/>
+    <w:bookmarkEnd w:id="65"/>
+    <w:bookmarkStart w:id="67" w:name="ref-schliep2011"/>
     <w:p>
       <w:pPr>
         <w:pStyle w:val="Bibliography"/>
@@ -12754,7 +13072,7 @@
       <w:r>
         <w:t xml:space="preserve">. Bioinformatics (Oxford, England). 2011;27: 592–593. doi:</w:t>
       </w:r>
-      <w:hyperlink r:id="rId65">
+      <w:hyperlink r:id="rId66">
         <w:r>
           <w:rPr>
             <w:rStyle w:val="Hyperlink"/>
@@ -12763,8 +13081,8 @@
         </w:r>
       </w:hyperlink>
     </w:p>
-    <w:bookmarkEnd w:id="66"/>
-    <w:bookmarkStart w:id="68" w:name="ref-legendre2010MantelAlternatives"/>
+    <w:bookmarkEnd w:id="67"/>
+    <w:bookmarkStart w:id="69" w:name="ref-legendre2010MantelAlternatives"/>
     <w:p>
       <w:pPr>
         <w:pStyle w:val="Bibliography"/>
@@ -12781,7 +13099,7 @@
       <w:r>
         <w:t xml:space="preserve">Legendre P, Fortin M-J. Comparison of the mantel test and alternative approaches for detecting complex multivariate relationships in the spatial analysis of genetic data. Molecular Ecology Resources. 2010;10: 831–844. doi:</w:t>
       </w:r>
-      <w:hyperlink r:id="rId67">
+      <w:hyperlink r:id="rId68">
         <w:r>
           <w:rPr>
             <w:rStyle w:val="Hyperlink"/>
@@ -12790,8 +13108,8 @@
         </w:r>
       </w:hyperlink>
     </w:p>
-    <w:bookmarkEnd w:id="68"/>
-    <w:bookmarkStart w:id="70" w:name="ref-legendre2015ShouldMantel"/>
+    <w:bookmarkEnd w:id="69"/>
+    <w:bookmarkStart w:id="71" w:name="ref-legendre2015ShouldMantel"/>
     <w:p>
       <w:pPr>
         <w:pStyle w:val="Bibliography"/>
@@ -12808,7 +13126,7 @@
       <w:r>
         <w:t xml:space="preserve">Legendre P, Fortin M-J, Borcard D. Should the mantel test be used in spatial analysis? Methods in Ecology and Evolution. 2015;6: 1239–1247. doi:</w:t>
       </w:r>
-      <w:hyperlink r:id="rId69">
+      <w:hyperlink r:id="rId70">
         <w:r>
           <w:rPr>
             <w:rStyle w:val="Hyperlink"/>
@@ -12817,8 +13135,8 @@
         </w:r>
       </w:hyperlink>
     </w:p>
-    <w:bookmarkEnd w:id="70"/>
-    <w:bookmarkStart w:id="72" w:name="ref-rubin1981"/>
+    <w:bookmarkEnd w:id="71"/>
+    <w:bookmarkStart w:id="73" w:name="ref-rubin1981"/>
     <w:p>
       <w:pPr>
         <w:pStyle w:val="Bibliography"/>
@@ -12835,7 +13153,7 @@
       <w:r>
         <w:t xml:space="preserve">Rubin DB. The bayesian bootstrap. The Annals of Statistics. 1981;9: 130–134. doi:</w:t>
       </w:r>
-      <w:hyperlink r:id="rId71">
+      <w:hyperlink r:id="rId72">
         <w:r>
           <w:rPr>
             <w:rStyle w:val="Hyperlink"/>
@@ -12844,8 +13162,8 @@
         </w:r>
       </w:hyperlink>
     </w:p>
-    <w:bookmarkEnd w:id="72"/>
-    <w:bookmarkStart w:id="74" w:name="ref-saitou1987NeighborJoining"/>
+    <w:bookmarkEnd w:id="73"/>
+    <w:bookmarkStart w:id="75" w:name="ref-saitou1987NeighborJoining"/>
     <w:p>
       <w:pPr>
         <w:pStyle w:val="Bibliography"/>
@@ -12862,7 +13180,7 @@
       <w:r>
         <w:t xml:space="preserve">Saitou N, Nei M. The neighbor-joining method: A new method for reconstructing phylogenetic trees. Molecular Biology and Evolution. 1987;4: 406–425. doi:</w:t>
       </w:r>
-      <w:hyperlink r:id="rId73">
+      <w:hyperlink r:id="rId74">
         <w:r>
           <w:rPr>
             <w:rStyle w:val="Hyperlink"/>
@@ -12871,8 +13189,8 @@
         </w:r>
       </w:hyperlink>
     </w:p>
-    <w:bookmarkEnd w:id="74"/>
-    <w:bookmarkStart w:id="76" w:name="ref-shimodaira1999ShTest"/>
+    <w:bookmarkEnd w:id="75"/>
+    <w:bookmarkStart w:id="77" w:name="ref-shimodaira1999ShTest"/>
     <w:p>
       <w:pPr>
         <w:pStyle w:val="Bibliography"/>
@@ -12889,7 +13207,7 @@
       <w:r>
         <w:t xml:space="preserve">Shimodaira H, Hasegawa M. Multiple comparisons of log-likelihoods with applications to phylogenetic inference. Molecular Biology and Evolution. 1999;16: 1114–1116. doi:</w:t>
       </w:r>
-      <w:hyperlink r:id="rId75">
+      <w:hyperlink r:id="rId76">
         <w:r>
           <w:rPr>
             <w:rStyle w:val="Hyperlink"/>
@@ -12898,8 +13216,8 @@
         </w:r>
       </w:hyperlink>
     </w:p>
-    <w:bookmarkEnd w:id="76"/>
-    <w:bookmarkStart w:id="78" w:name="X8b6875512c705bb343382cbd274febad517fdf3"/>
+    <w:bookmarkEnd w:id="77"/>
+    <w:bookmarkStart w:id="79" w:name="X8b6875512c705bb343382cbd274febad517fdf3"/>
     <w:p>
       <w:pPr>
         <w:pStyle w:val="Bibliography"/>
@@ -12916,7 +13234,7 @@
       <w:r>
         <w:t xml:space="preserve">Robinson DF, Foulds LR. Comparison of phylogenetic trees. Mathematical Biosciences. 1981;53: 131–147. doi:</w:t>
       </w:r>
-      <w:hyperlink r:id="rId77">
+      <w:hyperlink r:id="rId78">
         <w:r>
           <w:rPr>
             <w:rStyle w:val="Hyperlink"/>
@@ -12925,8 +13243,8 @@
         </w:r>
       </w:hyperlink>
     </w:p>
-    <w:bookmarkEnd w:id="78"/>
-    <w:bookmarkStart w:id="79" w:name="ref-rcoreteam2024"/>
+    <w:bookmarkEnd w:id="79"/>
+    <w:bookmarkStart w:id="80" w:name="ref-rcoreteam2024"/>
     <w:p>
       <w:pPr>
         <w:pStyle w:val="Bibliography"/>
@@ -12947,8 +13265,8 @@
         <w:t xml:space="preserve"> </w:t>
       </w:r>
     </w:p>
-    <w:bookmarkEnd w:id="79"/>
-    <w:bookmarkStart w:id="81" w:name="ref-bodenhofer2015"/>
+    <w:bookmarkEnd w:id="80"/>
+    <w:bookmarkStart w:id="82" w:name="ref-bodenhofer2015"/>
     <w:p>
       <w:pPr>
         <w:pStyle w:val="Bibliography"/>
@@ -12977,7 +13295,7 @@
       <w:r>
         <w:t xml:space="preserve">package for multiple sequence alignment. Bioinformatics. 2015;31: 3997–3999. doi:</w:t>
       </w:r>
-      <w:hyperlink r:id="rId80">
+      <w:hyperlink r:id="rId81">
         <w:r>
           <w:rPr>
             <w:rStyle w:val="Hyperlink"/>
@@ -12986,9 +13304,9 @@
         </w:r>
       </w:hyperlink>
     </w:p>
-    <w:bookmarkEnd w:id="81"/>
     <w:bookmarkEnd w:id="82"/>
     <w:bookmarkEnd w:id="83"/>
+    <w:bookmarkEnd w:id="84"/>
     <w:sectPr/>
   </w:body>
 </w:document>

</xml_diff>

<commit_message>
feat: add secondary sequence distance sensitivity
</commit_message>
<xml_diff>
--- a/products/manuscript.docx
+++ b/products/manuscript.docx
@@ -8566,6 +8566,72 @@
       </w:r>
       <w:r>
         <w:t xml:space="preserve">supplement.</w:t>
+      </w:r>
+    </w:p>
+    <w:p>
+      <w:pPr>
+        <w:pStyle w:val="BodyText"/>
+      </w:pPr>
+      <w:r>
+        <w:t xml:space="preserve">We also computed supplementary secondary sequence-distance metrics: amino-acid</w:t>
+      </w:r>
+      <w:r>
+        <w:t xml:space="preserve"> </w:t>
+      </w:r>
+      <w:r>
+        <w:t xml:space="preserve">Hamming distance, normalized optimal string alignment distance,</w:t>
+      </w:r>
+      <w:r>
+        <w:t xml:space="preserve"> </w:t>
+      </w:r>
+      <m:oMath>
+        <m:r>
+          <m:t>p</m:t>
+        </m:r>
+      </m:oMath>
+      <w:r>
+        <w:t xml:space="preserve">-all-epitope distance, and a BLOSUM62-derived dissimilarity. These metrics</w:t>
+      </w:r>
+      <w:r>
+        <w:t xml:space="preserve"> </w:t>
+      </w:r>
+      <w:r>
+        <w:t xml:space="preserve">are intended to complement, not replace, the primary temporal, Grantham,</w:t>
+      </w:r>
+      <w:r>
+        <w:t xml:space="preserve"> </w:t>
+      </w:r>
+      <m:oMath>
+        <m:r>
+          <m:t>p</m:t>
+        </m:r>
+      </m:oMath>
+      <w:r>
+        <w:t xml:space="preserve">-Epitope, and cartographic comparisons. They are reported in the supplement</w:t>
+      </w:r>
+      <w:r>
+        <w:t xml:space="preserve"> </w:t>
+      </w:r>
+      <w:r>
+        <w:t xml:space="preserve">as sensitivity outputs only; because the current regenerated outputs use</w:t>
+      </w:r>
+      <w:r>
+        <w:t xml:space="preserve"> </w:t>
+      </w:r>
+      <w:r>
+        <w:t xml:space="preserve">test-mode settings, we do not interpret the secondary-metric results here.</w:t>
+      </w:r>
+      <w:r>
+        <w:t xml:space="preserve"> </w:t>
+      </w:r>
+      <w:r>
+        <w:t xml:space="preserve">Unless full-mode outputs show a major difference, these secondary distances</w:t>
+      </w:r>
+      <w:r>
+        <w:t xml:space="preserve"> </w:t>
+      </w:r>
+      <w:r>
+        <w:t xml:space="preserve">will not be used to build distance-based neighbor-joining trees.</w:t>
       </w:r>
     </w:p>
     <w:p>

</xml_diff>

<commit_message>
feat: run all test mode artifacts
</commit_message>
<xml_diff>
--- a/products/manuscript.docx
+++ b/products/manuscript.docx
@@ -31,7 +31,7 @@
         <w:pStyle w:val="Date"/>
       </w:pPr>
       <w:r>
-        <w:t xml:space="preserve">2026-06-04</w:t>
+        <w:t xml:space="preserve">2026-06-05</w:t>
       </w:r>
     </w:p>
     <w:p>
@@ -237,7 +237,7 @@
         <w:t xml:space="preserve">methods.</w:t>
       </w:r>
     </w:p>
-    <w:bookmarkStart w:id="20" w:name="study-methodology"/>
+    <w:bookmarkStart w:id="21" w:name="study-methodology"/>
     <w:p>
       <w:pPr>
         <w:pStyle w:val="Heading1"/>
@@ -334,31 +334,43 @@
         <w:t xml:space="preserve"> </w:t>
       </w:r>
       <w:r>
-        <w:t xml:space="preserve">from hemagglutinin protein sequences. We restricted the</w:t>
-      </w:r>
-      <w:r>
-        <w:t xml:space="preserve"> </w:t>
-      </w:r>
-      <w:r>
-        <w:t xml:space="preserve">analysis panel to strains present in the stored H1N1 or H3N2 antigenic</w:t>
-      </w:r>
-      <w:r>
-        <w:t xml:space="preserve"> </w:t>
-      </w:r>
-      <w:r>
-        <w:t xml:space="preserve">cartography maps, because comparison with cartographic distance is a central</w:t>
-      </w:r>
-      <w:r>
-        <w:t xml:space="preserve"> </w:t>
-      </w:r>
-      <w:r>
-        <w:t xml:space="preserve">analysis objective. We used Racmacs to compute antigenic cartography distances</w:t>
-      </w:r>
-      <w:r>
-        <w:t xml:space="preserve"> </w:t>
-      </w:r>
-      <w:r>
-        <w:t xml:space="preserve">from the HAI data</w:t>
+        <w:t xml:space="preserve">from hemagglutinin protein sequences. The strain panel was</w:t>
+      </w:r>
+      <w:r>
+        <w:t xml:space="preserve"> </w:t>
+      </w:r>
+      <w:r>
+        <w:t xml:space="preserve">expert-selected to span historical H1N1/H3N2 antigenic space while retaining</w:t>
+      </w:r>
+      <w:r>
+        <w:t xml:space="preserve"> </w:t>
+      </w:r>
+      <w:r>
+        <w:t xml:space="preserve">strains that could be linked to sequence data and the stored antigenic</w:t>
+      </w:r>
+      <w:r>
+        <w:t xml:space="preserve"> </w:t>
+      </w:r>
+      <w:r>
+        <w:t xml:space="preserve">cartography maps. We restricted the analysis panel to strains present in the</w:t>
+      </w:r>
+      <w:r>
+        <w:t xml:space="preserve"> </w:t>
+      </w:r>
+      <w:r>
+        <w:t xml:space="preserve">stored H1N1 or H3N2 antigenic cartography maps, because comparison with</w:t>
+      </w:r>
+      <w:r>
+        <w:t xml:space="preserve"> </w:t>
+      </w:r>
+      <w:r>
+        <w:t xml:space="preserve">cartographic distance is a central analysis objective. We used Racmacs to</w:t>
+      </w:r>
+      <w:r>
+        <w:t xml:space="preserve"> </w:t>
+      </w:r>
+      <w:r>
+        <w:t xml:space="preserve">compute antigenic cartography distances from the HAI data</w:t>
       </w:r>
       <w:r>
         <w:t xml:space="preserve"> </w:t>
@@ -367,7 +379,13 @@
         <w:t xml:space="preserve">[11]</w:t>
       </w:r>
       <w:r>
-        <w:t xml:space="preserve">. The stored</w:t>
+        <w:t xml:space="preserve">. The</w:t>
+      </w:r>
+      <w:r>
+        <w:t xml:space="preserve"> </w:t>
+      </w:r>
+      <w:r>
+        <w:t xml:space="preserve">stored</w:t>
       </w:r>
       <w:r>
         <w:t xml:space="preserve"> </w:t>
@@ -382,49 +400,49 @@
         <w:t xml:space="preserve"> </w:t>
       </w:r>
       <w:r>
-        <w:t xml:space="preserve">maps were treated as</w:t>
-      </w:r>
-      <w:r>
-        <w:t xml:space="preserve"> </w:t>
-      </w:r>
-      <w:r>
-        <w:t xml:space="preserve">first-pass cartography inputs; map dimensionality, strain and serum counts,</w:t>
-      </w:r>
-      <w:r>
-        <w:t xml:space="preserve"> </w:t>
-      </w:r>
-      <w:r>
-        <w:t xml:space="preserve">stored stress, and titer missingness diagnostics are reported in the</w:t>
-      </w:r>
-      <w:r>
-        <w:t xml:space="preserve"> </w:t>
-      </w:r>
-      <w:r>
-        <w:t xml:space="preserve">supplement. A separate manuscript is planned to describe construction of the</w:t>
-      </w:r>
-      <w:r>
-        <w:t xml:space="preserve"> </w:t>
-      </w:r>
-      <w:r>
-        <w:t xml:space="preserve">human-serum antigenic cartographies. Using the same HAI dataset to build the</w:t>
-      </w:r>
-      <w:r>
-        <w:t xml:space="preserve"> </w:t>
-      </w:r>
-      <w:r>
-        <w:t xml:space="preserve">maps and compare cartographic distances is a limitation, but no comparable</w:t>
-      </w:r>
-      <w:r>
-        <w:t xml:space="preserve"> </w:t>
-      </w:r>
-      <w:r>
-        <w:t xml:space="preserve">alternative is currently available for this strain panel. All of our analyses</w:t>
-      </w:r>
-      <w:r>
-        <w:t xml:space="preserve"> </w:t>
-      </w:r>
-      <w:r>
-        <w:t xml:space="preserve">were conducted separately for H1N1 and H3N2 strains.</w:t>
+        <w:t xml:space="preserve">maps were treated as first-pass cartography inputs; map</w:t>
+      </w:r>
+      <w:r>
+        <w:t xml:space="preserve"> </w:t>
+      </w:r>
+      <w:r>
+        <w:t xml:space="preserve">dimensionality, strain and serum counts, stored stress, and titer missingness</w:t>
+      </w:r>
+      <w:r>
+        <w:t xml:space="preserve"> </w:t>
+      </w:r>
+      <w:r>
+        <w:t xml:space="preserve">diagnostics are reported in the supplement. A separate manuscript is planned to</w:t>
+      </w:r>
+      <w:r>
+        <w:t xml:space="preserve"> </w:t>
+      </w:r>
+      <w:r>
+        <w:t xml:space="preserve">describe construction of the human-serum antigenic cartographies. Using the</w:t>
+      </w:r>
+      <w:r>
+        <w:t xml:space="preserve"> </w:t>
+      </w:r>
+      <w:r>
+        <w:t xml:space="preserve">same HAI dataset to build the maps and compare cartographic distances is a</w:t>
+      </w:r>
+      <w:r>
+        <w:t xml:space="preserve"> </w:t>
+      </w:r>
+      <w:r>
+        <w:t xml:space="preserve">limitation, but no comparable alternative is currently available for this</w:t>
+      </w:r>
+      <w:r>
+        <w:t xml:space="preserve"> </w:t>
+      </w:r>
+      <w:r>
+        <w:t xml:space="preserve">strain panel. All of our analyses were conducted separately for H1N1 and H3N2</w:t>
+      </w:r>
+      <w:r>
+        <w:t xml:space="preserve"> </w:t>
+      </w:r>
+      <w:r>
+        <w:t xml:space="preserve">strains.</w:t>
       </w:r>
     </w:p>
     <w:p>
@@ -524,396 +542,9 @@
         <w:t xml:space="preserve"> </w:t>
       </w:r>
       <w:r>
-        <w:t xml:space="preserve">H3N2 strains in total. A full inclusion and provenance audit, including source</w:t>
-      </w:r>
-      <w:r>
-        <w:t xml:space="preserve"> </w:t>
-      </w:r>
-      <w:r>
-        <w:t xml:space="preserve">rows excluded because they were absent from the stored cartography maps,</w:t>
-      </w:r>
-      <w:r>
-        <w:t xml:space="preserve"> </w:t>
-      </w:r>
-      <w:r>
-        <w:t xml:space="preserve">source/accession fields, sequence completeness checks, and pair counts, is</w:t>
-      </w:r>
-      <w:r>
-        <w:t xml:space="preserve"> </w:t>
-      </w:r>
-      <w:r>
-        <w:t xml:space="preserve">reported in the supplement. We then used both protein alignments to construct maximum</w:t>
-      </w:r>
-      <w:r>
-        <w:t xml:space="preserve"> </w:t>
-      </w:r>
-      <w:r>
-        <w:t xml:space="preserve">likelihood (ML) unrooted phylogenetic trees using the FLU amino acid</w:t>
-      </w:r>
-      <w:r>
-        <w:t xml:space="preserve"> </w:t>
-      </w:r>
-      <w:r>
-        <w:t xml:space="preserve">substitution model</w:t>
-      </w:r>
-      <w:r>
-        <w:t xml:space="preserve"> </w:t>
-      </w:r>
-      <w:r>
-        <w:t xml:space="preserve">[13]</w:t>
-      </w:r>
-      <w:r>
-        <w:t xml:space="preserve">. For each subtype, we</w:t>
-      </w:r>
-      <w:r>
-        <w:t xml:space="preserve"> </w:t>
-      </w:r>
-      <w:r>
-        <w:t xml:space="preserve">compared FLU-family models with and without invariant sites and discrete gamma</w:t>
-      </w:r>
-      <w:r>
-        <w:t xml:space="preserve"> </w:t>
-      </w:r>
-      <w:r>
-        <w:t xml:space="preserve">rate variation, evaluating gamma category counts from 4 to 32 in increments of</w:t>
-      </w:r>
-      <w:r>
-        <w:t xml:space="preserve"> </w:t>
-      </w:r>
-      <w:r>
-        <w:t xml:space="preserve">4 for the full analysis. Models were compared with AICc</w:t>
-      </w:r>
-      <w:r>
-        <w:t xml:space="preserve"> </w:t>
-      </w:r>
-      <w:r>
-        <w:t xml:space="preserve">[14,15]</w:t>
-      </w:r>
-      <w:r>
-        <w:t xml:space="preserve">. We selected the AICc-supported model within</w:t>
-      </w:r>
-      <w:r>
-        <w:t xml:space="preserve"> </w:t>
-      </w:r>
-      <w:r>
-        <w:t xml:space="preserve">each subtype, but preferred a common model for both subtypes when the common</w:t>
-      </w:r>
-      <w:r>
-        <w:t xml:space="preserve"> </w:t>
-      </w:r>
-      <w:r>
-        <w:t xml:space="preserve">model’s log-likelihood loss was no more than 10% relative to the</w:t>
-      </w:r>
-      <w:r>
-        <w:t xml:space="preserve"> </w:t>
-      </w:r>
-      <w:r>
-        <w:t xml:space="preserve">subtype-specific AICc-supported model. We extracted the</w:t>
-      </w:r>
-      <w:r>
-        <w:t xml:space="preserve"> </w:t>
-      </w:r>
-      <w:r>
-        <w:t xml:space="preserve">cophenetic distances between taxa from the ML trees, and compared these</w:t>
-      </w:r>
-      <w:r>
-        <w:t xml:space="preserve"> </w:t>
-      </w:r>
-      <w:r>
-        <w:t xml:space="preserve">distances to our other distance metrics (temporal, Grantham,</w:t>
-      </w:r>
-      <w:r>
-        <w:t xml:space="preserve"> </w:t>
-      </w:r>
-      <m:oMath>
-        <m:r>
-          <m:t>p</m:t>
-        </m:r>
-      </m:oMath>
-      <w:r>
-        <w:t xml:space="preserve">-Epitope, and cartography) using Mantel correlations with matrix</w:t>
-      </w:r>
-      <w:r>
-        <w:t xml:space="preserve"> </w:t>
-      </w:r>
-      <w:r>
-        <w:t xml:space="preserve">permutation p-values</w:t>
-      </w:r>
-      <w:r>
-        <w:t xml:space="preserve"> </w:t>
-      </w:r>
-      <w:r>
-        <w:t xml:space="preserve">[16,17]</w:t>
-      </w:r>
-      <w:r>
-        <w:t xml:space="preserve">. These comparisons used only unique off-diagonal</w:t>
-      </w:r>
-      <w:r>
-        <w:t xml:space="preserve"> </w:t>
-      </w:r>
-      <w:r>
-        <w:t xml:space="preserve">strain pairs, excluding duplicate symmetric distances and self-comparisons.</w:t>
-      </w:r>
-      <w:r>
-        <w:t xml:space="preserve"> </w:t>
-      </w:r>
-      <w:r>
-        <w:t xml:space="preserve">We estimated 95% intervals for the Mantel statistic using Bayesian bootstrap</w:t>
-      </w:r>
-      <w:r>
-        <w:t xml:space="preserve"> </w:t>
-      </w:r>
-      <w:r>
-        <w:t xml:space="preserve">resampling over strain units</w:t>
-      </w:r>
-      <w:r>
-        <w:t xml:space="preserve"> </w:t>
-      </w:r>
-      <w:r>
-        <w:t xml:space="preserve">[18]</w:t>
-      </w:r>
-      <w:r>
-        <w:t xml:space="preserve">. To quantify subtype differences,</w:t>
-      </w:r>
-      <w:r>
-        <w:t xml:space="preserve"> </w:t>
-      </w:r>
-      <w:r>
-        <w:t xml:space="preserve">we subtracted the H1N1 Mantel correlation from the H3N2 Mantel correlation for</w:t>
-      </w:r>
-      <w:r>
-        <w:t xml:space="preserve"> </w:t>
-      </w:r>
-      <w:r>
-        <w:t xml:space="preserve">each distance metric, with uncertainty estimated by the same strain-level</w:t>
-      </w:r>
-      <w:r>
-        <w:t xml:space="preserve"> </w:t>
-      </w:r>
-      <w:r>
-        <w:t xml:space="preserve">Bayesian bootstrap. Descriptive Pearson correlations using the same unique</w:t>
-      </w:r>
-      <w:r>
-        <w:t xml:space="preserve"> </w:t>
-      </w:r>
-      <w:r>
-        <w:t xml:space="preserve">off-diagonal pair representation are reported in the supplement for</w:t>
-      </w:r>
-      <w:r>
-        <w:t xml:space="preserve"> </w:t>
-      </w:r>
-      <w:r>
-        <w:t xml:space="preserve">interpretability.</w:t>
-      </w:r>
-    </w:p>
-    <w:p>
-      <w:pPr>
-        <w:pStyle w:val="BodyText"/>
-      </w:pPr>
-      <w:r>
-        <w:t xml:space="preserve">For each of the four distance metrics, we also built distance-based trees using</w:t>
-      </w:r>
-      <w:r>
-        <w:t xml:space="preserve"> </w:t>
-      </w:r>
-      <w:r>
-        <w:t xml:space="preserve">neighbor joining</w:t>
-      </w:r>
-      <w:r>
-        <w:t xml:space="preserve"> </w:t>
-      </w:r>
-      <w:r>
-        <w:t xml:space="preserve">[19]</w:t>
-      </w:r>
-      <w:r>
-        <w:t xml:space="preserve">. To compare the methods, we</w:t>
-      </w:r>
-      <w:r>
-        <w:t xml:space="preserve"> </w:t>
-      </w:r>
-      <w:r>
-        <w:t xml:space="preserve">calculated the likelihood of each distance-based tree under the selected ML</w:t>
-      </w:r>
-      <w:r>
-        <w:t xml:space="preserve"> </w:t>
-      </w:r>
-      <w:r>
-        <w:t xml:space="preserve">model and treated the decrease in log likelihood from the ML tree as the primary</w:t>
-      </w:r>
-      <w:r>
-        <w:t xml:space="preserve"> </w:t>
-      </w:r>
-      <w:r>
-        <w:t xml:space="preserve">tree-comparison statistic. We did not use a standard likelihood-ratio test</w:t>
-      </w:r>
-      <w:r>
-        <w:t xml:space="preserve"> </w:t>
-      </w:r>
-      <w:r>
-        <w:t xml:space="preserve">because these fixed distance-tree topologies are not nested regular parametric</w:t>
-      </w:r>
-      <w:r>
-        <w:t xml:space="preserve"> </w:t>
-      </w:r>
-      <w:r>
-        <w:t xml:space="preserve">models relative to the optimized ML topology. As secondary checks, we estimated</w:t>
-      </w:r>
-      <w:r>
-        <w:t xml:space="preserve"> </w:t>
-      </w:r>
-      <w:r>
-        <w:t xml:space="preserve">Shimodaira-Hasegawa p-values</w:t>
-      </w:r>
-      <w:r>
-        <w:t xml:space="preserve"> </w:t>
-      </w:r>
-      <w:r>
-        <w:t xml:space="preserve">[20]</w:t>
-      </w:r>
-      <w:r>
-        <w:t xml:space="preserve"> </w:t>
-      </w:r>
-      <w:r>
-        <w:t xml:space="preserve">and computed</w:t>
-      </w:r>
-      <w:r>
-        <w:t xml:space="preserve"> </w:t>
-      </w:r>
-      <w:r>
-        <w:t xml:space="preserve">Robinson-Foulds distances</w:t>
-      </w:r>
-      <w:r>
-        <w:t xml:space="preserve"> </w:t>
-      </w:r>
-      <w:r>
-        <w:t xml:space="preserve">[21]</w:t>
-      </w:r>
-      <w:r>
-        <w:t xml:space="preserve"> </w:t>
-      </w:r>
-      <w:r>
-        <w:t xml:space="preserve">between</w:t>
-      </w:r>
-      <w:r>
-        <w:t xml:space="preserve"> </w:t>
-      </w:r>
-      <w:r>
-        <w:t xml:space="preserve">each distance tree and the ML tree. We also evaluated ML-tree robustness with</w:t>
-      </w:r>
-      <w:r>
-        <w:t xml:space="preserve"> </w:t>
-      </w:r>
-      <w:r>
-        <w:t xml:space="preserve">nonparametric site-bootstrap resampling of the fitted ML tree, reporting</w:t>
-      </w:r>
-      <w:r>
-        <w:t xml:space="preserve"> </w:t>
-      </w:r>
-      <w:r>
-        <w:t xml:space="preserve">internal-branch support and bootstrap topology-stability diagnostics in the</w:t>
-      </w:r>
-      <w:r>
-        <w:t xml:space="preserve"> </w:t>
-      </w:r>
-      <w:r>
-        <w:t xml:space="preserve">supplement. Our analyses were implemented</w:t>
-      </w:r>
-      <w:r>
-        <w:t xml:space="preserve"> </w:t>
-      </w:r>
-      <w:r>
-        <w:t xml:space="preserve">with R version 4.3.3</w:t>
-      </w:r>
-      <w:r>
-        <w:t xml:space="preserve"> </w:t>
-      </w:r>
-      <w:r>
-        <w:t xml:space="preserve">[22]</w:t>
-      </w:r>
-      <w:r>
-        <w:t xml:space="preserve"> </w:t>
-      </w:r>
-      <w:r>
-        <w:t xml:space="preserve">using the packages</w:t>
-      </w:r>
-      <w:r>
-        <w:t xml:space="preserve"> </w:t>
-      </w:r>
-      <w:r>
-        <w:rPr>
-          <w:rStyle w:val="VerbatimChar"/>
-        </w:rPr>
-        <w:t xml:space="preserve">phangorn</w:t>
-      </w:r>
-      <w:r>
-        <w:t xml:space="preserve"> </w:t>
-      </w:r>
-      <w:r>
-        <w:t xml:space="preserve">[15]</w:t>
-      </w:r>
-      <w:r>
-        <w:t xml:space="preserve"> </w:t>
-      </w:r>
-      <w:r>
-        <w:t xml:space="preserve">and</w:t>
-      </w:r>
-      <w:r>
-        <w:t xml:space="preserve"> </w:t>
-      </w:r>
-      <w:r>
-        <w:rPr>
-          <w:rStyle w:val="VerbatimChar"/>
-        </w:rPr>
-        <w:t xml:space="preserve">msa</w:t>
-      </w:r>
-      <w:r>
-        <w:t xml:space="preserve"> </w:t>
-      </w:r>
-      <w:r>
-        <w:t xml:space="preserve">[23]</w:t>
-      </w:r>
-      <w:r>
-        <w:t xml:space="preserve">.</w:t>
-      </w:r>
-    </w:p>
-    <w:bookmarkEnd w:id="20"/>
-    <w:bookmarkStart w:id="37" w:name="study-results"/>
-    <w:p>
-      <w:pPr>
-        <w:pStyle w:val="Heading1"/>
-      </w:pPr>
-      <w:r>
-        <w:t xml:space="preserve">Study Results</w:t>
-      </w:r>
-    </w:p>
-    <w:p>
-      <w:pPr>
-        <w:pStyle w:val="FirstParagraph"/>
-      </w:pPr>
-      <w:r>
-        <w:t xml:space="preserve">The distance metrics differed in their Mantel agreement with ML-tree cophenetic</w:t>
-      </w:r>
-      <w:r>
-        <w:t xml:space="preserve"> </w:t>
-      </w:r>
-      <w:r>
-        <w:t xml:space="preserve">distance (</w:t>
-      </w:r>
-      <w:hyperlink w:anchor="fig-corr">
-        <w:r>
-          <w:rPr>
-            <w:rStyle w:val="Hyperlink"/>
-          </w:rPr>
-          <w:t xml:space="preserve">Figure 1</w:t>
-        </w:r>
-      </w:hyperlink>
-      <w:r>
-        <w:t xml:space="preserve">;</w:t>
-      </w:r>
-      <w:r>
-        <w:t xml:space="preserve"> </w:t>
-      </w:r>
-      <w:hyperlink w:anchor="tbl-distance-correlations">
+        <w:t xml:space="preserve">H3N2 strains in total (</w:t>
+      </w:r>
+      <w:hyperlink w:anchor="tbl-panel-summary">
         <w:r>
           <w:rPr>
             <w:rStyle w:val="Hyperlink"/>
@@ -922,7 +553,115 @@
         </w:r>
       </w:hyperlink>
       <w:r>
-        <w:t xml:space="preserve">). Grantham and</w:t>
+        <w:t xml:space="preserve">). Fluzone vaccine-component status</w:t>
+      </w:r>
+      <w:r>
+        <w:t xml:space="preserve"> </w:t>
+      </w:r>
+      <w:r>
+        <w:t xml:space="preserve">is defined from the cohort-season vaccine-strain source reported in the</w:t>
+      </w:r>
+      <w:r>
+        <w:t xml:space="preserve"> </w:t>
+      </w:r>
+      <w:r>
+        <w:t xml:space="preserve">supplement. A full inclusion and provenance audit, including source rows</w:t>
+      </w:r>
+      <w:r>
+        <w:t xml:space="preserve"> </w:t>
+      </w:r>
+      <w:r>
+        <w:t xml:space="preserve">excluded because they were absent from the stored cartography maps,</w:t>
+      </w:r>
+      <w:r>
+        <w:t xml:space="preserve"> </w:t>
+      </w:r>
+      <w:r>
+        <w:t xml:space="preserve">source/accession fields, sequence completeness checks, vaccine-component</w:t>
+      </w:r>
+      <w:r>
+        <w:t xml:space="preserve"> </w:t>
+      </w:r>
+      <w:r>
+        <w:t xml:space="preserve">status, and pair counts, is reported in the supplement. We then used both protein alignments to construct maximum</w:t>
+      </w:r>
+      <w:r>
+        <w:t xml:space="preserve"> </w:t>
+      </w:r>
+      <w:r>
+        <w:t xml:space="preserve">likelihood (ML) unrooted phylogenetic trees using the FLU amino acid</w:t>
+      </w:r>
+      <w:r>
+        <w:t xml:space="preserve"> </w:t>
+      </w:r>
+      <w:r>
+        <w:t xml:space="preserve">substitution model</w:t>
+      </w:r>
+      <w:r>
+        <w:t xml:space="preserve"> </w:t>
+      </w:r>
+      <w:r>
+        <w:t xml:space="preserve">[13]</w:t>
+      </w:r>
+      <w:r>
+        <w:t xml:space="preserve">. For each subtype, we</w:t>
+      </w:r>
+      <w:r>
+        <w:t xml:space="preserve"> </w:t>
+      </w:r>
+      <w:r>
+        <w:t xml:space="preserve">compared FLU-family models with and without invariant sites and discrete gamma</w:t>
+      </w:r>
+      <w:r>
+        <w:t xml:space="preserve"> </w:t>
+      </w:r>
+      <w:r>
+        <w:t xml:space="preserve">rate variation, evaluating gamma category counts from 4 to 32 in increments of</w:t>
+      </w:r>
+      <w:r>
+        <w:t xml:space="preserve"> </w:t>
+      </w:r>
+      <w:r>
+        <w:t xml:space="preserve">4 for the full analysis. Models were compared with AICc</w:t>
+      </w:r>
+      <w:r>
+        <w:t xml:space="preserve"> </w:t>
+      </w:r>
+      <w:r>
+        <w:t xml:space="preserve">[14,15]</w:t>
+      </w:r>
+      <w:r>
+        <w:t xml:space="preserve">. We selected the AICc-supported model within</w:t>
+      </w:r>
+      <w:r>
+        <w:t xml:space="preserve"> </w:t>
+      </w:r>
+      <w:r>
+        <w:t xml:space="preserve">each subtype, but preferred a common model for both subtypes when the common</w:t>
+      </w:r>
+      <w:r>
+        <w:t xml:space="preserve"> </w:t>
+      </w:r>
+      <w:r>
+        <w:t xml:space="preserve">model’s log-likelihood loss was no more than 10% relative to the</w:t>
+      </w:r>
+      <w:r>
+        <w:t xml:space="preserve"> </w:t>
+      </w:r>
+      <w:r>
+        <w:t xml:space="preserve">subtype-specific AICc-supported model. We extracted the</w:t>
+      </w:r>
+      <w:r>
+        <w:t xml:space="preserve"> </w:t>
+      </w:r>
+      <w:r>
+        <w:t xml:space="preserve">cophenetic distances between taxa from the ML trees, and compared these</w:t>
+      </w:r>
+      <w:r>
+        <w:t xml:space="preserve"> </w:t>
+      </w:r>
+      <w:r>
+        <w:t xml:space="preserve">distances to our other distance metrics (temporal, Grantham,</w:t>
       </w:r>
       <w:r>
         <w:t xml:space="preserve"> </w:t>
@@ -933,49 +672,291 @@
         </m:r>
       </m:oMath>
       <w:r>
-        <w:t xml:space="preserve">-Epitope</w:t>
-      </w:r>
-      <w:r>
-        <w:t xml:space="preserve"> </w:t>
-      </w:r>
-      <w:r>
-        <w:t xml:space="preserve">distances were strongly associated with ML-tree distance for both subtypes,</w:t>
-      </w:r>
-      <w:r>
-        <w:t xml:space="preserve"> </w:t>
-      </w:r>
-      <w:r>
-        <w:t xml:space="preserve">while cartographic distance had lower matrix correlations. Temporal distance was</w:t>
-      </w:r>
-      <w:r>
-        <w:t xml:space="preserve"> </w:t>
-      </w:r>
-      <w:r>
-        <w:t xml:space="preserve">strongly associated with ML-tree distance for H3N2, but not for H1N1. H1N1 has</w:t>
-      </w:r>
-      <w:r>
-        <w:t xml:space="preserve"> </w:t>
-      </w:r>
-      <w:r>
-        <w:t xml:space="preserve">two clusters, 2009 pandemic-like (pdm) and non-pdm. The pdm-like strains are</w:t>
-      </w:r>
-      <w:r>
-        <w:t xml:space="preserve"> </w:t>
-      </w:r>
-      <w:r>
-        <w:t xml:space="preserve">genetically more similar to the 1918 pandemic strain than to most strains which</w:t>
-      </w:r>
-      <w:r>
-        <w:t xml:space="preserve"> </w:t>
-      </w:r>
-      <w:r>
-        <w:t xml:space="preserve">circulated from 1950 – 2009, so a simple temporal-distance comparison can be</w:t>
-      </w:r>
-      <w:r>
-        <w:t xml:space="preserve"> </w:t>
-      </w:r>
-      <w:r>
-        <w:t xml:space="preserve">weak for H1N1.</w:t>
+        <w:t xml:space="preserve">-Epitope, and cartography) using Mantel correlations with matrix</w:t>
+      </w:r>
+      <w:r>
+        <w:t xml:space="preserve"> </w:t>
+      </w:r>
+      <w:r>
+        <w:t xml:space="preserve">permutation p-values</w:t>
+      </w:r>
+      <w:r>
+        <w:t xml:space="preserve"> </w:t>
+      </w:r>
+      <w:r>
+        <w:t xml:space="preserve">[16,17]</w:t>
+      </w:r>
+      <w:r>
+        <w:t xml:space="preserve">. These comparisons used only unique off-diagonal</w:t>
+      </w:r>
+      <w:r>
+        <w:t xml:space="preserve"> </w:t>
+      </w:r>
+      <w:r>
+        <w:t xml:space="preserve">strain pairs, excluding duplicate symmetric distances and self-comparisons.</w:t>
+      </w:r>
+      <w:r>
+        <w:t xml:space="preserve"> </w:t>
+      </w:r>
+      <w:r>
+        <w:t xml:space="preserve">All distance-matrix associations and distance-tree analyses used raw distance</w:t>
+      </w:r>
+      <w:r>
+        <w:t xml:space="preserve"> </w:t>
+      </w:r>
+      <w:r>
+        <w:t xml:space="preserve">values unless explicitly labeled as normalized. We used min-max normalization</w:t>
+      </w:r>
+      <w:r>
+        <w:t xml:space="preserve"> </w:t>
+      </w:r>
+      <w:r>
+        <w:t xml:space="preserve">only for labeled visual or audit outputs where metrics with different units</w:t>
+      </w:r>
+      <w:r>
+        <w:t xml:space="preserve"> </w:t>
+      </w:r>
+      <w:r>
+        <w:t xml:space="preserve">needed to be displayed on a common 0–1 scale.</w:t>
+      </w:r>
+      <w:r>
+        <w:t xml:space="preserve"> </w:t>
+      </w:r>
+      <w:r>
+        <w:t xml:space="preserve">We estimated 95% intervals for the Mantel statistic using Bayesian bootstrap</w:t>
+      </w:r>
+      <w:r>
+        <w:t xml:space="preserve"> </w:t>
+      </w:r>
+      <w:r>
+        <w:t xml:space="preserve">resampling over strain units</w:t>
+      </w:r>
+      <w:r>
+        <w:t xml:space="preserve"> </w:t>
+      </w:r>
+      <w:r>
+        <w:t xml:space="preserve">[18]</w:t>
+      </w:r>
+      <w:r>
+        <w:t xml:space="preserve">. To quantify subtype differences,</w:t>
+      </w:r>
+      <w:r>
+        <w:t xml:space="preserve"> </w:t>
+      </w:r>
+      <w:r>
+        <w:t xml:space="preserve">we subtracted the H1N1 Mantel correlation from the H3N2 Mantel correlation for</w:t>
+      </w:r>
+      <w:r>
+        <w:t xml:space="preserve"> </w:t>
+      </w:r>
+      <w:r>
+        <w:t xml:space="preserve">each distance metric, with uncertainty estimated by the same strain-level</w:t>
+      </w:r>
+      <w:r>
+        <w:t xml:space="preserve"> </w:t>
+      </w:r>
+      <w:r>
+        <w:t xml:space="preserve">Bayesian bootstrap. Descriptive Pearson correlations using the same unique</w:t>
+      </w:r>
+      <w:r>
+        <w:t xml:space="preserve"> </w:t>
+      </w:r>
+      <w:r>
+        <w:t xml:space="preserve">off-diagonal pair representation are reported in the supplement for</w:t>
+      </w:r>
+      <w:r>
+        <w:t xml:space="preserve"> </w:t>
+      </w:r>
+      <w:r>
+        <w:t xml:space="preserve">interpretability. Rank-based Spearman Mantel and descriptive Spearman</w:t>
+      </w:r>
+      <w:r>
+        <w:t xml:space="preserve"> </w:t>
+      </w:r>
+      <w:r>
+        <w:t xml:space="preserve">correlations are also reported in the supplement as sensitivity analyses for</w:t>
+      </w:r>
+      <w:r>
+        <w:t xml:space="preserve"> </w:t>
+      </w:r>
+      <w:r>
+        <w:t xml:space="preserve">monotonic but nonlinear relationships, not as replacements for the primary</w:t>
+      </w:r>
+      <w:r>
+        <w:t xml:space="preserve"> </w:t>
+      </w:r>
+      <w:r>
+        <w:t xml:space="preserve">Mantel estimand.</w:t>
+      </w:r>
+    </w:p>
+    <w:p>
+      <w:pPr>
+        <w:pStyle w:val="BodyText"/>
+      </w:pPr>
+      <w:r>
+        <w:t xml:space="preserve">For each of the four distance metrics, we also built distance-based trees using</w:t>
+      </w:r>
+      <w:r>
+        <w:t xml:space="preserve"> </w:t>
+      </w:r>
+      <w:r>
+        <w:t xml:space="preserve">neighbor joining</w:t>
+      </w:r>
+      <w:r>
+        <w:t xml:space="preserve"> </w:t>
+      </w:r>
+      <w:r>
+        <w:t xml:space="preserve">[19]</w:t>
+      </w:r>
+      <w:r>
+        <w:t xml:space="preserve">. To compare the methods, we</w:t>
+      </w:r>
+      <w:r>
+        <w:t xml:space="preserve"> </w:t>
+      </w:r>
+      <w:r>
+        <w:t xml:space="preserve">calculated the likelihood of each distance-based tree under the selected ML</w:t>
+      </w:r>
+      <w:r>
+        <w:t xml:space="preserve"> </w:t>
+      </w:r>
+      <w:r>
+        <w:t xml:space="preserve">model and treated the decrease in log likelihood from the ML tree as the primary</w:t>
+      </w:r>
+      <w:r>
+        <w:t xml:space="preserve"> </w:t>
+      </w:r>
+      <w:r>
+        <w:t xml:space="preserve">tree-comparison statistic. We did not use a standard likelihood-ratio test</w:t>
+      </w:r>
+      <w:r>
+        <w:t xml:space="preserve"> </w:t>
+      </w:r>
+      <w:r>
+        <w:t xml:space="preserve">because these fixed distance-tree topologies are not nested regular parametric</w:t>
+      </w:r>
+      <w:r>
+        <w:t xml:space="preserve"> </w:t>
+      </w:r>
+      <w:r>
+        <w:t xml:space="preserve">models relative to the optimized ML topology. As secondary checks, we estimated</w:t>
+      </w:r>
+      <w:r>
+        <w:t xml:space="preserve"> </w:t>
+      </w:r>
+      <w:r>
+        <w:t xml:space="preserve">Shimodaira-Hasegawa p-values</w:t>
+      </w:r>
+      <w:r>
+        <w:t xml:space="preserve"> </w:t>
+      </w:r>
+      <w:r>
+        <w:t xml:space="preserve">[20]</w:t>
+      </w:r>
+      <w:r>
+        <w:t xml:space="preserve"> </w:t>
+      </w:r>
+      <w:r>
+        <w:t xml:space="preserve">and computed</w:t>
+      </w:r>
+      <w:r>
+        <w:t xml:space="preserve"> </w:t>
+      </w:r>
+      <w:r>
+        <w:t xml:space="preserve">Robinson-Foulds distances</w:t>
+      </w:r>
+      <w:r>
+        <w:t xml:space="preserve"> </w:t>
+      </w:r>
+      <w:r>
+        <w:t xml:space="preserve">[21]</w:t>
+      </w:r>
+      <w:r>
+        <w:t xml:space="preserve"> </w:t>
+      </w:r>
+      <w:r>
+        <w:t xml:space="preserve">between</w:t>
+      </w:r>
+      <w:r>
+        <w:t xml:space="preserve"> </w:t>
+      </w:r>
+      <w:r>
+        <w:t xml:space="preserve">each distance tree and the ML tree. We also evaluated ML-tree robustness with</w:t>
+      </w:r>
+      <w:r>
+        <w:t xml:space="preserve"> </w:t>
+      </w:r>
+      <w:r>
+        <w:t xml:space="preserve">nonparametric site-bootstrap resampling of the fitted ML tree, reporting</w:t>
+      </w:r>
+      <w:r>
+        <w:t xml:space="preserve"> </w:t>
+      </w:r>
+      <w:r>
+        <w:t xml:space="preserve">internal-branch support and bootstrap topology-stability diagnostics in the</w:t>
+      </w:r>
+      <w:r>
+        <w:t xml:space="preserve"> </w:t>
+      </w:r>
+      <w:r>
+        <w:t xml:space="preserve">supplement. Our analyses were implemented</w:t>
+      </w:r>
+      <w:r>
+        <w:t xml:space="preserve"> </w:t>
+      </w:r>
+      <w:r>
+        <w:t xml:space="preserve">with R version 4.3.3</w:t>
+      </w:r>
+      <w:r>
+        <w:t xml:space="preserve"> </w:t>
+      </w:r>
+      <w:r>
+        <w:t xml:space="preserve">[22]</w:t>
+      </w:r>
+      <w:r>
+        <w:t xml:space="preserve"> </w:t>
+      </w:r>
+      <w:r>
+        <w:t xml:space="preserve">using the packages</w:t>
+      </w:r>
+      <w:r>
+        <w:t xml:space="preserve"> </w:t>
+      </w:r>
+      <w:r>
+        <w:rPr>
+          <w:rStyle w:val="VerbatimChar"/>
+        </w:rPr>
+        <w:t xml:space="preserve">phangorn</w:t>
+      </w:r>
+      <w:r>
+        <w:t xml:space="preserve"> </w:t>
+      </w:r>
+      <w:r>
+        <w:t xml:space="preserve">[15]</w:t>
+      </w:r>
+      <w:r>
+        <w:t xml:space="preserve"> </w:t>
+      </w:r>
+      <w:r>
+        <w:t xml:space="preserve">and</w:t>
+      </w:r>
+      <w:r>
+        <w:t xml:space="preserve"> </w:t>
+      </w:r>
+      <w:r>
+        <w:rPr>
+          <w:rStyle w:val="VerbatimChar"/>
+        </w:rPr>
+        <w:t xml:space="preserve">msa</w:t>
+      </w:r>
+      <w:r>
+        <w:t xml:space="preserve"> </w:t>
+      </w:r>
+      <w:r>
+        <w:t xml:space="preserve">[23]</w:t>
+      </w:r>
+      <w:r>
+        <w:t xml:space="preserve">.</w:t>
       </w:r>
     </w:p>
     <w:tbl>
@@ -991,7 +972,1795 @@
       <w:tr>
         <w:tc>
           <w:tcPr/>
-          <w:bookmarkStart w:id="24" w:name="fig-corr"/>
+          <w:bookmarkStart w:id="20" w:name="tbl-panel-summary"/>
+          <w:p>
+            <w:pPr>
+              <w:jc w:val="center"/>
+            </w:pPr>
+            <w:pPr>
+              <w:jc w:val="start"/>
+              <w:spacing w:before="200"/>
+              <w:pStyle w:val="ImageCaption"/>
+            </w:pPr>
+            <w:r>
+              <w:t xml:space="preserve">Table 1: Summary of the expert-selected H1N1/H3N2 analysis panel. Vaccine component status is defined as inclusion as a Fluzone component during the cohort-study vaccine seasons.</w:t>
+            </w:r>
+          </w:p>
+          <w:tbl xmlns:w="http://schemas.openxmlformats.org/wordprocessingml/2006/main" xmlns:r="http://schemas.openxmlformats.org/officeDocument/2006/relationships" xmlns:w14="http://schemas.microsoft.com/office/word/2010/wordml" xmlns:wp="http://schemas.openxmlformats.org/drawingml/2006/wordprocessingDrawing" xmlns:a="http://schemas.openxmlformats.org/drawingml/2006/main" xmlns:pic="http://schemas.openxmlformats.org/drawingml/2006/picture">
+            <w:tblPr>
+              <w:tblLayout w:type="fixed"/>
+              <w:jc w:val="center"/>
+              <w:tblLook w:firstRow="1" w:lastRow="0" w:firstColumn="0" w:lastColumn="0" w:noHBand="0" w:noVBand="1"/>
+            </w:tblPr>
+            <w:tblGrid>
+              <w:gridCol w:w="1218"/>
+              <w:gridCol w:w="1952"/>
+              <w:gridCol w:w="2575"/>
+              <w:gridCol w:w="1633"/>
+              <w:gridCol w:w="1499"/>
+              <w:gridCol w:w="1414"/>
+              <w:gridCol w:w="3052"/>
+              <w:gridCol w:w="2588"/>
+              <w:gridCol w:w="2624"/>
+              <w:gridCol w:w="2514"/>
+            </w:tblGrid>
+            <w:tr>
+              <w:trPr>
+                <w:trHeight w:val="617" w:hRule="auto"/>
+                <w:tblHeader/>
+              </w:trPr>
+              <w:tc>
+                <w:tcPr>
+                  <w:tcBorders>
+                    <w:bottom w:val="single" w:sz="12" w:space="0" w:color="666666"/>
+                    <w:top w:val="single" w:sz="12" w:space="0" w:color="666666"/>
+                    <w:left w:val="none" w:sz="0" w:space="0" w:color="000000"/>
+                    <w:right w:val="none" w:sz="0" w:space="0" w:color="000000"/>
+                  </w:tcBorders>
+                  <w:shd w:val="clear" w:color="auto" w:fill="FFFFFF"/>
+                  <w:tcMar>
+                    <w:top w:w="0" w:type="dxa"/>
+                    <w:bottom w:w="0" w:type="dxa"/>
+                    <w:left w:w="0" w:type="dxa"/>
+                    <w:right w:w="0" w:type="dxa"/>
+                  </w:tcMar>
+                  <w:vAlign w:val="center"/>
+                </w:tcPr>
+                <w:p>
+                  <w:pPr>
+                    <w:jc w:val="left"/>
+                    <w:pBdr>
+                      <w:bottom w:val="none" w:sz="0" w:space="0" w:color="000000"/>
+                      <w:top w:val="none" w:sz="0" w:space="0" w:color="000000"/>
+                      <w:left w:val="none" w:sz="0" w:space="0" w:color="000000"/>
+                      <w:right w:val="none" w:sz="0" w:space="0" w:color="000000"/>
+                    </w:pBdr>
+                    <w:spacing w:after="100" w:before="100" w:line="240"/>
+                    <w:ind w:left="100" w:right="100" w:firstLine="0" w:firstLineChars="0"/>
+                    <w:rPr>
+                      <w:rFonts w:ascii="Arial" w:hAnsi="Arial" w:eastAsia="Arial" w:cs="Arial"/>
+                      <w:i w:val="false"/>
+                      <w:b w:val="false"/>
+                      <w:u w:val="none"/>
+                      <w:strike w:val="false"/>
+                      <w:sz w:val="22"/>
+                      <w:szCs w:val="22"/>
+                      <w:color w:val="000000"/>
+                    </w:rPr>
+                  </w:pPr>
+                  <w:r xmlns:w="http://schemas.openxmlformats.org/wordprocessingml/2006/main" xmlns:wp="http://schemas.openxmlformats.org/drawingml/2006/wordprocessingDrawing" xmlns:r="http://schemas.openxmlformats.org/officeDocument/2006/relationships" xmlns:w14="http://schemas.microsoft.com/office/word/2010/wordml">
+                    <w:rPr>
+                      <w:rFonts w:ascii="Arial" w:hAnsi="Arial" w:eastAsia="Arial" w:cs="Arial"/>
+                      <w:i w:val="false"/>
+                      <w:b w:val="false"/>
+                      <w:u w:val="none"/>
+                      <w:strike w:val="false"/>
+                      <w:sz w:val="22"/>
+                      <w:szCs w:val="22"/>
+                      <w:color w:val="000000"/>
+                    </w:rPr>
+                    <w:t xml:space="preserve">Subtype</w:t>
+                  </w:r>
+                </w:p>
+              </w:tc>
+              <w:tc>
+                <w:tcPr>
+                  <w:tcBorders>
+                    <w:bottom w:val="single" w:sz="12" w:space="0" w:color="666666"/>
+                    <w:top w:val="single" w:sz="12" w:space="0" w:color="666666"/>
+                    <w:left w:val="none" w:sz="0" w:space="0" w:color="000000"/>
+                    <w:right w:val="none" w:sz="0" w:space="0" w:color="000000"/>
+                  </w:tcBorders>
+                  <w:shd w:val="clear" w:color="auto" w:fill="FFFFFF"/>
+                  <w:tcMar>
+                    <w:top w:w="0" w:type="dxa"/>
+                    <w:bottom w:w="0" w:type="dxa"/>
+                    <w:left w:w="0" w:type="dxa"/>
+                    <w:right w:w="0" w:type="dxa"/>
+                  </w:tcMar>
+                  <w:vAlign w:val="center"/>
+                </w:tcPr>
+                <w:p>
+                  <w:pPr>
+                    <w:jc w:val="right"/>
+                    <w:pBdr>
+                      <w:bottom w:val="none" w:sz="0" w:space="0" w:color="000000"/>
+                      <w:top w:val="none" w:sz="0" w:space="0" w:color="000000"/>
+                      <w:left w:val="none" w:sz="0" w:space="0" w:color="000000"/>
+                      <w:right w:val="none" w:sz="0" w:space="0" w:color="000000"/>
+                    </w:pBdr>
+                    <w:spacing w:after="100" w:before="100" w:line="240"/>
+                    <w:ind w:left="100" w:right="100" w:firstLine="0" w:firstLineChars="0"/>
+                    <w:rPr>
+                      <w:rFonts w:ascii="Arial" w:hAnsi="Arial" w:eastAsia="Arial" w:cs="Arial"/>
+                      <w:i w:val="false"/>
+                      <w:b w:val="false"/>
+                      <w:u w:val="none"/>
+                      <w:strike w:val="false"/>
+                      <w:sz w:val="22"/>
+                      <w:szCs w:val="22"/>
+                      <w:color w:val="000000"/>
+                    </w:rPr>
+                  </w:pPr>
+                  <w:r xmlns:w="http://schemas.openxmlformats.org/wordprocessingml/2006/main" xmlns:wp="http://schemas.openxmlformats.org/drawingml/2006/wordprocessingDrawing" xmlns:r="http://schemas.openxmlformats.org/officeDocument/2006/relationships" xmlns:w14="http://schemas.microsoft.com/office/word/2010/wordml">
+                    <w:rPr>
+                      <w:rFonts w:ascii="Arial" w:hAnsi="Arial" w:eastAsia="Arial" w:cs="Arial"/>
+                      <w:i w:val="false"/>
+                      <w:b w:val="false"/>
+                      <w:u w:val="none"/>
+                      <w:strike w:val="false"/>
+                      <w:sz w:val="22"/>
+                      <w:szCs w:val="22"/>
+                      <w:color w:val="000000"/>
+                    </w:rPr>
+                    <w:t xml:space="preserve">Included strains</w:t>
+                  </w:r>
+                </w:p>
+              </w:tc>
+              <w:tc>
+                <w:tcPr>
+                  <w:tcBorders>
+                    <w:bottom w:val="single" w:sz="12" w:space="0" w:color="666666"/>
+                    <w:top w:val="single" w:sz="12" w:space="0" w:color="666666"/>
+                    <w:left w:val="none" w:sz="0" w:space="0" w:color="000000"/>
+                    <w:right w:val="none" w:sz="0" w:space="0" w:color="000000"/>
+                  </w:tcBorders>
+                  <w:shd w:val="clear" w:color="auto" w:fill="FFFFFF"/>
+                  <w:tcMar>
+                    <w:top w:w="0" w:type="dxa"/>
+                    <w:bottom w:w="0" w:type="dxa"/>
+                    <w:left w:w="0" w:type="dxa"/>
+                    <w:right w:w="0" w:type="dxa"/>
+                  </w:tcMar>
+                  <w:vAlign w:val="center"/>
+                </w:tcPr>
+                <w:p>
+                  <w:pPr>
+                    <w:jc w:val="right"/>
+                    <w:pBdr>
+                      <w:bottom w:val="none" w:sz="0" w:space="0" w:color="000000"/>
+                      <w:top w:val="none" w:sz="0" w:space="0" w:color="000000"/>
+                      <w:left w:val="none" w:sz="0" w:space="0" w:color="000000"/>
+                      <w:right w:val="none" w:sz="0" w:space="0" w:color="000000"/>
+                    </w:pBdr>
+                    <w:spacing w:after="100" w:before="100" w:line="240"/>
+                    <w:ind w:left="100" w:right="100" w:firstLine="0" w:firstLineChars="0"/>
+                    <w:rPr>
+                      <w:rFonts w:ascii="Arial" w:hAnsi="Arial" w:eastAsia="Arial" w:cs="Arial"/>
+                      <w:i w:val="false"/>
+                      <w:b w:val="false"/>
+                      <w:u w:val="none"/>
+                      <w:strike w:val="false"/>
+                      <w:sz w:val="22"/>
+                      <w:szCs w:val="22"/>
+                      <w:color w:val="000000"/>
+                    </w:rPr>
+                  </w:pPr>
+                  <w:r xmlns:w="http://schemas.openxmlformats.org/wordprocessingml/2006/main" xmlns:wp="http://schemas.openxmlformats.org/drawingml/2006/wordprocessingDrawing" xmlns:r="http://schemas.openxmlformats.org/officeDocument/2006/relationships" xmlns:w14="http://schemas.microsoft.com/office/word/2010/wordml">
+                    <w:rPr>
+                      <w:rFonts w:ascii="Arial" w:hAnsi="Arial" w:eastAsia="Arial" w:cs="Arial"/>
+                      <w:i w:val="false"/>
+                      <w:b w:val="false"/>
+                      <w:u w:val="none"/>
+                      <w:strike w:val="false"/>
+                      <w:sz w:val="22"/>
+                      <w:szCs w:val="22"/>
+                      <w:color w:val="000000"/>
+                    </w:rPr>
+                    <w:t xml:space="preserve">Unique isolation years</w:t>
+                  </w:r>
+                </w:p>
+              </w:tc>
+              <w:tc>
+                <w:tcPr>
+                  <w:tcBorders>
+                    <w:bottom w:val="single" w:sz="12" w:space="0" w:color="666666"/>
+                    <w:top w:val="single" w:sz="12" w:space="0" w:color="666666"/>
+                    <w:left w:val="none" w:sz="0" w:space="0" w:color="000000"/>
+                    <w:right w:val="none" w:sz="0" w:space="0" w:color="000000"/>
+                  </w:tcBorders>
+                  <w:shd w:val="clear" w:color="auto" w:fill="FFFFFF"/>
+                  <w:tcMar>
+                    <w:top w:w="0" w:type="dxa"/>
+                    <w:bottom w:w="0" w:type="dxa"/>
+                    <w:left w:w="0" w:type="dxa"/>
+                    <w:right w:w="0" w:type="dxa"/>
+                  </w:tcMar>
+                  <w:vAlign w:val="center"/>
+                </w:tcPr>
+                <w:p>
+                  <w:pPr>
+                    <w:jc w:val="right"/>
+                    <w:pBdr>
+                      <w:bottom w:val="none" w:sz="0" w:space="0" w:color="000000"/>
+                      <w:top w:val="none" w:sz="0" w:space="0" w:color="000000"/>
+                      <w:left w:val="none" w:sz="0" w:space="0" w:color="000000"/>
+                      <w:right w:val="none" w:sz="0" w:space="0" w:color="000000"/>
+                    </w:pBdr>
+                    <w:spacing w:after="100" w:before="100" w:line="240"/>
+                    <w:ind w:left="100" w:right="100" w:firstLine="0" w:firstLineChars="0"/>
+                    <w:rPr>
+                      <w:rFonts w:ascii="Arial" w:hAnsi="Arial" w:eastAsia="Arial" w:cs="Arial"/>
+                      <w:i w:val="false"/>
+                      <w:b w:val="false"/>
+                      <w:u w:val="none"/>
+                      <w:strike w:val="false"/>
+                      <w:sz w:val="22"/>
+                      <w:szCs w:val="22"/>
+                      <w:color w:val="000000"/>
+                    </w:rPr>
+                  </w:pPr>
+                  <w:r xmlns:w="http://schemas.openxmlformats.org/wordprocessingml/2006/main" xmlns:wp="http://schemas.openxmlformats.org/drawingml/2006/wordprocessingDrawing" xmlns:r="http://schemas.openxmlformats.org/officeDocument/2006/relationships" xmlns:w14="http://schemas.microsoft.com/office/word/2010/wordml">
+                    <w:rPr>
+                      <w:rFonts w:ascii="Arial" w:hAnsi="Arial" w:eastAsia="Arial" w:cs="Arial"/>
+                      <w:i w:val="false"/>
+                      <w:b w:val="false"/>
+                      <w:u w:val="none"/>
+                      <w:strike w:val="false"/>
+                      <w:sz w:val="22"/>
+                      <w:szCs w:val="22"/>
+                      <w:color w:val="000000"/>
+                    </w:rPr>
+                    <w:t xml:space="preserve">Earliest year</w:t>
+                  </w:r>
+                </w:p>
+              </w:tc>
+              <w:tc>
+                <w:tcPr>
+                  <w:tcBorders>
+                    <w:bottom w:val="single" w:sz="12" w:space="0" w:color="666666"/>
+                    <w:top w:val="single" w:sz="12" w:space="0" w:color="666666"/>
+                    <w:left w:val="none" w:sz="0" w:space="0" w:color="000000"/>
+                    <w:right w:val="none" w:sz="0" w:space="0" w:color="000000"/>
+                  </w:tcBorders>
+                  <w:shd w:val="clear" w:color="auto" w:fill="FFFFFF"/>
+                  <w:tcMar>
+                    <w:top w:w="0" w:type="dxa"/>
+                    <w:bottom w:w="0" w:type="dxa"/>
+                    <w:left w:w="0" w:type="dxa"/>
+                    <w:right w:w="0" w:type="dxa"/>
+                  </w:tcMar>
+                  <w:vAlign w:val="center"/>
+                </w:tcPr>
+                <w:p>
+                  <w:pPr>
+                    <w:jc w:val="right"/>
+                    <w:pBdr>
+                      <w:bottom w:val="none" w:sz="0" w:space="0" w:color="000000"/>
+                      <w:top w:val="none" w:sz="0" w:space="0" w:color="000000"/>
+                      <w:left w:val="none" w:sz="0" w:space="0" w:color="000000"/>
+                      <w:right w:val="none" w:sz="0" w:space="0" w:color="000000"/>
+                    </w:pBdr>
+                    <w:spacing w:after="100" w:before="100" w:line="240"/>
+                    <w:ind w:left="100" w:right="100" w:firstLine="0" w:firstLineChars="0"/>
+                    <w:rPr>
+                      <w:rFonts w:ascii="Arial" w:hAnsi="Arial" w:eastAsia="Arial" w:cs="Arial"/>
+                      <w:i w:val="false"/>
+                      <w:b w:val="false"/>
+                      <w:u w:val="none"/>
+                      <w:strike w:val="false"/>
+                      <w:sz w:val="22"/>
+                      <w:szCs w:val="22"/>
+                      <w:color w:val="000000"/>
+                    </w:rPr>
+                  </w:pPr>
+                  <w:r xmlns:w="http://schemas.openxmlformats.org/wordprocessingml/2006/main" xmlns:wp="http://schemas.openxmlformats.org/drawingml/2006/wordprocessingDrawing" xmlns:r="http://schemas.openxmlformats.org/officeDocument/2006/relationships" xmlns:w14="http://schemas.microsoft.com/office/word/2010/wordml">
+                    <w:rPr>
+                      <w:rFonts w:ascii="Arial" w:hAnsi="Arial" w:eastAsia="Arial" w:cs="Arial"/>
+                      <w:i w:val="false"/>
+                      <w:b w:val="false"/>
+                      <w:u w:val="none"/>
+                      <w:strike w:val="false"/>
+                      <w:sz w:val="22"/>
+                      <w:szCs w:val="22"/>
+                      <w:color w:val="000000"/>
+                    </w:rPr>
+                    <w:t xml:space="preserve">Latest year</w:t>
+                  </w:r>
+                </w:p>
+              </w:tc>
+              <w:tc>
+                <w:tcPr>
+                  <w:tcBorders>
+                    <w:bottom w:val="single" w:sz="12" w:space="0" w:color="666666"/>
+                    <w:top w:val="single" w:sz="12" w:space="0" w:color="666666"/>
+                    <w:left w:val="none" w:sz="0" w:space="0" w:color="000000"/>
+                    <w:right w:val="none" w:sz="0" w:space="0" w:color="000000"/>
+                  </w:tcBorders>
+                  <w:shd w:val="clear" w:color="auto" w:fill="FFFFFF"/>
+                  <w:tcMar>
+                    <w:top w:w="0" w:type="dxa"/>
+                    <w:bottom w:w="0" w:type="dxa"/>
+                    <w:left w:w="0" w:type="dxa"/>
+                    <w:right w:w="0" w:type="dxa"/>
+                  </w:tcMar>
+                  <w:vAlign w:val="center"/>
+                </w:tcPr>
+                <w:p>
+                  <w:pPr>
+                    <w:jc w:val="right"/>
+                    <w:pBdr>
+                      <w:bottom w:val="none" w:sz="0" w:space="0" w:color="000000"/>
+                      <w:top w:val="none" w:sz="0" w:space="0" w:color="000000"/>
+                      <w:left w:val="none" w:sz="0" w:space="0" w:color="000000"/>
+                      <w:right w:val="none" w:sz="0" w:space="0" w:color="000000"/>
+                    </w:pBdr>
+                    <w:spacing w:after="100" w:before="100" w:line="240"/>
+                    <w:ind w:left="100" w:right="100" w:firstLine="0" w:firstLineChars="0"/>
+                    <w:rPr>
+                      <w:rFonts w:ascii="Arial" w:hAnsi="Arial" w:eastAsia="Arial" w:cs="Arial"/>
+                      <w:i w:val="false"/>
+                      <w:b w:val="false"/>
+                      <w:u w:val="none"/>
+                      <w:strike w:val="false"/>
+                      <w:sz w:val="22"/>
+                      <w:szCs w:val="22"/>
+                      <w:color w:val="000000"/>
+                    </w:rPr>
+                  </w:pPr>
+                  <w:r xmlns:w="http://schemas.openxmlformats.org/wordprocessingml/2006/main" xmlns:wp="http://schemas.openxmlformats.org/drawingml/2006/wordprocessingDrawing" xmlns:r="http://schemas.openxmlformats.org/officeDocument/2006/relationships" xmlns:w14="http://schemas.microsoft.com/office/word/2010/wordml">
+                    <w:rPr>
+                      <w:rFonts w:ascii="Arial" w:hAnsi="Arial" w:eastAsia="Arial" w:cs="Arial"/>
+                      <w:i w:val="false"/>
+                      <w:b w:val="false"/>
+                      <w:u w:val="none"/>
+                      <w:strike w:val="false"/>
+                      <w:sz w:val="22"/>
+                      <w:szCs w:val="22"/>
+                      <w:color w:val="000000"/>
+                    </w:rPr>
+                    <w:t xml:space="preserve">Year span</w:t>
+                  </w:r>
+                </w:p>
+              </w:tc>
+              <w:tc>
+                <w:tcPr>
+                  <w:tcBorders>
+                    <w:bottom w:val="single" w:sz="12" w:space="0" w:color="666666"/>
+                    <w:top w:val="single" w:sz="12" w:space="0" w:color="666666"/>
+                    <w:left w:val="none" w:sz="0" w:space="0" w:color="000000"/>
+                    <w:right w:val="none" w:sz="0" w:space="0" w:color="000000"/>
+                  </w:tcBorders>
+                  <w:shd w:val="clear" w:color="auto" w:fill="FFFFFF"/>
+                  <w:tcMar>
+                    <w:top w:w="0" w:type="dxa"/>
+                    <w:bottom w:w="0" w:type="dxa"/>
+                    <w:left w:w="0" w:type="dxa"/>
+                    <w:right w:w="0" w:type="dxa"/>
+                  </w:tcMar>
+                  <w:vAlign w:val="center"/>
+                </w:tcPr>
+                <w:p>
+                  <w:pPr>
+                    <w:jc w:val="left"/>
+                    <w:pBdr>
+                      <w:bottom w:val="none" w:sz="0" w:space="0" w:color="000000"/>
+                      <w:top w:val="none" w:sz="0" w:space="0" w:color="000000"/>
+                      <w:left w:val="none" w:sz="0" w:space="0" w:color="000000"/>
+                      <w:right w:val="none" w:sz="0" w:space="0" w:color="000000"/>
+                    </w:pBdr>
+                    <w:spacing w:after="100" w:before="100" w:line="240"/>
+                    <w:ind w:left="100" w:right="100" w:firstLine="0" w:firstLineChars="0"/>
+                    <w:rPr>
+                      <w:rFonts w:ascii="Arial" w:hAnsi="Arial" w:eastAsia="Arial" w:cs="Arial"/>
+                      <w:i w:val="false"/>
+                      <w:b w:val="false"/>
+                      <w:u w:val="none"/>
+                      <w:strike w:val="false"/>
+                      <w:sz w:val="22"/>
+                      <w:szCs w:val="22"/>
+                      <w:color w:val="000000"/>
+                    </w:rPr>
+                  </w:pPr>
+                  <w:r xmlns:w="http://schemas.openxmlformats.org/wordprocessingml/2006/main" xmlns:wp="http://schemas.openxmlformats.org/drawingml/2006/wordprocessingDrawing" xmlns:r="http://schemas.openxmlformats.org/officeDocument/2006/relationships" xmlns:w14="http://schemas.microsoft.com/office/word/2010/wordml">
+                    <w:rPr>
+                      <w:rFonts w:ascii="Arial" w:hAnsi="Arial" w:eastAsia="Arial" w:cs="Arial"/>
+                      <w:i w:val="false"/>
+                      <w:b w:val="false"/>
+                      <w:u w:val="none"/>
+                      <w:strike w:val="false"/>
+                      <w:sz w:val="22"/>
+                      <w:szCs w:val="22"/>
+                      <w:color w:val="000000"/>
+                    </w:rPr>
+                    <w:t xml:space="preserve">Vaccine component strains</w:t>
+                  </w:r>
+                </w:p>
+              </w:tc>
+              <w:tc>
+                <w:tcPr>
+                  <w:tcBorders>
+                    <w:bottom w:val="single" w:sz="12" w:space="0" w:color="666666"/>
+                    <w:top w:val="single" w:sz="12" w:space="0" w:color="666666"/>
+                    <w:left w:val="none" w:sz="0" w:space="0" w:color="000000"/>
+                    <w:right w:val="none" w:sz="0" w:space="0" w:color="000000"/>
+                  </w:tcBorders>
+                  <w:shd w:val="clear" w:color="auto" w:fill="FFFFFF"/>
+                  <w:tcMar>
+                    <w:top w:w="0" w:type="dxa"/>
+                    <w:bottom w:w="0" w:type="dxa"/>
+                    <w:left w:w="0" w:type="dxa"/>
+                    <w:right w:w="0" w:type="dxa"/>
+                  </w:tcMar>
+                  <w:vAlign w:val="center"/>
+                </w:tcPr>
+                <w:p>
+                  <w:pPr>
+                    <w:jc w:val="right"/>
+                    <w:pBdr>
+                      <w:bottom w:val="none" w:sz="0" w:space="0" w:color="000000"/>
+                      <w:top w:val="none" w:sz="0" w:space="0" w:color="000000"/>
+                      <w:left w:val="none" w:sz="0" w:space="0" w:color="000000"/>
+                      <w:right w:val="none" w:sz="0" w:space="0" w:color="000000"/>
+                    </w:pBdr>
+                    <w:spacing w:after="100" w:before="100" w:line="240"/>
+                    <w:ind w:left="100" w:right="100" w:firstLine="0" w:firstLineChars="0"/>
+                    <w:rPr>
+                      <w:rFonts w:ascii="Arial" w:hAnsi="Arial" w:eastAsia="Arial" w:cs="Arial"/>
+                      <w:i w:val="false"/>
+                      <w:b w:val="false"/>
+                      <w:u w:val="none"/>
+                      <w:strike w:val="false"/>
+                      <w:sz w:val="22"/>
+                      <w:szCs w:val="22"/>
+                      <w:color w:val="000000"/>
+                    </w:rPr>
+                  </w:pPr>
+                  <w:r xmlns:w="http://schemas.openxmlformats.org/wordprocessingml/2006/main" xmlns:wp="http://schemas.openxmlformats.org/drawingml/2006/wordprocessingDrawing" xmlns:r="http://schemas.openxmlformats.org/officeDocument/2006/relationships" xmlns:w14="http://schemas.microsoft.com/office/word/2010/wordml">
+                    <w:rPr>
+                      <w:rFonts w:ascii="Arial" w:hAnsi="Arial" w:eastAsia="Arial" w:cs="Arial"/>
+                      <w:i w:val="false"/>
+                      <w:b w:val="false"/>
+                      <w:u w:val="none"/>
+                      <w:strike w:val="false"/>
+                      <w:sz w:val="22"/>
+                      <w:szCs w:val="22"/>
+                      <w:color w:val="000000"/>
+                    </w:rPr>
+                    <w:t xml:space="preserve">Expected unique pairs</w:t>
+                  </w:r>
+                </w:p>
+              </w:tc>
+              <w:tc>
+                <w:tcPr>
+                  <w:tcBorders>
+                    <w:bottom w:val="single" w:sz="12" w:space="0" w:color="666666"/>
+                    <w:top w:val="single" w:sz="12" w:space="0" w:color="666666"/>
+                    <w:left w:val="none" w:sz="0" w:space="0" w:color="000000"/>
+                    <w:right w:val="none" w:sz="0" w:space="0" w:color="000000"/>
+                  </w:tcBorders>
+                  <w:shd w:val="clear" w:color="auto" w:fill="FFFFFF"/>
+                  <w:tcMar>
+                    <w:top w:w="0" w:type="dxa"/>
+                    <w:bottom w:w="0" w:type="dxa"/>
+                    <w:left w:w="0" w:type="dxa"/>
+                    <w:right w:w="0" w:type="dxa"/>
+                  </w:tcMar>
+                  <w:vAlign w:val="center"/>
+                </w:tcPr>
+                <w:p>
+                  <w:pPr>
+                    <w:jc w:val="left"/>
+                    <w:pBdr>
+                      <w:bottom w:val="none" w:sz="0" w:space="0" w:color="000000"/>
+                      <w:top w:val="none" w:sz="0" w:space="0" w:color="000000"/>
+                      <w:left w:val="none" w:sz="0" w:space="0" w:color="000000"/>
+                      <w:right w:val="none" w:sz="0" w:space="0" w:color="000000"/>
+                    </w:pBdr>
+                    <w:spacing w:after="100" w:before="100" w:line="240"/>
+                    <w:ind w:left="100" w:right="100" w:firstLine="0" w:firstLineChars="0"/>
+                    <w:rPr>
+                      <w:rFonts w:ascii="Arial" w:hAnsi="Arial" w:eastAsia="Arial" w:cs="Arial"/>
+                      <w:i w:val="false"/>
+                      <w:b w:val="false"/>
+                      <w:u w:val="none"/>
+                      <w:strike w:val="false"/>
+                      <w:sz w:val="22"/>
+                      <w:szCs w:val="22"/>
+                      <w:color w:val="000000"/>
+                    </w:rPr>
+                  </w:pPr>
+                  <w:r xmlns:w="http://schemas.openxmlformats.org/wordprocessingml/2006/main" xmlns:wp="http://schemas.openxmlformats.org/drawingml/2006/wordprocessingDrawing" xmlns:r="http://schemas.openxmlformats.org/officeDocument/2006/relationships" xmlns:w14="http://schemas.microsoft.com/office/word/2010/wordml">
+                    <w:rPr>
+                      <w:rFonts w:ascii="Arial" w:hAnsi="Arial" w:eastAsia="Arial" w:cs="Arial"/>
+                      <w:i w:val="false"/>
+                      <w:b w:val="false"/>
+                      <w:u w:val="none"/>
+                      <w:strike w:val="false"/>
+                      <w:sz w:val="22"/>
+                      <w:szCs w:val="22"/>
+                      <w:color w:val="000000"/>
+                    </w:rPr>
+                    <w:t xml:space="preserve">Observed unique pairs</w:t>
+                  </w:r>
+                </w:p>
+              </w:tc>
+              <w:tc>
+                <w:tcPr>
+                  <w:tcBorders>
+                    <w:bottom w:val="single" w:sz="12" w:space="0" w:color="666666"/>
+                    <w:top w:val="single" w:sz="12" w:space="0" w:color="666666"/>
+                    <w:left w:val="none" w:sz="0" w:space="0" w:color="000000"/>
+                    <w:right w:val="none" w:sz="0" w:space="0" w:color="000000"/>
+                  </w:tcBorders>
+                  <w:shd w:val="clear" w:color="auto" w:fill="FFFFFF"/>
+                  <w:tcMar>
+                    <w:top w:w="0" w:type="dxa"/>
+                    <w:bottom w:w="0" w:type="dxa"/>
+                    <w:left w:w="0" w:type="dxa"/>
+                    <w:right w:w="0" w:type="dxa"/>
+                  </w:tcMar>
+                  <w:vAlign w:val="center"/>
+                </w:tcPr>
+                <w:p>
+                  <w:pPr>
+                    <w:jc w:val="left"/>
+                    <w:pBdr>
+                      <w:bottom w:val="none" w:sz="0" w:space="0" w:color="000000"/>
+                      <w:top w:val="none" w:sz="0" w:space="0" w:color="000000"/>
+                      <w:left w:val="none" w:sz="0" w:space="0" w:color="000000"/>
+                      <w:right w:val="none" w:sz="0" w:space="0" w:color="000000"/>
+                    </w:pBdr>
+                    <w:spacing w:after="100" w:before="100" w:line="240"/>
+                    <w:ind w:left="100" w:right="100" w:firstLine="0" w:firstLineChars="0"/>
+                    <w:rPr>
+                      <w:rFonts w:ascii="Arial" w:hAnsi="Arial" w:eastAsia="Arial" w:cs="Arial"/>
+                      <w:i w:val="false"/>
+                      <w:b w:val="false"/>
+                      <w:u w:val="none"/>
+                      <w:strike w:val="false"/>
+                      <w:sz w:val="22"/>
+                      <w:szCs w:val="22"/>
+                      <w:color w:val="000000"/>
+                    </w:rPr>
+                  </w:pPr>
+                  <w:r xmlns:w="http://schemas.openxmlformats.org/wordprocessingml/2006/main" xmlns:wp="http://schemas.openxmlformats.org/drawingml/2006/wordprocessingDrawing" xmlns:r="http://schemas.openxmlformats.org/officeDocument/2006/relationships" xmlns:w14="http://schemas.microsoft.com/office/word/2010/wordml">
+                    <w:rPr>
+                      <w:rFonts w:ascii="Arial" w:hAnsi="Arial" w:eastAsia="Arial" w:cs="Arial"/>
+                      <w:i w:val="false"/>
+                      <w:b w:val="false"/>
+                      <w:u w:val="none"/>
+                      <w:strike w:val="false"/>
+                      <w:sz w:val="22"/>
+                      <w:szCs w:val="22"/>
+                      <w:color w:val="000000"/>
+                    </w:rPr>
+                    <w:t xml:space="preserve">All methods complete</w:t>
+                  </w:r>
+                </w:p>
+              </w:tc>
+            </w:tr>
+            <w:tr>
+              <w:trPr>
+                <w:trHeight w:val="617" w:hRule="auto"/>
+              </w:trPr>
+              <w:tc>
+                <w:tcPr>
+                  <w:tcBorders>
+                    <w:bottom w:val="none" w:sz="0" w:space="0" w:color="000000"/>
+                    <w:top w:val="single" w:sz="12" w:space="0" w:color="666666"/>
+                    <w:left w:val="none" w:sz="0" w:space="0" w:color="000000"/>
+                    <w:right w:val="none" w:sz="0" w:space="0" w:color="000000"/>
+                  </w:tcBorders>
+                  <w:shd w:val="clear" w:color="auto" w:fill="FFFFFF"/>
+                  <w:tcMar>
+                    <w:top w:w="0" w:type="dxa"/>
+                    <w:bottom w:w="0" w:type="dxa"/>
+                    <w:left w:w="0" w:type="dxa"/>
+                    <w:right w:w="0" w:type="dxa"/>
+                  </w:tcMar>
+                  <w:vAlign w:val="center"/>
+                </w:tcPr>
+                <w:p>
+                  <w:pPr>
+                    <w:jc w:val="left"/>
+                    <w:pBdr>
+                      <w:bottom w:val="none" w:sz="0" w:space="0" w:color="000000"/>
+                      <w:top w:val="none" w:sz="0" w:space="0" w:color="000000"/>
+                      <w:left w:val="none" w:sz="0" w:space="0" w:color="000000"/>
+                      <w:right w:val="none" w:sz="0" w:space="0" w:color="000000"/>
+                    </w:pBdr>
+                    <w:spacing w:after="100" w:before="100" w:line="240"/>
+                    <w:ind w:left="100" w:right="100" w:firstLine="0" w:firstLineChars="0"/>
+                    <w:rPr>
+                      <w:rFonts w:ascii="Arial" w:hAnsi="Arial" w:eastAsia="Arial" w:cs="Arial"/>
+                      <w:i w:val="false"/>
+                      <w:b w:val="false"/>
+                      <w:u w:val="none"/>
+                      <w:strike w:val="false"/>
+                      <w:sz w:val="22"/>
+                      <w:szCs w:val="22"/>
+                      <w:color w:val="000000"/>
+                    </w:rPr>
+                  </w:pPr>
+                  <w:r xmlns:w="http://schemas.openxmlformats.org/wordprocessingml/2006/main" xmlns:wp="http://schemas.openxmlformats.org/drawingml/2006/wordprocessingDrawing" xmlns:r="http://schemas.openxmlformats.org/officeDocument/2006/relationships" xmlns:w14="http://schemas.microsoft.com/office/word/2010/wordml">
+                    <w:rPr>
+                      <w:rFonts w:ascii="Arial" w:hAnsi="Arial" w:eastAsia="Arial" w:cs="Arial"/>
+                      <w:i w:val="false"/>
+                      <w:b w:val="false"/>
+                      <w:u w:val="none"/>
+                      <w:strike w:val="false"/>
+                      <w:sz w:val="22"/>
+                      <w:szCs w:val="22"/>
+                      <w:color w:val="000000"/>
+                    </w:rPr>
+                    <w:t xml:space="preserve">H1N1</w:t>
+                  </w:r>
+                </w:p>
+              </w:tc>
+              <w:tc>
+                <w:tcPr>
+                  <w:tcBorders>
+                    <w:bottom w:val="none" w:sz="0" w:space="0" w:color="000000"/>
+                    <w:top w:val="single" w:sz="12" w:space="0" w:color="666666"/>
+                    <w:left w:val="none" w:sz="0" w:space="0" w:color="000000"/>
+                    <w:right w:val="none" w:sz="0" w:space="0" w:color="000000"/>
+                  </w:tcBorders>
+                  <w:shd w:val="clear" w:color="auto" w:fill="FFFFFF"/>
+                  <w:tcMar>
+                    <w:top w:w="0" w:type="dxa"/>
+                    <w:bottom w:w="0" w:type="dxa"/>
+                    <w:left w:w="0" w:type="dxa"/>
+                    <w:right w:w="0" w:type="dxa"/>
+                  </w:tcMar>
+                  <w:vAlign w:val="center"/>
+                </w:tcPr>
+                <w:p>
+                  <w:pPr>
+                    <w:jc w:val="right"/>
+                    <w:pBdr>
+                      <w:bottom w:val="none" w:sz="0" w:space="0" w:color="000000"/>
+                      <w:top w:val="none" w:sz="0" w:space="0" w:color="000000"/>
+                      <w:left w:val="none" w:sz="0" w:space="0" w:color="000000"/>
+                      <w:right w:val="none" w:sz="0" w:space="0" w:color="000000"/>
+                    </w:pBdr>
+                    <w:spacing w:after="100" w:before="100" w:line="240"/>
+                    <w:ind w:left="100" w:right="100" w:firstLine="0" w:firstLineChars="0"/>
+                    <w:rPr>
+                      <w:rFonts w:ascii="Arial" w:hAnsi="Arial" w:eastAsia="Arial" w:cs="Arial"/>
+                      <w:i w:val="false"/>
+                      <w:b w:val="false"/>
+                      <w:u w:val="none"/>
+                      <w:strike w:val="false"/>
+                      <w:sz w:val="22"/>
+                      <w:szCs w:val="22"/>
+                      <w:color w:val="000000"/>
+                    </w:rPr>
+                  </w:pPr>
+                  <w:r xmlns:w="http://schemas.openxmlformats.org/wordprocessingml/2006/main" xmlns:wp="http://schemas.openxmlformats.org/drawingml/2006/wordprocessingDrawing" xmlns:r="http://schemas.openxmlformats.org/officeDocument/2006/relationships" xmlns:w14="http://schemas.microsoft.com/office/word/2010/wordml">
+                    <w:rPr>
+                      <w:rFonts w:ascii="Arial" w:hAnsi="Arial" w:eastAsia="Arial" w:cs="Arial"/>
+                      <w:i w:val="false"/>
+                      <w:b w:val="false"/>
+                      <w:u w:val="none"/>
+                      <w:strike w:val="false"/>
+                      <w:sz w:val="22"/>
+                      <w:szCs w:val="22"/>
+                      <w:color w:val="000000"/>
+                    </w:rPr>
+                    <w:t xml:space="preserve">18</w:t>
+                  </w:r>
+                </w:p>
+              </w:tc>
+              <w:tc>
+                <w:tcPr>
+                  <w:tcBorders>
+                    <w:bottom w:val="none" w:sz="0" w:space="0" w:color="000000"/>
+                    <w:top w:val="single" w:sz="12" w:space="0" w:color="666666"/>
+                    <w:left w:val="none" w:sz="0" w:space="0" w:color="000000"/>
+                    <w:right w:val="none" w:sz="0" w:space="0" w:color="000000"/>
+                  </w:tcBorders>
+                  <w:shd w:val="clear" w:color="auto" w:fill="FFFFFF"/>
+                  <w:tcMar>
+                    <w:top w:w="0" w:type="dxa"/>
+                    <w:bottom w:w="0" w:type="dxa"/>
+                    <w:left w:w="0" w:type="dxa"/>
+                    <w:right w:w="0" w:type="dxa"/>
+                  </w:tcMar>
+                  <w:vAlign w:val="center"/>
+                </w:tcPr>
+                <w:p>
+                  <w:pPr>
+                    <w:jc w:val="right"/>
+                    <w:pBdr>
+                      <w:bottom w:val="none" w:sz="0" w:space="0" w:color="000000"/>
+                      <w:top w:val="none" w:sz="0" w:space="0" w:color="000000"/>
+                      <w:left w:val="none" w:sz="0" w:space="0" w:color="000000"/>
+                      <w:right w:val="none" w:sz="0" w:space="0" w:color="000000"/>
+                    </w:pBdr>
+                    <w:spacing w:after="100" w:before="100" w:line="240"/>
+                    <w:ind w:left="100" w:right="100" w:firstLine="0" w:firstLineChars="0"/>
+                    <w:rPr>
+                      <w:rFonts w:ascii="Arial" w:hAnsi="Arial" w:eastAsia="Arial" w:cs="Arial"/>
+                      <w:i w:val="false"/>
+                      <w:b w:val="false"/>
+                      <w:u w:val="none"/>
+                      <w:strike w:val="false"/>
+                      <w:sz w:val="22"/>
+                      <w:szCs w:val="22"/>
+                      <w:color w:val="000000"/>
+                    </w:rPr>
+                  </w:pPr>
+                  <w:r xmlns:w="http://schemas.openxmlformats.org/wordprocessingml/2006/main" xmlns:wp="http://schemas.openxmlformats.org/drawingml/2006/wordprocessingDrawing" xmlns:r="http://schemas.openxmlformats.org/officeDocument/2006/relationships" xmlns:w14="http://schemas.microsoft.com/office/word/2010/wordml">
+                    <w:rPr>
+                      <w:rFonts w:ascii="Arial" w:hAnsi="Arial" w:eastAsia="Arial" w:cs="Arial"/>
+                      <w:i w:val="false"/>
+                      <w:b w:val="false"/>
+                      <w:u w:val="none"/>
+                      <w:strike w:val="false"/>
+                      <w:sz w:val="22"/>
+                      <w:szCs w:val="22"/>
+                      <w:color w:val="000000"/>
+                    </w:rPr>
+                    <w:t xml:space="preserve">17</w:t>
+                  </w:r>
+                </w:p>
+              </w:tc>
+              <w:tc>
+                <w:tcPr>
+                  <w:tcBorders>
+                    <w:bottom w:val="none" w:sz="0" w:space="0" w:color="000000"/>
+                    <w:top w:val="single" w:sz="12" w:space="0" w:color="666666"/>
+                    <w:left w:val="none" w:sz="0" w:space="0" w:color="000000"/>
+                    <w:right w:val="none" w:sz="0" w:space="0" w:color="000000"/>
+                  </w:tcBorders>
+                  <w:shd w:val="clear" w:color="auto" w:fill="FFFFFF"/>
+                  <w:tcMar>
+                    <w:top w:w="0" w:type="dxa"/>
+                    <w:bottom w:w="0" w:type="dxa"/>
+                    <w:left w:w="0" w:type="dxa"/>
+                    <w:right w:w="0" w:type="dxa"/>
+                  </w:tcMar>
+                  <w:vAlign w:val="center"/>
+                </w:tcPr>
+                <w:p>
+                  <w:pPr>
+                    <w:jc w:val="right"/>
+                    <w:pBdr>
+                      <w:bottom w:val="none" w:sz="0" w:space="0" w:color="000000"/>
+                      <w:top w:val="none" w:sz="0" w:space="0" w:color="000000"/>
+                      <w:left w:val="none" w:sz="0" w:space="0" w:color="000000"/>
+                      <w:right w:val="none" w:sz="0" w:space="0" w:color="000000"/>
+                    </w:pBdr>
+                    <w:spacing w:after="100" w:before="100" w:line="240"/>
+                    <w:ind w:left="100" w:right="100" w:firstLine="0" w:firstLineChars="0"/>
+                    <w:rPr>
+                      <w:rFonts w:ascii="Arial" w:hAnsi="Arial" w:eastAsia="Arial" w:cs="Arial"/>
+                      <w:i w:val="false"/>
+                      <w:b w:val="false"/>
+                      <w:u w:val="none"/>
+                      <w:strike w:val="false"/>
+                      <w:sz w:val="22"/>
+                      <w:szCs w:val="22"/>
+                      <w:color w:val="000000"/>
+                    </w:rPr>
+                  </w:pPr>
+                  <w:r xmlns:w="http://schemas.openxmlformats.org/wordprocessingml/2006/main" xmlns:wp="http://schemas.openxmlformats.org/drawingml/2006/wordprocessingDrawing" xmlns:r="http://schemas.openxmlformats.org/officeDocument/2006/relationships" xmlns:w14="http://schemas.microsoft.com/office/word/2010/wordml">
+                    <w:rPr>
+                      <w:rFonts w:ascii="Arial" w:hAnsi="Arial" w:eastAsia="Arial" w:cs="Arial"/>
+                      <w:i w:val="false"/>
+                      <w:b w:val="false"/>
+                      <w:u w:val="none"/>
+                      <w:strike w:val="false"/>
+                      <w:sz w:val="22"/>
+                      <w:szCs w:val="22"/>
+                      <w:color w:val="000000"/>
+                    </w:rPr>
+                    <w:t xml:space="preserve">1,918</w:t>
+                  </w:r>
+                </w:p>
+              </w:tc>
+              <w:tc>
+                <w:tcPr>
+                  <w:tcBorders>
+                    <w:bottom w:val="none" w:sz="0" w:space="0" w:color="000000"/>
+                    <w:top w:val="single" w:sz="12" w:space="0" w:color="666666"/>
+                    <w:left w:val="none" w:sz="0" w:space="0" w:color="000000"/>
+                    <w:right w:val="none" w:sz="0" w:space="0" w:color="000000"/>
+                  </w:tcBorders>
+                  <w:shd w:val="clear" w:color="auto" w:fill="FFFFFF"/>
+                  <w:tcMar>
+                    <w:top w:w="0" w:type="dxa"/>
+                    <w:bottom w:w="0" w:type="dxa"/>
+                    <w:left w:w="0" w:type="dxa"/>
+                    <w:right w:w="0" w:type="dxa"/>
+                  </w:tcMar>
+                  <w:vAlign w:val="center"/>
+                </w:tcPr>
+                <w:p>
+                  <w:pPr>
+                    <w:jc w:val="right"/>
+                    <w:pBdr>
+                      <w:bottom w:val="none" w:sz="0" w:space="0" w:color="000000"/>
+                      <w:top w:val="none" w:sz="0" w:space="0" w:color="000000"/>
+                      <w:left w:val="none" w:sz="0" w:space="0" w:color="000000"/>
+                      <w:right w:val="none" w:sz="0" w:space="0" w:color="000000"/>
+                    </w:pBdr>
+                    <w:spacing w:after="100" w:before="100" w:line="240"/>
+                    <w:ind w:left="100" w:right="100" w:firstLine="0" w:firstLineChars="0"/>
+                    <w:rPr>
+                      <w:rFonts w:ascii="Arial" w:hAnsi="Arial" w:eastAsia="Arial" w:cs="Arial"/>
+                      <w:i w:val="false"/>
+                      <w:b w:val="false"/>
+                      <w:u w:val="none"/>
+                      <w:strike w:val="false"/>
+                      <w:sz w:val="22"/>
+                      <w:szCs w:val="22"/>
+                      <w:color w:val="000000"/>
+                    </w:rPr>
+                  </w:pPr>
+                  <w:r xmlns:w="http://schemas.openxmlformats.org/wordprocessingml/2006/main" xmlns:wp="http://schemas.openxmlformats.org/drawingml/2006/wordprocessingDrawing" xmlns:r="http://schemas.openxmlformats.org/officeDocument/2006/relationships" xmlns:w14="http://schemas.microsoft.com/office/word/2010/wordml">
+                    <w:rPr>
+                      <w:rFonts w:ascii="Arial" w:hAnsi="Arial" w:eastAsia="Arial" w:cs="Arial"/>
+                      <w:i w:val="false"/>
+                      <w:b w:val="false"/>
+                      <w:u w:val="none"/>
+                      <w:strike w:val="false"/>
+                      <w:sz w:val="22"/>
+                      <w:szCs w:val="22"/>
+                      <w:color w:val="000000"/>
+                    </w:rPr>
+                    <w:t xml:space="preserve">2,018</w:t>
+                  </w:r>
+                </w:p>
+              </w:tc>
+              <w:tc>
+                <w:tcPr>
+                  <w:tcBorders>
+                    <w:bottom w:val="none" w:sz="0" w:space="0" w:color="000000"/>
+                    <w:top w:val="single" w:sz="12" w:space="0" w:color="666666"/>
+                    <w:left w:val="none" w:sz="0" w:space="0" w:color="000000"/>
+                    <w:right w:val="none" w:sz="0" w:space="0" w:color="000000"/>
+                  </w:tcBorders>
+                  <w:shd w:val="clear" w:color="auto" w:fill="FFFFFF"/>
+                  <w:tcMar>
+                    <w:top w:w="0" w:type="dxa"/>
+                    <w:bottom w:w="0" w:type="dxa"/>
+                    <w:left w:w="0" w:type="dxa"/>
+                    <w:right w:w="0" w:type="dxa"/>
+                  </w:tcMar>
+                  <w:vAlign w:val="center"/>
+                </w:tcPr>
+                <w:p>
+                  <w:pPr>
+                    <w:jc w:val="right"/>
+                    <w:pBdr>
+                      <w:bottom w:val="none" w:sz="0" w:space="0" w:color="000000"/>
+                      <w:top w:val="none" w:sz="0" w:space="0" w:color="000000"/>
+                      <w:left w:val="none" w:sz="0" w:space="0" w:color="000000"/>
+                      <w:right w:val="none" w:sz="0" w:space="0" w:color="000000"/>
+                    </w:pBdr>
+                    <w:spacing w:after="100" w:before="100" w:line="240"/>
+                    <w:ind w:left="100" w:right="100" w:firstLine="0" w:firstLineChars="0"/>
+                    <w:rPr>
+                      <w:rFonts w:ascii="Arial" w:hAnsi="Arial" w:eastAsia="Arial" w:cs="Arial"/>
+                      <w:i w:val="false"/>
+                      <w:b w:val="false"/>
+                      <w:u w:val="none"/>
+                      <w:strike w:val="false"/>
+                      <w:sz w:val="22"/>
+                      <w:szCs w:val="22"/>
+                      <w:color w:val="000000"/>
+                    </w:rPr>
+                  </w:pPr>
+                  <w:r xmlns:w="http://schemas.openxmlformats.org/wordprocessingml/2006/main" xmlns:wp="http://schemas.openxmlformats.org/drawingml/2006/wordprocessingDrawing" xmlns:r="http://schemas.openxmlformats.org/officeDocument/2006/relationships" xmlns:w14="http://schemas.microsoft.com/office/word/2010/wordml">
+                    <w:rPr>
+                      <w:rFonts w:ascii="Arial" w:hAnsi="Arial" w:eastAsia="Arial" w:cs="Arial"/>
+                      <w:i w:val="false"/>
+                      <w:b w:val="false"/>
+                      <w:u w:val="none"/>
+                      <w:strike w:val="false"/>
+                      <w:sz w:val="22"/>
+                      <w:szCs w:val="22"/>
+                      <w:color w:val="000000"/>
+                    </w:rPr>
+                    <w:t xml:space="preserve">100</w:t>
+                  </w:r>
+                </w:p>
+              </w:tc>
+              <w:tc>
+                <w:tcPr>
+                  <w:tcBorders>
+                    <w:bottom w:val="none" w:sz="0" w:space="0" w:color="000000"/>
+                    <w:top w:val="single" w:sz="12" w:space="0" w:color="666666"/>
+                    <w:left w:val="none" w:sz="0" w:space="0" w:color="000000"/>
+                    <w:right w:val="none" w:sz="0" w:space="0" w:color="000000"/>
+                  </w:tcBorders>
+                  <w:shd w:val="clear" w:color="auto" w:fill="FFFFFF"/>
+                  <w:tcMar>
+                    <w:top w:w="0" w:type="dxa"/>
+                    <w:bottom w:w="0" w:type="dxa"/>
+                    <w:left w:w="0" w:type="dxa"/>
+                    <w:right w:w="0" w:type="dxa"/>
+                  </w:tcMar>
+                  <w:vAlign w:val="center"/>
+                </w:tcPr>
+                <w:p>
+                  <w:pPr>
+                    <w:jc w:val="left"/>
+                    <w:pBdr>
+                      <w:bottom w:val="none" w:sz="0" w:space="0" w:color="000000"/>
+                      <w:top w:val="none" w:sz="0" w:space="0" w:color="000000"/>
+                      <w:left w:val="none" w:sz="0" w:space="0" w:color="000000"/>
+                      <w:right w:val="none" w:sz="0" w:space="0" w:color="000000"/>
+                    </w:pBdr>
+                    <w:spacing w:after="100" w:before="100" w:line="240"/>
+                    <w:ind w:left="100" w:right="100" w:firstLine="0" w:firstLineChars="0"/>
+                    <w:rPr>
+                      <w:rFonts w:ascii="Arial" w:hAnsi="Arial" w:eastAsia="Arial" w:cs="Arial"/>
+                      <w:i w:val="false"/>
+                      <w:b w:val="false"/>
+                      <w:u w:val="none"/>
+                      <w:strike w:val="false"/>
+                      <w:sz w:val="22"/>
+                      <w:szCs w:val="22"/>
+                      <w:color w:val="000000"/>
+                    </w:rPr>
+                  </w:pPr>
+                  <w:r xmlns:w="http://schemas.openxmlformats.org/wordprocessingml/2006/main" xmlns:wp="http://schemas.openxmlformats.org/drawingml/2006/wordprocessingDrawing" xmlns:r="http://schemas.openxmlformats.org/officeDocument/2006/relationships" xmlns:w14="http://schemas.microsoft.com/office/word/2010/wordml">
+                    <w:rPr>
+                      <w:rFonts w:ascii="Arial" w:hAnsi="Arial" w:eastAsia="Arial" w:cs="Arial"/>
+                      <w:i w:val="false"/>
+                      <w:b w:val="false"/>
+                      <w:u w:val="none"/>
+                      <w:strike w:val="false"/>
+                      <w:sz w:val="22"/>
+                      <w:szCs w:val="22"/>
+                      <w:color w:val="000000"/>
+                    </w:rPr>
+                    <w:t xml:space="preserve">3 (16.7%)</w:t>
+                  </w:r>
+                </w:p>
+              </w:tc>
+              <w:tc>
+                <w:tcPr>
+                  <w:tcBorders>
+                    <w:bottom w:val="none" w:sz="0" w:space="0" w:color="000000"/>
+                    <w:top w:val="single" w:sz="12" w:space="0" w:color="666666"/>
+                    <w:left w:val="none" w:sz="0" w:space="0" w:color="000000"/>
+                    <w:right w:val="none" w:sz="0" w:space="0" w:color="000000"/>
+                  </w:tcBorders>
+                  <w:shd w:val="clear" w:color="auto" w:fill="FFFFFF"/>
+                  <w:tcMar>
+                    <w:top w:w="0" w:type="dxa"/>
+                    <w:bottom w:w="0" w:type="dxa"/>
+                    <w:left w:w="0" w:type="dxa"/>
+                    <w:right w:w="0" w:type="dxa"/>
+                  </w:tcMar>
+                  <w:vAlign w:val="center"/>
+                </w:tcPr>
+                <w:p>
+                  <w:pPr>
+                    <w:jc w:val="right"/>
+                    <w:pBdr>
+                      <w:bottom w:val="none" w:sz="0" w:space="0" w:color="000000"/>
+                      <w:top w:val="none" w:sz="0" w:space="0" w:color="000000"/>
+                      <w:left w:val="none" w:sz="0" w:space="0" w:color="000000"/>
+                      <w:right w:val="none" w:sz="0" w:space="0" w:color="000000"/>
+                    </w:pBdr>
+                    <w:spacing w:after="100" w:before="100" w:line="240"/>
+                    <w:ind w:left="100" w:right="100" w:firstLine="0" w:firstLineChars="0"/>
+                    <w:rPr>
+                      <w:rFonts w:ascii="Arial" w:hAnsi="Arial" w:eastAsia="Arial" w:cs="Arial"/>
+                      <w:i w:val="false"/>
+                      <w:b w:val="false"/>
+                      <w:u w:val="none"/>
+                      <w:strike w:val="false"/>
+                      <w:sz w:val="22"/>
+                      <w:szCs w:val="22"/>
+                      <w:color w:val="000000"/>
+                    </w:rPr>
+                  </w:pPr>
+                  <w:r xmlns:w="http://schemas.openxmlformats.org/wordprocessingml/2006/main" xmlns:wp="http://schemas.openxmlformats.org/drawingml/2006/wordprocessingDrawing" xmlns:r="http://schemas.openxmlformats.org/officeDocument/2006/relationships" xmlns:w14="http://schemas.microsoft.com/office/word/2010/wordml">
+                    <w:rPr>
+                      <w:rFonts w:ascii="Arial" w:hAnsi="Arial" w:eastAsia="Arial" w:cs="Arial"/>
+                      <w:i w:val="false"/>
+                      <w:b w:val="false"/>
+                      <w:u w:val="none"/>
+                      <w:strike w:val="false"/>
+                      <w:sz w:val="22"/>
+                      <w:szCs w:val="22"/>
+                      <w:color w:val="000000"/>
+                    </w:rPr>
+                    <w:t xml:space="preserve">153</w:t>
+                  </w:r>
+                </w:p>
+              </w:tc>
+              <w:tc>
+                <w:tcPr>
+                  <w:tcBorders>
+                    <w:bottom w:val="none" w:sz="0" w:space="0" w:color="000000"/>
+                    <w:top w:val="single" w:sz="12" w:space="0" w:color="666666"/>
+                    <w:left w:val="none" w:sz="0" w:space="0" w:color="000000"/>
+                    <w:right w:val="none" w:sz="0" w:space="0" w:color="000000"/>
+                  </w:tcBorders>
+                  <w:shd w:val="clear" w:color="auto" w:fill="FFFFFF"/>
+                  <w:tcMar>
+                    <w:top w:w="0" w:type="dxa"/>
+                    <w:bottom w:w="0" w:type="dxa"/>
+                    <w:left w:w="0" w:type="dxa"/>
+                    <w:right w:w="0" w:type="dxa"/>
+                  </w:tcMar>
+                  <w:vAlign w:val="center"/>
+                </w:tcPr>
+                <w:p>
+                  <w:pPr>
+                    <w:jc w:val="left"/>
+                    <w:pBdr>
+                      <w:bottom w:val="none" w:sz="0" w:space="0" w:color="000000"/>
+                      <w:top w:val="none" w:sz="0" w:space="0" w:color="000000"/>
+                      <w:left w:val="none" w:sz="0" w:space="0" w:color="000000"/>
+                      <w:right w:val="none" w:sz="0" w:space="0" w:color="000000"/>
+                    </w:pBdr>
+                    <w:spacing w:after="100" w:before="100" w:line="240"/>
+                    <w:ind w:left="100" w:right="100" w:firstLine="0" w:firstLineChars="0"/>
+                    <w:rPr>
+                      <w:rFonts w:ascii="Arial" w:hAnsi="Arial" w:eastAsia="Arial" w:cs="Arial"/>
+                      <w:i w:val="false"/>
+                      <w:b w:val="false"/>
+                      <w:u w:val="none"/>
+                      <w:strike w:val="false"/>
+                      <w:sz w:val="22"/>
+                      <w:szCs w:val="22"/>
+                      <w:color w:val="000000"/>
+                    </w:rPr>
+                  </w:pPr>
+                  <w:r xmlns:w="http://schemas.openxmlformats.org/wordprocessingml/2006/main" xmlns:wp="http://schemas.openxmlformats.org/drawingml/2006/wordprocessingDrawing" xmlns:r="http://schemas.openxmlformats.org/officeDocument/2006/relationships" xmlns:w14="http://schemas.microsoft.com/office/word/2010/wordml">
+                    <w:rPr>
+                      <w:rFonts w:ascii="Arial" w:hAnsi="Arial" w:eastAsia="Arial" w:cs="Arial"/>
+                      <w:i w:val="false"/>
+                      <w:b w:val="false"/>
+                      <w:u w:val="none"/>
+                      <w:strike w:val="false"/>
+                      <w:sz w:val="22"/>
+                      <w:szCs w:val="22"/>
+                      <w:color w:val="000000"/>
+                    </w:rPr>
+                    <w:t xml:space="preserve">153</w:t>
+                  </w:r>
+                </w:p>
+              </w:tc>
+              <w:tc>
+                <w:tcPr>
+                  <w:tcBorders>
+                    <w:bottom w:val="none" w:sz="0" w:space="0" w:color="000000"/>
+                    <w:top w:val="single" w:sz="12" w:space="0" w:color="666666"/>
+                    <w:left w:val="none" w:sz="0" w:space="0" w:color="000000"/>
+                    <w:right w:val="none" w:sz="0" w:space="0" w:color="000000"/>
+                  </w:tcBorders>
+                  <w:shd w:val="clear" w:color="auto" w:fill="FFFFFF"/>
+                  <w:tcMar>
+                    <w:top w:w="0" w:type="dxa"/>
+                    <w:bottom w:w="0" w:type="dxa"/>
+                    <w:left w:w="0" w:type="dxa"/>
+                    <w:right w:w="0" w:type="dxa"/>
+                  </w:tcMar>
+                  <w:vAlign w:val="center"/>
+                </w:tcPr>
+                <w:p>
+                  <w:pPr>
+                    <w:jc w:val="left"/>
+                    <w:pBdr>
+                      <w:bottom w:val="none" w:sz="0" w:space="0" w:color="000000"/>
+                      <w:top w:val="none" w:sz="0" w:space="0" w:color="000000"/>
+                      <w:left w:val="none" w:sz="0" w:space="0" w:color="000000"/>
+                      <w:right w:val="none" w:sz="0" w:space="0" w:color="000000"/>
+                    </w:pBdr>
+                    <w:spacing w:after="100" w:before="100" w:line="240"/>
+                    <w:ind w:left="100" w:right="100" w:firstLine="0" w:firstLineChars="0"/>
+                    <w:rPr>
+                      <w:rFonts w:ascii="Arial" w:hAnsi="Arial" w:eastAsia="Arial" w:cs="Arial"/>
+                      <w:i w:val="false"/>
+                      <w:b w:val="false"/>
+                      <w:u w:val="none"/>
+                      <w:strike w:val="false"/>
+                      <w:sz w:val="22"/>
+                      <w:szCs w:val="22"/>
+                      <w:color w:val="000000"/>
+                    </w:rPr>
+                  </w:pPr>
+                  <w:r xmlns:w="http://schemas.openxmlformats.org/wordprocessingml/2006/main" xmlns:wp="http://schemas.openxmlformats.org/drawingml/2006/wordprocessingDrawing" xmlns:r="http://schemas.openxmlformats.org/officeDocument/2006/relationships" xmlns:w14="http://schemas.microsoft.com/office/word/2010/wordml">
+                    <w:rPr>
+                      <w:rFonts w:ascii="Arial" w:hAnsi="Arial" w:eastAsia="Arial" w:cs="Arial"/>
+                      <w:i w:val="false"/>
+                      <w:b w:val="false"/>
+                      <w:u w:val="none"/>
+                      <w:strike w:val="false"/>
+                      <w:sz w:val="22"/>
+                      <w:szCs w:val="22"/>
+                      <w:color w:val="000000"/>
+                    </w:rPr>
+                    <w:t xml:space="preserve">yes</w:t>
+                  </w:r>
+                </w:p>
+              </w:tc>
+            </w:tr>
+            <w:tr>
+              <w:trPr>
+                <w:trHeight w:val="617" w:hRule="auto"/>
+              </w:trPr>
+              <w:tc>
+                <w:tcPr>
+                  <w:tcBorders>
+                    <w:bottom w:val="single" w:sz="12" w:space="0" w:color="666666"/>
+                    <w:top w:val="none" w:sz="0" w:space="0" w:color="000000"/>
+                    <w:left w:val="none" w:sz="0" w:space="0" w:color="000000"/>
+                    <w:right w:val="none" w:sz="0" w:space="0" w:color="000000"/>
+                  </w:tcBorders>
+                  <w:shd w:val="clear" w:color="auto" w:fill="FFFFFF"/>
+                  <w:tcMar>
+                    <w:top w:w="0" w:type="dxa"/>
+                    <w:bottom w:w="0" w:type="dxa"/>
+                    <w:left w:w="0" w:type="dxa"/>
+                    <w:right w:w="0" w:type="dxa"/>
+                  </w:tcMar>
+                  <w:vAlign w:val="center"/>
+                </w:tcPr>
+                <w:p>
+                  <w:pPr>
+                    <w:jc w:val="left"/>
+                    <w:pBdr>
+                      <w:bottom w:val="none" w:sz="0" w:space="0" w:color="000000"/>
+                      <w:top w:val="none" w:sz="0" w:space="0" w:color="000000"/>
+                      <w:left w:val="none" w:sz="0" w:space="0" w:color="000000"/>
+                      <w:right w:val="none" w:sz="0" w:space="0" w:color="000000"/>
+                    </w:pBdr>
+                    <w:spacing w:after="100" w:before="100" w:line="240"/>
+                    <w:ind w:left="100" w:right="100" w:firstLine="0" w:firstLineChars="0"/>
+                    <w:rPr>
+                      <w:rFonts w:ascii="Arial" w:hAnsi="Arial" w:eastAsia="Arial" w:cs="Arial"/>
+                      <w:i w:val="false"/>
+                      <w:b w:val="false"/>
+                      <w:u w:val="none"/>
+                      <w:strike w:val="false"/>
+                      <w:sz w:val="22"/>
+                      <w:szCs w:val="22"/>
+                      <w:color w:val="000000"/>
+                    </w:rPr>
+                  </w:pPr>
+                  <w:r xmlns:w="http://schemas.openxmlformats.org/wordprocessingml/2006/main" xmlns:wp="http://schemas.openxmlformats.org/drawingml/2006/wordprocessingDrawing" xmlns:r="http://schemas.openxmlformats.org/officeDocument/2006/relationships" xmlns:w14="http://schemas.microsoft.com/office/word/2010/wordml">
+                    <w:rPr>
+                      <w:rFonts w:ascii="Arial" w:hAnsi="Arial" w:eastAsia="Arial" w:cs="Arial"/>
+                      <w:i w:val="false"/>
+                      <w:b w:val="false"/>
+                      <w:u w:val="none"/>
+                      <w:strike w:val="false"/>
+                      <w:sz w:val="22"/>
+                      <w:szCs w:val="22"/>
+                      <w:color w:val="000000"/>
+                    </w:rPr>
+                    <w:t xml:space="preserve">H3N2</w:t>
+                  </w:r>
+                </w:p>
+              </w:tc>
+              <w:tc>
+                <w:tcPr>
+                  <w:tcBorders>
+                    <w:bottom w:val="single" w:sz="12" w:space="0" w:color="666666"/>
+                    <w:top w:val="none" w:sz="0" w:space="0" w:color="000000"/>
+                    <w:left w:val="none" w:sz="0" w:space="0" w:color="000000"/>
+                    <w:right w:val="none" w:sz="0" w:space="0" w:color="000000"/>
+                  </w:tcBorders>
+                  <w:shd w:val="clear" w:color="auto" w:fill="FFFFFF"/>
+                  <w:tcMar>
+                    <w:top w:w="0" w:type="dxa"/>
+                    <w:bottom w:w="0" w:type="dxa"/>
+                    <w:left w:w="0" w:type="dxa"/>
+                    <w:right w:w="0" w:type="dxa"/>
+                  </w:tcMar>
+                  <w:vAlign w:val="center"/>
+                </w:tcPr>
+                <w:p>
+                  <w:pPr>
+                    <w:jc w:val="right"/>
+                    <w:pBdr>
+                      <w:bottom w:val="none" w:sz="0" w:space="0" w:color="000000"/>
+                      <w:top w:val="none" w:sz="0" w:space="0" w:color="000000"/>
+                      <w:left w:val="none" w:sz="0" w:space="0" w:color="000000"/>
+                      <w:right w:val="none" w:sz="0" w:space="0" w:color="000000"/>
+                    </w:pBdr>
+                    <w:spacing w:after="100" w:before="100" w:line="240"/>
+                    <w:ind w:left="100" w:right="100" w:firstLine="0" w:firstLineChars="0"/>
+                    <w:rPr>
+                      <w:rFonts w:ascii="Arial" w:hAnsi="Arial" w:eastAsia="Arial" w:cs="Arial"/>
+                      <w:i w:val="false"/>
+                      <w:b w:val="false"/>
+                      <w:u w:val="none"/>
+                      <w:strike w:val="false"/>
+                      <w:sz w:val="22"/>
+                      <w:szCs w:val="22"/>
+                      <w:color w:val="000000"/>
+                    </w:rPr>
+                  </w:pPr>
+                  <w:r xmlns:w="http://schemas.openxmlformats.org/wordprocessingml/2006/main" xmlns:wp="http://schemas.openxmlformats.org/drawingml/2006/wordprocessingDrawing" xmlns:r="http://schemas.openxmlformats.org/officeDocument/2006/relationships" xmlns:w14="http://schemas.microsoft.com/office/word/2010/wordml">
+                    <w:rPr>
+                      <w:rFonts w:ascii="Arial" w:hAnsi="Arial" w:eastAsia="Arial" w:cs="Arial"/>
+                      <w:i w:val="false"/>
+                      <w:b w:val="false"/>
+                      <w:u w:val="none"/>
+                      <w:strike w:val="false"/>
+                      <w:sz w:val="22"/>
+                      <w:szCs w:val="22"/>
+                      <w:color w:val="000000"/>
+                    </w:rPr>
+                    <w:t xml:space="preserve">21</w:t>
+                  </w:r>
+                </w:p>
+              </w:tc>
+              <w:tc>
+                <w:tcPr>
+                  <w:tcBorders>
+                    <w:bottom w:val="single" w:sz="12" w:space="0" w:color="666666"/>
+                    <w:top w:val="none" w:sz="0" w:space="0" w:color="000000"/>
+                    <w:left w:val="none" w:sz="0" w:space="0" w:color="000000"/>
+                    <w:right w:val="none" w:sz="0" w:space="0" w:color="000000"/>
+                  </w:tcBorders>
+                  <w:shd w:val="clear" w:color="auto" w:fill="FFFFFF"/>
+                  <w:tcMar>
+                    <w:top w:w="0" w:type="dxa"/>
+                    <w:bottom w:w="0" w:type="dxa"/>
+                    <w:left w:w="0" w:type="dxa"/>
+                    <w:right w:w="0" w:type="dxa"/>
+                  </w:tcMar>
+                  <w:vAlign w:val="center"/>
+                </w:tcPr>
+                <w:p>
+                  <w:pPr>
+                    <w:jc w:val="right"/>
+                    <w:pBdr>
+                      <w:bottom w:val="none" w:sz="0" w:space="0" w:color="000000"/>
+                      <w:top w:val="none" w:sz="0" w:space="0" w:color="000000"/>
+                      <w:left w:val="none" w:sz="0" w:space="0" w:color="000000"/>
+                      <w:right w:val="none" w:sz="0" w:space="0" w:color="000000"/>
+                    </w:pBdr>
+                    <w:spacing w:after="100" w:before="100" w:line="240"/>
+                    <w:ind w:left="100" w:right="100" w:firstLine="0" w:firstLineChars="0"/>
+                    <w:rPr>
+                      <w:rFonts w:ascii="Arial" w:hAnsi="Arial" w:eastAsia="Arial" w:cs="Arial"/>
+                      <w:i w:val="false"/>
+                      <w:b w:val="false"/>
+                      <w:u w:val="none"/>
+                      <w:strike w:val="false"/>
+                      <w:sz w:val="22"/>
+                      <w:szCs w:val="22"/>
+                      <w:color w:val="000000"/>
+                    </w:rPr>
+                  </w:pPr>
+                  <w:r xmlns:w="http://schemas.openxmlformats.org/wordprocessingml/2006/main" xmlns:wp="http://schemas.openxmlformats.org/drawingml/2006/wordprocessingDrawing" xmlns:r="http://schemas.openxmlformats.org/officeDocument/2006/relationships" xmlns:w14="http://schemas.microsoft.com/office/word/2010/wordml">
+                    <w:rPr>
+                      <w:rFonts w:ascii="Arial" w:hAnsi="Arial" w:eastAsia="Arial" w:cs="Arial"/>
+                      <w:i w:val="false"/>
+                      <w:b w:val="false"/>
+                      <w:u w:val="none"/>
+                      <w:strike w:val="false"/>
+                      <w:sz w:val="22"/>
+                      <w:szCs w:val="22"/>
+                      <w:color w:val="000000"/>
+                    </w:rPr>
+                    <w:t xml:space="preserve">21</w:t>
+                  </w:r>
+                </w:p>
+              </w:tc>
+              <w:tc>
+                <w:tcPr>
+                  <w:tcBorders>
+                    <w:bottom w:val="single" w:sz="12" w:space="0" w:color="666666"/>
+                    <w:top w:val="none" w:sz="0" w:space="0" w:color="000000"/>
+                    <w:left w:val="none" w:sz="0" w:space="0" w:color="000000"/>
+                    <w:right w:val="none" w:sz="0" w:space="0" w:color="000000"/>
+                  </w:tcBorders>
+                  <w:shd w:val="clear" w:color="auto" w:fill="FFFFFF"/>
+                  <w:tcMar>
+                    <w:top w:w="0" w:type="dxa"/>
+                    <w:bottom w:w="0" w:type="dxa"/>
+                    <w:left w:w="0" w:type="dxa"/>
+                    <w:right w:w="0" w:type="dxa"/>
+                  </w:tcMar>
+                  <w:vAlign w:val="center"/>
+                </w:tcPr>
+                <w:p>
+                  <w:pPr>
+                    <w:jc w:val="right"/>
+                    <w:pBdr>
+                      <w:bottom w:val="none" w:sz="0" w:space="0" w:color="000000"/>
+                      <w:top w:val="none" w:sz="0" w:space="0" w:color="000000"/>
+                      <w:left w:val="none" w:sz="0" w:space="0" w:color="000000"/>
+                      <w:right w:val="none" w:sz="0" w:space="0" w:color="000000"/>
+                    </w:pBdr>
+                    <w:spacing w:after="100" w:before="100" w:line="240"/>
+                    <w:ind w:left="100" w:right="100" w:firstLine="0" w:firstLineChars="0"/>
+                    <w:rPr>
+                      <w:rFonts w:ascii="Arial" w:hAnsi="Arial" w:eastAsia="Arial" w:cs="Arial"/>
+                      <w:i w:val="false"/>
+                      <w:b w:val="false"/>
+                      <w:u w:val="none"/>
+                      <w:strike w:val="false"/>
+                      <w:sz w:val="22"/>
+                      <w:szCs w:val="22"/>
+                      <w:color w:val="000000"/>
+                    </w:rPr>
+                  </w:pPr>
+                  <w:r xmlns:w="http://schemas.openxmlformats.org/wordprocessingml/2006/main" xmlns:wp="http://schemas.openxmlformats.org/drawingml/2006/wordprocessingDrawing" xmlns:r="http://schemas.openxmlformats.org/officeDocument/2006/relationships" xmlns:w14="http://schemas.microsoft.com/office/word/2010/wordml">
+                    <w:rPr>
+                      <w:rFonts w:ascii="Arial" w:hAnsi="Arial" w:eastAsia="Arial" w:cs="Arial"/>
+                      <w:i w:val="false"/>
+                      <w:b w:val="false"/>
+                      <w:u w:val="none"/>
+                      <w:strike w:val="false"/>
+                      <w:sz w:val="22"/>
+                      <w:szCs w:val="22"/>
+                      <w:color w:val="000000"/>
+                    </w:rPr>
+                    <w:t xml:space="preserve">1,968</w:t>
+                  </w:r>
+                </w:p>
+              </w:tc>
+              <w:tc>
+                <w:tcPr>
+                  <w:tcBorders>
+                    <w:bottom w:val="single" w:sz="12" w:space="0" w:color="666666"/>
+                    <w:top w:val="none" w:sz="0" w:space="0" w:color="000000"/>
+                    <w:left w:val="none" w:sz="0" w:space="0" w:color="000000"/>
+                    <w:right w:val="none" w:sz="0" w:space="0" w:color="000000"/>
+                  </w:tcBorders>
+                  <w:shd w:val="clear" w:color="auto" w:fill="FFFFFF"/>
+                  <w:tcMar>
+                    <w:top w:w="0" w:type="dxa"/>
+                    <w:bottom w:w="0" w:type="dxa"/>
+                    <w:left w:w="0" w:type="dxa"/>
+                    <w:right w:w="0" w:type="dxa"/>
+                  </w:tcMar>
+                  <w:vAlign w:val="center"/>
+                </w:tcPr>
+                <w:p>
+                  <w:pPr>
+                    <w:jc w:val="right"/>
+                    <w:pBdr>
+                      <w:bottom w:val="none" w:sz="0" w:space="0" w:color="000000"/>
+                      <w:top w:val="none" w:sz="0" w:space="0" w:color="000000"/>
+                      <w:left w:val="none" w:sz="0" w:space="0" w:color="000000"/>
+                      <w:right w:val="none" w:sz="0" w:space="0" w:color="000000"/>
+                    </w:pBdr>
+                    <w:spacing w:after="100" w:before="100" w:line="240"/>
+                    <w:ind w:left="100" w:right="100" w:firstLine="0" w:firstLineChars="0"/>
+                    <w:rPr>
+                      <w:rFonts w:ascii="Arial" w:hAnsi="Arial" w:eastAsia="Arial" w:cs="Arial"/>
+                      <w:i w:val="false"/>
+                      <w:b w:val="false"/>
+                      <w:u w:val="none"/>
+                      <w:strike w:val="false"/>
+                      <w:sz w:val="22"/>
+                      <w:szCs w:val="22"/>
+                      <w:color w:val="000000"/>
+                    </w:rPr>
+                  </w:pPr>
+                  <w:r xmlns:w="http://schemas.openxmlformats.org/wordprocessingml/2006/main" xmlns:wp="http://schemas.openxmlformats.org/drawingml/2006/wordprocessingDrawing" xmlns:r="http://schemas.openxmlformats.org/officeDocument/2006/relationships" xmlns:w14="http://schemas.microsoft.com/office/word/2010/wordml">
+                    <w:rPr>
+                      <w:rFonts w:ascii="Arial" w:hAnsi="Arial" w:eastAsia="Arial" w:cs="Arial"/>
+                      <w:i w:val="false"/>
+                      <w:b w:val="false"/>
+                      <w:u w:val="none"/>
+                      <w:strike w:val="false"/>
+                      <w:sz w:val="22"/>
+                      <w:szCs w:val="22"/>
+                      <w:color w:val="000000"/>
+                    </w:rPr>
+                    <w:t xml:space="preserve">2,019</w:t>
+                  </w:r>
+                </w:p>
+              </w:tc>
+              <w:tc>
+                <w:tcPr>
+                  <w:tcBorders>
+                    <w:bottom w:val="single" w:sz="12" w:space="0" w:color="666666"/>
+                    <w:top w:val="none" w:sz="0" w:space="0" w:color="000000"/>
+                    <w:left w:val="none" w:sz="0" w:space="0" w:color="000000"/>
+                    <w:right w:val="none" w:sz="0" w:space="0" w:color="000000"/>
+                  </w:tcBorders>
+                  <w:shd w:val="clear" w:color="auto" w:fill="FFFFFF"/>
+                  <w:tcMar>
+                    <w:top w:w="0" w:type="dxa"/>
+                    <w:bottom w:w="0" w:type="dxa"/>
+                    <w:left w:w="0" w:type="dxa"/>
+                    <w:right w:w="0" w:type="dxa"/>
+                  </w:tcMar>
+                  <w:vAlign w:val="center"/>
+                </w:tcPr>
+                <w:p>
+                  <w:pPr>
+                    <w:jc w:val="right"/>
+                    <w:pBdr>
+                      <w:bottom w:val="none" w:sz="0" w:space="0" w:color="000000"/>
+                      <w:top w:val="none" w:sz="0" w:space="0" w:color="000000"/>
+                      <w:left w:val="none" w:sz="0" w:space="0" w:color="000000"/>
+                      <w:right w:val="none" w:sz="0" w:space="0" w:color="000000"/>
+                    </w:pBdr>
+                    <w:spacing w:after="100" w:before="100" w:line="240"/>
+                    <w:ind w:left="100" w:right="100" w:firstLine="0" w:firstLineChars="0"/>
+                    <w:rPr>
+                      <w:rFonts w:ascii="Arial" w:hAnsi="Arial" w:eastAsia="Arial" w:cs="Arial"/>
+                      <w:i w:val="false"/>
+                      <w:b w:val="false"/>
+                      <w:u w:val="none"/>
+                      <w:strike w:val="false"/>
+                      <w:sz w:val="22"/>
+                      <w:szCs w:val="22"/>
+                      <w:color w:val="000000"/>
+                    </w:rPr>
+                  </w:pPr>
+                  <w:r xmlns:w="http://schemas.openxmlformats.org/wordprocessingml/2006/main" xmlns:wp="http://schemas.openxmlformats.org/drawingml/2006/wordprocessingDrawing" xmlns:r="http://schemas.openxmlformats.org/officeDocument/2006/relationships" xmlns:w14="http://schemas.microsoft.com/office/word/2010/wordml">
+                    <w:rPr>
+                      <w:rFonts w:ascii="Arial" w:hAnsi="Arial" w:eastAsia="Arial" w:cs="Arial"/>
+                      <w:i w:val="false"/>
+                      <w:b w:val="false"/>
+                      <w:u w:val="none"/>
+                      <w:strike w:val="false"/>
+                      <w:sz w:val="22"/>
+                      <w:szCs w:val="22"/>
+                      <w:color w:val="000000"/>
+                    </w:rPr>
+                    <w:t xml:space="preserve">51</w:t>
+                  </w:r>
+                </w:p>
+              </w:tc>
+              <w:tc>
+                <w:tcPr>
+                  <w:tcBorders>
+                    <w:bottom w:val="single" w:sz="12" w:space="0" w:color="666666"/>
+                    <w:top w:val="none" w:sz="0" w:space="0" w:color="000000"/>
+                    <w:left w:val="none" w:sz="0" w:space="0" w:color="000000"/>
+                    <w:right w:val="none" w:sz="0" w:space="0" w:color="000000"/>
+                  </w:tcBorders>
+                  <w:shd w:val="clear" w:color="auto" w:fill="FFFFFF"/>
+                  <w:tcMar>
+                    <w:top w:w="0" w:type="dxa"/>
+                    <w:bottom w:w="0" w:type="dxa"/>
+                    <w:left w:w="0" w:type="dxa"/>
+                    <w:right w:w="0" w:type="dxa"/>
+                  </w:tcMar>
+                  <w:vAlign w:val="center"/>
+                </w:tcPr>
+                <w:p>
+                  <w:pPr>
+                    <w:jc w:val="left"/>
+                    <w:pBdr>
+                      <w:bottom w:val="none" w:sz="0" w:space="0" w:color="000000"/>
+                      <w:top w:val="none" w:sz="0" w:space="0" w:color="000000"/>
+                      <w:left w:val="none" w:sz="0" w:space="0" w:color="000000"/>
+                      <w:right w:val="none" w:sz="0" w:space="0" w:color="000000"/>
+                    </w:pBdr>
+                    <w:spacing w:after="100" w:before="100" w:line="240"/>
+                    <w:ind w:left="100" w:right="100" w:firstLine="0" w:firstLineChars="0"/>
+                    <w:rPr>
+                      <w:rFonts w:ascii="Arial" w:hAnsi="Arial" w:eastAsia="Arial" w:cs="Arial"/>
+                      <w:i w:val="false"/>
+                      <w:b w:val="false"/>
+                      <w:u w:val="none"/>
+                      <w:strike w:val="false"/>
+                      <w:sz w:val="22"/>
+                      <w:szCs w:val="22"/>
+                      <w:color w:val="000000"/>
+                    </w:rPr>
+                  </w:pPr>
+                  <w:r xmlns:w="http://schemas.openxmlformats.org/wordprocessingml/2006/main" xmlns:wp="http://schemas.openxmlformats.org/drawingml/2006/wordprocessingDrawing" xmlns:r="http://schemas.openxmlformats.org/officeDocument/2006/relationships" xmlns:w14="http://schemas.microsoft.com/office/word/2010/wordml">
+                    <w:rPr>
+                      <w:rFonts w:ascii="Arial" w:hAnsi="Arial" w:eastAsia="Arial" w:cs="Arial"/>
+                      <w:i w:val="false"/>
+                      <w:b w:val="false"/>
+                      <w:u w:val="none"/>
+                      <w:strike w:val="false"/>
+                      <w:sz w:val="22"/>
+                      <w:szCs w:val="22"/>
+                      <w:color w:val="000000"/>
+                    </w:rPr>
+                    <w:t xml:space="preserve">3 (14.3%)</w:t>
+                  </w:r>
+                </w:p>
+              </w:tc>
+              <w:tc>
+                <w:tcPr>
+                  <w:tcBorders>
+                    <w:bottom w:val="single" w:sz="12" w:space="0" w:color="666666"/>
+                    <w:top w:val="none" w:sz="0" w:space="0" w:color="000000"/>
+                    <w:left w:val="none" w:sz="0" w:space="0" w:color="000000"/>
+                    <w:right w:val="none" w:sz="0" w:space="0" w:color="000000"/>
+                  </w:tcBorders>
+                  <w:shd w:val="clear" w:color="auto" w:fill="FFFFFF"/>
+                  <w:tcMar>
+                    <w:top w:w="0" w:type="dxa"/>
+                    <w:bottom w:w="0" w:type="dxa"/>
+                    <w:left w:w="0" w:type="dxa"/>
+                    <w:right w:w="0" w:type="dxa"/>
+                  </w:tcMar>
+                  <w:vAlign w:val="center"/>
+                </w:tcPr>
+                <w:p>
+                  <w:pPr>
+                    <w:jc w:val="right"/>
+                    <w:pBdr>
+                      <w:bottom w:val="none" w:sz="0" w:space="0" w:color="000000"/>
+                      <w:top w:val="none" w:sz="0" w:space="0" w:color="000000"/>
+                      <w:left w:val="none" w:sz="0" w:space="0" w:color="000000"/>
+                      <w:right w:val="none" w:sz="0" w:space="0" w:color="000000"/>
+                    </w:pBdr>
+                    <w:spacing w:after="100" w:before="100" w:line="240"/>
+                    <w:ind w:left="100" w:right="100" w:firstLine="0" w:firstLineChars="0"/>
+                    <w:rPr>
+                      <w:rFonts w:ascii="Arial" w:hAnsi="Arial" w:eastAsia="Arial" w:cs="Arial"/>
+                      <w:i w:val="false"/>
+                      <w:b w:val="false"/>
+                      <w:u w:val="none"/>
+                      <w:strike w:val="false"/>
+                      <w:sz w:val="22"/>
+                      <w:szCs w:val="22"/>
+                      <w:color w:val="000000"/>
+                    </w:rPr>
+                  </w:pPr>
+                  <w:r xmlns:w="http://schemas.openxmlformats.org/wordprocessingml/2006/main" xmlns:wp="http://schemas.openxmlformats.org/drawingml/2006/wordprocessingDrawing" xmlns:r="http://schemas.openxmlformats.org/officeDocument/2006/relationships" xmlns:w14="http://schemas.microsoft.com/office/word/2010/wordml">
+                    <w:rPr>
+                      <w:rFonts w:ascii="Arial" w:hAnsi="Arial" w:eastAsia="Arial" w:cs="Arial"/>
+                      <w:i w:val="false"/>
+                      <w:b w:val="false"/>
+                      <w:u w:val="none"/>
+                      <w:strike w:val="false"/>
+                      <w:sz w:val="22"/>
+                      <w:szCs w:val="22"/>
+                      <w:color w:val="000000"/>
+                    </w:rPr>
+                    <w:t xml:space="preserve">210</w:t>
+                  </w:r>
+                </w:p>
+              </w:tc>
+              <w:tc>
+                <w:tcPr>
+                  <w:tcBorders>
+                    <w:bottom w:val="single" w:sz="12" w:space="0" w:color="666666"/>
+                    <w:top w:val="none" w:sz="0" w:space="0" w:color="000000"/>
+                    <w:left w:val="none" w:sz="0" w:space="0" w:color="000000"/>
+                    <w:right w:val="none" w:sz="0" w:space="0" w:color="000000"/>
+                  </w:tcBorders>
+                  <w:shd w:val="clear" w:color="auto" w:fill="FFFFFF"/>
+                  <w:tcMar>
+                    <w:top w:w="0" w:type="dxa"/>
+                    <w:bottom w:w="0" w:type="dxa"/>
+                    <w:left w:w="0" w:type="dxa"/>
+                    <w:right w:w="0" w:type="dxa"/>
+                  </w:tcMar>
+                  <w:vAlign w:val="center"/>
+                </w:tcPr>
+                <w:p>
+                  <w:pPr>
+                    <w:jc w:val="left"/>
+                    <w:pBdr>
+                      <w:bottom w:val="none" w:sz="0" w:space="0" w:color="000000"/>
+                      <w:top w:val="none" w:sz="0" w:space="0" w:color="000000"/>
+                      <w:left w:val="none" w:sz="0" w:space="0" w:color="000000"/>
+                      <w:right w:val="none" w:sz="0" w:space="0" w:color="000000"/>
+                    </w:pBdr>
+                    <w:spacing w:after="100" w:before="100" w:line="240"/>
+                    <w:ind w:left="100" w:right="100" w:firstLine="0" w:firstLineChars="0"/>
+                    <w:rPr>
+                      <w:rFonts w:ascii="Arial" w:hAnsi="Arial" w:eastAsia="Arial" w:cs="Arial"/>
+                      <w:i w:val="false"/>
+                      <w:b w:val="false"/>
+                      <w:u w:val="none"/>
+                      <w:strike w:val="false"/>
+                      <w:sz w:val="22"/>
+                      <w:szCs w:val="22"/>
+                      <w:color w:val="000000"/>
+                    </w:rPr>
+                  </w:pPr>
+                  <w:r xmlns:w="http://schemas.openxmlformats.org/wordprocessingml/2006/main" xmlns:wp="http://schemas.openxmlformats.org/drawingml/2006/wordprocessingDrawing" xmlns:r="http://schemas.openxmlformats.org/officeDocument/2006/relationships" xmlns:w14="http://schemas.microsoft.com/office/word/2010/wordml">
+                    <w:rPr>
+                      <w:rFonts w:ascii="Arial" w:hAnsi="Arial" w:eastAsia="Arial" w:cs="Arial"/>
+                      <w:i w:val="false"/>
+                      <w:b w:val="false"/>
+                      <w:u w:val="none"/>
+                      <w:strike w:val="false"/>
+                      <w:sz w:val="22"/>
+                      <w:szCs w:val="22"/>
+                      <w:color w:val="000000"/>
+                    </w:rPr>
+                    <w:t xml:space="preserve">210</w:t>
+                  </w:r>
+                </w:p>
+              </w:tc>
+              <w:tc>
+                <w:tcPr>
+                  <w:tcBorders>
+                    <w:bottom w:val="single" w:sz="12" w:space="0" w:color="666666"/>
+                    <w:top w:val="none" w:sz="0" w:space="0" w:color="000000"/>
+                    <w:left w:val="none" w:sz="0" w:space="0" w:color="000000"/>
+                    <w:right w:val="none" w:sz="0" w:space="0" w:color="000000"/>
+                  </w:tcBorders>
+                  <w:shd w:val="clear" w:color="auto" w:fill="FFFFFF"/>
+                  <w:tcMar>
+                    <w:top w:w="0" w:type="dxa"/>
+                    <w:bottom w:w="0" w:type="dxa"/>
+                    <w:left w:w="0" w:type="dxa"/>
+                    <w:right w:w="0" w:type="dxa"/>
+                  </w:tcMar>
+                  <w:vAlign w:val="center"/>
+                </w:tcPr>
+                <w:p>
+                  <w:pPr>
+                    <w:jc w:val="left"/>
+                    <w:pBdr>
+                      <w:bottom w:val="none" w:sz="0" w:space="0" w:color="000000"/>
+                      <w:top w:val="none" w:sz="0" w:space="0" w:color="000000"/>
+                      <w:left w:val="none" w:sz="0" w:space="0" w:color="000000"/>
+                      <w:right w:val="none" w:sz="0" w:space="0" w:color="000000"/>
+                    </w:pBdr>
+                    <w:spacing w:after="100" w:before="100" w:line="240"/>
+                    <w:ind w:left="100" w:right="100" w:firstLine="0" w:firstLineChars="0"/>
+                    <w:rPr>
+                      <w:rFonts w:ascii="Arial" w:hAnsi="Arial" w:eastAsia="Arial" w:cs="Arial"/>
+                      <w:i w:val="false"/>
+                      <w:b w:val="false"/>
+                      <w:u w:val="none"/>
+                      <w:strike w:val="false"/>
+                      <w:sz w:val="22"/>
+                      <w:szCs w:val="22"/>
+                      <w:color w:val="000000"/>
+                    </w:rPr>
+                  </w:pPr>
+                  <w:r xmlns:w="http://schemas.openxmlformats.org/wordprocessingml/2006/main" xmlns:wp="http://schemas.openxmlformats.org/drawingml/2006/wordprocessingDrawing" xmlns:r="http://schemas.openxmlformats.org/officeDocument/2006/relationships" xmlns:w14="http://schemas.microsoft.com/office/word/2010/wordml">
+                    <w:rPr>
+                      <w:rFonts w:ascii="Arial" w:hAnsi="Arial" w:eastAsia="Arial" w:cs="Arial"/>
+                      <w:i w:val="false"/>
+                      <w:b w:val="false"/>
+                      <w:u w:val="none"/>
+                      <w:strike w:val="false"/>
+                      <w:sz w:val="22"/>
+                      <w:szCs w:val="22"/>
+                      <w:color w:val="000000"/>
+                    </w:rPr>
+                    <w:t xml:space="preserve">yes</w:t>
+                  </w:r>
+                </w:p>
+              </w:tc>
+            </w:tr>
+          </w:tbl>
+          <w:bookmarkEnd w:id="20"/>
+        </w:tc>
+      </w:tr>
+    </w:tbl>
+    <w:bookmarkEnd w:id="21"/>
+    <w:bookmarkStart w:id="38" w:name="study-results"/>
+    <w:p>
+      <w:pPr>
+        <w:pStyle w:val="Heading1"/>
+      </w:pPr>
+      <w:r>
+        <w:t xml:space="preserve">Study Results</w:t>
+      </w:r>
+    </w:p>
+    <w:p>
+      <w:pPr>
+        <w:pStyle w:val="FirstParagraph"/>
+      </w:pPr>
+      <w:r>
+        <w:t xml:space="preserve">The distance metrics differed in their Mantel agreement with ML-tree cophenetic</w:t>
+      </w:r>
+      <w:r>
+        <w:t xml:space="preserve"> </w:t>
+      </w:r>
+      <w:r>
+        <w:t xml:space="preserve">distance (</w:t>
+      </w:r>
+      <w:hyperlink w:anchor="fig-corr">
+        <w:r>
+          <w:rPr>
+            <w:rStyle w:val="Hyperlink"/>
+          </w:rPr>
+          <w:t xml:space="preserve">Figure 1</w:t>
+        </w:r>
+      </w:hyperlink>
+      <w:r>
+        <w:t xml:space="preserve">;</w:t>
+      </w:r>
+      <w:r>
+        <w:t xml:space="preserve"> </w:t>
+      </w:r>
+      <w:hyperlink w:anchor="tbl-distance-correlations">
+        <w:r>
+          <w:rPr>
+            <w:rStyle w:val="Hyperlink"/>
+          </w:rPr>
+          <w:t xml:space="preserve">Table 2</w:t>
+        </w:r>
+      </w:hyperlink>
+      <w:r>
+        <w:t xml:space="preserve">). Grantham and</w:t>
+      </w:r>
+      <w:r>
+        <w:t xml:space="preserve"> </w:t>
+      </w:r>
+      <m:oMath>
+        <m:r>
+          <m:t>p</m:t>
+        </m:r>
+      </m:oMath>
+      <w:r>
+        <w:t xml:space="preserve">-Epitope</w:t>
+      </w:r>
+      <w:r>
+        <w:t xml:space="preserve"> </w:t>
+      </w:r>
+      <w:r>
+        <w:t xml:space="preserve">distances were strongly associated with ML-tree distance for both subtypes,</w:t>
+      </w:r>
+      <w:r>
+        <w:t xml:space="preserve"> </w:t>
+      </w:r>
+      <w:r>
+        <w:t xml:space="preserve">while cartographic distance had lower matrix correlations. Temporal distance was</w:t>
+      </w:r>
+      <w:r>
+        <w:t xml:space="preserve"> </w:t>
+      </w:r>
+      <w:r>
+        <w:t xml:space="preserve">strongly associated with ML-tree distance for H3N2, but not for H1N1. H1N1 has</w:t>
+      </w:r>
+      <w:r>
+        <w:t xml:space="preserve"> </w:t>
+      </w:r>
+      <w:r>
+        <w:t xml:space="preserve">two clusters, 2009 pandemic-like (pdm) and non-pdm. The pdm-like strains are</w:t>
+      </w:r>
+      <w:r>
+        <w:t xml:space="preserve"> </w:t>
+      </w:r>
+      <w:r>
+        <w:t xml:space="preserve">genetically more similar to the 1918 pandemic strain than to most strains which</w:t>
+      </w:r>
+      <w:r>
+        <w:t xml:space="preserve"> </w:t>
+      </w:r>
+      <w:r>
+        <w:t xml:space="preserve">circulated from 1950 – 2009, so a simple temporal-distance comparison can be</w:t>
+      </w:r>
+      <w:r>
+        <w:t xml:space="preserve"> </w:t>
+      </w:r>
+      <w:r>
+        <w:t xml:space="preserve">weak for H1N1.</w:t>
+      </w:r>
+    </w:p>
+    <w:tbl>
+      <w:tblPr>
+        <w:tblStyle w:val="Table"/>
+        <w:tblW w:type="pct" w:w="5000"/>
+        <w:tblLayout w:type="fixed"/>
+        <w:tblLook w:firstRow="0" w:lastRow="0" w:firstColumn="0" w:lastColumn="0" w:noHBand="0" w:noVBand="0" w:val="0000"/>
+      </w:tblPr>
+      <w:tblGrid>
+        <w:gridCol w:w="7920"/>
+      </w:tblGrid>
+      <w:tr>
+        <w:tc>
+          <w:tcPr/>
+          <w:bookmarkStart w:id="25" w:name="fig-corr"/>
           <w:p>
             <w:pPr>
               <w:pStyle w:val="Compact"/>
@@ -1002,18 +2771,18 @@
                 <wp:inline>
                   <wp:extent cx="5334000" cy="4445000"/>
                   <wp:effectExtent b="0" l="0" r="0" t="0"/>
-                  <wp:docPr descr="" title="" id="22" name="Picture"/>
+                  <wp:docPr descr="" title="" id="23" name="Picture"/>
                   <a:graphic>
                     <a:graphicData uri="http://schemas.openxmlformats.org/drawingml/2006/picture">
                       <pic:pic>
                         <pic:nvPicPr>
-                          <pic:cNvPr descr="../results/Figures/corr-plot.png" id="23" name="Picture"/>
+                          <pic:cNvPr descr="../results/Figures/corr-plot.png" id="24" name="Picture"/>
                           <pic:cNvPicPr>
                             <a:picLocks noChangeArrowheads="1" noChangeAspect="1"/>
                           </pic:cNvPicPr>
                         </pic:nvPicPr>
                         <pic:blipFill>
-                          <a:blip r:embed="rId21"/>
+                          <a:blip r:embed="rId22"/>
                           <a:stretch>
                             <a:fillRect/>
                           </a:stretch>
@@ -1056,16 +2825,22 @@
               <w:t xml:space="preserve"> </w:t>
             </w:r>
             <w:r>
-              <w:t xml:space="preserve">x-axis and each min-max normalized distance metric on the y-axis. Points</w:t>
+              <w:t xml:space="preserve">x-axis and each min-max normalized distance metric on the y-axis.</w:t>
             </w:r>
             <w:r>
               <w:t xml:space="preserve"> </w:t>
             </w:r>
             <w:r>
-              <w:t xml:space="preserve">are unique off-diagonal strain pairs and are colored by subtype.</w:t>
+              <w:t xml:space="preserve">Normalization is by metric across all displayed unique off-diagonal</w:t>
+            </w:r>
+            <w:r>
+              <w:t xml:space="preserve"> </w:t>
+            </w:r>
+            <w:r>
+              <w:t xml:space="preserve">strain pairs. Points are colored by subtype.</w:t>
             </w:r>
           </w:p>
-          <w:bookmarkEnd w:id="24"/>
+          <w:bookmarkEnd w:id="25"/>
         </w:tc>
       </w:tr>
     </w:tbl>
@@ -1082,7 +2857,7 @@
       <w:tr>
         <w:tc>
           <w:tcPr/>
-          <w:bookmarkStart w:id="25" w:name="tbl-distance-correlations"/>
+          <w:bookmarkStart w:id="26" w:name="tbl-distance-correlations"/>
           <w:p>
             <w:pPr>
               <w:jc w:val="center"/>
@@ -1093,7 +2868,7 @@
               <w:pStyle w:val="ImageCaption"/>
             </w:pPr>
             <w:r>
-              <w:t xml:space="preserve">Table 1: Mantel correlations between each distance metric and ML-tree cophenetic distance, overall and by subtype. Intervals are Bayesian bootstrap 95% intervals over strain units. P-values are two-sided matrix-permutation p-values for the observed strain panel.</w:t>
+              <w:t xml:space="preserve">Table 2: Mantel correlations between each distance metric and ML-tree cophenetic distance, overall and by subtype. Intervals are Bayesian bootstrap 95% intervals over strain units. P-values are two-sided matrix-permutation p-values for the observed strain panel.</w:t>
             </w:r>
           </w:p>
           <w:tbl xmlns:w="http://schemas.openxmlformats.org/wordprocessingml/2006/main" xmlns:r="http://schemas.openxmlformats.org/officeDocument/2006/relationships" xmlns:w14="http://schemas.microsoft.com/office/word/2010/wordml" xmlns:wp="http://schemas.openxmlformats.org/drawingml/2006/wordprocessingDrawing" xmlns:a="http://schemas.openxmlformats.org/drawingml/2006/main" xmlns:pic="http://schemas.openxmlformats.org/drawingml/2006/picture">
@@ -6000,7 +7775,7 @@
               </w:tc>
             </w:tr>
           </w:tbl>
-          <w:bookmarkEnd w:id="25"/>
+          <w:bookmarkEnd w:id="26"/>
         </w:tc>
       </w:tr>
     </w:tbl>
@@ -6030,7 +7805,7 @@
           <w:rPr>
             <w:rStyle w:val="Hyperlink"/>
           </w:rPr>
-          <w:t xml:space="preserve">Table 2</w:t>
+          <w:t xml:space="preserve">Table 3</w:t>
         </w:r>
       </w:hyperlink>
       <w:r>
@@ -6062,7 +7837,7 @@
       <w:tr>
         <w:tc>
           <w:tcPr/>
-          <w:bookmarkStart w:id="29" w:name="fig-subtype-contrasts"/>
+          <w:bookmarkStart w:id="30" w:name="fig-subtype-contrasts"/>
           <w:p>
             <w:pPr>
               <w:pStyle w:val="Compact"/>
@@ -6073,18 +7848,18 @@
                 <wp:inline>
                   <wp:extent cx="5334000" cy="3048000"/>
                   <wp:effectExtent b="0" l="0" r="0" t="0"/>
-                  <wp:docPr descr="" title="" id="27" name="Picture"/>
+                  <wp:docPr descr="" title="" id="28" name="Picture"/>
                   <a:graphic>
                     <a:graphicData uri="http://schemas.openxmlformats.org/drawingml/2006/picture">
                       <pic:pic>
                         <pic:nvPicPr>
-                          <pic:cNvPr descr="../results/Figures/subtype-mantel-contrast-plot.png" id="28" name="Picture"/>
+                          <pic:cNvPr descr="../results/Figures/subtype-mantel-contrast-plot.png" id="29" name="Picture"/>
                           <pic:cNvPicPr>
                             <a:picLocks noChangeArrowheads="1" noChangeAspect="1"/>
                           </pic:cNvPicPr>
                         </pic:nvPicPr>
                         <pic:blipFill>
-                          <a:blip r:embed="rId26"/>
+                          <a:blip r:embed="rId27"/>
                           <a:stretch>
                             <a:fillRect/>
                           </a:stretch>
@@ -6136,7 +7911,7 @@
               <w:t xml:space="preserve">95% Bayesian bootstrap intervals over strain units.</w:t>
             </w:r>
           </w:p>
-          <w:bookmarkEnd w:id="29"/>
+          <w:bookmarkEnd w:id="30"/>
         </w:tc>
       </w:tr>
     </w:tbl>
@@ -6153,7 +7928,7 @@
       <w:tr>
         <w:tc>
           <w:tcPr/>
-          <w:bookmarkStart w:id="30" w:name="tbl-subtype-contrasts"/>
+          <w:bookmarkStart w:id="31" w:name="tbl-subtype-contrasts"/>
           <w:p>
             <w:pPr>
               <w:jc w:val="center"/>
@@ -6164,7 +7939,7 @@
               <w:pStyle w:val="ImageCaption"/>
             </w:pPr>
             <w:r>
-              <w:t xml:space="preserve">Table 2: H1N1 and H3N2 Mantel correlations and their subtype contrast for each distance metric. Differences are H3N2 minus H1N1. Intervals are Bayesian bootstrap 95% intervals over strain units.</w:t>
+              <w:t xml:space="preserve">Table 3: H1N1 and H3N2 Mantel correlations and their subtype contrast for each distance metric. Differences are H3N2 minus H1N1. Intervals are Bayesian bootstrap 95% intervals over strain units.</w:t>
             </w:r>
           </w:p>
           <w:tbl xmlns:w="http://schemas.openxmlformats.org/wordprocessingml/2006/main" xmlns:r="http://schemas.openxmlformats.org/officeDocument/2006/relationships" xmlns:w14="http://schemas.microsoft.com/office/word/2010/wordml" xmlns:wp="http://schemas.openxmlformats.org/drawingml/2006/wordprocessingDrawing" xmlns:a="http://schemas.openxmlformats.org/drawingml/2006/main" xmlns:pic="http://schemas.openxmlformats.org/drawingml/2006/picture">
@@ -8370,11 +10145,11 @@
               </w:tc>
             </w:tr>
           </w:tbl>
-          <w:bookmarkEnd w:id="30"/>
+          <w:bookmarkEnd w:id="31"/>
         </w:tc>
       </w:tr>
     </w:tbl>
-    <w:bookmarkStart w:id="36" w:name="sensitivity-analyses"/>
+    <w:bookmarkStart w:id="37" w:name="sensitivity-analyses"/>
     <w:p>
       <w:pPr>
         <w:pStyle w:val="Heading2"/>
@@ -8632,6 +10407,38 @@
       </w:r>
       <w:r>
         <w:t xml:space="preserve">will not be used to build distance-based neighbor-joining trees.</w:t>
+      </w:r>
+    </w:p>
+    <w:p>
+      <w:pPr>
+        <w:pStyle w:val="BodyText"/>
+      </w:pPr>
+      <w:r>
+        <w:t xml:space="preserve">Rank-based Spearman Mantel and descriptive Spearman correlations are reported</w:t>
+      </w:r>
+      <w:r>
+        <w:t xml:space="preserve"> </w:t>
+      </w:r>
+      <w:r>
+        <w:t xml:space="preserve">in the supplement as monotonic-association sensitivity analyses. These outputs</w:t>
+      </w:r>
+      <w:r>
+        <w:t xml:space="preserve"> </w:t>
+      </w:r>
+      <w:r>
+        <w:t xml:space="preserve">are intended to check whether the primary distance-matrix patterns depend on</w:t>
+      </w:r>
+      <w:r>
+        <w:t xml:space="preserve"> </w:t>
+      </w:r>
+      <w:r>
+        <w:t xml:space="preserve">approximately linear relationships between distance scales; they are not used</w:t>
+      </w:r>
+      <w:r>
+        <w:t xml:space="preserve"> </w:t>
+      </w:r>
+      <w:r>
+        <w:t xml:space="preserve">to reinterpret the main results in this manuscript pass.</w:t>
       </w:r>
     </w:p>
     <w:p>
@@ -8769,7 +10576,7 @@
       <w:tr>
         <w:tc>
           <w:tcPr/>
-          <w:bookmarkStart w:id="34" w:name="fig-mltrees"/>
+          <w:bookmarkStart w:id="35" w:name="fig-mltrees"/>
           <w:p>
             <w:pPr>
               <w:pStyle w:val="Compact"/>
@@ -8780,18 +10587,18 @@
                 <wp:inline>
                   <wp:extent cx="5334000" cy="2666309"/>
                   <wp:effectExtent b="0" l="0" r="0" t="0"/>
-                  <wp:docPr descr="" title="" id="32" name="Picture"/>
+                  <wp:docPr descr="" title="" id="33" name="Picture"/>
                   <a:graphic>
                     <a:graphicData uri="http://schemas.openxmlformats.org/drawingml/2006/picture">
                       <pic:pic>
                         <pic:nvPicPr>
-                          <pic:cNvPr descr="../results/Figures/ml-trees.png" id="33" name="Picture"/>
+                          <pic:cNvPr descr="../results/Figures/ml-trees.png" id="34" name="Picture"/>
                           <pic:cNvPicPr>
                             <a:picLocks noChangeArrowheads="1" noChangeAspect="1"/>
                           </pic:cNvPicPr>
                         </pic:nvPicPr>
                         <pic:blipFill>
-                          <a:blip r:embed="rId31"/>
+                          <a:blip r:embed="rId32"/>
                           <a:stretch>
                             <a:fillRect/>
                           </a:stretch>
@@ -8843,7 +10650,7 @@
               <w:t xml:space="preserve">purposes, but the root was not optimized during fitting.</w:t>
             </w:r>
           </w:p>
-          <w:bookmarkEnd w:id="34"/>
+          <w:bookmarkEnd w:id="35"/>
         </w:tc>
       </w:tr>
     </w:tbl>
@@ -8877,7 +10684,7 @@
           <w:rPr>
             <w:rStyle w:val="Hyperlink"/>
           </w:rPr>
-          <w:t xml:space="preserve">Table 3</w:t>
+          <w:t xml:space="preserve">Table 4</w:t>
         </w:r>
       </w:hyperlink>
       <w:r>
@@ -8956,7 +10763,7 @@
       <w:tr>
         <w:tc>
           <w:tcPr/>
-          <w:bookmarkStart w:id="35" w:name="tbl-tree-comparison"/>
+          <w:bookmarkStart w:id="36" w:name="tbl-tree-comparison"/>
           <w:p>
             <w:pPr>
               <w:jc w:val="center"/>
@@ -8967,7 +10774,7 @@
               <w:pStyle w:val="ImageCaption"/>
             </w:pPr>
             <w:r>
-              <w:t xml:space="preserve">Table 3: Distance-tree likelihood comparison against the optimized ML tree. Delta log likelihood is the decrease in log likelihood from the ML tree. SH p-values and RF distances are secondary topology checks.</w:t>
+              <w:t xml:space="preserve">Table 4: Distance-tree likelihood comparison against the optimized ML tree. Delta log likelihood is the decrease in log likelihood from the ML tree. SH p-values and RF distances are secondary topology checks.</w:t>
             </w:r>
           </w:p>
           <w:tbl xmlns:w="http://schemas.openxmlformats.org/wordprocessingml/2006/main" xmlns:r="http://schemas.openxmlformats.org/officeDocument/2006/relationships" xmlns:w14="http://schemas.microsoft.com/office/word/2010/wordml" xmlns:wp="http://schemas.openxmlformats.org/drawingml/2006/wordprocessingDrawing" xmlns:a="http://schemas.openxmlformats.org/drawingml/2006/main" xmlns:pic="http://schemas.openxmlformats.org/drawingml/2006/picture">
@@ -12294,13 +14101,13 @@
               </w:tc>
             </w:tr>
           </w:tbl>
-          <w:bookmarkEnd w:id="35"/>
+          <w:bookmarkEnd w:id="36"/>
         </w:tc>
       </w:tr>
     </w:tbl>
-    <w:bookmarkEnd w:id="36"/>
     <w:bookmarkEnd w:id="37"/>
-    <w:bookmarkStart w:id="38" w:name="conclusions"/>
+    <w:bookmarkEnd w:id="38"/>
+    <w:bookmarkStart w:id="39" w:name="conclusions"/>
     <w:p>
       <w:pPr>
         <w:pStyle w:val="Heading1"/>
@@ -12386,37 +14193,55 @@
         <w:t xml:space="preserve"> </w:t>
       </w:r>
       <w:r>
-        <w:t xml:space="preserve">both H1N1 and H3N2. Since cartographic distance is based on observed immune</w:t>
-      </w:r>
-      <w:r>
-        <w:t xml:space="preserve"> </w:t>
-      </w:r>
-      <w:r>
-        <w:t xml:space="preserve">response data, this implies that the hemagglutinin</w:t>
-      </w:r>
-      <w:r>
-        <w:t xml:space="preserve"> </w:t>
-      </w:r>
-      <w:r>
-        <w:t xml:space="preserve">sequence is not the only factor in determining individual immune responses. Our</w:t>
-      </w:r>
-      <w:r>
-        <w:t xml:space="preserve"> </w:t>
-      </w:r>
-      <w:r>
-        <w:t xml:space="preserve">sample is likely not representative, so similar analyses should be repeated on</w:t>
-      </w:r>
-      <w:r>
-        <w:t xml:space="preserve"> </w:t>
-      </w:r>
-      <w:r>
-        <w:t xml:space="preserve">other cohorts. Performing similar analyses using neuraminidase sequence and</w:t>
-      </w:r>
-      <w:r>
-        <w:t xml:space="preserve"> </w:t>
-      </w:r>
-      <w:r>
-        <w:t xml:space="preserve">inhibition data would complete our findings well.</w:t>
+        <w:t xml:space="preserve">both H1N1 and H3N2. Because cartographic distance is based on observed immune</w:t>
+      </w:r>
+      <w:r>
+        <w:t xml:space="preserve"> </w:t>
+      </w:r>
+      <w:r>
+        <w:t xml:space="preserve">response data, this pattern is consistent with HAI-based cartography capturing</w:t>
+      </w:r>
+      <w:r>
+        <w:t xml:space="preserve"> </w:t>
+      </w:r>
+      <w:r>
+        <w:t xml:space="preserve">immune-response structure that is not fully explained by HA phylogenetic</w:t>
+      </w:r>
+      <w:r>
+        <w:t xml:space="preserve"> </w:t>
+      </w:r>
+      <w:r>
+        <w:t xml:space="preserve">distance in this panel. The selected panel spans historical H1N1/H3N2 antigenic</w:t>
+      </w:r>
+      <w:r>
+        <w:t xml:space="preserve"> </w:t>
+      </w:r>
+      <w:r>
+        <w:t xml:space="preserve">space and cohort-season Fluzone components, but it is not a representative</w:t>
+      </w:r>
+      <w:r>
+        <w:t xml:space="preserve"> </w:t>
+      </w:r>
+      <w:r>
+        <w:t xml:space="preserve">survey of all influenza strains, cohorts, or eras. Similar analyses should be</w:t>
+      </w:r>
+      <w:r>
+        <w:t xml:space="preserve"> </w:t>
+      </w:r>
+      <w:r>
+        <w:t xml:space="preserve">repeated on independent panels and other cohorts. Performing similar analyses</w:t>
+      </w:r>
+      <w:r>
+        <w:t xml:space="preserve"> </w:t>
+      </w:r>
+      <w:r>
+        <w:t xml:space="preserve">using neuraminidase sequence and inhibition data would complete our findings</w:t>
+      </w:r>
+      <w:r>
+        <w:t xml:space="preserve"> </w:t>
+      </w:r>
+      <w:r>
+        <w:t xml:space="preserve">well.</w:t>
       </w:r>
     </w:p>
     <w:p>
@@ -12451,8 +14276,8 @@
         <w:t xml:space="preserve">evolution do not always agree.</w:t>
       </w:r>
     </w:p>
-    <w:bookmarkEnd w:id="38"/>
-    <w:bookmarkStart w:id="39" w:name="acknowledgement"/>
+    <w:bookmarkEnd w:id="39"/>
+    <w:bookmarkStart w:id="40" w:name="acknowledgement"/>
     <w:p>
       <w:pPr>
         <w:pStyle w:val="Heading1"/>
@@ -12505,8 +14330,8 @@
         <w:t xml:space="preserve">graduate school for providing funding.</w:t>
       </w:r>
     </w:p>
-    <w:bookmarkEnd w:id="39"/>
-    <w:bookmarkStart w:id="84" w:name="references"/>
+    <w:bookmarkEnd w:id="40"/>
+    <w:bookmarkStart w:id="85" w:name="references"/>
     <w:p>
       <w:pPr>
         <w:pStyle w:val="Heading1"/>
@@ -12515,8 +14340,8 @@
         <w:t xml:space="preserve">References</w:t>
       </w:r>
     </w:p>
-    <w:bookmarkStart w:id="83" w:name="refs"/>
-    <w:bookmarkStart w:id="41" w:name="ref-kim2018"/>
+    <w:bookmarkStart w:id="84" w:name="refs"/>
+    <w:bookmarkStart w:id="42" w:name="ref-kim2018"/>
     <w:p>
       <w:pPr>
         <w:pStyle w:val="Bibliography"/>
@@ -12575,7 +14400,7 @@
       <w:r>
         <w:t xml:space="preserve">. Viral Immunology. 2018;31: 174–183. doi:</w:t>
       </w:r>
-      <w:hyperlink r:id="rId40">
+      <w:hyperlink r:id="rId41">
         <w:r>
           <w:rPr>
             <w:rStyle w:val="Hyperlink"/>
@@ -12584,8 +14409,8 @@
         </w:r>
       </w:hyperlink>
     </w:p>
-    <w:bookmarkEnd w:id="41"/>
-    <w:bookmarkStart w:id="43" w:name="ref-erbelding2018"/>
+    <w:bookmarkEnd w:id="42"/>
+    <w:bookmarkStart w:id="44" w:name="ref-erbelding2018"/>
     <w:p>
       <w:pPr>
         <w:pStyle w:val="Bibliography"/>
@@ -12656,7 +14481,7 @@
       <w:r>
         <w:t xml:space="preserve">. The Journal of Infectious Diseases. 2018;218: 347–354. doi:</w:t>
       </w:r>
-      <w:hyperlink r:id="rId42">
+      <w:hyperlink r:id="rId43">
         <w:r>
           <w:rPr>
             <w:rStyle w:val="Hyperlink"/>
@@ -12665,8 +14490,8 @@
         </w:r>
       </w:hyperlink>
     </w:p>
-    <w:bookmarkEnd w:id="43"/>
-    <w:bookmarkStart w:id="45" w:name="ref-viboud2020a"/>
+    <w:bookmarkEnd w:id="44"/>
+    <w:bookmarkStart w:id="46" w:name="ref-viboud2020a"/>
     <w:p>
       <w:pPr>
         <w:pStyle w:val="Bibliography"/>
@@ -12695,7 +14520,7 @@
       <w:r>
         <w:t xml:space="preserve">and epidemiological considerations for development of a universal influenza vaccine. PLoS pathogens. 2020;16: e1008583. doi:</w:t>
       </w:r>
-      <w:hyperlink r:id="rId44">
+      <w:hyperlink r:id="rId45">
         <w:r>
           <w:rPr>
             <w:rStyle w:val="Hyperlink"/>
@@ -12704,8 +14529,8 @@
         </w:r>
       </w:hyperlink>
     </w:p>
-    <w:bookmarkEnd w:id="45"/>
-    <w:bookmarkStart w:id="47" w:name="ref-durviaux2014"/>
+    <w:bookmarkEnd w:id="46"/>
+    <w:bookmarkStart w:id="48" w:name="ref-durviaux2014"/>
     <w:p>
       <w:pPr>
         <w:pStyle w:val="Bibliography"/>
@@ -12755,7 +14580,7 @@
       <w:r>
         <w:t xml:space="preserve">. Clinical and Vaccine Immunology. 2014;21: 271–279. doi:</w:t>
       </w:r>
-      <w:hyperlink r:id="rId46">
+      <w:hyperlink r:id="rId47">
         <w:r>
           <w:rPr>
             <w:rStyle w:val="Hyperlink"/>
@@ -12764,8 +14589,8 @@
         </w:r>
       </w:hyperlink>
     </w:p>
-    <w:bookmarkEnd w:id="47"/>
-    <w:bookmarkStart w:id="49" w:name="ref-grantham1974"/>
+    <w:bookmarkEnd w:id="48"/>
+    <w:bookmarkStart w:id="50" w:name="ref-grantham1974"/>
     <w:p>
       <w:pPr>
         <w:pStyle w:val="Bibliography"/>
@@ -12782,7 +14607,7 @@
       <w:r>
         <w:t xml:space="preserve">Grantham R. Amino acid difference formula to help explain protein evolution. Science. 1974;185: 862–864. doi:</w:t>
       </w:r>
-      <w:hyperlink r:id="rId48">
+      <w:hyperlink r:id="rId49">
         <w:r>
           <w:rPr>
             <w:rStyle w:val="Hyperlink"/>
@@ -12791,8 +14616,8 @@
         </w:r>
       </w:hyperlink>
     </w:p>
-    <w:bookmarkEnd w:id="49"/>
-    <w:bookmarkStart w:id="51" w:name="ref-gupta2006"/>
+    <w:bookmarkEnd w:id="50"/>
+    <w:bookmarkStart w:id="52" w:name="ref-gupta2006"/>
     <w:p>
       <w:pPr>
         <w:pStyle w:val="Bibliography"/>
@@ -12809,7 +14634,7 @@
       <w:r>
         <w:t xml:space="preserve">Gupta V, Earl DJ, Deem MW. Quantifying influenza vaccine efficacy and antigenic distance. Vaccine. 2006;24: 3881–3888. doi:</w:t>
       </w:r>
-      <w:hyperlink r:id="rId50">
+      <w:hyperlink r:id="rId51">
         <w:r>
           <w:rPr>
             <w:rStyle w:val="Hyperlink"/>
@@ -12818,8 +14643,8 @@
         </w:r>
       </w:hyperlink>
     </w:p>
-    <w:bookmarkEnd w:id="51"/>
-    <w:bookmarkStart w:id="53" w:name="ref-fonville2016"/>
+    <w:bookmarkEnd w:id="52"/>
+    <w:bookmarkStart w:id="54" w:name="ref-fonville2016"/>
     <w:p>
       <w:pPr>
         <w:pStyle w:val="Bibliography"/>
@@ -12872,7 +14697,7 @@
       <w:r>
         <w:t xml:space="preserve">. The Journal of Infectious Diseases. 2016;213: 31–38. doi:</w:t>
       </w:r>
-      <w:hyperlink r:id="rId52">
+      <w:hyperlink r:id="rId53">
         <w:r>
           <w:rPr>
             <w:rStyle w:val="Hyperlink"/>
@@ -12881,8 +14706,8 @@
         </w:r>
       </w:hyperlink>
     </w:p>
-    <w:bookmarkEnd w:id="53"/>
-    <w:bookmarkStart w:id="55" w:name="ref-nunez2017"/>
+    <w:bookmarkEnd w:id="54"/>
+    <w:bookmarkStart w:id="56" w:name="ref-nunez2017"/>
     <w:p>
       <w:pPr>
         <w:pStyle w:val="Bibliography"/>
@@ -12911,7 +14736,7 @@
       <w:r>
         <w:t xml:space="preserve">strains. PloS One. 2017;12: e0185666. doi:</w:t>
       </w:r>
-      <w:hyperlink r:id="rId54">
+      <w:hyperlink r:id="rId55">
         <w:r>
           <w:rPr>
             <w:rStyle w:val="Hyperlink"/>
@@ -12920,8 +14745,8 @@
         </w:r>
       </w:hyperlink>
     </w:p>
-    <w:bookmarkEnd w:id="55"/>
-    <w:bookmarkStart w:id="57" w:name="ref-abreu2020"/>
+    <w:bookmarkEnd w:id="56"/>
+    <w:bookmarkStart w:id="58" w:name="ref-abreu2020"/>
     <w:p>
       <w:pPr>
         <w:pStyle w:val="Bibliography"/>
@@ -12947,7 +14772,7 @@
       <w:r>
         <w:t xml:space="preserve">. Frontiers in Immunology. 2020;11. doi:</w:t>
       </w:r>
-      <w:hyperlink r:id="rId56">
+      <w:hyperlink r:id="rId57">
         <w:r>
           <w:rPr>
             <w:rStyle w:val="Hyperlink"/>
@@ -12956,8 +14781,8 @@
         </w:r>
       </w:hyperlink>
     </w:p>
-    <w:bookmarkEnd w:id="57"/>
-    <w:bookmarkStart w:id="59" w:name="ref-auladell2022"/>
+    <w:bookmarkEnd w:id="58"/>
+    <w:bookmarkStart w:id="60" w:name="ref-auladell2022"/>
     <w:p>
       <w:pPr>
         <w:pStyle w:val="Bibliography"/>
@@ -12974,7 +14799,7 @@
       <w:r>
         <w:t xml:space="preserve">Auladell M, Phuong HVM, Mai LTQ, Tseng Y-Y, Carolan L, Wilks S, et al. Influenza virus infection history shapes antibody responses to influenza vaccination. Nature Medicine. 2022;28: 363–372. doi:</w:t>
       </w:r>
-      <w:hyperlink r:id="rId58">
+      <w:hyperlink r:id="rId59">
         <w:r>
           <w:rPr>
             <w:rStyle w:val="Hyperlink"/>
@@ -12983,8 +14808,8 @@
         </w:r>
       </w:hyperlink>
     </w:p>
-    <w:bookmarkEnd w:id="59"/>
-    <w:bookmarkStart w:id="60" w:name="ref-wilks2023"/>
+    <w:bookmarkEnd w:id="60"/>
+    <w:bookmarkStart w:id="61" w:name="ref-wilks2023"/>
     <w:p>
       <w:pPr>
         <w:pStyle w:val="Bibliography"/>
@@ -13017,8 +14842,8 @@
         <w:t xml:space="preserve"> </w:t>
       </w:r>
     </w:p>
-    <w:bookmarkEnd w:id="60"/>
-    <w:bookmarkStart w:id="62" w:name="ref-edgar2004"/>
+    <w:bookmarkEnd w:id="61"/>
+    <w:bookmarkStart w:id="63" w:name="ref-edgar2004"/>
     <w:p>
       <w:pPr>
         <w:pStyle w:val="Bibliography"/>
@@ -13044,7 +14869,7 @@
       <w:r>
         <w:t xml:space="preserve">: A multiple sequence alignment method with reduced time and space complexity. BMC Bioinformatics. 2004;5: 113. doi:</w:t>
       </w:r>
-      <w:hyperlink r:id="rId61">
+      <w:hyperlink r:id="rId62">
         <w:r>
           <w:rPr>
             <w:rStyle w:val="Hyperlink"/>
@@ -13053,8 +14878,8 @@
         </w:r>
       </w:hyperlink>
     </w:p>
-    <w:bookmarkEnd w:id="62"/>
-    <w:bookmarkStart w:id="64" w:name="ref-dang2010"/>
+    <w:bookmarkEnd w:id="63"/>
+    <w:bookmarkStart w:id="65" w:name="ref-dang2010"/>
     <w:p>
       <w:pPr>
         <w:pStyle w:val="Bibliography"/>
@@ -13080,7 +14905,7 @@
       <w:r>
         <w:t xml:space="preserve">, an amino acid substitution model for influenza proteins. BMC Evolutionary Biology. 2010;10: 99. doi:</w:t>
       </w:r>
-      <w:hyperlink r:id="rId63">
+      <w:hyperlink r:id="rId64">
         <w:r>
           <w:rPr>
             <w:rStyle w:val="Hyperlink"/>
@@ -13089,8 +14914,8 @@
         </w:r>
       </w:hyperlink>
     </w:p>
-    <w:bookmarkEnd w:id="64"/>
-    <w:bookmarkStart w:id="65" w:name="ref-burnham2002model"/>
+    <w:bookmarkEnd w:id="65"/>
+    <w:bookmarkStart w:id="66" w:name="ref-burnham2002model"/>
     <w:p>
       <w:pPr>
         <w:pStyle w:val="Bibliography"/>
@@ -13111,8 +14936,8 @@
         <w:t xml:space="preserve"> </w:t>
       </w:r>
     </w:p>
-    <w:bookmarkEnd w:id="65"/>
-    <w:bookmarkStart w:id="67" w:name="ref-schliep2011"/>
+    <w:bookmarkEnd w:id="66"/>
+    <w:bookmarkStart w:id="68" w:name="ref-schliep2011"/>
     <w:p>
       <w:pPr>
         <w:pStyle w:val="Bibliography"/>
@@ -13138,7 +14963,7 @@
       <w:r>
         <w:t xml:space="preserve">. Bioinformatics (Oxford, England). 2011;27: 592–593. doi:</w:t>
       </w:r>
-      <w:hyperlink r:id="rId66">
+      <w:hyperlink r:id="rId67">
         <w:r>
           <w:rPr>
             <w:rStyle w:val="Hyperlink"/>
@@ -13147,8 +14972,8 @@
         </w:r>
       </w:hyperlink>
     </w:p>
-    <w:bookmarkEnd w:id="67"/>
-    <w:bookmarkStart w:id="69" w:name="ref-legendre2010MantelAlternatives"/>
+    <w:bookmarkEnd w:id="68"/>
+    <w:bookmarkStart w:id="70" w:name="ref-legendre2010MantelAlternatives"/>
     <w:p>
       <w:pPr>
         <w:pStyle w:val="Bibliography"/>
@@ -13165,7 +14990,7 @@
       <w:r>
         <w:t xml:space="preserve">Legendre P, Fortin M-J. Comparison of the mantel test and alternative approaches for detecting complex multivariate relationships in the spatial analysis of genetic data. Molecular Ecology Resources. 2010;10: 831–844. doi:</w:t>
       </w:r>
-      <w:hyperlink r:id="rId68">
+      <w:hyperlink r:id="rId69">
         <w:r>
           <w:rPr>
             <w:rStyle w:val="Hyperlink"/>
@@ -13174,8 +14999,8 @@
         </w:r>
       </w:hyperlink>
     </w:p>
-    <w:bookmarkEnd w:id="69"/>
-    <w:bookmarkStart w:id="71" w:name="ref-legendre2015ShouldMantel"/>
+    <w:bookmarkEnd w:id="70"/>
+    <w:bookmarkStart w:id="72" w:name="ref-legendre2015ShouldMantel"/>
     <w:p>
       <w:pPr>
         <w:pStyle w:val="Bibliography"/>
@@ -13192,7 +15017,7 @@
       <w:r>
         <w:t xml:space="preserve">Legendre P, Fortin M-J, Borcard D. Should the mantel test be used in spatial analysis? Methods in Ecology and Evolution. 2015;6: 1239–1247. doi:</w:t>
       </w:r>
-      <w:hyperlink r:id="rId70">
+      <w:hyperlink r:id="rId71">
         <w:r>
           <w:rPr>
             <w:rStyle w:val="Hyperlink"/>
@@ -13201,8 +15026,8 @@
         </w:r>
       </w:hyperlink>
     </w:p>
-    <w:bookmarkEnd w:id="71"/>
-    <w:bookmarkStart w:id="73" w:name="ref-rubin1981"/>
+    <w:bookmarkEnd w:id="72"/>
+    <w:bookmarkStart w:id="74" w:name="ref-rubin1981"/>
     <w:p>
       <w:pPr>
         <w:pStyle w:val="Bibliography"/>
@@ -13219,7 +15044,7 @@
       <w:r>
         <w:t xml:space="preserve">Rubin DB. The bayesian bootstrap. The Annals of Statistics. 1981;9: 130–134. doi:</w:t>
       </w:r>
-      <w:hyperlink r:id="rId72">
+      <w:hyperlink r:id="rId73">
         <w:r>
           <w:rPr>
             <w:rStyle w:val="Hyperlink"/>
@@ -13228,8 +15053,8 @@
         </w:r>
       </w:hyperlink>
     </w:p>
-    <w:bookmarkEnd w:id="73"/>
-    <w:bookmarkStart w:id="75" w:name="ref-saitou1987NeighborJoining"/>
+    <w:bookmarkEnd w:id="74"/>
+    <w:bookmarkStart w:id="76" w:name="ref-saitou1987NeighborJoining"/>
     <w:p>
       <w:pPr>
         <w:pStyle w:val="Bibliography"/>
@@ -13246,7 +15071,7 @@
       <w:r>
         <w:t xml:space="preserve">Saitou N, Nei M. The neighbor-joining method: A new method for reconstructing phylogenetic trees. Molecular Biology and Evolution. 1987;4: 406–425. doi:</w:t>
       </w:r>
-      <w:hyperlink r:id="rId74">
+      <w:hyperlink r:id="rId75">
         <w:r>
           <w:rPr>
             <w:rStyle w:val="Hyperlink"/>
@@ -13255,8 +15080,8 @@
         </w:r>
       </w:hyperlink>
     </w:p>
-    <w:bookmarkEnd w:id="75"/>
-    <w:bookmarkStart w:id="77" w:name="ref-shimodaira1999ShTest"/>
+    <w:bookmarkEnd w:id="76"/>
+    <w:bookmarkStart w:id="78" w:name="ref-shimodaira1999ShTest"/>
     <w:p>
       <w:pPr>
         <w:pStyle w:val="Bibliography"/>
@@ -13273,7 +15098,7 @@
       <w:r>
         <w:t xml:space="preserve">Shimodaira H, Hasegawa M. Multiple comparisons of log-likelihoods with applications to phylogenetic inference. Molecular Biology and Evolution. 1999;16: 1114–1116. doi:</w:t>
       </w:r>
-      <w:hyperlink r:id="rId76">
+      <w:hyperlink r:id="rId77">
         <w:r>
           <w:rPr>
             <w:rStyle w:val="Hyperlink"/>
@@ -13282,8 +15107,8 @@
         </w:r>
       </w:hyperlink>
     </w:p>
-    <w:bookmarkEnd w:id="77"/>
-    <w:bookmarkStart w:id="79" w:name="X8b6875512c705bb343382cbd274febad517fdf3"/>
+    <w:bookmarkEnd w:id="78"/>
+    <w:bookmarkStart w:id="80" w:name="X8b6875512c705bb343382cbd274febad517fdf3"/>
     <w:p>
       <w:pPr>
         <w:pStyle w:val="Bibliography"/>
@@ -13300,7 +15125,7 @@
       <w:r>
         <w:t xml:space="preserve">Robinson DF, Foulds LR. Comparison of phylogenetic trees. Mathematical Biosciences. 1981;53: 131–147. doi:</w:t>
       </w:r>
-      <w:hyperlink r:id="rId78">
+      <w:hyperlink r:id="rId79">
         <w:r>
           <w:rPr>
             <w:rStyle w:val="Hyperlink"/>
@@ -13309,8 +15134,8 @@
         </w:r>
       </w:hyperlink>
     </w:p>
-    <w:bookmarkEnd w:id="79"/>
-    <w:bookmarkStart w:id="80" w:name="ref-rcoreteam2024"/>
+    <w:bookmarkEnd w:id="80"/>
+    <w:bookmarkStart w:id="81" w:name="ref-rcoreteam2024"/>
     <w:p>
       <w:pPr>
         <w:pStyle w:val="Bibliography"/>
@@ -13331,8 +15156,8 @@
         <w:t xml:space="preserve"> </w:t>
       </w:r>
     </w:p>
-    <w:bookmarkEnd w:id="80"/>
-    <w:bookmarkStart w:id="82" w:name="ref-bodenhofer2015"/>
+    <w:bookmarkEnd w:id="81"/>
+    <w:bookmarkStart w:id="83" w:name="ref-bodenhofer2015"/>
     <w:p>
       <w:pPr>
         <w:pStyle w:val="Bibliography"/>
@@ -13361,7 +15186,7 @@
       <w:r>
         <w:t xml:space="preserve">package for multiple sequence alignment. Bioinformatics. 2015;31: 3997–3999. doi:</w:t>
       </w:r>
-      <w:hyperlink r:id="rId81">
+      <w:hyperlink r:id="rId82">
         <w:r>
           <w:rPr>
             <w:rStyle w:val="Hyperlink"/>
@@ -13370,9 +15195,9 @@
         </w:r>
       </w:hyperlink>
     </w:p>
-    <w:bookmarkEnd w:id="82"/>
     <w:bookmarkEnd w:id="83"/>
     <w:bookmarkEnd w:id="84"/>
+    <w:bookmarkEnd w:id="85"/>
     <w:sectPr/>
   </w:body>
 </w:document>

</xml_diff>